<commit_message>
Documentacion de Elegir perfil y del espacio del profesional (DAS v1.15, CP-050 a CP-060, defectos 15 a 24)
DAS: decisiones D25 (reemplaza D21), D26 y D27, flujo del espacio del profesional, Ilustraciones 6 y 10 nuevas. Planilla: 11 casos ejecutados contra el backend y MySQL reales y notas en los casos desactualizados. Registro de defectos 15 a 24. Capturas evidencia_14 a evidencia_22 y mockups del PO.
</commit_message>
<xml_diff>
--- a/FASE 2/Evidencias Proyecto/Evidencias de documentación/Documento de Arquitectura (DAS)/Documento_Arquitectura_Sistema_DAS_.docx
+++ b/FASE 2/Evidencias Proyecto/Evidencias de documentación/Documento de Arquitectura (DAS)/Documento_Arquitectura_Sistema_DAS_.docx
@@ -237,7 +237,7 @@
           <w:szCs w:val="36"/>
           <w:lang w:val="es-CL"/>
         </w:rPr>
-        <w:t>Versión 1.14</w:t>
+        <w:t>Versión 1.15</w:t>
       </w:r>
     </w:p>
     <w:p>
@@ -567,7 +567,7 @@
               </w:rPr>
             </w:pPr>
             <w:r>
-              <w:t>1.14</w:t>
+              <w:t>1.15</w:t>
             </w:r>
           </w:p>
         </w:tc>
@@ -679,7 +679,7 @@
               </w:rPr>
             </w:pPr>
             <w:r>
-              <w:t>03-10-2026</w:t>
+              <w:t>08-10-2026</w:t>
             </w:r>
           </w:p>
         </w:tc>
@@ -1959,6 +1959,72 @@
             </w:pPr>
             <w:r>
               <w:t>Inicio con sesión y navegación común (FS-HU-21), búsqueda avanzada y por cercanía (FS-HU-22 y FS-HU-05), favoritos (FS-HU-23) y reseñas (FS-HU-24): columnas comuna y modalidad en profesionales, tablas favoritos y resenas (el modelo pasa a catorce tablas), flujo de búsqueda, decisiones D22 a D24 y D20 ajustada (con sesión la raíz lleva al Inicio). Se actualizan las épicas E1 a E3, los casos de uso CU-01 y CU-03 (Ilustración 1), el diagrama de clases (Ilustración 2) y el modelo físico (Ilustración 4, que ahora incluye profesionales y establecimientos). Se corrigen la portada del documento (decía versión 1.11), el flujo de autenticación (el rol ya no se elige en el registro y el asistente es de 5 pasos) y el índice de ubicación de profesionales, que aún no está creado.</w:t>
+            </w:r>
+          </w:p>
+        </w:tc>
+        <w:tc>
+          <w:tcPr>
+            <w:tcW w:w="1908" w:type="dxa"/>
+          </w:tcPr>
+          <w:p>
+            <w:pPr>
+              <w:pStyle w:val="Tabletext"/>
+              <w:rPr>
+                <w:lang w:val="es-CL"/>
+              </w:rPr>
+            </w:pPr>
+            <w:r>
+              <w:t>Rodrigo Cárcamo Rojas</w:t>
+            </w:r>
+          </w:p>
+        </w:tc>
+      </w:tr>
+      <w:tr>
+        <w:tc>
+          <w:tcPr>
+            <w:tcW w:w="2196" w:type="dxa"/>
+          </w:tcPr>
+          <w:p>
+            <w:pPr>
+              <w:pStyle w:val="Tabletext"/>
+              <w:rPr>
+                <w:lang w:val="es-CL"/>
+              </w:rPr>
+            </w:pPr>
+            <w:r>
+              <w:t>08-10-2026</w:t>
+            </w:r>
+          </w:p>
+        </w:tc>
+        <w:tc>
+          <w:tcPr>
+            <w:tcW w:w="1152" w:type="dxa"/>
+          </w:tcPr>
+          <w:p>
+            <w:pPr>
+              <w:pStyle w:val="Tabletext"/>
+              <w:rPr>
+                <w:lang w:val="es-CL"/>
+              </w:rPr>
+            </w:pPr>
+            <w:r>
+              <w:t>1.15</w:t>
+            </w:r>
+          </w:p>
+        </w:tc>
+        <w:tc>
+          <w:tcPr>
+            <w:tcW w:w="3744" w:type="dxa"/>
+          </w:tcPr>
+          <w:p>
+            <w:pPr>
+              <w:pStyle w:val="Tabletext"/>
+              <w:rPr>
+                <w:lang w:val="es-CL"/>
+              </w:rPr>
+            </w:pPr>
+            <w:r>
+              <w:t>Elección del perfil fuera del asistente y espacio propio del profesional (decisión D25, que reemplaza a D21): pantalla "Elegir perfil" (/elegir-perfil) donde cada cuenta elige una sola vez si es usuario o profesional (PUT /api/perfil/tipo-cuenta responde 409 si ya se eligió), asistente del usuario de 4 pasos (Ilustración 6 nueva), Inicio y perfil del profesional con vista previa de su ficha pública, y separación por rol en las pantallas y en la API. Clima del Inicio del profesional con Open-Meteo (D26: endpoint GET /api/clima y nodo nuevo en la vista física, Ilustración 10). Ficha propia del profesional de FS-HU-04 (D27: GET y PUT /api/profesionales/mi-ficha) con el catálogo de especialidades en shared/reglas.json. Se actualizan las épicas E1 y E2, los casos de uso CU-01 y CU-04, los escenarios QS2 y QS3, la columna rol_confirmado y la tabla profesionales, el flujo de autenticación, el flujo nuevo del espacio del profesional, la vista de desarrollo, la vista física (que además corrige 12 tablas por 14) y la decisión D22 (menú del usuario sin Farmacias ni Historial de chats y con Comidas).</w:t>
             </w:r>
           </w:p>
         </w:tc>
@@ -4359,7 +4425,7 @@
         <w:rPr>
           <w:b/>
         </w:rPr>
-        <w:t>E1 Gestión de usuarios: portada pública para quien aún no ha iniciado sesión, registro e inicio de sesión (con correo y contraseña o con Google), recuperación de contraseña por correo, roles (el tipo de cuenta se elige en el asistente de perfil), perfil del usuario (datos básicos, objetivos y estilo de vida, e información de salud) e Inicio personalizado con la navegación de la aplicación (FS-HU-01, FS-HU-02, FS-HU-15 a FS-HU-21).</w:t>
+        <w:t>E1 Gestión de usuarios: portada pública para quien aún no ha iniciado sesión, registro e inicio de sesión (con correo y contraseña o con Google), recuperación de contraseña por correo, elección única del perfil (usuario o profesional) en la pantalla "Elegir perfil", perfil del usuario (datos básicos, objetivos y estilo de vida, e información de salud) e Inicio personalizado con la navegación de la aplicación (FS-HU-01, FS-HU-02, FS-HU-15 a FS-HU-21).</w:t>
       </w:r>
     </w:p>
     <w:p>
@@ -4376,7 +4442,7 @@
         <w:rPr>
           <w:b/>
         </w:rPr>
-        <w:t>E2 Profesionales: listado, ficha y perfil de profesionales, favoritos, calificaciones y reseñas, y verificación de perfiles por el administrador (FS-HU-03, FS-HU-04, FS-HU-12, FS-HU-23, FS-HU-24).</w:t>
+        <w:t>E2 Profesionales: listado y ficha de profesionales, ficha propia y espacio del profesional (Inicio con el clima de su comuna y perfil profesional con la vista previa de su ficha pública), favoritos, calificaciones y reseñas, y verificación de perfiles por el administrador (FS-HU-03, FS-HU-04, FS-HU-12, FS-HU-23, FS-HU-24).</w:t>
       </w:r>
     </w:p>
     <w:p>
@@ -5532,7 +5598,7 @@
         <w:rPr>
           <w:b/>
         </w:rPr>
-        <w:t>Diagramas fuente de las vistas: tablero de Miro del equipo y carpeta "Diagramas (Miro)/Actualización Sprint 2" (PNG, SVG y, cuando corresponde, código Mermaid de los diez diagramas UML y de datos).</w:t>
+        <w:t>Diagramas fuente de las vistas: tablero de Miro del equipo y carpetas "Diagramas (Miro)/Actualización Sprint 2" y "Diagramas (Miro)/Actualización Sprint 3" (la segunda, con los diagramas que cambiaron en el Sprint 3) (PNG, SVG y, cuando corresponde, código Mermaid de los diez diagramas UML y de datos).</w:t>
       </w:r>
     </w:p>
     <w:p>
@@ -5869,13 +5935,7 @@
         <w:rPr>
           <w:b/>
         </w:rPr>
-        <w:t xml:space="preserve">Tolerancia a fallos: </w:t>
-      </w:r>
-      <w:r>
-        <w:rPr>
-          <w:i w:val="0"/>
-        </w:rPr>
-        <w:t>una falla de un servicio externo (API de Claude o Google Maps) no debe detener el backend ni afectar las funcionalidades que no dependen de él; el usuario recibe un mensaje claro.</w:t>
+        <w:t>Tolerancia a fallos: una falla de un servicio externo (API de Claude, Google Maps u Open-Meteo) no debe detener el backend ni afectar las funcionalidades que no dependen de él; el usuario recibe un mensaje claro.</w:t>
       </w:r>
     </w:p>
     <w:p>
@@ -5892,7 +5952,7 @@
         <w:rPr>
           <w:b/>
         </w:rPr>
-        <w:t>Seguridad: contraseñas almacenadas con bcrypt, autenticación con JWT, control de acceso por rol (usuario, profesional, administrador), validación de entradas en el backend, claves de API y credenciales de correo solo en variables de entorno del servidor y buenas prácticas OWASP. El acceso con Google se valida en el backend y los enlaces de recuperación de contraseña son de un solo uso y con vencimiento (QS6). Los datos de salud del perfil (peso, altura, edad) se tratan como datos personales sensibles.</w:t>
+        <w:t>Seguridad: contraseñas almacenadas con bcrypt, autenticación con JWT, control de acceso por rol (usuario, profesional, administrador; cada rol solo usa sus propias pantallas y endpoints, D25), validación de entradas en el backend, claves de API y credenciales de correo solo en variables de entorno del servidor y buenas prácticas OWASP. El acceso con Google se valida en el backend y los enlaces de recuperación de contraseña son de un solo uso y con vencimiento (QS6). Los datos de salud del perfil (peso, altura, edad) se tratan como datos personales sensibles.</w:t>
       </w:r>
     </w:p>
     <w:p>
@@ -6077,13 +6137,7 @@
         <w:rPr>
           <w:b/>
         </w:rPr>
-        <w:t xml:space="preserve">Otros componentes de software: </w:t>
-      </w:r>
-      <w:r>
-        <w:rPr>
-          <w:i w:val="0"/>
-        </w:rPr>
-        <w:t>solo se utilizan bibliotecas de código abierto y los planes gratuitos o de bajo costo de Google Maps Platform y de la API de Claude, con límites de uso conservadores.</w:t>
+        <w:t>Otros componentes de software: solo se utilizan bibliotecas de código abierto y los planes gratuitos o de bajo costo de Google Maps Platform y de la API de Claude, con límites de uso conservadores, y el servicio gratuito Open-Meteo (sin clave) para el clima del Inicio del profesional (D26).</w:t>
       </w:r>
     </w:p>
     <w:p>
@@ -6344,7 +6398,7 @@
         <w:rPr>
           <w:i w:val="0"/>
         </w:rPr>
-        <w:t>El sistema considera tres actores: el Usuario, que busca profesionales, los guarda como favoritos, los califica y reserva horas, conversa con el asistente y registra su alimentación; el Profesional, que gestiona su perfil y su disponibilidad y responde las reservas; y el Administrador, que administra la plataforma y gestiona los procesos que requieren intervención manual, como la verificación de perfiles profesionales. El detalle de cada caso de uso, con sus escenarios de aceptación, se encuentra en el Documento de Épicas e Historias de Usuario. El diagrama usa «include» para comportamientos que el caso base siempre ejecuta (por ejemplo, estimar el requerimiento calórico al gestionar el perfil) y «extend» para opciones que lo amplían (recuperar la contraseña o acceder con Google en CU-01).</w:t>
+        <w:t>El sistema considera tres actores: el Usuario, que busca profesionales, los guarda como favoritos, los califica y reserva horas, conversa con el asistente y registra su alimentación; el Profesional, que elige su perfil al crear la cuenta y, desde su propio espacio, gestiona su ficha y su disponibilidad y responde las reservas; y el Administrador, que administra la plataforma y gestiona los procesos que requieren intervención manual, como la verificación de perfiles profesionales. El detalle de cada caso de uso, con sus escenarios de aceptación, se encuentra en el Documento de Épicas e Historias de Usuario. El diagrama usa «include» para comportamientos que el caso base siempre ejecuta (por ejemplo, estimar el requerimiento calórico al gestionar el perfil) y «extend» para opciones que lo amplían (recuperar la contraseña o acceder con Google en CU-01).</w:t>
       </w:r>
     </w:p>
     <w:p>
@@ -6792,7 +6846,7 @@
                 <w:szCs w:val="16"/>
                 <w:lang w:val="es-ES" w:eastAsia="es-ES"/>
               </w:rPr>
-              <w:t>Entrar a la plataforma desde la portada, registrarse, iniciar y cerrar sesión, recuperar la contraseña y navegar desde el Inicio (FS-HU-01, FS-HU-15, FS-HU-16, FS-HU-17, FS-HU-20, FS-HU-21)</w:t>
+              <w:t>Entrar a la plataforma desde la portada, registrarse, elegir una sola vez cómo usar FitSearch (usuario o profesional), iniciar y cerrar sesión, recuperar la contraseña y navegar desde el Inicio (FS-HU-01, FS-HU-15, FS-HU-16, FS-HU-17, FS-HU-20, FS-HU-21)</w:t>
             </w:r>
           </w:p>
         </w:tc>
@@ -7242,7 +7296,7 @@
                 <w:szCs w:val="16"/>
                 <w:lang w:val="es-ES" w:eastAsia="es-ES"/>
               </w:rPr>
-              <w:t xml:space="preserve">Gestionar perfil profesional (FS-HU-04)</w:t>
+              <w:t>Gestionar perfil profesional: ficha pública propia, Inicio y espacio del profesional (FS-HU-04)</w:t>
             </w:r>
           </w:p>
         </w:tc>
@@ -8215,13 +8269,7 @@
         <w:rPr>
           <w:b/>
         </w:rPr>
-        <w:t xml:space="preserve">Sinopsis: </w:t>
-      </w:r>
-      <w:r>
-        <w:rPr>
-          <w:i w:val="0"/>
-        </w:rPr>
-        <w:t>Una falla de la API de Claude o de Google Maps no debe botar el sistema.</w:t>
+        <w:t>Sinopsis: Una falla de la API de Claude, de Google Maps o de Open-Meteo no debe botar el sistema.</w:t>
       </w:r>
     </w:p>
     <w:p>
@@ -8275,13 +8323,7 @@
         <w:rPr>
           <w:b/>
         </w:rPr>
-        <w:t xml:space="preserve">Comportamiento esperado: </w:t>
-      </w:r>
-      <w:r>
-        <w:rPr>
-          <w:i w:val="0"/>
-        </w:rPr>
-        <w:t>El backend responde con un mensaje de error controlado; el perfil, el listado y el resto de la plataforma siguen disponibles.</w:t>
+        <w:t>Comportamiento esperado: El backend responde con un mensaje de error controlado; el perfil, el listado y el resto de la plataforma siguen disponibles. Si el clima no responde (espera máxima de 4 segundos), el Inicio del profesional se muestra sin esa tarjeta (D26).</w:t>
       </w:r>
     </w:p>
     <w:p>
@@ -8335,13 +8377,7 @@
         <w:rPr>
           <w:b/>
         </w:rPr>
-        <w:t xml:space="preserve">Aplicación: </w:t>
-      </w:r>
-      <w:r>
-        <w:rPr>
-          <w:i w:val="0"/>
-        </w:rPr>
-        <w:t>Local (módulos de asistente y mapas)</w:t>
+        <w:t>Aplicación: Local (módulos de asistente, mapas y clima)</w:t>
       </w:r>
     </w:p>
     <w:p/>
@@ -8391,13 +8427,7 @@
         <w:rPr>
           <w:b/>
         </w:rPr>
-        <w:t xml:space="preserve">Sinopsis: </w:t>
-      </w:r>
-      <w:r>
-        <w:rPr>
-          <w:i w:val="0"/>
-        </w:rPr>
-        <w:t>Solo el dueño de un perfil, conversación o registro de comida puede consultarlo o modificarlo.</w:t>
+        <w:t>Sinopsis: Solo el dueño de un perfil, conversación o registro de comida puede consultarlo o modificarlo, y cada rol solo accede a sus propias funciones (D25).</w:t>
       </w:r>
     </w:p>
     <w:p>
@@ -8431,13 +8461,7 @@
         <w:rPr>
           <w:b/>
         </w:rPr>
-        <w:t xml:space="preserve">Cambio en el entorno: </w:t>
-      </w:r>
-      <w:r>
-        <w:rPr>
-          <w:i w:val="0"/>
-        </w:rPr>
-        <w:t>Se realiza una petición sin token, con token inválido o expirado, o sobre un recurso de otro usuario.</w:t>
+        <w:t>Cambio en el entorno: Se realiza una petición sin token, con token inválido o expirado, o sobre un recurso de otro usuario o de otro rol (por ejemplo, un profesional que intenta guardar datos de salud o favoritos).</w:t>
       </w:r>
     </w:p>
     <w:p>
@@ -9527,7 +9551,7 @@
               <w:rPr>
                 <w:sz w:val="17"/>
               </w:rPr>
-              <w:t>Google Maps Platform, API de Claude, Google Identity Services, servidor SMTP (Gmail)</w:t>
+              <w:t>Google Maps Platform, API de Claude, Google Identity Services, servidor SMTP (Gmail), Open-Meteo</w:t>
             </w:r>
           </w:p>
         </w:tc>
@@ -9543,7 +9567,7 @@
               <w:rPr>
                 <w:sz w:val="17"/>
               </w:rPr>
-              <w:t>Geocodificación, lugares y mapas; procesamiento de lenguaje natural con function calling; acceso con cuenta de Google; envío de correos de recuperación de contraseña.</w:t>
+              <w:t>Geocodificación, lugares y mapas; procesamiento de lenguaje natural con function calling; acceso con cuenta de Google; envío de correos de recuperación de contraseña; clima actual del Inicio del profesional.</w:t>
             </w:r>
           </w:p>
         </w:tc>
@@ -11731,7 +11755,7 @@
               <w:rPr>
                 <w:sz w:val="17"/>
               </w:rPr>
-              <w:t>Queda en true cuando la persona elige su tipo de cuenta en el asistente de perfil (FS-HU-02). El registro crea toda cuenta con el rol usuario, así que esta columna distingue el rol provisional del confirmado.</w:t>
+              <w:t>Queda en true cuando la persona elige, una sola vez, si usa FitSearch como usuario o como profesional en la pantalla "Elegir perfil" (D25). El registro crea toda cuenta con el rol usuario, así que esta columna distingue el rol provisional del confirmado; la confirmación solo cambia el rol si todavía estaba en false.</w:t>
             </w:r>
           </w:p>
         </w:tc>
@@ -12605,13 +12629,7 @@
         <w:rPr>
           <w:b/>
         </w:rPr>
-        <w:t xml:space="preserve">Tabla profesionales: </w:t>
-      </w:r>
-      <w:r>
-        <w:rPr>
-          <w:i w:val="0"/>
-        </w:rPr>
-        <w:t>Ficha pública de un usuario con rol profesional.</w:t>
+        <w:t>Tabla profesionales: Ficha pública de un usuario con rol profesional. La crea o actualiza el propio profesional desde "Perfil profesional" (FS-HU-04, D27): la fila no existe hasta que completa su ficha por primera vez, por lo que el buscador nunca muestra fichas a medio llenar.</w:t>
       </w:r>
     </w:p>
     <w:tbl>
@@ -12974,7 +12992,7 @@
               <w:rPr>
                 <w:sz w:val="17"/>
               </w:rPr>
-              <w:t>Especialidad (por ejemplo: nutricionista, kinesiólogo).</w:t>
+              <w:t>Especialidad elegida del catálogo de shared/reglas.json: Entrenamiento personal, Kinesiología, Medicina deportiva, Nutrición o Psicología deportiva (FS-HU-04).</w:t>
             </w:r>
           </w:p>
         </w:tc>
@@ -13309,7 +13327,7 @@
               <w:rPr>
                 <w:sz w:val="17"/>
               </w:rPr>
-              <w:t>Comuna donde atiende, usada por el filtro de comuna del buscador (FS-HU-22). Es nula en fichas anteriores al 03-10-2026 hasta que el profesional la complete (FS-HU-04).</w:t>
+              <w:t>Comuna donde atiende, usada por el filtro de comuna del buscador (FS-HU-22) y como lugar del clima del Inicio del profesional (D26). Es obligatoria al completar la ficha desde el 08-10-2026; solo es nula en fichas anteriores al 03-10-2026 hasta que el profesional la edite.</w:t>
             </w:r>
           </w:p>
         </w:tc>
@@ -20033,7 +20051,7 @@
               <w:rPr>
                 <w:sz w:val="17"/>
               </w:rPr>
-              <w:t>Desde la portada pública (/) presiona "Registrarse" y completa nombre, correo, contraseña y su confirmación; el tipo de cuenta no se elige aquí, sino en el primer paso del asistente de perfil (D21).</w:t>
+              <w:t>Desde la portada pública (/) presiona "Registrarse" y completa nombre, correo, contraseña y su confirmación; el tipo de cuenta no se elige aquí, sino justo después, en la pantalla "Elegir perfil" (D25).</w:t>
             </w:r>
           </w:p>
         </w:tc>
@@ -20083,7 +20101,7 @@
               <w:rPr>
                 <w:sz w:val="17"/>
               </w:rPr>
-              <w:t>POST /api/auth/registro con nombre, correo y contraseña en JSON; la cuenta se crea siempre con el rol usuario (el tipo de cuenta se elige después en el perfil).</w:t>
+              <w:t>POST /api/auth/registro con nombre, correo y contraseña en JSON; la cuenta se crea siempre con el rol usuario (el tipo de cuenta se elige después en "Elegir perfil").</w:t>
             </w:r>
           </w:p>
         </w:tc>
@@ -20283,7 +20301,7 @@
               <w:rPr>
                 <w:sz w:val="17"/>
               </w:rPr>
-              <w:t>201 Created con el token JWT y los datos públicos del usuario; el frontend guarda la sesión y abre el asistente de perfil con el aviso de cuenta creada.</w:t>
+              <w:t>201 Created con el token JWT y los datos públicos del usuario; el frontend guarda la sesión (con rolConfirmado en false) y abre "Elegir perfil" con el aviso de cuenta creada.</w:t>
             </w:r>
           </w:p>
         </w:tc>
@@ -20333,7 +20351,7 @@
               <w:rPr>
                 <w:sz w:val="17"/>
               </w:rPr>
-              <w:t>POST /api/auth/login con la opción "Recordarme": el backend compara la contraseña con bcrypt y responde 200 con un JWT (30 días si se marcó "Recordarme", 8 horas si no), o 401 con un mensaje genérico que no indica qué dato falló. Con "Recordarme" el frontend guarda la sesión en localStorage; sin ella, en sessionStorage (se cierra al cerrar el navegador). Después de iniciar sesión el frontend vuelve a la página que se había pedido sin sesión (por ejemplo, una búsqueda compartida) o abre el Inicio (/inicio); si el tipo de cuenta aún no está confirmado, el Inicio lleva al asistente.</w:t>
+              <w:t>POST /api/auth/login con la opción "Recordarme": el backend compara la contraseña con bcrypt y responde 200 con un JWT (30 días si se marcó "Recordarme", 8 horas si no), o 401 con un mensaje genérico que no indica qué dato falló. Con "Recordarme" el frontend guarda la sesión en localStorage; sin ella, en sessionStorage (se cierra al cerrar el navegador). Después de iniciar sesión el frontend vuelve a la página que se había pedido sin sesión (por ejemplo, una búsqueda compartida) o abre el Inicio de su rol (/inicio o /profesional/inicio); la respuesta incluye rolConfirmado y, si la cuenta aún no elige su perfil, va a "Elegir perfil".</w:t>
             </w:r>
           </w:p>
         </w:tc>
@@ -20383,7 +20401,7 @@
               <w:rPr>
                 <w:sz w:val="17"/>
               </w:rPr>
-              <w:t>GET y PUT /api/perfil con la cabecera Authorization: Bearer &lt;token&gt;; un middleware valida el JWT y se consultan o actualizan los datos del usuario autenticado en perfiles_usuario; con el perfil completo, la respuesta incluye el requerimiento calórico diario estimado. Desde el Sprint 2 el perfil se completa con un asistente de 5 pasos: PUT /api/perfil/tipo-cuenta (tipo de cuenta, D21), PUT /api/perfil (datos personales), PUT /api/perfil/objetivos (FS-HU-18) y PUT /api/perfil/salud (FS-HU-19); cada paso se guarda por separado y GET /api/perfil informa qué pasos faltan. Con el perfil completo se muestra un resumen con la opción "Editar" por sección.</w:t>
+              <w:t>GET y PUT /api/perfil con la cabecera Authorization: Bearer &lt;token&gt;; un middleware valida el JWT y se consultan o actualizan los datos del usuario autenticado en perfiles_usuario; con el perfil completo, la respuesta incluye el requerimiento calórico diario estimado. Desde el 08-10-2026 el tipo de cuenta se elige antes, en "Elegir perfil": PUT /api/perfil/tipo-cuenta confirma el rol una sola vez (responde 409 si ya estaba elegido) y emite un token nuevo con el mismo vencimiento (D25). El usuario completa después un asistente de 4 pasos: PUT /api/perfil (datos personales), PUT /api/perfil/objetivos (FS-HU-18) y PUT /api/perfil/salud (FS-HU-19); cada paso se guarda por separado y GET /api/perfil informa qué pasos faltan. Con el perfil completo se muestra un resumen con la opción "Editar" por sección. Estos tres PUT son solo para cuentas de usuario: una cuenta profesional recibe 403.</w:t>
             </w:r>
           </w:p>
         </w:tc>
@@ -20533,7 +20551,7 @@
               <w:rPr>
                 <w:sz w:val="17"/>
               </w:rPr>
-              <w:t>Navegación según la sesión (FS-HU-20 y FS-HU-21, decisiones D20 y D22): la portada (/), el registro y el inicio de sesión son solo para invitados, por lo que con la sesión iniciada redirigen al Inicio (/inicio). El logo lleva al Inicio con sesión y a la portada sin ella. Sin sesión, las rutas protegidas (/inicio, /perfil, /profesionales, /favoritos y las secciones próximas) redirigen al inicio de sesión recordando la ruta pedida, salvo justo después de un cierre de sesión voluntario, que vuelve a la portada.</w:t>
+              <w:t>Navegación según la sesión y el rol (FS-HU-20 y FS-HU-21, decisiones D20, D22 y D25): la portada (/), el registro y el inicio de sesión son solo para invitados, por lo que con la sesión iniciada redirigen al Inicio de su rol. Cada rol tiene su espacio: el usuario usa /inicio, /perfil, /profesionales, /favoritos y sus secciones próximas; el profesional usa /profesional/inicio, /profesional/perfil (con /profesional/perfil/publico) y sus secciones próximas (agenda, clientes, mensajes, reportes y configuración). Si una cuenta abre una ruta del otro rol, va a su propio Inicio, y si aún no elige su perfil, a /elegir-perfil. El logo lleva al Inicio de su rol con sesión y a la portada sin ella. Sin sesión, las rutas protegidas redirigen al inicio de sesión recordando la ruta pedida, salvo justo después de un cierre de sesión voluntario, que vuelve a la portada.</w:t>
             </w:r>
           </w:p>
         </w:tc>
@@ -20547,7 +20565,7 @@
       <w:r>
         <w:drawing>
           <wp:inline xmlns:a="http://schemas.openxmlformats.org/drawingml/2006/main" xmlns:pic="http://schemas.openxmlformats.org/drawingml/2006/picture">
-            <wp:extent cx="5400000" cy="5269256"/>
+            <wp:extent cx="5400000" cy="3933658"/>
             <wp:docPr id="901" name="Diagrama 901"/>
             <wp:cNvGraphicFramePr>
               <a:graphicFrameLocks noChangeAspect="1"/>
@@ -20568,7 +20586,7 @@
                   <pic:spPr>
                     <a:xfrm>
                       <a:off x="0" y="0"/>
-                      <a:ext cx="5400000" cy="5269256"/>
+                      <a:ext cx="5400000" cy="3933658"/>
                     </a:xfrm>
                     <a:prstGeom prst="rect"/>
                   </pic:spPr>
@@ -20593,7 +20611,7 @@
         <w:rPr>
           <w:i w:val="0"/>
         </w:rPr>
-        <w:t>Ilustración 6: Diagrama de secuencia del asistente de perfil de 5 pasos (FS-HU-02, FS-HU-18 y FS-HU-19)</w:t>
+        <w:t>Ilustración 6: Diagrama de secuencia de la elección del perfil y del asistente del usuario de 4 pasos (D25, FS-HU-02, FS-HU-18 y FS-HU-19)</w:t>
       </w:r>
     </w:p>
     <w:p/>
@@ -21759,7 +21777,7 @@
               <w:rPr>
                 <w:sz w:val="17"/>
               </w:rPr>
-              <w:t>Busca al usuario por google_id o por correo: si existe, vincula google_id y conserva su rol; si no existe, crea el usuario con el rol usuario y su perfil vacío. Responde 200 con el JWT de FitSearch.</w:t>
+              <w:t>Busca al usuario por google_id o por correo: si existe, vincula google_id y conserva su rol; si no existe, crea el usuario con el rol usuario y su perfil vacío. Responde 200 con el JWT de FitSearch. La respuesta incluye rolConfirmado: una cuenta nueva va a "Elegir perfil" (D25).</w:t>
             </w:r>
           </w:p>
         </w:tc>
@@ -22281,6 +22299,462 @@
     <w:p/>
     <w:p>
       <w:pPr>
+        <w:pStyle w:val="EstiloTtulo2VerdanaJustificado"/>
+        <w:numPr>
+          <w:ilvl w:val="1"/>
+          <w:numId w:val="0"/>
+        </w:numPr>
+      </w:pPr>
+      <w:r>
+        <w:t>Flujo del espacio del profesional (Sprint 3)</w:t>
+      </w:r>
+    </w:p>
+    <w:p>
+      <w:pPr>
+        <w:jc w:val="both"/>
+        <w:rPr>
+          <w:lang w:val="es-ES"/>
+        </w:rPr>
+      </w:pPr>
+      <w:r>
+        <w:rPr>
+          <w:i w:val="0"/>
+        </w:rPr>
+        <w:t>Implementa D25, D26 y la ficha propia de FS-HU-04 (D27). Todas las rutas exigen sesión (Bearer JWT) y se exponen bajo el prefijo /api. Estado al 08-10-2026: los siete pasos están implementados y probados (CP-050 a CP-060); la agenda, los clientes y los mensajes llegarán con FS-HU-13 y FS-HU-14.</w:t>
+      </w:r>
+    </w:p>
+    <w:tbl>
+      <w:tblPr>
+        <w:tblW w:type="dxa" w:w="9000"/>
+        <w:tblBorders>
+          <w:top w:val="single" w:sz="4" w:space="0" w:color="000000"/>
+          <w:left w:val="single" w:sz="4" w:space="0" w:color="000000"/>
+          <w:bottom w:val="single" w:sz="4" w:space="0" w:color="000000"/>
+          <w:right w:val="single" w:sz="4" w:space="0" w:color="000000"/>
+          <w:insideH w:val="single" w:sz="4" w:space="0" w:color="000000"/>
+          <w:insideV w:val="single" w:sz="4" w:space="0" w:color="000000"/>
+        </w:tblBorders>
+        <w:tblLayout w:type="fixed"/>
+        <w:tblLook w:firstColumn="1" w:firstRow="1" w:lastColumn="0" w:lastRow="0" w:noHBand="0" w:noVBand="1" w:val="04A0"/>
+      </w:tblPr>
+      <w:tblGrid>
+        <w:gridCol w:w="700"/>
+        <w:gridCol w:w="2100"/>
+        <w:gridCol w:w="6200"/>
+      </w:tblGrid>
+      <w:tr>
+        <w:trPr>
+          <w:tblHeader/>
+        </w:trPr>
+        <w:tc>
+          <w:tcPr>
+            <w:tcW w:type="dxa" w:w="700"/>
+            <w:shd w:val="clear" w:color="auto" w:fill="c6d9f1"/>
+          </w:tcPr>
+          <w:p>
+            <w:pPr>
+              <w:spacing w:after="0"/>
+            </w:pPr>
+            <w:r>
+              <w:rPr>
+                <w:b/>
+                <w:sz w:val="17"/>
+              </w:rPr>
+              <w:t>Paso</w:t>
+            </w:r>
+          </w:p>
+        </w:tc>
+        <w:tc>
+          <w:tcPr>
+            <w:tcW w:type="dxa" w:w="2100"/>
+            <w:shd w:val="clear" w:color="auto" w:fill="c6d9f1"/>
+          </w:tcPr>
+          <w:p>
+            <w:pPr>
+              <w:spacing w:after="0"/>
+            </w:pPr>
+            <w:r>
+              <w:rPr>
+                <w:b/>
+                <w:sz w:val="17"/>
+              </w:rPr>
+              <w:t>Origen → Destino</w:t>
+            </w:r>
+          </w:p>
+        </w:tc>
+        <w:tc>
+          <w:tcPr>
+            <w:tcW w:type="dxa" w:w="6200"/>
+            <w:shd w:val="clear" w:color="auto" w:fill="c6d9f1"/>
+          </w:tcPr>
+          <w:p>
+            <w:pPr>
+              <w:spacing w:after="0"/>
+            </w:pPr>
+            <w:r>
+              <w:rPr>
+                <w:b/>
+                <w:sz w:val="17"/>
+              </w:rPr>
+              <w:t>Interacción</w:t>
+            </w:r>
+          </w:p>
+        </w:tc>
+      </w:tr>
+      <w:tr>
+        <w:tc>
+          <w:tcPr>
+            <w:tcW w:type="dxa" w:w="700"/>
+          </w:tcPr>
+          <w:p>
+            <w:pPr>
+              <w:spacing w:after="0"/>
+            </w:pPr>
+            <w:r>
+              <w:rPr>
+                <w:sz w:val="17"/>
+              </w:rPr>
+              <w:t>1</w:t>
+            </w:r>
+          </w:p>
+        </w:tc>
+        <w:tc>
+          <w:tcPr>
+            <w:tcW w:type="dxa" w:w="2100"/>
+          </w:tcPr>
+          <w:p>
+            <w:pPr>
+              <w:spacing w:after="0"/>
+            </w:pPr>
+            <w:r>
+              <w:rPr>
+                <w:sz w:val="17"/>
+              </w:rPr>
+              <w:t>Profesional → Frontend</w:t>
+            </w:r>
+          </w:p>
+        </w:tc>
+        <w:tc>
+          <w:tcPr>
+            <w:tcW w:type="dxa" w:w="6200"/>
+          </w:tcPr>
+          <w:p>
+            <w:pPr>
+              <w:spacing w:after="0"/>
+            </w:pPr>
+            <w:r>
+              <w:rPr>
+                <w:sz w:val="17"/>
+              </w:rPr>
+              <w:t>Después de crear su cuenta elige "Continuar como profesional" en /elegir-perfil; el frontend envía PUT /api/perfil/tipo-cuenta y guarda el token nuevo con el rol profesional (D25).</w:t>
+            </w:r>
+          </w:p>
+        </w:tc>
+      </w:tr>
+      <w:tr>
+        <w:tc>
+          <w:tcPr>
+            <w:tcW w:type="dxa" w:w="700"/>
+          </w:tcPr>
+          <w:p>
+            <w:pPr>
+              <w:spacing w:after="0"/>
+            </w:pPr>
+            <w:r>
+              <w:rPr>
+                <w:sz w:val="17"/>
+              </w:rPr>
+              <w:t>2</w:t>
+            </w:r>
+          </w:p>
+        </w:tc>
+        <w:tc>
+          <w:tcPr>
+            <w:tcW w:type="dxa" w:w="2100"/>
+          </w:tcPr>
+          <w:p>
+            <w:pPr>
+              <w:spacing w:after="0"/>
+            </w:pPr>
+            <w:r>
+              <w:rPr>
+                <w:sz w:val="17"/>
+              </w:rPr>
+              <w:t>Frontend</w:t>
+            </w:r>
+          </w:p>
+        </w:tc>
+        <w:tc>
+          <w:tcPr>
+            <w:tcW w:type="dxa" w:w="6200"/>
+          </w:tcPr>
+          <w:p>
+            <w:pPr>
+              <w:spacing w:after="0"/>
+            </w:pPr>
+            <w:r>
+              <w:rPr>
+                <w:sz w:val="17"/>
+              </w:rPr>
+              <w:t>Abre /profesional/inicio con el aviso "¡Listo!": el profesional no pasa por el asistente del usuario. Su menú propio tiene Inicio, Agenda, Clientes, Perfil profesional, Mensajes, Reportes y Configuración; las secciones aún no construidas se muestran como "Próximamente".</w:t>
+            </w:r>
+          </w:p>
+        </w:tc>
+      </w:tr>
+      <w:tr>
+        <w:tc>
+          <w:tcPr>
+            <w:tcW w:type="dxa" w:w="700"/>
+          </w:tcPr>
+          <w:p>
+            <w:pPr>
+              <w:spacing w:after="0"/>
+            </w:pPr>
+            <w:r>
+              <w:rPr>
+                <w:sz w:val="17"/>
+              </w:rPr>
+              <w:t>3</w:t>
+            </w:r>
+          </w:p>
+        </w:tc>
+        <w:tc>
+          <w:tcPr>
+            <w:tcW w:type="dxa" w:w="2100"/>
+          </w:tcPr>
+          <w:p>
+            <w:pPr>
+              <w:spacing w:after="0"/>
+            </w:pPr>
+            <w:r>
+              <w:rPr>
+                <w:sz w:val="17"/>
+              </w:rPr>
+              <w:t>Frontend → Backend</w:t>
+            </w:r>
+          </w:p>
+        </w:tc>
+        <w:tc>
+          <w:tcPr>
+            <w:tcW w:type="dxa" w:w="6200"/>
+          </w:tcPr>
+          <w:p>
+            <w:pPr>
+              <w:spacing w:after="0"/>
+            </w:pPr>
+            <w:r>
+              <w:rPr>
+                <w:sz w:val="17"/>
+              </w:rPr>
+              <w:t>GET /api/profesionales/mi-ficha (null si aún no la completa: entonces la primera tarea pendiente es completarla) y GET /api/clima (solo rol profesional).</w:t>
+            </w:r>
+          </w:p>
+        </w:tc>
+      </w:tr>
+      <w:tr>
+        <w:tc>
+          <w:tcPr>
+            <w:tcW w:type="dxa" w:w="700"/>
+          </w:tcPr>
+          <w:p>
+            <w:pPr>
+              <w:spacing w:after="0"/>
+            </w:pPr>
+            <w:r>
+              <w:rPr>
+                <w:sz w:val="17"/>
+              </w:rPr>
+              <w:t>4</w:t>
+            </w:r>
+          </w:p>
+        </w:tc>
+        <w:tc>
+          <w:tcPr>
+            <w:tcW w:type="dxa" w:w="2100"/>
+          </w:tcPr>
+          <w:p>
+            <w:pPr>
+              <w:spacing w:after="0"/>
+            </w:pPr>
+            <w:r>
+              <w:rPr>
+                <w:sz w:val="17"/>
+              </w:rPr>
+              <w:t>Backend → Open-Meteo</w:t>
+            </w:r>
+          </w:p>
+        </w:tc>
+        <w:tc>
+          <w:tcPr>
+            <w:tcW w:type="dxa" w:w="6200"/>
+          </w:tcPr>
+          <w:p>
+            <w:pPr>
+              <w:spacing w:after="0"/>
+            </w:pPr>
+            <w:r>
+              <w:rPr>
+                <w:sz w:val="17"/>
+              </w:rPr>
+              <w:t>Consulta el clima actual con la ubicación de la ficha redondeada a 2 decimales (o el centro de Santiago si no hay ficha), con espera máxima de 4 segundos y caché en memoria de 30 minutos por ubicación. Si falla responde 503 y el Inicio se muestra sin la tarjeta del clima (D26, QS2).</w:t>
+            </w:r>
+          </w:p>
+        </w:tc>
+      </w:tr>
+      <w:tr>
+        <w:tc>
+          <w:tcPr>
+            <w:tcW w:type="dxa" w:w="700"/>
+          </w:tcPr>
+          <w:p>
+            <w:pPr>
+              <w:spacing w:after="0"/>
+            </w:pPr>
+            <w:r>
+              <w:rPr>
+                <w:sz w:val="17"/>
+              </w:rPr>
+              <w:t>5</w:t>
+            </w:r>
+          </w:p>
+        </w:tc>
+        <w:tc>
+          <w:tcPr>
+            <w:tcW w:type="dxa" w:w="2100"/>
+          </w:tcPr>
+          <w:p>
+            <w:pPr>
+              <w:spacing w:after="0"/>
+            </w:pPr>
+            <w:r>
+              <w:rPr>
+                <w:sz w:val="17"/>
+              </w:rPr>
+              <w:t>Profesional → Backend</w:t>
+            </w:r>
+          </w:p>
+        </w:tc>
+        <w:tc>
+          <w:tcPr>
+            <w:tcW w:type="dxa" w:w="6200"/>
+          </w:tcPr>
+          <w:p>
+            <w:pPr>
+              <w:spacing w:after="0"/>
+            </w:pPr>
+            <w:r>
+              <w:rPr>
+                <w:sz w:val="17"/>
+              </w:rPr>
+              <w:t>En /profesional/perfil completa o edita su ficha: PUT /api/profesionales/mi-ficha con especialidad (del catálogo), descripción opcional, comuna, modalidad y ubicación; el backend valida los datos y crea o actualiza la fila de profesionales (D27).</w:t>
+            </w:r>
+          </w:p>
+        </w:tc>
+      </w:tr>
+      <w:tr>
+        <w:tc>
+          <w:tcPr>
+            <w:tcW w:type="dxa" w:w="700"/>
+          </w:tcPr>
+          <w:p>
+            <w:pPr>
+              <w:spacing w:after="0"/>
+            </w:pPr>
+            <w:r>
+              <w:rPr>
+                <w:sz w:val="17"/>
+              </w:rPr>
+              <w:t>6</w:t>
+            </w:r>
+          </w:p>
+        </w:tc>
+        <w:tc>
+          <w:tcPr>
+            <w:tcW w:type="dxa" w:w="2100"/>
+          </w:tcPr>
+          <w:p>
+            <w:pPr>
+              <w:spacing w:after="0"/>
+            </w:pPr>
+            <w:r>
+              <w:rPr>
+                <w:sz w:val="17"/>
+              </w:rPr>
+              <w:t>Profesional → Backend</w:t>
+            </w:r>
+          </w:p>
+        </w:tc>
+        <w:tc>
+          <w:tcPr>
+            <w:tcW w:type="dxa" w:w="6200"/>
+          </w:tcPr>
+          <w:p>
+            <w:pPr>
+              <w:spacing w:after="0"/>
+            </w:pPr>
+            <w:r>
+              <w:rPr>
+                <w:sz w:val="17"/>
+              </w:rPr>
+              <w:t>"Ver mi perfil público" abre /profesional/perfil/publico, que muestra su ficha con GET /api/profesionales/:id tal como la ven los usuarios, sin favoritos ni opción de calificar.</w:t>
+            </w:r>
+          </w:p>
+        </w:tc>
+      </w:tr>
+      <w:tr>
+        <w:tc>
+          <w:tcPr>
+            <w:tcW w:type="dxa" w:w="700"/>
+          </w:tcPr>
+          <w:p>
+            <w:pPr>
+              <w:spacing w:after="0"/>
+            </w:pPr>
+            <w:r>
+              <w:rPr>
+                <w:sz w:val="17"/>
+              </w:rPr>
+              <w:t>7</w:t>
+            </w:r>
+          </w:p>
+        </w:tc>
+        <w:tc>
+          <w:tcPr>
+            <w:tcW w:type="dxa" w:w="2100"/>
+          </w:tcPr>
+          <w:p>
+            <w:pPr>
+              <w:spacing w:after="0"/>
+            </w:pPr>
+            <w:r>
+              <w:rPr>
+                <w:sz w:val="17"/>
+              </w:rPr>
+              <w:t>Frontend / Backend</w:t>
+            </w:r>
+          </w:p>
+        </w:tc>
+        <w:tc>
+          <w:tcPr>
+            <w:tcW w:type="dxa" w:w="6200"/>
+          </w:tcPr>
+          <w:p>
+            <w:pPr>
+              <w:spacing w:after="0"/>
+            </w:pPr>
+            <w:r>
+              <w:rPr>
+                <w:sz w:val="17"/>
+              </w:rPr>
+              <w:t>Separación por rol: si el profesional abre una ruta del usuario, el frontend lo lleva a su Inicio; la API responde 403 a sus peticiones al asistente del usuario (datos personales, objetivos y salud), al buscador y a los favoritos, y también a un usuario que pida /api/clima o /api/profesionales/mi-ficha (QS3).</w:t>
+            </w:r>
+          </w:p>
+        </w:tc>
+      </w:tr>
+    </w:tbl>
+    <w:p/>
+    <w:p>
+      <w:pPr>
         <w:pStyle w:val="EstiloTtulo1VerdanaJustificado"/>
         <w:numPr>
           <w:ilvl w:val="0"/>
@@ -22495,7 +22969,7 @@
               <w:rPr>
                 <w:sz w:val="17"/>
               </w:rPr>
-              <w:t>Pantallas de la aplicación (portada pública, registro, inicio de sesión, Inicio con sesión, perfil, profesionales y su ficha, favoritos y secciones próximas; más adelante, chat y alimentación).</w:t>
+              <w:t>Pantallas de la aplicación: portada pública, registro, inicio de sesión, "Elegir perfil", espacio del usuario (Inicio, perfil, profesionales y su ficha, favoritos y secciones próximas) y espacio del profesional (pages/profesional: Inicio, perfil profesional y vista previa de su ficha pública); más adelante, chat y alimentación.</w:t>
             </w:r>
           </w:p>
         </w:tc>
@@ -22546,7 +23020,7 @@
               <w:rPr>
                 <w:sz w:val="17"/>
               </w:rPr>
-              <w:t>Componentes de interfaz reutilizables (formularios, diseño común con encabezado, menú lateral y barra inferior, tarjetas de profesional, filtros, reseñas y, más adelante, el mapa).</w:t>
+              <w:t>Componentes de interfaz reutilizables (formularios, diseño común con encabezado, menú lateral y barra inferior según el rol, formulario de la ficha profesional, tarjetas de profesional, filtros, reseñas y, más adelante, el mapa).</w:t>
             </w:r>
           </w:p>
         </w:tc>
@@ -22597,7 +23071,7 @@
               <w:rPr>
                 <w:sz w:val="17"/>
               </w:rPr>
-              <w:t>Cliente HTTP de la API REST, manejo del token de sesión, ubicación del navegador (solo en memoria) y formatos en español de Chile.</w:t>
+              <w:t>Cliente HTTP de la API REST, manejo del token de sesión, ubicación del navegador (solo en memoria) formatos en español de Chile y navegación según el rol (Inicio de cada rol y destino tras iniciar sesión).</w:t>
             </w:r>
           </w:p>
         </w:tc>
@@ -22648,7 +23122,7 @@
               <w:rPr>
                 <w:sz w:val="17"/>
               </w:rPr>
-              <w:t>Estado global de la sesión del usuario (inicio, cierre y expiración).</w:t>
+              <w:t>Estado global de la sesión del usuario (inicio, cierre, expiración y rol elegido).</w:t>
             </w:r>
           </w:p>
         </w:tc>
@@ -22903,7 +23377,7 @@
               <w:rPr>
                 <w:sz w:val="17"/>
               </w:rPr>
-              <w:t>Lógica de negocio (autenticación, perfil, estimación nutricional, directorio, favoritos y reseñas) e integración con la API de Claude y Google Maps Platform.</w:t>
+              <w:t>Lógica de negocio (autenticación, perfil, estimación nutricional, directorio, ficha propia del profesional, favoritos, reseñas y clima) e integración con la API de Claude, Google Maps Platform y Open-Meteo.</w:t>
             </w:r>
           </w:p>
         </w:tc>
@@ -23056,7 +23530,7 @@
               <w:rPr>
                 <w:sz w:val="17"/>
               </w:rPr>
-              <w:t>Reglas y catálogos comunes a frontend y backend (reglas.json): roles, límites de campos, niveles de actividad física, modalidades, distancias, órdenes del buscador y límites de las reseñas.</w:t>
+              <w:t>Reglas y catálogos comunes a frontend y backend (reglas.json): roles, límites de campos, niveles de actividad física, especialidades y modalidades de los profesionales, distancias, órdenes del buscador y límites de las reseñas.</w:t>
             </w:r>
           </w:p>
         </w:tc>
@@ -23105,7 +23579,7 @@
         <w:rPr>
           <w:i w:val="0"/>
         </w:rPr>
-        <w:t>La solución se despliega en un único host con Docker que ejecuta tres contenedores orquestados con docker-compose. El backend es el único contenedor que se conecta a la base de datos y a los servicios externos, salvo Google Maps JavaScript y Google Identity Services, que se cargan directamente en el navegador. El diagrama de despliegue UML muestra los nodos («device» y «executionEnvironment»), los artefactos desplegados en cada contenedor y las rutas de comunicación con su protocolo.</w:t>
+        <w:t>La solución se despliega en un único host con Docker que ejecuta tres contenedores orquestados con docker-compose. El backend es el único contenedor que se conecta a la base de datos y a los servicios externos (incluido Open-Meteo, para el clima), salvo Google Maps JavaScript y Google Identity Services, que se cargan directamente en el navegador. El diagrama de despliegue UML muestra los nodos («device» y «executionEnvironment»), los artefactos desplegados en cada contenedor y las rutas de comunicación con su protocolo.</w:t>
       </w:r>
     </w:p>
     <w:p>
@@ -23115,7 +23589,7 @@
       <w:r>
         <w:drawing>
           <wp:inline xmlns:a="http://schemas.openxmlformats.org/drawingml/2006/main" xmlns:pic="http://schemas.openxmlformats.org/drawingml/2006/picture">
-            <wp:extent cx="5760000" cy="3653831"/>
+            <wp:extent cx="5760000" cy="4206139"/>
             <wp:docPr id="8" name="Picture 8"/>
             <wp:cNvGraphicFramePr>
               <a:graphicFrameLocks noChangeAspect="1"/>
@@ -23136,7 +23610,7 @@
                   <pic:spPr>
                     <a:xfrm>
                       <a:off x="0" y="0"/>
-                      <a:ext cx="5760000" cy="3653831"/>
+                      <a:ext cx="5760000" cy="4206139"/>
                     </a:xfrm>
                     <a:prstGeom prst="rect"/>
                   </pic:spPr>
@@ -23161,7 +23635,7 @@
         <w:rPr>
           <w:i w:val="0"/>
         </w:rPr>
-        <w:t>Ilustración 10: Vista física: diagrama de despliegue UML</w:t>
+        <w:t>Ilustración 10: Vista física: diagrama de despliegue UML (actualizado al 08-10-2026, Sprint 3)</w:t>
       </w:r>
     </w:p>
     <w:p>
@@ -23811,6 +24285,73 @@
           </w:p>
         </w:tc>
       </w:tr>
+      <w:tr>
+        <w:tc>
+          <w:tcPr>
+            <w:tcW w:type="dxa" w:w="2000"/>
+          </w:tcPr>
+          <w:p>
+            <w:pPr>
+              <w:spacing w:after="0"/>
+            </w:pPr>
+            <w:r>
+              <w:rPr>
+                <w:b/>
+                <w:sz w:val="17"/>
+              </w:rPr>
+              <w:t>Open-Meteo</w:t>
+            </w:r>
+          </w:p>
+        </w:tc>
+        <w:tc>
+          <w:tcPr>
+            <w:tcW w:type="dxa" w:w="2000"/>
+          </w:tcPr>
+          <w:p>
+            <w:pPr>
+              <w:spacing w:after="0"/>
+            </w:pPr>
+            <w:r>
+              <w:rPr>
+                <w:sz w:val="17"/>
+              </w:rPr>
+              <w:t>Servicio externo (gratuito, sin clave)</w:t>
+            </w:r>
+          </w:p>
+        </w:tc>
+        <w:tc>
+          <w:tcPr>
+            <w:tcW w:type="dxa" w:w="3500"/>
+          </w:tcPr>
+          <w:p>
+            <w:pPr>
+              <w:spacing w:after="0"/>
+            </w:pPr>
+            <w:r>
+              <w:rPr>
+                <w:sz w:val="17"/>
+              </w:rPr>
+              <w:t>Clima actual del Inicio del profesional (D26).</w:t>
+            </w:r>
+          </w:p>
+        </w:tc>
+        <w:tc>
+          <w:tcPr>
+            <w:tcW w:type="dxa" w:w="1500"/>
+          </w:tcPr>
+          <w:p>
+            <w:pPr>
+              <w:spacing w:after="0"/>
+            </w:pPr>
+            <w:r>
+              <w:rPr>
+                <w:sz w:val="17"/>
+              </w:rPr>
+              <w:t>443</w:t>
+            </w:r>
+          </w:p>
+        </w:tc>
+      </w:tr>
     </w:tbl>
     <w:p/>
     <w:p>
@@ -24580,6 +25121,72 @@
                 <w:sz w:val="17"/>
               </w:rPr>
               <w:t>Correo de recuperación; usuario y contraseña de aplicación solo en variables de entorno del backend.</w:t>
+            </w:r>
+          </w:p>
+        </w:tc>
+      </w:tr>
+      <w:tr>
+        <w:tc>
+          <w:tcPr>
+            <w:tcW w:type="dxa" w:w="1700"/>
+          </w:tcPr>
+          <w:p>
+            <w:pPr>
+              <w:spacing w:after="0"/>
+            </w:pPr>
+            <w:r>
+              <w:rPr>
+                <w:sz w:val="17"/>
+              </w:rPr>
+              <w:t>Backend</w:t>
+            </w:r>
+          </w:p>
+        </w:tc>
+        <w:tc>
+          <w:tcPr>
+            <w:tcW w:type="dxa" w:w="2500"/>
+          </w:tcPr>
+          <w:p>
+            <w:pPr>
+              <w:spacing w:after="0"/>
+            </w:pPr>
+            <w:r>
+              <w:rPr>
+                <w:sz w:val="17"/>
+              </w:rPr>
+              <w:t>Open-Meteo</w:t>
+            </w:r>
+          </w:p>
+        </w:tc>
+        <w:tc>
+          <w:tcPr>
+            <w:tcW w:type="dxa" w:w="2100"/>
+          </w:tcPr>
+          <w:p>
+            <w:pPr>
+              <w:spacing w:after="0"/>
+            </w:pPr>
+            <w:r>
+              <w:rPr>
+                <w:sz w:val="17"/>
+              </w:rPr>
+              <w:t>HTTPS, REST</w:t>
+            </w:r>
+          </w:p>
+        </w:tc>
+        <w:tc>
+          <w:tcPr>
+            <w:tcW w:type="dxa" w:w="2700"/>
+          </w:tcPr>
+          <w:p>
+            <w:pPr>
+              <w:spacing w:after="0"/>
+            </w:pPr>
+            <w:r>
+              <w:rPr>
+                <w:sz w:val="17"/>
+              </w:rPr>
+              <w:t>JSON sin clave; solo viaja la ubicación aproximada (2 decimales); respuesta en caché 30 minutos y espera máxima de 4 segundos.</w:t>
             </w:r>
           </w:p>
         </w:tc>
@@ -24779,7 +25386,7 @@
                 <w:b/>
                 <w:sz w:val="17"/>
               </w:rPr>
-              <w:t>CU-01 Registro, sesión, recuperación e Inicio</w:t>
+              <w:t>CU-01 Registro, elección del perfil, sesión, recuperación e Inicio</w:t>
             </w:r>
           </w:p>
         </w:tc>
@@ -25044,7 +25651,7 @@
               <w:rPr>
                 <w:sz w:val="17"/>
               </w:rPr>
-              <w:t>profesionales, establecimientos</w:t>
+              <w:t>profesionales, establecimientos, usuarios</w:t>
             </w:r>
           </w:p>
         </w:tc>
@@ -25060,7 +25667,7 @@
               <w:rPr>
                 <w:sz w:val="17"/>
               </w:rPr>
-              <w:t>profesionales</w:t>
+              <w:t>profesionales, clima</w:t>
             </w:r>
           </w:p>
         </w:tc>
@@ -25076,7 +25683,7 @@
               <w:rPr>
                 <w:sz w:val="17"/>
               </w:rPr>
-              <w:t>Navegador, Frontend, Backend, MySQL</w:t>
+              <w:t>Navegador, Frontend, Backend, MySQL + Open-Meteo (clima)</w:t>
             </w:r>
           </w:p>
         </w:tc>
@@ -25092,7 +25699,7 @@
               <w:rPr>
                 <w:sz w:val="17"/>
               </w:rPr>
-              <w:t>2</w:t>
+              <w:t>2 y 3</w:t>
             </w:r>
           </w:p>
         </w:tc>
@@ -26866,7 +27473,7 @@
               <w:rPr>
                 <w:sz w:val="17"/>
               </w:rPr>
-              <w:t>Asistente de perfil de 5 pasos que guarda cada paso por separado</w:t>
+              <w:t>Asistente de perfil del usuario que guarda cada paso por separado (5 pasos hasta el 07-10-2026; 4 pasos desde el 08-10-2026, cuando el tipo de cuenta pasó a "Elegir perfil", D25)</w:t>
             </w:r>
           </w:p>
         </w:tc>
@@ -26998,7 +27605,7 @@
               <w:rPr>
                 <w:sz w:val="17"/>
               </w:rPr>
-              <w:t>El tipo de cuenta (rol) se elige en el primer paso del asistente de perfil y no en el registro; la columna rol_confirmado distingue el rol provisional del confirmado</w:t>
+              <w:t>Reemplazada por D25 desde el 08-10-2026. El tipo de cuenta (rol) se elige en el primer paso del asistente de perfil y no en el registro; la columna rol_confirmado distingue el rol provisional del confirmado</w:t>
             </w:r>
           </w:p>
         </w:tc>
@@ -27096,7 +27703,7 @@
               <w:rPr>
                 <w:sz w:val="17"/>
               </w:rPr>
-              <w:t>Sigue el mockup aprobado por el Product Owner y deja todas las secciones a un toque desde cualquier pantalla; la barra inferior es el patrón habitual en celular. Volver a la ruta pedida permite que una búsqueda compartida, cuyos filtros viajan en la dirección, funcione aunque se abra sin sesión. Las secciones aún no construidas se muestran como "Próximamente" en vez de simular datos. El encabezado no repite el acceso a Profesionales porque el menú lateral, la barra inferior y los accesos rápidos del Inicio ya llevan a Profesionales.</w:t>
+              <w:t>Sigue el mockup aprobado por el Product Owner y deja todas las secciones a un toque desde cualquier pantalla; la barra inferior es el patrón habitual en celular. Volver a la ruta pedida permite que una búsqueda compartida, cuyos filtros viajan en la dirección, funcione aunque se abra sin sesión. Las secciones aún no construidas se muestran como "Próximamente" en vez de simular datos. El encabezado no repite el acceso a Profesionales porque el menú lateral, la barra inferior y los accesos rápidos del Inicio ya llevan a Profesionales. Desde el 08-10-2026 el menú del usuario ya no incluye Farmacias (fuera del alcance) ni Historial de chats (vivirá dentro del asistente IA) y suma Comidas como "Próximamente" (decisión del Product Owner del 05-10-2026); el profesional tiene su propio menú (D25).</w:t>
             </w:r>
           </w:p>
         </w:tc>
@@ -27229,6 +27836,204 @@
                 <w:sz w:val="17"/>
               </w:rPr>
               <w:t>Evita que una misma persona infle o hunda una calificación y mantiene un único dato fuente, sin columnas que desincronizar. Exigir una reserva confirmada se incorporará con FS-HU-14; mientras tanto, la restricción por rol evita que los profesionales se califiquen entre sí. Del autor solo se muestra el nombre y la inicial del apellido.</w:t>
+            </w:r>
+          </w:p>
+        </w:tc>
+      </w:tr>
+      <w:tr>
+        <w:tc>
+          <w:tcPr>
+            <w:tcW w:type="dxa" w:w="600"/>
+          </w:tcPr>
+          <w:p>
+            <w:pPr>
+              <w:spacing w:after="0"/>
+            </w:pPr>
+            <w:r>
+              <w:rPr>
+                <w:sz w:val="17"/>
+              </w:rPr>
+              <w:t>D25</w:t>
+            </w:r>
+          </w:p>
+        </w:tc>
+        <w:tc>
+          <w:tcPr>
+            <w:tcW w:type="dxa" w:w="2400"/>
+          </w:tcPr>
+          <w:p>
+            <w:pPr>
+              <w:spacing w:after="0"/>
+            </w:pPr>
+            <w:r>
+              <w:rPr>
+                <w:sz w:val="17"/>
+              </w:rPr>
+              <w:t>El perfil (usuario o profesional) se elige una sola vez en una pantalla propia, "Elegir perfil" (/elegir-perfil), después de crear la cuenta y fuera del asistente de perfil. El usuario sigue con su asistente de 4 pasos y el profesional entra directo a su propio espacio (/profesional/...) con su menú e Inicio. Cada rol solo accede a sus pantallas y endpoints, y cambiar el rol queda en manos del administrador (CU-07). Reemplaza a D21</w:t>
+            </w:r>
+          </w:p>
+        </w:tc>
+        <w:tc>
+          <w:tcPr>
+            <w:tcW w:type="dxa" w:w="2400"/>
+          </w:tcPr>
+          <w:p>
+            <w:pPr>
+              <w:spacing w:after="0"/>
+            </w:pPr>
+            <w:r>
+              <w:rPr>
+                <w:sz w:val="17"/>
+              </w:rPr>
+              <w:t>Mantener el tipo de cuenta como paso 1 del asistente (D21); un mismo menú para ambos roles con secciones ocultas; permitir cambiar el rol desde la cuenta</w:t>
+            </w:r>
+          </w:p>
+        </w:tc>
+        <w:tc>
+          <w:tcPr>
+            <w:tcW w:type="dxa" w:w="3600"/>
+          </w:tcPr>
+          <w:p>
+            <w:pPr>
+              <w:spacing w:after="0"/>
+            </w:pPr>
+            <w:r>
+              <w:rPr>
+                <w:sz w:val="17"/>
+              </w:rPr>
+              <w:t>Decisión del Product Owner del 08-10-2026, con mockup. El asistente pregunta datos de salud y nutrición que no le sirven al profesional, y ver "pasos pendientes" en una cuenta profesional confundía. Separar los espacios sigue el mockup y simplifica la autorización: el frontend redirige y el backend responde 403 (QS3). Elegir una sola vez evita cuentas que cambian de rol con datos inconsistentes (fichas o datos de salud huérfanos). Se conserva lo bueno de D21: el registro y Google siguen sin pedir el rol y la elección es explícita (sin opción marcada). La confirmación es atómica (solo cambia si rol_confirmado está en false) y responde 409 si ya se eligió.</w:t>
+            </w:r>
+          </w:p>
+        </w:tc>
+      </w:tr>
+      <w:tr>
+        <w:tc>
+          <w:tcPr>
+            <w:tcW w:type="dxa" w:w="600"/>
+          </w:tcPr>
+          <w:p>
+            <w:pPr>
+              <w:spacing w:after="0"/>
+            </w:pPr>
+            <w:r>
+              <w:rPr>
+                <w:sz w:val="17"/>
+              </w:rPr>
+              <w:t>D26</w:t>
+            </w:r>
+          </w:p>
+        </w:tc>
+        <w:tc>
+          <w:tcPr>
+            <w:tcW w:type="dxa" w:w="2400"/>
+          </w:tcPr>
+          <w:p>
+            <w:pPr>
+              <w:spacing w:after="0"/>
+            </w:pPr>
+            <w:r>
+              <w:rPr>
+                <w:sz w:val="17"/>
+              </w:rPr>
+              <w:t>Clima del Inicio del profesional desde Open-Meteo, consultado por el backend (GET /api/clima, solo rol profesional) con la ubicación de la ficha redondeada a 2 decimales (o el centro de Santiago si no hay ficha), caché en memoria de 30 minutos y espera máxima de 4 segundos; si falla, el Inicio se muestra sin la tarjeta</w:t>
+            </w:r>
+          </w:p>
+        </w:tc>
+        <w:tc>
+          <w:tcPr>
+            <w:tcW w:type="dxa" w:w="2400"/>
+          </w:tcPr>
+          <w:p>
+            <w:pPr>
+              <w:spacing w:after="0"/>
+            </w:pPr>
+            <w:r>
+              <w:rPr>
+                <w:sz w:val="17"/>
+              </w:rPr>
+              <w:t>OpenWeatherMap u otro servicio con clave; consultar el clima desde el navegador; no mostrar el clima</w:t>
+            </w:r>
+          </w:p>
+        </w:tc>
+        <w:tc>
+          <w:tcPr>
+            <w:tcW w:type="dxa" w:w="3600"/>
+          </w:tcPr>
+          <w:p>
+            <w:pPr>
+              <w:spacing w:after="0"/>
+            </w:pPr>
+            <w:r>
+              <w:rPr>
+                <w:sz w:val="17"/>
+              </w:rPr>
+              <w:t>Lo pidió el Product Owner para dar vida al Inicio del profesional. Open-Meteo es gratuito y no requiere cuenta ni clave (no hay secreto que guardar); sus datos se usan con atribución (licencia CC BY 4.0), que la tarjeta muestra. Consultar desde el backend evita enviar la ubicación exacta a un tercero desde cada navegador, permite la caché y cumple QS2: una falla externa no afecta el resto del Inicio.</w:t>
+            </w:r>
+          </w:p>
+        </w:tc>
+      </w:tr>
+      <w:tr>
+        <w:tc>
+          <w:tcPr>
+            <w:tcW w:type="dxa" w:w="600"/>
+          </w:tcPr>
+          <w:p>
+            <w:pPr>
+              <w:spacing w:after="0"/>
+            </w:pPr>
+            <w:r>
+              <w:rPr>
+                <w:sz w:val="17"/>
+              </w:rPr>
+              <w:t>D27</w:t>
+            </w:r>
+          </w:p>
+        </w:tc>
+        <w:tc>
+          <w:tcPr>
+            <w:tcW w:type="dxa" w:w="2400"/>
+          </w:tcPr>
+          <w:p>
+            <w:pPr>
+              <w:spacing w:after="0"/>
+            </w:pPr>
+            <w:r>
+              <w:rPr>
+                <w:sz w:val="17"/>
+              </w:rPr>
+              <w:t>Ficha propia del profesional con GET y PUT /api/profesionales/mi-ficha: la fila de profesionales se crea con la primera ficha (crear o actualizar, upsert) y exige especialidad del catálogo de shared/reglas.json, comuna, modalidad y ubicación</w:t>
+            </w:r>
+          </w:p>
+        </w:tc>
+        <w:tc>
+          <w:tcPr>
+            <w:tcW w:type="dxa" w:w="2400"/>
+          </w:tcPr>
+          <w:p>
+            <w:pPr>
+              <w:spacing w:after="0"/>
+            </w:pPr>
+            <w:r>
+              <w:rPr>
+                <w:sz w:val="17"/>
+              </w:rPr>
+              <w:t>Crear la fila vacía al elegir el rol; especialidad como texto libre; solo actualizar una fila existente</w:t>
+            </w:r>
+          </w:p>
+        </w:tc>
+        <w:tc>
+          <w:tcPr>
+            <w:tcW w:type="dxa" w:w="3600"/>
+          </w:tcPr>
+          <w:p>
+            <w:pPr>
+              <w:spacing w:after="0"/>
+            </w:pPr>
+            <w:r>
+              <w:rPr>
+                <w:sz w:val="17"/>
+              </w:rPr>
+              <w:t>El buscador nunca muestra fichas a medio llenar: un profesional aparece solo cuando completa los datos obligatorios. El catálogo evita variantes de una misma especialidad que romperían el filtro del buscador (FS-HU-22) y coincide con los perfiles de demostración. Solo actualizar una fila existente impedía a los profesionales nuevos guardar su ficha (defecto 16).</w:t>
             </w:r>
           </w:p>
         </w:tc>
@@ -27823,6 +28628,57 @@
                 <w:b/>
                 <w:sz w:val="17"/>
               </w:rPr>
+              <w:t>Open-Meteo</w:t>
+            </w:r>
+          </w:p>
+        </w:tc>
+        <w:tc>
+          <w:tcPr>
+            <w:tcW w:type="dxa" w:w="2200"/>
+          </w:tcPr>
+          <w:p>
+            <w:pPr>
+              <w:spacing w:after="0"/>
+            </w:pPr>
+            <w:r>
+              <w:rPr>
+                <w:sz w:val="17"/>
+              </w:rPr>
+              <w:t>Reutilizado (servicio externo)</w:t>
+            </w:r>
+          </w:p>
+        </w:tc>
+        <w:tc>
+          <w:tcPr>
+            <w:tcW w:type="dxa" w:w="3800"/>
+          </w:tcPr>
+          <w:p>
+            <w:pPr>
+              <w:spacing w:after="0"/>
+            </w:pPr>
+            <w:r>
+              <w:rPr>
+                <w:sz w:val="17"/>
+              </w:rPr>
+              <w:t>Clima actual del Inicio del profesional (D26); datos con licencia CC BY 4.0, con la atribución en la tarjeta.</w:t>
+            </w:r>
+          </w:p>
+        </w:tc>
+      </w:tr>
+      <w:tr>
+        <w:tc>
+          <w:tcPr>
+            <w:tcW w:type="dxa" w:w="3000"/>
+          </w:tcPr>
+          <w:p>
+            <w:pPr>
+              <w:spacing w:after="0"/>
+            </w:pPr>
+            <w:r>
+              <w:rPr>
+                <w:b/>
+                <w:sz w:val="17"/>
+              </w:rPr>
               <w:t>Jest, Supertest, Vitest, Testing Library</w:t>
             </w:r>
           </w:p>
@@ -27957,7 +28813,7 @@
               <w:rPr>
                 <w:sz w:val="17"/>
               </w:rPr>
-              <w:t>Registro con rol, login, logout, "Recordarme", acceso con Google, recuperación de contraseña por correo y middlewares de JWT y rol.</w:t>
+              <w:t>Registro, elección única del perfil, login, logout, "Recordarme", acceso con Google, recuperación de contraseña por correo y middlewares de JWT y rol.</w:t>
             </w:r>
           </w:p>
         </w:tc>

</xml_diff>

<commit_message>
Corrige FS-HU-12 y documenta avance pendiente de aceptación
</commit_message>
<xml_diff>
--- a/FASE 2/Evidencias Proyecto/Evidencias de documentación/Documento de Arquitectura (DAS)/Documento_Arquitectura_Sistema_DAS_.docx
+++ b/FASE 2/Evidencias Proyecto/Evidencias de documentación/Documento de Arquitectura (DAS)/Documento_Arquitectura_Sistema_DAS_.docx
@@ -237,7 +237,7 @@
           <w:szCs w:val="36"/>
           <w:lang w:val="es-CL"/>
         </w:rPr>
-        <w:t>Versión 1.15</w:t>
+        <w:t>Versión 1.16</w:t>
       </w:r>
     </w:p>
     <w:p>
@@ -560,14 +560,8 @@
             <w:tcW w:w="6115" w:type="dxa"/>
           </w:tcPr>
           <w:p>
-            <w:pPr>
-              <w:pStyle w:val="Tabletext"/>
-              <w:rPr>
-                <w:lang w:val="es-CL"/>
-              </w:rPr>
-            </w:pPr>
-            <w:r>
-              <w:t>1.15</w:t>
+            <w:r>
+              <w:t>1.16</w:t>
             </w:r>
           </w:p>
         </w:tc>
@@ -672,14 +666,8 @@
             <w:tcW w:w="6077" w:type="dxa"/>
           </w:tcPr>
           <w:p>
-            <w:pPr>
-              <w:pStyle w:val="Tabletext"/>
-              <w:rPr>
-                <w:lang w:val="es-CL"/>
-              </w:rPr>
-            </w:pPr>
-            <w:r>
-              <w:t>08-10-2026</w:t>
+            <w:r>
+              <w:t>10-10-2026</w:t>
             </w:r>
           </w:p>
         </w:tc>
@@ -2041,6 +2029,72 @@
             </w:pPr>
             <w:r>
               <w:t>Rodrigo Cárcamo Rojas</w:t>
+            </w:r>
+          </w:p>
+        </w:tc>
+      </w:tr>
+      <w:tr>
+        <w:tc>
+          <w:tcPr>
+            <w:tcW w:w="2196" w:type="dxa"/>
+          </w:tcPr>
+          <w:p>
+            <w:pPr>
+              <w:pStyle w:val="Tabletext"/>
+              <w:rPr>
+                <w:lang w:val="es-CL"/>
+              </w:rPr>
+            </w:pPr>
+            <w:r>
+              <w:t>10-10-2026</w:t>
+            </w:r>
+          </w:p>
+        </w:tc>
+        <w:tc>
+          <w:tcPr>
+            <w:tcW w:w="1152" w:type="dxa"/>
+          </w:tcPr>
+          <w:p>
+            <w:pPr>
+              <w:pStyle w:val="Tabletext"/>
+              <w:rPr>
+                <w:lang w:val="es-CL"/>
+              </w:rPr>
+            </w:pPr>
+            <w:r>
+              <w:t>1.16</w:t>
+            </w:r>
+          </w:p>
+        </w:tc>
+        <w:tc>
+          <w:tcPr>
+            <w:tcW w:w="3744" w:type="dxa"/>
+          </w:tcPr>
+          <w:p>
+            <w:pPr>
+              <w:pStyle w:val="Tabletext"/>
+              <w:rPr>
+                <w:lang w:val="es-CL"/>
+              </w:rPr>
+            </w:pPr>
+            <w:r>
+              <w:t>FS-HU-12: endpoint de verificación reservado al administrador, respuesta mínima y error 404. Decisión D28. Insignia en listado, Inicio y perfil profesional. CP-061 a CP-068 automatizados. Implementación parcial en revisión; pantalla administrativa y provisión de cuentas pendientes de alcance del PO.</w:t>
+            </w:r>
+          </w:p>
+        </w:tc>
+        <w:tc>
+          <w:tcPr>
+            <w:tcW w:w="1908" w:type="dxa"/>
+          </w:tcPr>
+          <w:p>
+            <w:pPr>
+              <w:pStyle w:val="Tabletext"/>
+              <w:rPr>
+                <w:lang w:val="es-CL"/>
+              </w:rPr>
+            </w:pPr>
+            <w:r>
+              <w:t>Luis Méndez</w:t>
             </w:r>
           </w:p>
         </w:tc>
@@ -22755,6 +22809,50 @@
     <w:p/>
     <w:p>
       <w:pPr>
+        <w:pStyle w:val="EstiloTtulo2VerdanaJustificado"/>
+      </w:pPr>
+      <w:r>
+        <w:t>Flujo de verificación de profesionales</w:t>
+      </w:r>
+    </w:p>
+    <w:p>
+      <w:pPr/>
+      <w:r>
+        <w:t>FS-HU-12 y CU-07. Estado al 10-10-2026: avance técnico en revisión sobre el PR #13. La planificación conserva Sprint 5, prioridad baja y 3 puntos. El PO confirma el alcance final; la historia no está aceptada ni completada.</w:t>
+      </w:r>
+    </w:p>
+    <w:p>
+      <w:pPr/>
+      <w:r>
+        <w:t>La petición PATCH /api/profesionales/:id/verificar exige Bearer JWT y rol administrador. El middleware responde 401 sin sesión, 403 para usuario o profesional y 400 ante un id inválido. El servicio consulta profesional.model.existe(id) y responde 404 con “No encontramos este profesional” si la ficha no existe o no pertenece a una cuenta profesional.</w:t>
+      </w:r>
+    </w:p>
+    <w:p>
+      <w:pPr/>
+      <w:r>
+        <w:t>El modelo usa la instancia compartida de models/prisma.js y actualiza únicamente verificado a true. La respuesta 200 es { id, verificado: true }, sin usuarioId, datos de salud ni coordenadas. Repetir la aprobación mantiene el estado verificado. La edición de la ficha propia selecciona únicamente los campos permitidos y no permite cambiar la verificación.</w:t>
+      </w:r>
+    </w:p>
+    <w:p>
+      <w:pPr/>
+      <w:r>
+        <w:t>TarjetaProfesional muestra el ícono escudo y el texto Verificado cuando la API confirma el estado, tanto en el listado como en el Inicio. PerfilProfesional y FichaProfesional conservan sus insignias. ResumenPerfil sigue reservado al usuario según D25.</w:t>
+      </w:r>
+    </w:p>
+    <w:p>
+      <w:pPr/>
+      <w:r>
+        <w:t>No se ha implementado una pantalla de revisión, un listado de pendientes ni un mecanismo de creación de cuentas de administrador. La aprobación se consume mediante la API con una cuenta administrativa existente. Estas funciones y la aceptación final requieren la definición del PO. No se agregan migraciones ni columnas nuevas.</w:t>
+      </w:r>
+    </w:p>
+    <w:p>
+      <w:pPr/>
+      <w:r>
+        <w:t>Validación automatizada al 10-10-2026: 166 pruebas Jest y 135 Vitest aprobadas, lint en ambas capas y build frontend correctos. CP-061 a CP-068 detallan los casos en la planilla. Los modelos se simulan: estos resultados no sustituyen una prueba contra MySQL real ni la aceptación del PO.</w:t>
+      </w:r>
+    </w:p>
+    <w:p>
+      <w:pPr>
         <w:pStyle w:val="EstiloTtulo1VerdanaJustificado"/>
         <w:numPr>
           <w:ilvl w:val="0"/>
@@ -28034,6 +28132,60 @@
                 <w:sz w:val="17"/>
               </w:rPr>
               <w:t>El buscador nunca muestra fichas a medio llenar: un profesional aparece solo cuando completa los datos obligatorios. El catálogo evita variantes de una misma especialidad que romperían el filtro del buscador (FS-HU-22) y coincide con los perfiles de demostración. Solo actualizar una fila existente impedía a los profesionales nuevos guardar su ficha (defecto 16).</w:t>
+            </w:r>
+          </w:p>
+        </w:tc>
+      </w:tr>
+      <w:tr>
+        <w:tc>
+          <w:tcPr>
+            <w:tcW w:type="dxa" w:w="600"/>
+          </w:tcPr>
+          <w:p>
+            <w:pPr>
+              <w:spacing w:after="0"/>
+            </w:pPr>
+            <w:r>
+              <w:t>D28</w:t>
+            </w:r>
+          </w:p>
+        </w:tc>
+        <w:tc>
+          <w:tcPr>
+            <w:tcW w:type="dxa" w:w="2400"/>
+          </w:tcPr>
+          <w:p>
+            <w:pPr>
+              <w:spacing w:after="0"/>
+            </w:pPr>
+            <w:r>
+              <w:t>Verificación básica mediante PATCH reservado al administrador; consulta y actualización en profesional.model con Prisma compartido, respuesta { id, verificado } e insignias con escudo.</w:t>
+            </w:r>
+          </w:p>
+        </w:tc>
+        <w:tc>
+          <w:tcPr>
+            <w:tcW w:type="dxa" w:w="2400"/>
+          </w:tcPr>
+          <w:p>
+            <w:pPr>
+              <w:spacing w:after="0"/>
+            </w:pPr>
+            <w:r>
+              <w:t>PrismaClient adicional dentro del servicio; devolución de la fila completa; permitir al profesional cambiar su verificación.</w:t>
+            </w:r>
+          </w:p>
+        </w:tc>
+        <w:tc>
+          <w:tcPr>
+            <w:tcW w:type="dxa" w:w="3600"/>
+          </w:tcPr>
+          <w:p>
+            <w:pPr>
+              <w:spacing w:after="0"/>
+            </w:pPr>
+            <w:r>
+              <w:t>Mantiene las capas y D25, limita la respuesta y evita la autoverificación. Devuelve 404 para una ficha inexistente. La pantalla administrativa y la provisión de cuentas requieren alcance del PO; FS-HU-12 permanece parcial, prevista para Sprint 5.</w:t>
             </w:r>
           </w:p>
         </w:tc>

</xml_diff>

<commit_message>
Precisa trazabilidad y pendientes de revisión documental
</commit_message>
<xml_diff>
--- a/FASE 2/Evidencias Proyecto/Evidencias de documentación/Documento de Arquitectura (DAS)/Documento_Arquitectura_Sistema_DAS_.docx
+++ b/FASE 2/Evidencias Proyecto/Evidencias de documentación/Documento de Arquitectura (DAS)/Documento_Arquitectura_Sistema_DAS_.docx
@@ -17984,7 +17984,7 @@
         </w:rPr>
       </w:pPr>
       <w:r>
-        <w:t>Ilustración 5: Diagrama de secuencia del registro de comida por lenguaje natural</w:t>
+        <w:t>Ilustración 5: Diagrama de secuencia del registro de comida por lenguaje natural (diseño previsto, pendiente de implementación)</w:t>
       </w:r>
     </w:p>
     <w:p>
@@ -23238,7 +23238,7 @@
               <w:rPr>
                 <w:sz w:val="17"/>
               </w:rPr>
-              <w:t>2</w:t>
+              <w:t>2 (arrastrado al Sprint 3)</w:t>
             </w:r>
           </w:p>
         </w:tc>

</xml_diff>

<commit_message>
Corrige recarga de documentos y consolida verificacion administrativa
</commit_message>
<xml_diff>
--- a/FASE 2/Evidencias Proyecto/Evidencias de documentación/Documento de Arquitectura (DAS)/Documento_Arquitectura_Sistema_DAS_.docx
+++ b/FASE 2/Evidencias Proyecto/Evidencias de documentación/Documento de Arquitectura (DAS)/Documento_Arquitectura_Sistema_DAS_.docx
@@ -2303,7 +2303,7 @@
         </w:rPr>
         <w:fldChar w:fldCharType="separate"/>
       </w:r>
-      <w:hyperlink w:anchor="_Toc242549032" w:history="1">
+      <w:hyperlink w:anchor="_Toc242562232" w:history="1">
         <w:r>
           <w:rPr>
             <w:rStyle w:val="Hipervnculo"/>
@@ -2354,7 +2354,7 @@
             <w:noProof/>
             <w:webHidden/>
           </w:rPr>
-          <w:instrText xml:space="preserve"> PAGEREF _Toc242549032 \h </w:instrText>
+          <w:instrText xml:space="preserve"> PAGEREF _Toc242562232 \h </w:instrText>
         </w:r>
         <w:r>
           <w:rPr>
@@ -2403,7 +2403,7 @@
           <w14:ligatures w14:val="standardContextual"/>
         </w:rPr>
       </w:pPr>
-      <w:hyperlink w:anchor="_Toc242549033" w:history="1">
+      <w:hyperlink w:anchor="_Toc242562233" w:history="1">
         <w:r>
           <w:rPr>
             <w:rStyle w:val="Hipervnculo"/>
@@ -2452,7 +2452,7 @@
             <w:noProof/>
             <w:webHidden/>
           </w:rPr>
-          <w:instrText xml:space="preserve"> PAGEREF _Toc242549033 \h </w:instrText>
+          <w:instrText xml:space="preserve"> PAGEREF _Toc242562233 \h </w:instrText>
         </w:r>
         <w:r>
           <w:rPr>
@@ -2501,7 +2501,7 @@
           <w14:ligatures w14:val="standardContextual"/>
         </w:rPr>
       </w:pPr>
-      <w:hyperlink w:anchor="_Toc242549034" w:history="1">
+      <w:hyperlink w:anchor="_Toc242562234" w:history="1">
         <w:r>
           <w:rPr>
             <w:rStyle w:val="Hipervnculo"/>
@@ -2550,7 +2550,7 @@
             <w:noProof/>
             <w:webHidden/>
           </w:rPr>
-          <w:instrText xml:space="preserve"> PAGEREF _Toc242549034 \h </w:instrText>
+          <w:instrText xml:space="preserve"> PAGEREF _Toc242562234 \h </w:instrText>
         </w:r>
         <w:r>
           <w:rPr>
@@ -2599,7 +2599,7 @@
           <w14:ligatures w14:val="standardContextual"/>
         </w:rPr>
       </w:pPr>
-      <w:hyperlink w:anchor="_Toc242549035" w:history="1">
+      <w:hyperlink w:anchor="_Toc242562235" w:history="1">
         <w:r>
           <w:rPr>
             <w:rStyle w:val="Hipervnculo"/>
@@ -2648,7 +2648,7 @@
             <w:noProof/>
             <w:webHidden/>
           </w:rPr>
-          <w:instrText xml:space="preserve"> PAGEREF _Toc242549035 \h </w:instrText>
+          <w:instrText xml:space="preserve"> PAGEREF _Toc242562235 \h </w:instrText>
         </w:r>
         <w:r>
           <w:rPr>
@@ -2697,7 +2697,7 @@
           <w14:ligatures w14:val="standardContextual"/>
         </w:rPr>
       </w:pPr>
-      <w:hyperlink w:anchor="_Toc242549036" w:history="1">
+      <w:hyperlink w:anchor="_Toc242562236" w:history="1">
         <w:r>
           <w:rPr>
             <w:rStyle w:val="Hipervnculo"/>
@@ -2746,7 +2746,7 @@
             <w:noProof/>
             <w:webHidden/>
           </w:rPr>
-          <w:instrText xml:space="preserve"> PAGEREF _Toc242549036 \h </w:instrText>
+          <w:instrText xml:space="preserve"> PAGEREF _Toc242562236 \h </w:instrText>
         </w:r>
         <w:r>
           <w:rPr>
@@ -2795,7 +2795,7 @@
           <w14:ligatures w14:val="standardContextual"/>
         </w:rPr>
       </w:pPr>
-      <w:hyperlink w:anchor="_Toc242549037" w:history="1">
+      <w:hyperlink w:anchor="_Toc242562237" w:history="1">
         <w:r>
           <w:rPr>
             <w:rStyle w:val="Hipervnculo"/>
@@ -2844,7 +2844,7 @@
             <w:noProof/>
             <w:webHidden/>
           </w:rPr>
-          <w:instrText xml:space="preserve"> PAGEREF _Toc242549037 \h </w:instrText>
+          <w:instrText xml:space="preserve"> PAGEREF _Toc242562237 \h </w:instrText>
         </w:r>
         <w:r>
           <w:rPr>
@@ -2893,7 +2893,7 @@
           <w14:ligatures w14:val="standardContextual"/>
         </w:rPr>
       </w:pPr>
-      <w:hyperlink w:anchor="_Toc242549038" w:history="1">
+      <w:hyperlink w:anchor="_Toc242562238" w:history="1">
         <w:r>
           <w:rPr>
             <w:rStyle w:val="Hipervnculo"/>
@@ -2942,7 +2942,7 @@
             <w:noProof/>
             <w:webHidden/>
           </w:rPr>
-          <w:instrText xml:space="preserve"> PAGEREF _Toc242549038 \h </w:instrText>
+          <w:instrText xml:space="preserve"> PAGEREF _Toc242562238 \h </w:instrText>
         </w:r>
         <w:r>
           <w:rPr>
@@ -2991,7 +2991,7 @@
           <w14:ligatures w14:val="standardContextual"/>
         </w:rPr>
       </w:pPr>
-      <w:hyperlink w:anchor="_Toc242549039" w:history="1">
+      <w:hyperlink w:anchor="_Toc242562239" w:history="1">
         <w:r>
           <w:rPr>
             <w:rStyle w:val="Hipervnculo"/>
@@ -3040,7 +3040,7 @@
             <w:noProof/>
             <w:webHidden/>
           </w:rPr>
-          <w:instrText xml:space="preserve"> PAGEREF _Toc242549039 \h </w:instrText>
+          <w:instrText xml:space="preserve"> PAGEREF _Toc242562239 \h </w:instrText>
         </w:r>
         <w:r>
           <w:rPr>
@@ -3091,7 +3091,7 @@
           <w14:ligatures w14:val="standardContextual"/>
         </w:rPr>
       </w:pPr>
-      <w:hyperlink w:anchor="_Toc242549040" w:history="1">
+      <w:hyperlink w:anchor="_Toc242562240" w:history="1">
         <w:r>
           <w:rPr>
             <w:rStyle w:val="Hipervnculo"/>
@@ -3142,7 +3142,7 @@
             <w:noProof/>
             <w:webHidden/>
           </w:rPr>
-          <w:instrText xml:space="preserve"> PAGEREF _Toc242549040 \h </w:instrText>
+          <w:instrText xml:space="preserve"> PAGEREF _Toc242562240 \h </w:instrText>
         </w:r>
         <w:r>
           <w:rPr>
@@ -3191,7 +3191,7 @@
           <w14:ligatures w14:val="standardContextual"/>
         </w:rPr>
       </w:pPr>
-      <w:hyperlink w:anchor="_Toc242549041" w:history="1">
+      <w:hyperlink w:anchor="_Toc242562241" w:history="1">
         <w:r>
           <w:rPr>
             <w:rStyle w:val="Hipervnculo"/>
@@ -3240,7 +3240,7 @@
             <w:noProof/>
             <w:webHidden/>
           </w:rPr>
-          <w:instrText xml:space="preserve"> PAGEREF _Toc242549041 \h </w:instrText>
+          <w:instrText xml:space="preserve"> PAGEREF _Toc242562241 \h </w:instrText>
         </w:r>
         <w:r>
           <w:rPr>
@@ -3289,7 +3289,7 @@
           <w14:ligatures w14:val="standardContextual"/>
         </w:rPr>
       </w:pPr>
-      <w:hyperlink w:anchor="_Toc242549042" w:history="1">
+      <w:hyperlink w:anchor="_Toc242562242" w:history="1">
         <w:r>
           <w:rPr>
             <w:rStyle w:val="Hipervnculo"/>
@@ -3338,7 +3338,7 @@
             <w:noProof/>
             <w:webHidden/>
           </w:rPr>
-          <w:instrText xml:space="preserve"> PAGEREF _Toc242549042 \h </w:instrText>
+          <w:instrText xml:space="preserve"> PAGEREF _Toc242562242 \h </w:instrText>
         </w:r>
         <w:r>
           <w:rPr>
@@ -3387,7 +3387,7 @@
           <w14:ligatures w14:val="standardContextual"/>
         </w:rPr>
       </w:pPr>
-      <w:hyperlink w:anchor="_Toc242549043" w:history="1">
+      <w:hyperlink w:anchor="_Toc242562243" w:history="1">
         <w:r>
           <w:rPr>
             <w:rStyle w:val="Hipervnculo"/>
@@ -3436,7 +3436,7 @@
             <w:noProof/>
             <w:webHidden/>
           </w:rPr>
-          <w:instrText xml:space="preserve"> PAGEREF _Toc242549043 \h </w:instrText>
+          <w:instrText xml:space="preserve"> PAGEREF _Toc242562243 \h </w:instrText>
         </w:r>
         <w:r>
           <w:rPr>
@@ -3487,7 +3487,7 @@
           <w14:ligatures w14:val="standardContextual"/>
         </w:rPr>
       </w:pPr>
-      <w:hyperlink w:anchor="_Toc242549044" w:history="1">
+      <w:hyperlink w:anchor="_Toc242562244" w:history="1">
         <w:r>
           <w:rPr>
             <w:rStyle w:val="Hipervnculo"/>
@@ -3538,7 +3538,7 @@
             <w:noProof/>
             <w:webHidden/>
           </w:rPr>
-          <w:instrText xml:space="preserve"> PAGEREF _Toc242549044 \h </w:instrText>
+          <w:instrText xml:space="preserve"> PAGEREF _Toc242562244 \h </w:instrText>
         </w:r>
         <w:r>
           <w:rPr>
@@ -3587,7 +3587,7 @@
           <w14:ligatures w14:val="standardContextual"/>
         </w:rPr>
       </w:pPr>
-      <w:hyperlink w:anchor="_Toc242549045" w:history="1">
+      <w:hyperlink w:anchor="_Toc242562245" w:history="1">
         <w:r>
           <w:rPr>
             <w:rStyle w:val="Hipervnculo"/>
@@ -3636,7 +3636,7 @@
             <w:noProof/>
             <w:webHidden/>
           </w:rPr>
-          <w:instrText xml:space="preserve"> PAGEREF _Toc242549045 \h </w:instrText>
+          <w:instrText xml:space="preserve"> PAGEREF _Toc242562245 \h </w:instrText>
         </w:r>
         <w:r>
           <w:rPr>
@@ -3685,7 +3685,7 @@
           <w14:ligatures w14:val="standardContextual"/>
         </w:rPr>
       </w:pPr>
-      <w:hyperlink w:anchor="_Toc242549046" w:history="1">
+      <w:hyperlink w:anchor="_Toc242562246" w:history="1">
         <w:r>
           <w:rPr>
             <w:rStyle w:val="Hipervnculo"/>
@@ -3734,7 +3734,7 @@
             <w:noProof/>
             <w:webHidden/>
           </w:rPr>
-          <w:instrText xml:space="preserve"> PAGEREF _Toc242549046 \h </w:instrText>
+          <w:instrText xml:space="preserve"> PAGEREF _Toc242562246 \h </w:instrText>
         </w:r>
         <w:r>
           <w:rPr>
@@ -3783,7 +3783,7 @@
           <w14:ligatures w14:val="standardContextual"/>
         </w:rPr>
       </w:pPr>
-      <w:hyperlink w:anchor="_Toc242549047" w:history="1">
+      <w:hyperlink w:anchor="_Toc242562247" w:history="1">
         <w:r>
           <w:rPr>
             <w:rStyle w:val="Hipervnculo"/>
@@ -3832,7 +3832,7 @@
             <w:noProof/>
             <w:webHidden/>
           </w:rPr>
-          <w:instrText xml:space="preserve"> PAGEREF _Toc242549047 \h </w:instrText>
+          <w:instrText xml:space="preserve"> PAGEREF _Toc242562247 \h </w:instrText>
         </w:r>
         <w:r>
           <w:rPr>
@@ -3882,7 +3882,7 @@
           <w14:ligatures w14:val="standardContextual"/>
         </w:rPr>
       </w:pPr>
-      <w:hyperlink w:anchor="_Toc242549048" w:history="1">
+      <w:hyperlink w:anchor="_Toc242562248" w:history="1">
         <w:r>
           <w:rPr>
             <w:rStyle w:val="Hipervnculo"/>
@@ -3910,7 +3910,7 @@
             <w:noProof/>
             <w:webHidden/>
           </w:rPr>
-          <w:instrText xml:space="preserve"> PAGEREF _Toc242549048 \h </w:instrText>
+          <w:instrText xml:space="preserve"> PAGEREF _Toc242562248 \h </w:instrText>
         </w:r>
         <w:r>
           <w:rPr>
@@ -3958,7 +3958,7 @@
           <w14:ligatures w14:val="standardContextual"/>
         </w:rPr>
       </w:pPr>
-      <w:hyperlink w:anchor="_Toc242549049" w:history="1">
+      <w:hyperlink w:anchor="_Toc242562249" w:history="1">
         <w:r>
           <w:rPr>
             <w:rStyle w:val="Hipervnculo"/>
@@ -3985,7 +3985,7 @@
             <w:noProof/>
             <w:webHidden/>
           </w:rPr>
-          <w:instrText xml:space="preserve"> PAGEREF _Toc242549049 \h </w:instrText>
+          <w:instrText xml:space="preserve"> PAGEREF _Toc242562249 \h </w:instrText>
         </w:r>
         <w:r>
           <w:rPr>
@@ -4033,7 +4033,7 @@
           <w14:ligatures w14:val="standardContextual"/>
         </w:rPr>
       </w:pPr>
-      <w:hyperlink w:anchor="_Toc242549050" w:history="1">
+      <w:hyperlink w:anchor="_Toc242562250" w:history="1">
         <w:r>
           <w:rPr>
             <w:rStyle w:val="Hipervnculo"/>
@@ -4060,7 +4060,7 @@
             <w:noProof/>
             <w:webHidden/>
           </w:rPr>
-          <w:instrText xml:space="preserve"> PAGEREF _Toc242549050 \h </w:instrText>
+          <w:instrText xml:space="preserve"> PAGEREF _Toc242562250 \h </w:instrText>
         </w:r>
         <w:r>
           <w:rPr>
@@ -4110,7 +4110,7 @@
           <w14:ligatures w14:val="standardContextual"/>
         </w:rPr>
       </w:pPr>
-      <w:hyperlink w:anchor="_Toc242549051" w:history="1">
+      <w:hyperlink w:anchor="_Toc242562251" w:history="1">
         <w:r>
           <w:rPr>
             <w:rStyle w:val="Hipervnculo"/>
@@ -4138,7 +4138,7 @@
             <w:noProof/>
             <w:webHidden/>
           </w:rPr>
-          <w:instrText xml:space="preserve"> PAGEREF _Toc242549051 \h </w:instrText>
+          <w:instrText xml:space="preserve"> PAGEREF _Toc242562251 \h </w:instrText>
         </w:r>
         <w:r>
           <w:rPr>
@@ -4186,7 +4186,7 @@
           <w14:ligatures w14:val="standardContextual"/>
         </w:rPr>
       </w:pPr>
-      <w:hyperlink w:anchor="_Toc242549052" w:history="1">
+      <w:hyperlink w:anchor="_Toc242562252" w:history="1">
         <w:r>
           <w:rPr>
             <w:rStyle w:val="Hipervnculo"/>
@@ -4213,7 +4213,7 @@
             <w:noProof/>
             <w:webHidden/>
           </w:rPr>
-          <w:instrText xml:space="preserve"> PAGEREF _Toc242549052 \h </w:instrText>
+          <w:instrText xml:space="preserve"> PAGEREF _Toc242562252 \h </w:instrText>
         </w:r>
         <w:r>
           <w:rPr>
@@ -4261,7 +4261,7 @@
           <w14:ligatures w14:val="standardContextual"/>
         </w:rPr>
       </w:pPr>
-      <w:hyperlink w:anchor="_Toc242549053" w:history="1">
+      <w:hyperlink w:anchor="_Toc242562253" w:history="1">
         <w:r>
           <w:rPr>
             <w:rStyle w:val="Hipervnculo"/>
@@ -4288,7 +4288,7 @@
             <w:noProof/>
             <w:webHidden/>
           </w:rPr>
-          <w:instrText xml:space="preserve"> PAGEREF _Toc242549053 \h </w:instrText>
+          <w:instrText xml:space="preserve"> PAGEREF _Toc242562253 \h </w:instrText>
         </w:r>
         <w:r>
           <w:rPr>
@@ -4336,7 +4336,7 @@
           <w14:ligatures w14:val="standardContextual"/>
         </w:rPr>
       </w:pPr>
-      <w:hyperlink w:anchor="_Toc242549054" w:history="1">
+      <w:hyperlink w:anchor="_Toc242562254" w:history="1">
         <w:r>
           <w:rPr>
             <w:rStyle w:val="Hipervnculo"/>
@@ -4363,7 +4363,7 @@
             <w:noProof/>
             <w:webHidden/>
           </w:rPr>
-          <w:instrText xml:space="preserve"> PAGEREF _Toc242549054 \h </w:instrText>
+          <w:instrText xml:space="preserve"> PAGEREF _Toc242562254 \h </w:instrText>
         </w:r>
         <w:r>
           <w:rPr>
@@ -4411,7 +4411,7 @@
           <w14:ligatures w14:val="standardContextual"/>
         </w:rPr>
       </w:pPr>
-      <w:hyperlink w:anchor="_Toc242549055" w:history="1">
+      <w:hyperlink w:anchor="_Toc242562255" w:history="1">
         <w:r>
           <w:rPr>
             <w:rStyle w:val="Hipervnculo"/>
@@ -4438,7 +4438,7 @@
             <w:noProof/>
             <w:webHidden/>
           </w:rPr>
-          <w:instrText xml:space="preserve"> PAGEREF _Toc242549055 \h </w:instrText>
+          <w:instrText xml:space="preserve"> PAGEREF _Toc242562255 \h </w:instrText>
         </w:r>
         <w:r>
           <w:rPr>
@@ -4486,7 +4486,7 @@
           <w14:ligatures w14:val="standardContextual"/>
         </w:rPr>
       </w:pPr>
-      <w:hyperlink w:anchor="_Toc242549056" w:history="1">
+      <w:hyperlink w:anchor="_Toc242562256" w:history="1">
         <w:r>
           <w:rPr>
             <w:rStyle w:val="Hipervnculo"/>
@@ -4513,7 +4513,7 @@
             <w:noProof/>
             <w:webHidden/>
           </w:rPr>
-          <w:instrText xml:space="preserve"> PAGEREF _Toc242549056 \h </w:instrText>
+          <w:instrText xml:space="preserve"> PAGEREF _Toc242562256 \h </w:instrText>
         </w:r>
         <w:r>
           <w:rPr>
@@ -4562,7 +4562,7 @@
           <w14:ligatures w14:val="standardContextual"/>
         </w:rPr>
       </w:pPr>
-      <w:hyperlink w:anchor="_Toc242549057" w:history="1">
+      <w:hyperlink w:anchor="_Toc242562257" w:history="1">
         <w:r>
           <w:rPr>
             <w:rStyle w:val="Hipervnculo"/>
@@ -4609,7 +4609,7 @@
             <w:noProof/>
             <w:webHidden/>
           </w:rPr>
-          <w:instrText xml:space="preserve"> PAGEREF _Toc242549057 \h </w:instrText>
+          <w:instrText xml:space="preserve"> PAGEREF _Toc242562257 \h </w:instrText>
         </w:r>
         <w:r>
           <w:rPr>
@@ -4659,7 +4659,7 @@
           <w14:ligatures w14:val="standardContextual"/>
         </w:rPr>
       </w:pPr>
-      <w:hyperlink w:anchor="_Toc242549058" w:history="1">
+      <w:hyperlink w:anchor="_Toc242562258" w:history="1">
         <w:r>
           <w:rPr>
             <w:rStyle w:val="Hipervnculo"/>
@@ -4687,7 +4687,7 @@
             <w:noProof/>
             <w:webHidden/>
           </w:rPr>
-          <w:instrText xml:space="preserve"> PAGEREF _Toc242549058 \h </w:instrText>
+          <w:instrText xml:space="preserve"> PAGEREF _Toc242562258 \h </w:instrText>
         </w:r>
         <w:r>
           <w:rPr>
@@ -4737,7 +4737,7 @@
           <w14:ligatures w14:val="standardContextual"/>
         </w:rPr>
       </w:pPr>
-      <w:hyperlink w:anchor="_Toc242549059" w:history="1">
+      <w:hyperlink w:anchor="_Toc242562259" w:history="1">
         <w:r>
           <w:rPr>
             <w:rStyle w:val="Hipervnculo"/>
@@ -4765,7 +4765,7 @@
             <w:noProof/>
             <w:webHidden/>
           </w:rPr>
-          <w:instrText xml:space="preserve"> PAGEREF _Toc242549059 \h </w:instrText>
+          <w:instrText xml:space="preserve"> PAGEREF _Toc242562259 \h </w:instrText>
         </w:r>
         <w:r>
           <w:rPr>
@@ -4815,7 +4815,7 @@
           <w14:ligatures w14:val="standardContextual"/>
         </w:rPr>
       </w:pPr>
-      <w:hyperlink w:anchor="_Toc242549060" w:history="1">
+      <w:hyperlink w:anchor="_Toc242562260" w:history="1">
         <w:r>
           <w:rPr>
             <w:rStyle w:val="Hipervnculo"/>
@@ -4843,7 +4843,7 @@
             <w:noProof/>
             <w:webHidden/>
           </w:rPr>
-          <w:instrText xml:space="preserve"> PAGEREF _Toc242549060 \h </w:instrText>
+          <w:instrText xml:space="preserve"> PAGEREF _Toc242562260 \h </w:instrText>
         </w:r>
         <w:r>
           <w:rPr>
@@ -4863,7 +4863,7 @@
             <w:noProof/>
             <w:webHidden/>
           </w:rPr>
-          <w:t>40</w:t>
+          <w:t>39</w:t>
         </w:r>
         <w:r>
           <w:rPr>
@@ -4894,7 +4894,7 @@
           <w14:ligatures w14:val="standardContextual"/>
         </w:rPr>
       </w:pPr>
-      <w:hyperlink w:anchor="_Toc242549061" w:history="1">
+      <w:hyperlink w:anchor="_Toc242562261" w:history="1">
         <w:r>
           <w:rPr>
             <w:rStyle w:val="Hipervnculo"/>
@@ -4945,7 +4945,7 @@
             <w:noProof/>
             <w:webHidden/>
           </w:rPr>
-          <w:instrText xml:space="preserve"> PAGEREF _Toc242549061 \h </w:instrText>
+          <w:instrText xml:space="preserve"> PAGEREF _Toc242562261 \h </w:instrText>
         </w:r>
         <w:r>
           <w:rPr>
@@ -4965,7 +4965,7 @@
             <w:noProof/>
             <w:webHidden/>
           </w:rPr>
-          <w:t>41</w:t>
+          <w:t>40</w:t>
         </w:r>
         <w:r>
           <w:rPr>
@@ -4996,7 +4996,7 @@
           <w14:ligatures w14:val="standardContextual"/>
         </w:rPr>
       </w:pPr>
-      <w:hyperlink w:anchor="_Toc242549062" w:history="1">
+      <w:hyperlink w:anchor="_Toc242562262" w:history="1">
         <w:r>
           <w:rPr>
             <w:rStyle w:val="Hipervnculo"/>
@@ -5047,7 +5047,7 @@
             <w:noProof/>
             <w:webHidden/>
           </w:rPr>
-          <w:instrText xml:space="preserve"> PAGEREF _Toc242549062 \h </w:instrText>
+          <w:instrText xml:space="preserve"> PAGEREF _Toc242562262 \h </w:instrText>
         </w:r>
         <w:r>
           <w:rPr>
@@ -5067,7 +5067,7 @@
             <w:noProof/>
             <w:webHidden/>
           </w:rPr>
-          <w:t>46</w:t>
+          <w:t>45</w:t>
         </w:r>
         <w:r>
           <w:rPr>
@@ -5119,7 +5119,7 @@
         </w:rPr>
         <w:br w:type="page"/>
       </w:r>
-      <w:bookmarkStart w:id="1" w:name="_Toc242549032"/>
+      <w:bookmarkStart w:id="1" w:name="_Toc242562232"/>
       <w:r>
         <w:rPr>
           <w:lang w:val="es-CL"/>
@@ -5142,7 +5142,7 @@
       <w:bookmarkStart w:id="4" w:name="_Toc324851941"/>
       <w:bookmarkStart w:id="5" w:name="_Toc324915524"/>
       <w:bookmarkStart w:id="6" w:name="_Toc433104437"/>
-      <w:bookmarkStart w:id="7" w:name="_Toc242549033"/>
+      <w:bookmarkStart w:id="7" w:name="_Toc242562233"/>
       <w:r>
         <w:rPr>
           <w:lang w:val="es-CL"/>
@@ -5180,7 +5180,7 @@
           <w:lang w:val="es-CL"/>
         </w:rPr>
       </w:pPr>
-      <w:bookmarkStart w:id="8" w:name="_Toc242549034"/>
+      <w:bookmarkStart w:id="8" w:name="_Toc242562234"/>
       <w:r>
         <w:rPr>
           <w:lang w:val="es-CL"/>
@@ -5229,7 +5229,7 @@
           <w:lang w:val="es-CL"/>
         </w:rPr>
       </w:pPr>
-      <w:bookmarkStart w:id="9" w:name="_Toc242549035"/>
+      <w:bookmarkStart w:id="9" w:name="_Toc242562235"/>
       <w:r>
         <w:rPr>
           <w:lang w:val="es-CL"/>
@@ -5398,7 +5398,7 @@
           <w:lang w:val="es-CL"/>
         </w:rPr>
       </w:pPr>
-      <w:bookmarkStart w:id="10" w:name="_Toc242549036"/>
+      <w:bookmarkStart w:id="10" w:name="_Toc242562236"/>
       <w:r>
         <w:rPr>
           <w:lang w:val="es-CL"/>
@@ -6188,7 +6188,7 @@
       <w:bookmarkStart w:id="13" w:name="_Toc324851945"/>
       <w:bookmarkStart w:id="14" w:name="_Toc324915528"/>
       <w:bookmarkStart w:id="15" w:name="_Toc433104441"/>
-      <w:bookmarkStart w:id="16" w:name="_Toc242549037"/>
+      <w:bookmarkStart w:id="16" w:name="_Toc242562237"/>
       <w:r>
         <w:rPr>
           <w:lang w:val="es-CL"/>
@@ -6335,7 +6335,7 @@
           <w:lang w:val="es-CL"/>
         </w:rPr>
       </w:pPr>
-      <w:bookmarkStart w:id="17" w:name="_Toc242549038"/>
+      <w:bookmarkStart w:id="17" w:name="_Toc242562238"/>
       <w:r>
         <w:rPr>
           <w:lang w:val="es-CL"/>
@@ -6385,7 +6385,7 @@
           <w:lang w:val="es-CL"/>
         </w:rPr>
       </w:pPr>
-      <w:bookmarkStart w:id="18" w:name="_Toc242549039"/>
+      <w:bookmarkStart w:id="18" w:name="_Toc242562239"/>
       <w:bookmarkEnd w:id="11"/>
       <w:bookmarkEnd w:id="12"/>
       <w:bookmarkEnd w:id="13"/>
@@ -6545,7 +6545,7 @@
         </w:rPr>
         <w:br w:type="page"/>
       </w:r>
-      <w:bookmarkStart w:id="19" w:name="_Toc242549040"/>
+      <w:bookmarkStart w:id="19" w:name="_Toc242562240"/>
       <w:r>
         <w:rPr>
           <w:lang w:val="es-CL"/>
@@ -6573,7 +6573,7 @@
           <w:lang w:val="es-CL"/>
         </w:rPr>
       </w:pPr>
-      <w:bookmarkStart w:id="20" w:name="_Toc242549041"/>
+      <w:bookmarkStart w:id="20" w:name="_Toc242562241"/>
       <w:r>
         <w:rPr>
           <w:lang w:val="es-CL"/>
@@ -6717,7 +6717,7 @@
           <w:lang w:val="es-CL"/>
         </w:rPr>
       </w:pPr>
-      <w:bookmarkStart w:id="21" w:name="_Toc242549042"/>
+      <w:bookmarkStart w:id="21" w:name="_Toc242562242"/>
       <w:r>
         <w:rPr>
           <w:lang w:val="es-CL"/>
@@ -6861,7 +6861,7 @@
           <w:lang w:val="es-CL"/>
         </w:rPr>
       </w:pPr>
-      <w:bookmarkStart w:id="22" w:name="_Toc242549043"/>
+      <w:bookmarkStart w:id="22" w:name="_Toc242562243"/>
       <w:r>
         <w:rPr>
           <w:lang w:val="es-CL"/>
@@ -6984,7 +6984,7 @@
         </w:rPr>
         <w:br w:type="page"/>
       </w:r>
-      <w:bookmarkStart w:id="23" w:name="_Toc242549044"/>
+      <w:bookmarkStart w:id="23" w:name="_Toc242562244"/>
       <w:r>
         <w:rPr>
           <w:lang w:val="es-ES"/>
@@ -7035,7 +7035,7 @@
           <w:lang w:val="es-ES"/>
         </w:rPr>
       </w:pPr>
-      <w:bookmarkStart w:id="24" w:name="_Toc242549045"/>
+      <w:bookmarkStart w:id="24" w:name="_Toc242562245"/>
       <w:r>
         <w:rPr>
           <w:lang w:val="es-CL"/>
@@ -7121,7 +7121,7 @@
           <w:lang w:val="es-CL"/>
         </w:rPr>
       </w:pPr>
-      <w:bookmarkStart w:id="25" w:name="_Toc242549046"/>
+      <w:bookmarkStart w:id="25" w:name="_Toc242562246"/>
       <w:r>
         <w:rPr>
           <w:lang w:val="es-CL"/>
@@ -8675,7 +8675,7 @@
           <w:lang w:val="es-CL"/>
         </w:rPr>
       </w:pPr>
-      <w:bookmarkStart w:id="26" w:name="_Toc242549047"/>
+      <w:bookmarkStart w:id="26" w:name="_Toc242562247"/>
       <w:r>
         <w:rPr>
           <w:lang w:val="es-CL"/>
@@ -9763,7 +9763,7 @@
           <w:lang w:val="es-ES"/>
         </w:rPr>
       </w:pPr>
-      <w:bookmarkStart w:id="27" w:name="_Toc242549048"/>
+      <w:bookmarkStart w:id="27" w:name="_Toc242562248"/>
       <w:r>
         <w:rPr>
           <w:lang w:val="es-ES"/>
@@ -10178,7 +10178,7 @@
           <w:numId w:val="0"/>
         </w:numPr>
       </w:pPr>
-      <w:bookmarkStart w:id="28" w:name="_Toc242549049"/>
+      <w:bookmarkStart w:id="28" w:name="_Toc242562249"/>
       <w:r>
         <w:t>Modelo de datos</w:t>
       </w:r>
@@ -11220,7 +11220,7 @@
           <w:numId w:val="0"/>
         </w:numPr>
       </w:pPr>
-      <w:bookmarkStart w:id="29" w:name="_Toc242549050"/>
+      <w:bookmarkStart w:id="29" w:name="_Toc242562250"/>
       <w:r>
         <w:t>Diccionario de datos</w:t>
       </w:r>
@@ -19798,7 +19798,7 @@
           <w:lang w:val="es-CL"/>
         </w:rPr>
       </w:pPr>
-      <w:bookmarkStart w:id="30" w:name="_Toc242549051"/>
+      <w:bookmarkStart w:id="30" w:name="_Toc242562251"/>
       <w:r>
         <w:rPr>
           <w:lang w:val="es-CL"/>
@@ -19897,7 +19897,7 @@
           <w:numId w:val="0"/>
         </w:numPr>
       </w:pPr>
-      <w:bookmarkStart w:id="31" w:name="_Toc242549052"/>
+      <w:bookmarkStart w:id="31" w:name="_Toc242562252"/>
       <w:r>
         <w:t>Flujo de autenticación y perfil (Sprint 1)</w:t>
       </w:r>
@@ -20643,7 +20643,7 @@
           <w:numId w:val="0"/>
         </w:numPr>
       </w:pPr>
-      <w:bookmarkStart w:id="32" w:name="_Toc242549053"/>
+      <w:bookmarkStart w:id="32" w:name="_Toc242562253"/>
       <w:r>
         <w:t>Flujo de reserva de hora (Sprints 2 y 3)</w:t>
       </w:r>
@@ -21086,7 +21086,7 @@
           <w:numId w:val="0"/>
         </w:numPr>
       </w:pPr>
-      <w:bookmarkStart w:id="33" w:name="_Toc242549054"/>
+      <w:bookmarkStart w:id="33" w:name="_Toc242562254"/>
       <w:r>
         <w:t>Flujo de recuperación de contraseña y acceso con Google (Sprint 2)</w:t>
       </w:r>
@@ -21697,7 +21697,7 @@
           <w:numId w:val="0"/>
         </w:numPr>
       </w:pPr>
-      <w:bookmarkStart w:id="34" w:name="_Toc242549055"/>
+      <w:bookmarkStart w:id="34" w:name="_Toc242562255"/>
       <w:r>
         <w:t>Flujo de búsqueda de profesionales, favoritos y reseñas (Sprint 3)</w:t>
       </w:r>
@@ -22081,7 +22081,7 @@
           <w:numId w:val="0"/>
         </w:numPr>
       </w:pPr>
-      <w:bookmarkStart w:id="35" w:name="_Toc242549056"/>
+      <w:bookmarkStart w:id="35" w:name="_Toc242562256"/>
       <w:r>
         <w:t>Flujo del espacio del profesional (Sprint 3)</w:t>
       </w:r>
@@ -22467,7 +22467,7 @@
       <w:pPr>
         <w:pStyle w:val="EstiloTtulo2VerdanaJustificado"/>
       </w:pPr>
-      <w:bookmarkStart w:id="36" w:name="_Toc242549057"/>
+      <w:bookmarkStart w:id="36" w:name="_Toc242562257"/>
       <w:r>
         <w:t>Flujo de verificación de profesionales</w:t>
       </w:r>
@@ -22480,7 +22480,7 @@
     </w:p>
     <w:p>
       <w:r>
-        <w:t>El profesional usa Certificaciones para registrar RUT chileno válido, adjuntar identidad y título profesional y enviar o reenviar su solicitud. Teléfono y antecedentes son opcionales. Se admiten PDF, PNG y JPEG con firma de formato válida, hasta 5 MB por archivo y 20 documentos por ficha. El almacenamiento privado conserva las versiones; solo el propietario o el administrador descarga con sesión vigente. No hay correo automático ni validación contra registros externos de títulos.</w:t>
+        <w:t>Certificaciones muestra bloques independientes para identidad y título obligatorios y antecedentes opcionales, con botones azules para adjuntar y envío naranjo. El RUT agrega automáticamente el guion y valida su dígito verificador. Si la solicitud no está verificada, recargar o reabrir vacía los apartados; el envío exige adjuntar identidad y título en esa pantalla. Tras rechazo o revocación, los archivos previos dejan de contar y la API exige nuevas subidas. No se muestran versiones anteriores. Se admiten PDF, PNG y JPEG válidos de hasta 5 MB y 20 archivos por ficha. Los archivos permanecen privados; no hay correo automático ni acreditación externa de títulos.</w:t>
       </w:r>
     </w:p>
     <w:p>
@@ -22490,7 +22490,7 @@
     </w:p>
     <w:p>
       <w:r>
-        <w:t>La aprobación muestra el escudo y Verificado en PerfilProfesional, FichaProfesional y TarjetaProfesional. Rechazar o revocar retira la insignia; una revocación o cambio de especialidad devuelve la ficha a pendiente. El profesional ve el motivo y puede corregir y reenviar. Cualquier edición o carga incrementa la revisión para impedir decisiones sobre datos obsoletos. ResumenPerfil sigue reservado al usuario; el profesional no puede verificar su propia ficha.</w:t>
+        <w:t>La aprobación muestra el escudo y Verificado en PerfilProfesional, FichaProfesional y TarjetaProfesional. Rechazar o revocar retira la insignia; la revocación deja la solicitud rechazada y exige documentos nuevos; cambiar la especialidad devuelve la ficha a pendiente. El profesional ve el motivo y puede corregir y reenviar. Cualquier edición o carga incrementa la revisión para impedir decisiones sobre datos obsoletos. ResumenPerfil sigue reservado al usuario; el profesional no puede verificar su propia ficha.</w:t>
       </w:r>
     </w:p>
     <w:p>
@@ -22500,7 +22500,7 @@
     </w:p>
     <w:p>
       <w:r>
-        <w:t>Validación del PR #17 al 10-10-2026: 202 pruebas backend en 25 suites y 152 frontend en 21 archivos aprobadas; lint de ambas capas y build correctos. Se realizaron 17 comprobaciones con MySQL y cuentas/archivos temporales, eliminados al terminar, además de cinco vistas administrativas y Certificaciones en Edge a 1440 y 390 px. Los casos automatizados y manuales se registran en Plan de Pruebas/FS-HU-12_Verificacion.md. Estas comprobaciones no equivalen a aceptación del PO.</w:t>
+        <w:t>Validación final del PR #17 al 10-10-2026: 206 pruebas backend en 25 suites y 161 frontend en 21 archivos aprobadas; lint de ambas capas y build correctos. Incluye recarga con apartados vacíos, envío incompleto bloqueado, documentos independientes, formato del RUT y exclusión de archivos anteriores tras rechazo/revocación. Inicialmente se realizaron 17 comprobaciones con MySQL y cuentas/archivos temporales, además de revisión de las vistas en Edge a 1440 y 390 px. Los casos están en Plan de Pruebas/FS-HU-12_Verificacion.md. La aceptación del PO sigue pendiente.</w:t>
       </w:r>
     </w:p>
     <w:p>
@@ -22515,7 +22515,7 @@
           <w:lang w:val="es-ES"/>
         </w:rPr>
       </w:pPr>
-      <w:bookmarkStart w:id="37" w:name="_Toc242549058"/>
+      <w:bookmarkStart w:id="37" w:name="_Toc242562258"/>
       <w:r>
         <w:rPr>
           <w:lang w:val="es-ES"/>
@@ -23197,7 +23197,7 @@
         </w:rPr>
         <w:br w:type="page"/>
       </w:r>
-      <w:bookmarkStart w:id="38" w:name="_Toc242549059"/>
+      <w:bookmarkStart w:id="38" w:name="_Toc242562259"/>
       <w:r>
         <w:rPr>
           <w:lang w:val="es-ES"/>
@@ -23290,7 +23290,7 @@
         <w:lastRenderedPageBreak/>
         <w:drawing>
           <wp:inline distT="0" distB="0" distL="0" distR="0" wp14:anchorId="6152AB04" wp14:editId="3B7798A9">
-            <wp:extent cx="3060757" cy="7100000"/>
+            <wp:extent cx="3060757" cy="6344375"/>
             <wp:effectExtent l="0" t="0" r="0" b="0"/>
             <wp:docPr id="900" name="Flujo de verificación administrativa" descr="Solicitud con documentos privados, revisión, rechazo, aprobación y revocación."/>
             <wp:cNvGraphicFramePr>
@@ -23312,7 +23312,7 @@
                   <pic:spPr>
                     <a:xfrm>
                       <a:off x="0" y="0"/>
-                      <a:ext cx="3060757" cy="7100000"/>
+                      <a:ext cx="3060757" cy="6344375"/>
                     </a:xfrm>
                     <a:prstGeom prst="rect">
                       <a:avLst/>
@@ -23527,14 +23527,124 @@
               <w:rPr>
                 <w:sz w:val="17"/>
               </w:rPr>
-              <w:t xml:space="preserve">Sirve el build estático de React y reenvía </w:t>
+              <w:t>Sirve el build estático de React y reenvía las rutas /api al backend (proxy inverso).</w:t>
+            </w:r>
+          </w:p>
+        </w:tc>
+        <w:tc>
+          <w:tcPr>
+            <w:tcW w:w="1500" w:type="dxa"/>
+          </w:tcPr>
+          <w:p>
+            <w:r>
+              <w:rPr>
+                <w:sz w:val="17"/>
+              </w:rPr>
+              <w:t>80 / 443 (expuesto)</w:t>
+            </w:r>
+          </w:p>
+        </w:tc>
+      </w:tr>
+      <w:tr>
+        <w:tc>
+          <w:tcPr>
+            <w:tcW w:w="2000" w:type="dxa"/>
+          </w:tcPr>
+          <w:p>
+            <w:r>
+              <w:rPr>
+                <w:b/>
+                <w:sz w:val="17"/>
+              </w:rPr>
+              <w:t>Backend container</w:t>
+            </w:r>
+          </w:p>
+        </w:tc>
+        <w:tc>
+          <w:tcPr>
+            <w:tcW w:w="2000" w:type="dxa"/>
+          </w:tcPr>
+          <w:p>
+            <w:r>
+              <w:rPr>
+                <w:sz w:val="17"/>
+              </w:rPr>
+              <w:t>Node.js LTS + Express</w:t>
+            </w:r>
+          </w:p>
+        </w:tc>
+        <w:tc>
+          <w:tcPr>
+            <w:tcW w:w="3500" w:type="dxa"/>
+          </w:tcPr>
+          <w:p>
+            <w:r>
+              <w:rPr>
+                <w:sz w:val="17"/>
+              </w:rPr>
+              <w:t>API REST, autenticación, lógica de negocio e integración con servicios externos.</w:t>
+            </w:r>
+          </w:p>
+        </w:tc>
+        <w:tc>
+          <w:tcPr>
+            <w:tcW w:w="1500" w:type="dxa"/>
+          </w:tcPr>
+          <w:p>
+            <w:r>
+              <w:rPr>
+                <w:sz w:val="17"/>
+              </w:rPr>
+              <w:t>3000 (red interna)</w:t>
+            </w:r>
+          </w:p>
+        </w:tc>
+      </w:tr>
+      <w:tr>
+        <w:tc>
+          <w:tcPr>
+            <w:tcW w:w="2000" w:type="dxa"/>
+          </w:tcPr>
+          <w:p>
+            <w:r>
+              <w:rPr>
+                <w:b/>
+                <w:sz w:val="17"/>
+              </w:rPr>
+              <w:t>MySQL container</w:t>
+            </w:r>
+          </w:p>
+        </w:tc>
+        <w:tc>
+          <w:tcPr>
+            <w:tcW w:w="2000" w:type="dxa"/>
+          </w:tcPr>
+          <w:p>
+            <w:r>
+              <w:rPr>
+                <w:sz w:val="17"/>
+              </w:rPr>
+              <w:t>MySQL 8</w:t>
+            </w:r>
+          </w:p>
+        </w:tc>
+        <w:tc>
+          <w:tcPr>
+            <w:tcW w:w="3500" w:type="dxa"/>
+          </w:tcPr>
+          <w:p>
+            <w:r>
+              <w:rPr>
+                <w:sz w:val="17"/>
+              </w:rPr>
+              <w:t xml:space="preserve">Persistencia de datos en un volumen </w:t>
             </w:r>
             <w:r>
               <w:rPr>
                 <w:sz w:val="17"/>
               </w:rPr>
               <w:lastRenderedPageBreak/>
-              <w:t>las rutas /api al backend (proxy inverso).</w:t>
+              <w:t>Docker.</w:t>
             </w:r>
           </w:p>
         </w:tc>
@@ -23548,14 +23658,14 @@
                 <w:sz w:val="17"/>
               </w:rPr>
               <w:lastRenderedPageBreak/>
-              <w:t xml:space="preserve">80 / 443 </w:t>
+              <w:t xml:space="preserve">3306 (red </w:t>
             </w:r>
             <w:r>
               <w:rPr>
                 <w:sz w:val="17"/>
               </w:rPr>
               <w:lastRenderedPageBreak/>
-              <w:t>(expuesto)</w:t>
+              <w:t>interna)</w:t>
             </w:r>
           </w:p>
         </w:tc>
@@ -23572,116 +23682,6 @@
                 <w:sz w:val="17"/>
               </w:rPr>
               <w:lastRenderedPageBreak/>
-              <w:t>Backend container</w:t>
-            </w:r>
-          </w:p>
-        </w:tc>
-        <w:tc>
-          <w:tcPr>
-            <w:tcW w:w="2000" w:type="dxa"/>
-          </w:tcPr>
-          <w:p>
-            <w:r>
-              <w:rPr>
-                <w:sz w:val="17"/>
-              </w:rPr>
-              <w:t>Node.js LTS + Express</w:t>
-            </w:r>
-          </w:p>
-        </w:tc>
-        <w:tc>
-          <w:tcPr>
-            <w:tcW w:w="3500" w:type="dxa"/>
-          </w:tcPr>
-          <w:p>
-            <w:r>
-              <w:rPr>
-                <w:sz w:val="17"/>
-              </w:rPr>
-              <w:t>API REST, autenticación, lógica de negocio e integración con servicios externos.</w:t>
-            </w:r>
-          </w:p>
-        </w:tc>
-        <w:tc>
-          <w:tcPr>
-            <w:tcW w:w="1500" w:type="dxa"/>
-          </w:tcPr>
-          <w:p>
-            <w:r>
-              <w:rPr>
-                <w:sz w:val="17"/>
-              </w:rPr>
-              <w:t>3000 (red interna)</w:t>
-            </w:r>
-          </w:p>
-        </w:tc>
-      </w:tr>
-      <w:tr>
-        <w:tc>
-          <w:tcPr>
-            <w:tcW w:w="2000" w:type="dxa"/>
-          </w:tcPr>
-          <w:p>
-            <w:r>
-              <w:rPr>
-                <w:b/>
-                <w:sz w:val="17"/>
-              </w:rPr>
-              <w:t>MySQL container</w:t>
-            </w:r>
-          </w:p>
-        </w:tc>
-        <w:tc>
-          <w:tcPr>
-            <w:tcW w:w="2000" w:type="dxa"/>
-          </w:tcPr>
-          <w:p>
-            <w:r>
-              <w:rPr>
-                <w:sz w:val="17"/>
-              </w:rPr>
-              <w:t>MySQL 8</w:t>
-            </w:r>
-          </w:p>
-        </w:tc>
-        <w:tc>
-          <w:tcPr>
-            <w:tcW w:w="3500" w:type="dxa"/>
-          </w:tcPr>
-          <w:p>
-            <w:r>
-              <w:rPr>
-                <w:sz w:val="17"/>
-              </w:rPr>
-              <w:t>Persistencia de datos en un volumen Docker.</w:t>
-            </w:r>
-          </w:p>
-        </w:tc>
-        <w:tc>
-          <w:tcPr>
-            <w:tcW w:w="1500" w:type="dxa"/>
-          </w:tcPr>
-          <w:p>
-            <w:r>
-              <w:rPr>
-                <w:sz w:val="17"/>
-              </w:rPr>
-              <w:t>3306 (red interna)</w:t>
-            </w:r>
-          </w:p>
-        </w:tc>
-      </w:tr>
-      <w:tr>
-        <w:tc>
-          <w:tcPr>
-            <w:tcW w:w="2000" w:type="dxa"/>
-          </w:tcPr>
-          <w:p>
-            <w:r>
-              <w:rPr>
-                <w:b/>
-                <w:sz w:val="17"/>
-              </w:rPr>
               <w:t>Google Maps Platform</w:t>
             </w:r>
           </w:p>
@@ -24651,7 +24651,6 @@
               <w:rPr>
                 <w:sz w:val="17"/>
               </w:rPr>
-              <w:lastRenderedPageBreak/>
               <w:t>Backend</w:t>
             </w:r>
           </w:p>
@@ -24728,7 +24727,7 @@
         </w:rPr>
         <w:br w:type="page"/>
       </w:r>
-      <w:bookmarkStart w:id="39" w:name="_Toc242549060"/>
+      <w:bookmarkStart w:id="39" w:name="_Toc242562260"/>
       <w:r>
         <w:rPr>
           <w:lang w:val="es-ES"/>
@@ -25484,7 +25483,7 @@
         </w:rPr>
         <w:br w:type="page"/>
       </w:r>
-      <w:bookmarkStart w:id="40" w:name="_Toc242549061"/>
+      <w:bookmarkStart w:id="40" w:name="_Toc242562261"/>
       <w:r>
         <w:rPr>
           <w:lang w:val="es-ES"/>
@@ -27270,7 +27269,7 @@
         </w:rPr>
         <w:br w:type="page"/>
       </w:r>
-      <w:bookmarkStart w:id="41" w:name="_Toc242549062"/>
+      <w:bookmarkStart w:id="41" w:name="_Toc242562262"/>
       <w:r>
         <w:rPr>
           <w:lang w:val="es-ES"/>

</xml_diff>

<commit_message>
Cierra decisiones tras rechazo o revocacion hasta nuevo envio
</commit_message>
<xml_diff>
--- a/FASE 2/Evidencias Proyecto/Evidencias de documentación/Documento de Arquitectura (DAS)/Documento_Arquitectura_Sistema_DAS_.docx
+++ b/FASE 2/Evidencias Proyecto/Evidencias de documentación/Documento de Arquitectura (DAS)/Documento_Arquitectura_Sistema_DAS_.docx
@@ -2303,7 +2303,7 @@
         </w:rPr>
         <w:fldChar w:fldCharType="separate"/>
       </w:r>
-      <w:hyperlink w:anchor="_Toc242562232" w:history="1">
+      <w:hyperlink w:anchor="_Toc242563733" w:history="1">
         <w:r>
           <w:rPr>
             <w:rStyle w:val="Hipervnculo"/>
@@ -2354,7 +2354,7 @@
             <w:noProof/>
             <w:webHidden/>
           </w:rPr>
-          <w:instrText xml:space="preserve"> PAGEREF _Toc242562232 \h </w:instrText>
+          <w:instrText xml:space="preserve"> PAGEREF _Toc242563733 \h </w:instrText>
         </w:r>
         <w:r>
           <w:rPr>
@@ -2403,7 +2403,7 @@
           <w14:ligatures w14:val="standardContextual"/>
         </w:rPr>
       </w:pPr>
-      <w:hyperlink w:anchor="_Toc242562233" w:history="1">
+      <w:hyperlink w:anchor="_Toc242563734" w:history="1">
         <w:r>
           <w:rPr>
             <w:rStyle w:val="Hipervnculo"/>
@@ -2452,7 +2452,7 @@
             <w:noProof/>
             <w:webHidden/>
           </w:rPr>
-          <w:instrText xml:space="preserve"> PAGEREF _Toc242562233 \h </w:instrText>
+          <w:instrText xml:space="preserve"> PAGEREF _Toc242563734 \h </w:instrText>
         </w:r>
         <w:r>
           <w:rPr>
@@ -2501,7 +2501,7 @@
           <w14:ligatures w14:val="standardContextual"/>
         </w:rPr>
       </w:pPr>
-      <w:hyperlink w:anchor="_Toc242562234" w:history="1">
+      <w:hyperlink w:anchor="_Toc242563735" w:history="1">
         <w:r>
           <w:rPr>
             <w:rStyle w:val="Hipervnculo"/>
@@ -2550,7 +2550,7 @@
             <w:noProof/>
             <w:webHidden/>
           </w:rPr>
-          <w:instrText xml:space="preserve"> PAGEREF _Toc242562234 \h </w:instrText>
+          <w:instrText xml:space="preserve"> PAGEREF _Toc242563735 \h </w:instrText>
         </w:r>
         <w:r>
           <w:rPr>
@@ -2599,7 +2599,7 @@
           <w14:ligatures w14:val="standardContextual"/>
         </w:rPr>
       </w:pPr>
-      <w:hyperlink w:anchor="_Toc242562235" w:history="1">
+      <w:hyperlink w:anchor="_Toc242563736" w:history="1">
         <w:r>
           <w:rPr>
             <w:rStyle w:val="Hipervnculo"/>
@@ -2648,7 +2648,7 @@
             <w:noProof/>
             <w:webHidden/>
           </w:rPr>
-          <w:instrText xml:space="preserve"> PAGEREF _Toc242562235 \h </w:instrText>
+          <w:instrText xml:space="preserve"> PAGEREF _Toc242563736 \h </w:instrText>
         </w:r>
         <w:r>
           <w:rPr>
@@ -2697,7 +2697,7 @@
           <w14:ligatures w14:val="standardContextual"/>
         </w:rPr>
       </w:pPr>
-      <w:hyperlink w:anchor="_Toc242562236" w:history="1">
+      <w:hyperlink w:anchor="_Toc242563737" w:history="1">
         <w:r>
           <w:rPr>
             <w:rStyle w:val="Hipervnculo"/>
@@ -2746,7 +2746,7 @@
             <w:noProof/>
             <w:webHidden/>
           </w:rPr>
-          <w:instrText xml:space="preserve"> PAGEREF _Toc242562236 \h </w:instrText>
+          <w:instrText xml:space="preserve"> PAGEREF _Toc242563737 \h </w:instrText>
         </w:r>
         <w:r>
           <w:rPr>
@@ -2795,7 +2795,7 @@
           <w14:ligatures w14:val="standardContextual"/>
         </w:rPr>
       </w:pPr>
-      <w:hyperlink w:anchor="_Toc242562237" w:history="1">
+      <w:hyperlink w:anchor="_Toc242563738" w:history="1">
         <w:r>
           <w:rPr>
             <w:rStyle w:val="Hipervnculo"/>
@@ -2844,7 +2844,7 @@
             <w:noProof/>
             <w:webHidden/>
           </w:rPr>
-          <w:instrText xml:space="preserve"> PAGEREF _Toc242562237 \h </w:instrText>
+          <w:instrText xml:space="preserve"> PAGEREF _Toc242563738 \h </w:instrText>
         </w:r>
         <w:r>
           <w:rPr>
@@ -2893,7 +2893,7 @@
           <w14:ligatures w14:val="standardContextual"/>
         </w:rPr>
       </w:pPr>
-      <w:hyperlink w:anchor="_Toc242562238" w:history="1">
+      <w:hyperlink w:anchor="_Toc242563739" w:history="1">
         <w:r>
           <w:rPr>
             <w:rStyle w:val="Hipervnculo"/>
@@ -2942,7 +2942,7 @@
             <w:noProof/>
             <w:webHidden/>
           </w:rPr>
-          <w:instrText xml:space="preserve"> PAGEREF _Toc242562238 \h </w:instrText>
+          <w:instrText xml:space="preserve"> PAGEREF _Toc242563739 \h </w:instrText>
         </w:r>
         <w:r>
           <w:rPr>
@@ -2991,7 +2991,7 @@
           <w14:ligatures w14:val="standardContextual"/>
         </w:rPr>
       </w:pPr>
-      <w:hyperlink w:anchor="_Toc242562239" w:history="1">
+      <w:hyperlink w:anchor="_Toc242563740" w:history="1">
         <w:r>
           <w:rPr>
             <w:rStyle w:val="Hipervnculo"/>
@@ -3040,7 +3040,7 @@
             <w:noProof/>
             <w:webHidden/>
           </w:rPr>
-          <w:instrText xml:space="preserve"> PAGEREF _Toc242562239 \h </w:instrText>
+          <w:instrText xml:space="preserve"> PAGEREF _Toc242563740 \h </w:instrText>
         </w:r>
         <w:r>
           <w:rPr>
@@ -3091,7 +3091,7 @@
           <w14:ligatures w14:val="standardContextual"/>
         </w:rPr>
       </w:pPr>
-      <w:hyperlink w:anchor="_Toc242562240" w:history="1">
+      <w:hyperlink w:anchor="_Toc242563741" w:history="1">
         <w:r>
           <w:rPr>
             <w:rStyle w:val="Hipervnculo"/>
@@ -3142,7 +3142,7 @@
             <w:noProof/>
             <w:webHidden/>
           </w:rPr>
-          <w:instrText xml:space="preserve"> PAGEREF _Toc242562240 \h </w:instrText>
+          <w:instrText xml:space="preserve"> PAGEREF _Toc242563741 \h </w:instrText>
         </w:r>
         <w:r>
           <w:rPr>
@@ -3191,7 +3191,7 @@
           <w14:ligatures w14:val="standardContextual"/>
         </w:rPr>
       </w:pPr>
-      <w:hyperlink w:anchor="_Toc242562241" w:history="1">
+      <w:hyperlink w:anchor="_Toc242563742" w:history="1">
         <w:r>
           <w:rPr>
             <w:rStyle w:val="Hipervnculo"/>
@@ -3240,7 +3240,7 @@
             <w:noProof/>
             <w:webHidden/>
           </w:rPr>
-          <w:instrText xml:space="preserve"> PAGEREF _Toc242562241 \h </w:instrText>
+          <w:instrText xml:space="preserve"> PAGEREF _Toc242563742 \h </w:instrText>
         </w:r>
         <w:r>
           <w:rPr>
@@ -3289,7 +3289,7 @@
           <w14:ligatures w14:val="standardContextual"/>
         </w:rPr>
       </w:pPr>
-      <w:hyperlink w:anchor="_Toc242562242" w:history="1">
+      <w:hyperlink w:anchor="_Toc242563743" w:history="1">
         <w:r>
           <w:rPr>
             <w:rStyle w:val="Hipervnculo"/>
@@ -3338,7 +3338,7 @@
             <w:noProof/>
             <w:webHidden/>
           </w:rPr>
-          <w:instrText xml:space="preserve"> PAGEREF _Toc242562242 \h </w:instrText>
+          <w:instrText xml:space="preserve"> PAGEREF _Toc242563743 \h </w:instrText>
         </w:r>
         <w:r>
           <w:rPr>
@@ -3387,7 +3387,7 @@
           <w14:ligatures w14:val="standardContextual"/>
         </w:rPr>
       </w:pPr>
-      <w:hyperlink w:anchor="_Toc242562243" w:history="1">
+      <w:hyperlink w:anchor="_Toc242563744" w:history="1">
         <w:r>
           <w:rPr>
             <w:rStyle w:val="Hipervnculo"/>
@@ -3436,7 +3436,7 @@
             <w:noProof/>
             <w:webHidden/>
           </w:rPr>
-          <w:instrText xml:space="preserve"> PAGEREF _Toc242562243 \h </w:instrText>
+          <w:instrText xml:space="preserve"> PAGEREF _Toc242563744 \h </w:instrText>
         </w:r>
         <w:r>
           <w:rPr>
@@ -3487,7 +3487,7 @@
           <w14:ligatures w14:val="standardContextual"/>
         </w:rPr>
       </w:pPr>
-      <w:hyperlink w:anchor="_Toc242562244" w:history="1">
+      <w:hyperlink w:anchor="_Toc242563745" w:history="1">
         <w:r>
           <w:rPr>
             <w:rStyle w:val="Hipervnculo"/>
@@ -3538,7 +3538,7 @@
             <w:noProof/>
             <w:webHidden/>
           </w:rPr>
-          <w:instrText xml:space="preserve"> PAGEREF _Toc242562244 \h </w:instrText>
+          <w:instrText xml:space="preserve"> PAGEREF _Toc242563745 \h </w:instrText>
         </w:r>
         <w:r>
           <w:rPr>
@@ -3587,7 +3587,7 @@
           <w14:ligatures w14:val="standardContextual"/>
         </w:rPr>
       </w:pPr>
-      <w:hyperlink w:anchor="_Toc242562245" w:history="1">
+      <w:hyperlink w:anchor="_Toc242563746" w:history="1">
         <w:r>
           <w:rPr>
             <w:rStyle w:val="Hipervnculo"/>
@@ -3636,7 +3636,7 @@
             <w:noProof/>
             <w:webHidden/>
           </w:rPr>
-          <w:instrText xml:space="preserve"> PAGEREF _Toc242562245 \h </w:instrText>
+          <w:instrText xml:space="preserve"> PAGEREF _Toc242563746 \h </w:instrText>
         </w:r>
         <w:r>
           <w:rPr>
@@ -3685,7 +3685,7 @@
           <w14:ligatures w14:val="standardContextual"/>
         </w:rPr>
       </w:pPr>
-      <w:hyperlink w:anchor="_Toc242562246" w:history="1">
+      <w:hyperlink w:anchor="_Toc242563747" w:history="1">
         <w:r>
           <w:rPr>
             <w:rStyle w:val="Hipervnculo"/>
@@ -3734,7 +3734,7 @@
             <w:noProof/>
             <w:webHidden/>
           </w:rPr>
-          <w:instrText xml:space="preserve"> PAGEREF _Toc242562246 \h </w:instrText>
+          <w:instrText xml:space="preserve"> PAGEREF _Toc242563747 \h </w:instrText>
         </w:r>
         <w:r>
           <w:rPr>
@@ -3783,7 +3783,7 @@
           <w14:ligatures w14:val="standardContextual"/>
         </w:rPr>
       </w:pPr>
-      <w:hyperlink w:anchor="_Toc242562247" w:history="1">
+      <w:hyperlink w:anchor="_Toc242563748" w:history="1">
         <w:r>
           <w:rPr>
             <w:rStyle w:val="Hipervnculo"/>
@@ -3832,7 +3832,7 @@
             <w:noProof/>
             <w:webHidden/>
           </w:rPr>
-          <w:instrText xml:space="preserve"> PAGEREF _Toc242562247 \h </w:instrText>
+          <w:instrText xml:space="preserve"> PAGEREF _Toc242563748 \h </w:instrText>
         </w:r>
         <w:r>
           <w:rPr>
@@ -3882,7 +3882,7 @@
           <w14:ligatures w14:val="standardContextual"/>
         </w:rPr>
       </w:pPr>
-      <w:hyperlink w:anchor="_Toc242562248" w:history="1">
+      <w:hyperlink w:anchor="_Toc242563749" w:history="1">
         <w:r>
           <w:rPr>
             <w:rStyle w:val="Hipervnculo"/>
@@ -3910,7 +3910,7 @@
             <w:noProof/>
             <w:webHidden/>
           </w:rPr>
-          <w:instrText xml:space="preserve"> PAGEREF _Toc242562248 \h </w:instrText>
+          <w:instrText xml:space="preserve"> PAGEREF _Toc242563749 \h </w:instrText>
         </w:r>
         <w:r>
           <w:rPr>
@@ -3958,7 +3958,7 @@
           <w14:ligatures w14:val="standardContextual"/>
         </w:rPr>
       </w:pPr>
-      <w:hyperlink w:anchor="_Toc242562249" w:history="1">
+      <w:hyperlink w:anchor="_Toc242563750" w:history="1">
         <w:r>
           <w:rPr>
             <w:rStyle w:val="Hipervnculo"/>
@@ -3985,7 +3985,7 @@
             <w:noProof/>
             <w:webHidden/>
           </w:rPr>
-          <w:instrText xml:space="preserve"> PAGEREF _Toc242562249 \h </w:instrText>
+          <w:instrText xml:space="preserve"> PAGEREF _Toc242563750 \h </w:instrText>
         </w:r>
         <w:r>
           <w:rPr>
@@ -4033,7 +4033,7 @@
           <w14:ligatures w14:val="standardContextual"/>
         </w:rPr>
       </w:pPr>
-      <w:hyperlink w:anchor="_Toc242562250" w:history="1">
+      <w:hyperlink w:anchor="_Toc242563751" w:history="1">
         <w:r>
           <w:rPr>
             <w:rStyle w:val="Hipervnculo"/>
@@ -4060,7 +4060,7 @@
             <w:noProof/>
             <w:webHidden/>
           </w:rPr>
-          <w:instrText xml:space="preserve"> PAGEREF _Toc242562250 \h </w:instrText>
+          <w:instrText xml:space="preserve"> PAGEREF _Toc242563751 \h </w:instrText>
         </w:r>
         <w:r>
           <w:rPr>
@@ -4110,7 +4110,7 @@
           <w14:ligatures w14:val="standardContextual"/>
         </w:rPr>
       </w:pPr>
-      <w:hyperlink w:anchor="_Toc242562251" w:history="1">
+      <w:hyperlink w:anchor="_Toc242563752" w:history="1">
         <w:r>
           <w:rPr>
             <w:rStyle w:val="Hipervnculo"/>
@@ -4138,7 +4138,7 @@
             <w:noProof/>
             <w:webHidden/>
           </w:rPr>
-          <w:instrText xml:space="preserve"> PAGEREF _Toc242562251 \h </w:instrText>
+          <w:instrText xml:space="preserve"> PAGEREF _Toc242563752 \h </w:instrText>
         </w:r>
         <w:r>
           <w:rPr>
@@ -4186,7 +4186,7 @@
           <w14:ligatures w14:val="standardContextual"/>
         </w:rPr>
       </w:pPr>
-      <w:hyperlink w:anchor="_Toc242562252" w:history="1">
+      <w:hyperlink w:anchor="_Toc242563753" w:history="1">
         <w:r>
           <w:rPr>
             <w:rStyle w:val="Hipervnculo"/>
@@ -4213,7 +4213,7 @@
             <w:noProof/>
             <w:webHidden/>
           </w:rPr>
-          <w:instrText xml:space="preserve"> PAGEREF _Toc242562252 \h </w:instrText>
+          <w:instrText xml:space="preserve"> PAGEREF _Toc242563753 \h </w:instrText>
         </w:r>
         <w:r>
           <w:rPr>
@@ -4261,7 +4261,7 @@
           <w14:ligatures w14:val="standardContextual"/>
         </w:rPr>
       </w:pPr>
-      <w:hyperlink w:anchor="_Toc242562253" w:history="1">
+      <w:hyperlink w:anchor="_Toc242563754" w:history="1">
         <w:r>
           <w:rPr>
             <w:rStyle w:val="Hipervnculo"/>
@@ -4288,7 +4288,7 @@
             <w:noProof/>
             <w:webHidden/>
           </w:rPr>
-          <w:instrText xml:space="preserve"> PAGEREF _Toc242562253 \h </w:instrText>
+          <w:instrText xml:space="preserve"> PAGEREF _Toc242563754 \h </w:instrText>
         </w:r>
         <w:r>
           <w:rPr>
@@ -4336,7 +4336,7 @@
           <w14:ligatures w14:val="standardContextual"/>
         </w:rPr>
       </w:pPr>
-      <w:hyperlink w:anchor="_Toc242562254" w:history="1">
+      <w:hyperlink w:anchor="_Toc242563755" w:history="1">
         <w:r>
           <w:rPr>
             <w:rStyle w:val="Hipervnculo"/>
@@ -4363,7 +4363,7 @@
             <w:noProof/>
             <w:webHidden/>
           </w:rPr>
-          <w:instrText xml:space="preserve"> PAGEREF _Toc242562254 \h </w:instrText>
+          <w:instrText xml:space="preserve"> PAGEREF _Toc242563755 \h </w:instrText>
         </w:r>
         <w:r>
           <w:rPr>
@@ -4411,7 +4411,7 @@
           <w14:ligatures w14:val="standardContextual"/>
         </w:rPr>
       </w:pPr>
-      <w:hyperlink w:anchor="_Toc242562255" w:history="1">
+      <w:hyperlink w:anchor="_Toc242563756" w:history="1">
         <w:r>
           <w:rPr>
             <w:rStyle w:val="Hipervnculo"/>
@@ -4438,7 +4438,7 @@
             <w:noProof/>
             <w:webHidden/>
           </w:rPr>
-          <w:instrText xml:space="preserve"> PAGEREF _Toc242562255 \h </w:instrText>
+          <w:instrText xml:space="preserve"> PAGEREF _Toc242563756 \h </w:instrText>
         </w:r>
         <w:r>
           <w:rPr>
@@ -4486,7 +4486,7 @@
           <w14:ligatures w14:val="standardContextual"/>
         </w:rPr>
       </w:pPr>
-      <w:hyperlink w:anchor="_Toc242562256" w:history="1">
+      <w:hyperlink w:anchor="_Toc242563757" w:history="1">
         <w:r>
           <w:rPr>
             <w:rStyle w:val="Hipervnculo"/>
@@ -4513,7 +4513,7 @@
             <w:noProof/>
             <w:webHidden/>
           </w:rPr>
-          <w:instrText xml:space="preserve"> PAGEREF _Toc242562256 \h </w:instrText>
+          <w:instrText xml:space="preserve"> PAGEREF _Toc242563757 \h </w:instrText>
         </w:r>
         <w:r>
           <w:rPr>
@@ -4562,7 +4562,7 @@
           <w14:ligatures w14:val="standardContextual"/>
         </w:rPr>
       </w:pPr>
-      <w:hyperlink w:anchor="_Toc242562257" w:history="1">
+      <w:hyperlink w:anchor="_Toc242563758" w:history="1">
         <w:r>
           <w:rPr>
             <w:rStyle w:val="Hipervnculo"/>
@@ -4609,7 +4609,7 @@
             <w:noProof/>
             <w:webHidden/>
           </w:rPr>
-          <w:instrText xml:space="preserve"> PAGEREF _Toc242562257 \h </w:instrText>
+          <w:instrText xml:space="preserve"> PAGEREF _Toc242563758 \h </w:instrText>
         </w:r>
         <w:r>
           <w:rPr>
@@ -4659,7 +4659,7 @@
           <w14:ligatures w14:val="standardContextual"/>
         </w:rPr>
       </w:pPr>
-      <w:hyperlink w:anchor="_Toc242562258" w:history="1">
+      <w:hyperlink w:anchor="_Toc242563759" w:history="1">
         <w:r>
           <w:rPr>
             <w:rStyle w:val="Hipervnculo"/>
@@ -4687,7 +4687,7 @@
             <w:noProof/>
             <w:webHidden/>
           </w:rPr>
-          <w:instrText xml:space="preserve"> PAGEREF _Toc242562258 \h </w:instrText>
+          <w:instrText xml:space="preserve"> PAGEREF _Toc242563759 \h </w:instrText>
         </w:r>
         <w:r>
           <w:rPr>
@@ -4737,7 +4737,7 @@
           <w14:ligatures w14:val="standardContextual"/>
         </w:rPr>
       </w:pPr>
-      <w:hyperlink w:anchor="_Toc242562259" w:history="1">
+      <w:hyperlink w:anchor="_Toc242563760" w:history="1">
         <w:r>
           <w:rPr>
             <w:rStyle w:val="Hipervnculo"/>
@@ -4765,7 +4765,7 @@
             <w:noProof/>
             <w:webHidden/>
           </w:rPr>
-          <w:instrText xml:space="preserve"> PAGEREF _Toc242562259 \h </w:instrText>
+          <w:instrText xml:space="preserve"> PAGEREF _Toc242563760 \h </w:instrText>
         </w:r>
         <w:r>
           <w:rPr>
@@ -4815,7 +4815,7 @@
           <w14:ligatures w14:val="standardContextual"/>
         </w:rPr>
       </w:pPr>
-      <w:hyperlink w:anchor="_Toc242562260" w:history="1">
+      <w:hyperlink w:anchor="_Toc242563761" w:history="1">
         <w:r>
           <w:rPr>
             <w:rStyle w:val="Hipervnculo"/>
@@ -4843,7 +4843,7 @@
             <w:noProof/>
             <w:webHidden/>
           </w:rPr>
-          <w:instrText xml:space="preserve"> PAGEREF _Toc242562260 \h </w:instrText>
+          <w:instrText xml:space="preserve"> PAGEREF _Toc242563761 \h </w:instrText>
         </w:r>
         <w:r>
           <w:rPr>
@@ -4894,7 +4894,7 @@
           <w14:ligatures w14:val="standardContextual"/>
         </w:rPr>
       </w:pPr>
-      <w:hyperlink w:anchor="_Toc242562261" w:history="1">
+      <w:hyperlink w:anchor="_Toc242563762" w:history="1">
         <w:r>
           <w:rPr>
             <w:rStyle w:val="Hipervnculo"/>
@@ -4945,7 +4945,7 @@
             <w:noProof/>
             <w:webHidden/>
           </w:rPr>
-          <w:instrText xml:space="preserve"> PAGEREF _Toc242562261 \h </w:instrText>
+          <w:instrText xml:space="preserve"> PAGEREF _Toc242563762 \h </w:instrText>
         </w:r>
         <w:r>
           <w:rPr>
@@ -4996,7 +4996,7 @@
           <w14:ligatures w14:val="standardContextual"/>
         </w:rPr>
       </w:pPr>
-      <w:hyperlink w:anchor="_Toc242562262" w:history="1">
+      <w:hyperlink w:anchor="_Toc242563763" w:history="1">
         <w:r>
           <w:rPr>
             <w:rStyle w:val="Hipervnculo"/>
@@ -5047,7 +5047,7 @@
             <w:noProof/>
             <w:webHidden/>
           </w:rPr>
-          <w:instrText xml:space="preserve"> PAGEREF _Toc242562262 \h </w:instrText>
+          <w:instrText xml:space="preserve"> PAGEREF _Toc242563763 \h </w:instrText>
         </w:r>
         <w:r>
           <w:rPr>
@@ -5119,7 +5119,7 @@
         </w:rPr>
         <w:br w:type="page"/>
       </w:r>
-      <w:bookmarkStart w:id="1" w:name="_Toc242562232"/>
+      <w:bookmarkStart w:id="1" w:name="_Toc242563733"/>
       <w:r>
         <w:rPr>
           <w:lang w:val="es-CL"/>
@@ -5142,7 +5142,7 @@
       <w:bookmarkStart w:id="4" w:name="_Toc324851941"/>
       <w:bookmarkStart w:id="5" w:name="_Toc324915524"/>
       <w:bookmarkStart w:id="6" w:name="_Toc433104437"/>
-      <w:bookmarkStart w:id="7" w:name="_Toc242562233"/>
+      <w:bookmarkStart w:id="7" w:name="_Toc242563734"/>
       <w:r>
         <w:rPr>
           <w:lang w:val="es-CL"/>
@@ -5180,7 +5180,7 @@
           <w:lang w:val="es-CL"/>
         </w:rPr>
       </w:pPr>
-      <w:bookmarkStart w:id="8" w:name="_Toc242562234"/>
+      <w:bookmarkStart w:id="8" w:name="_Toc242563735"/>
       <w:r>
         <w:rPr>
           <w:lang w:val="es-CL"/>
@@ -5229,7 +5229,7 @@
           <w:lang w:val="es-CL"/>
         </w:rPr>
       </w:pPr>
-      <w:bookmarkStart w:id="9" w:name="_Toc242562235"/>
+      <w:bookmarkStart w:id="9" w:name="_Toc242563736"/>
       <w:r>
         <w:rPr>
           <w:lang w:val="es-CL"/>
@@ -5398,7 +5398,7 @@
           <w:lang w:val="es-CL"/>
         </w:rPr>
       </w:pPr>
-      <w:bookmarkStart w:id="10" w:name="_Toc242562236"/>
+      <w:bookmarkStart w:id="10" w:name="_Toc242563737"/>
       <w:r>
         <w:rPr>
           <w:lang w:val="es-CL"/>
@@ -6188,7 +6188,7 @@
       <w:bookmarkStart w:id="13" w:name="_Toc324851945"/>
       <w:bookmarkStart w:id="14" w:name="_Toc324915528"/>
       <w:bookmarkStart w:id="15" w:name="_Toc433104441"/>
-      <w:bookmarkStart w:id="16" w:name="_Toc242562237"/>
+      <w:bookmarkStart w:id="16" w:name="_Toc242563738"/>
       <w:r>
         <w:rPr>
           <w:lang w:val="es-CL"/>
@@ -6335,7 +6335,7 @@
           <w:lang w:val="es-CL"/>
         </w:rPr>
       </w:pPr>
-      <w:bookmarkStart w:id="17" w:name="_Toc242562238"/>
+      <w:bookmarkStart w:id="17" w:name="_Toc242563739"/>
       <w:r>
         <w:rPr>
           <w:lang w:val="es-CL"/>
@@ -6385,7 +6385,7 @@
           <w:lang w:val="es-CL"/>
         </w:rPr>
       </w:pPr>
-      <w:bookmarkStart w:id="18" w:name="_Toc242562239"/>
+      <w:bookmarkStart w:id="18" w:name="_Toc242563740"/>
       <w:bookmarkEnd w:id="11"/>
       <w:bookmarkEnd w:id="12"/>
       <w:bookmarkEnd w:id="13"/>
@@ -6545,7 +6545,7 @@
         </w:rPr>
         <w:br w:type="page"/>
       </w:r>
-      <w:bookmarkStart w:id="19" w:name="_Toc242562240"/>
+      <w:bookmarkStart w:id="19" w:name="_Toc242563741"/>
       <w:r>
         <w:rPr>
           <w:lang w:val="es-CL"/>
@@ -6573,7 +6573,7 @@
           <w:lang w:val="es-CL"/>
         </w:rPr>
       </w:pPr>
-      <w:bookmarkStart w:id="20" w:name="_Toc242562241"/>
+      <w:bookmarkStart w:id="20" w:name="_Toc242563742"/>
       <w:r>
         <w:rPr>
           <w:lang w:val="es-CL"/>
@@ -6717,7 +6717,7 @@
           <w:lang w:val="es-CL"/>
         </w:rPr>
       </w:pPr>
-      <w:bookmarkStart w:id="21" w:name="_Toc242562242"/>
+      <w:bookmarkStart w:id="21" w:name="_Toc242563743"/>
       <w:r>
         <w:rPr>
           <w:lang w:val="es-CL"/>
@@ -6861,7 +6861,7 @@
           <w:lang w:val="es-CL"/>
         </w:rPr>
       </w:pPr>
-      <w:bookmarkStart w:id="22" w:name="_Toc242562243"/>
+      <w:bookmarkStart w:id="22" w:name="_Toc242563744"/>
       <w:r>
         <w:rPr>
           <w:lang w:val="es-CL"/>
@@ -6984,7 +6984,7 @@
         </w:rPr>
         <w:br w:type="page"/>
       </w:r>
-      <w:bookmarkStart w:id="23" w:name="_Toc242562244"/>
+      <w:bookmarkStart w:id="23" w:name="_Toc242563745"/>
       <w:r>
         <w:rPr>
           <w:lang w:val="es-ES"/>
@@ -7035,7 +7035,7 @@
           <w:lang w:val="es-ES"/>
         </w:rPr>
       </w:pPr>
-      <w:bookmarkStart w:id="24" w:name="_Toc242562245"/>
+      <w:bookmarkStart w:id="24" w:name="_Toc242563746"/>
       <w:r>
         <w:rPr>
           <w:lang w:val="es-CL"/>
@@ -7121,7 +7121,7 @@
           <w:lang w:val="es-CL"/>
         </w:rPr>
       </w:pPr>
-      <w:bookmarkStart w:id="25" w:name="_Toc242562246"/>
+      <w:bookmarkStart w:id="25" w:name="_Toc242563747"/>
       <w:r>
         <w:rPr>
           <w:lang w:val="es-CL"/>
@@ -8675,7 +8675,7 @@
           <w:lang w:val="es-CL"/>
         </w:rPr>
       </w:pPr>
-      <w:bookmarkStart w:id="26" w:name="_Toc242562247"/>
+      <w:bookmarkStart w:id="26" w:name="_Toc242563748"/>
       <w:r>
         <w:rPr>
           <w:lang w:val="es-CL"/>
@@ -9763,7 +9763,7 @@
           <w:lang w:val="es-ES"/>
         </w:rPr>
       </w:pPr>
-      <w:bookmarkStart w:id="27" w:name="_Toc242562248"/>
+      <w:bookmarkStart w:id="27" w:name="_Toc242563749"/>
       <w:r>
         <w:rPr>
           <w:lang w:val="es-ES"/>
@@ -10178,7 +10178,7 @@
           <w:numId w:val="0"/>
         </w:numPr>
       </w:pPr>
-      <w:bookmarkStart w:id="28" w:name="_Toc242562249"/>
+      <w:bookmarkStart w:id="28" w:name="_Toc242563750"/>
       <w:r>
         <w:t>Modelo de datos</w:t>
       </w:r>
@@ -11220,7 +11220,7 @@
           <w:numId w:val="0"/>
         </w:numPr>
       </w:pPr>
-      <w:bookmarkStart w:id="29" w:name="_Toc242562250"/>
+      <w:bookmarkStart w:id="29" w:name="_Toc242563751"/>
       <w:r>
         <w:t>Diccionario de datos</w:t>
       </w:r>
@@ -19798,7 +19798,7 @@
           <w:lang w:val="es-CL"/>
         </w:rPr>
       </w:pPr>
-      <w:bookmarkStart w:id="30" w:name="_Toc242562251"/>
+      <w:bookmarkStart w:id="30" w:name="_Toc242563752"/>
       <w:r>
         <w:rPr>
           <w:lang w:val="es-CL"/>
@@ -19897,7 +19897,7 @@
           <w:numId w:val="0"/>
         </w:numPr>
       </w:pPr>
-      <w:bookmarkStart w:id="31" w:name="_Toc242562252"/>
+      <w:bookmarkStart w:id="31" w:name="_Toc242563753"/>
       <w:r>
         <w:t>Flujo de autenticación y perfil (Sprint 1)</w:t>
       </w:r>
@@ -20643,7 +20643,7 @@
           <w:numId w:val="0"/>
         </w:numPr>
       </w:pPr>
-      <w:bookmarkStart w:id="32" w:name="_Toc242562253"/>
+      <w:bookmarkStart w:id="32" w:name="_Toc242563754"/>
       <w:r>
         <w:t>Flujo de reserva de hora (Sprints 2 y 3)</w:t>
       </w:r>
@@ -21086,7 +21086,7 @@
           <w:numId w:val="0"/>
         </w:numPr>
       </w:pPr>
-      <w:bookmarkStart w:id="33" w:name="_Toc242562254"/>
+      <w:bookmarkStart w:id="33" w:name="_Toc242563755"/>
       <w:r>
         <w:t>Flujo de recuperación de contraseña y acceso con Google (Sprint 2)</w:t>
       </w:r>
@@ -21697,7 +21697,7 @@
           <w:numId w:val="0"/>
         </w:numPr>
       </w:pPr>
-      <w:bookmarkStart w:id="34" w:name="_Toc242562255"/>
+      <w:bookmarkStart w:id="34" w:name="_Toc242563756"/>
       <w:r>
         <w:t>Flujo de búsqueda de profesionales, favoritos y reseñas (Sprint 3)</w:t>
       </w:r>
@@ -22081,7 +22081,7 @@
           <w:numId w:val="0"/>
         </w:numPr>
       </w:pPr>
-      <w:bookmarkStart w:id="35" w:name="_Toc242562256"/>
+      <w:bookmarkStart w:id="35" w:name="_Toc242563757"/>
       <w:r>
         <w:t>Flujo del espacio del profesional (Sprint 3)</w:t>
       </w:r>
@@ -22467,7 +22467,7 @@
       <w:pPr>
         <w:pStyle w:val="EstiloTtulo2VerdanaJustificado"/>
       </w:pPr>
-      <w:bookmarkStart w:id="36" w:name="_Toc242562257"/>
+      <w:bookmarkStart w:id="36" w:name="_Toc242563758"/>
       <w:r>
         <w:t>Flujo de verificación de profesionales</w:t>
       </w:r>
@@ -22485,7 +22485,7 @@
     </w:p>
     <w:p>
       <w:r>
-        <w:t>El administrador busca y filtra pendientes, verificados o rechazados, abre Información, Documentos e Historial y decide aprobar, rechazar o revocar. Rechazo y revocación exigen un motivo de 5 a 500 caracteres. La transacción con Prisma compartido registra fecha, administrador y acción e incrementa revision_verificacion. Una revisión desactualizada o una cuenta inactiva recibe 409. Aprobar exige los documentos obligatorios y RUT válido; las verificaciones anteriores se conservan. El PATCH legado aplica las mismas reglas y devuelve { id, verificado }.</w:t>
+        <w:t>El administrador busca y filtra pendientes, verificados o rechazados, abre Información, Documentos e Historial y decide aprobar, rechazar o revocar. Rechazo y revocación exigen un motivo de 5 a 500 caracteres. La transacción con Prisma compartido registra fecha, administrador y acción e incrementa revision_verificacion. Una revisión desactualizada o una cuenta inactiva recibe 409. Aprobar exige los documentos obligatorios y RUT válido; las verificaciones anteriores se conservan. El PATCH legado aplica las mismas reglas y devuelve { id, verificado }. Rechazo y revocación cierran la solicitud (409); Aprobar/Rechazar vuelve solo tras el reenvío del profesional.</w:t>
       </w:r>
     </w:p>
     <w:p>
@@ -22500,7 +22500,7 @@
     </w:p>
     <w:p>
       <w:r>
-        <w:t>Validación final del PR #17 al 10-10-2026: 206 pruebas backend en 25 suites y 161 frontend en 21 archivos aprobadas; lint de ambas capas y build correctos. Incluye recarga con apartados vacíos, envío incompleto bloqueado, documentos independientes, formato del RUT y exclusión de archivos anteriores tras rechazo/revocación. Inicialmente se realizaron 17 comprobaciones con MySQL y cuentas/archivos temporales, además de revisión de las vistas en Edge a 1440 y 390 px. Los casos están en Plan de Pruebas/FS-HU-12_Verificacion.md. La aceptación del PO sigue pendiente.</w:t>
+        <w:t>Validación final del PR #17 al 10-10-2026: 208 pruebas backend en 25 suites y 163 frontend en 21 archivos aprobadas; lint de ambas capas y build correctos. Incluye cierre tras rechazo/revocación y reapertura solo por reenvío, recarga con apartados vacíos, envío incompleto bloqueado, documentos independientes, formato del RUT y exclusión de archivos anteriores tras rechazo/revocación. Inicialmente se realizaron 17 comprobaciones con MySQL y cuentas/archivos temporales, además de revisión de las vistas en Edge a 1440 y 390 px. Los casos están en Plan de Pruebas/FS-HU-12_Verificacion.md. La aceptación del PO sigue pendiente.</w:t>
       </w:r>
     </w:p>
     <w:p>
@@ -22515,7 +22515,7 @@
           <w:lang w:val="es-ES"/>
         </w:rPr>
       </w:pPr>
-      <w:bookmarkStart w:id="37" w:name="_Toc242562258"/>
+      <w:bookmarkStart w:id="37" w:name="_Toc242563759"/>
       <w:r>
         <w:rPr>
           <w:lang w:val="es-ES"/>
@@ -23197,7 +23197,7 @@
         </w:rPr>
         <w:br w:type="page"/>
       </w:r>
-      <w:bookmarkStart w:id="38" w:name="_Toc242562259"/>
+      <w:bookmarkStart w:id="38" w:name="_Toc242563760"/>
       <w:r>
         <w:rPr>
           <w:lang w:val="es-ES"/>
@@ -23290,7 +23290,7 @@
         <w:lastRenderedPageBreak/>
         <w:drawing>
           <wp:inline distT="0" distB="0" distL="0" distR="0" wp14:anchorId="6152AB04" wp14:editId="3B7798A9">
-            <wp:extent cx="3060757" cy="6344375"/>
+            <wp:extent cx="3060757" cy="6535672"/>
             <wp:effectExtent l="0" t="0" r="0" b="0"/>
             <wp:docPr id="900" name="Flujo de verificación administrativa" descr="Solicitud con documentos privados, revisión, rechazo, aprobación y revocación."/>
             <wp:cNvGraphicFramePr>
@@ -23312,7 +23312,7 @@
                   <pic:spPr>
                     <a:xfrm>
                       <a:off x="0" y="0"/>
-                      <a:ext cx="3060757" cy="6344375"/>
+                      <a:ext cx="3060757" cy="6535672"/>
                     </a:xfrm>
                     <a:prstGeom prst="rect">
                       <a:avLst/>
@@ -23582,7 +23582,14 @@
               <w:rPr>
                 <w:sz w:val="17"/>
               </w:rPr>
-              <w:t>API REST, autenticación, lógica de negocio e integración con servicios externos.</w:t>
+              <w:t xml:space="preserve">API REST, autenticación, lógica de negocio e integración con servicios </w:t>
+            </w:r>
+            <w:r>
+              <w:rPr>
+                <w:sz w:val="17"/>
+              </w:rPr>
+              <w:lastRenderedPageBreak/>
+              <w:t>externos.</w:t>
             </w:r>
           </w:p>
         </w:tc>
@@ -23595,6 +23602,7 @@
               <w:rPr>
                 <w:sz w:val="17"/>
               </w:rPr>
+              <w:lastRenderedPageBreak/>
               <w:t>3000 (red interna)</w:t>
             </w:r>
           </w:p>
@@ -23637,14 +23645,7 @@
               <w:rPr>
                 <w:sz w:val="17"/>
               </w:rPr>
-              <w:t xml:space="preserve">Persistencia de datos en un volumen </w:t>
-            </w:r>
-            <w:r>
-              <w:rPr>
-                <w:sz w:val="17"/>
-              </w:rPr>
-              <w:lastRenderedPageBreak/>
-              <w:t>Docker.</w:t>
+              <w:t>Persistencia de datos en un volumen Docker.</w:t>
             </w:r>
           </w:p>
         </w:tc>
@@ -23657,15 +23658,7 @@
               <w:rPr>
                 <w:sz w:val="17"/>
               </w:rPr>
-              <w:lastRenderedPageBreak/>
-              <w:t xml:space="preserve">3306 (red </w:t>
-            </w:r>
-            <w:r>
-              <w:rPr>
-                <w:sz w:val="17"/>
-              </w:rPr>
-              <w:lastRenderedPageBreak/>
-              <w:t>interna)</w:t>
+              <w:t>3306 (red interna)</w:t>
             </w:r>
           </w:p>
         </w:tc>
@@ -23681,7 +23674,6 @@
                 <w:b/>
                 <w:sz w:val="17"/>
               </w:rPr>
-              <w:lastRenderedPageBreak/>
               <w:t>Google Maps Platform</w:t>
             </w:r>
           </w:p>
@@ -24705,7 +24697,7 @@
         </w:rPr>
       </w:pPr>
       <w:r>
-        <w:t>En el ambiente de desarrollo local la comunicación con el frontend y el backend se realiza por HTTP; HTTPS se habilita en el despliegue final.</w:t>
+        <w:t>Desarrollo local: HTTP. El despliegue final habilita HTTPS.</w:t>
       </w:r>
     </w:p>
     <w:p>
@@ -24727,7 +24719,7 @@
         </w:rPr>
         <w:br w:type="page"/>
       </w:r>
-      <w:bookmarkStart w:id="39" w:name="_Toc242562260"/>
+      <w:bookmarkStart w:id="39" w:name="_Toc242563761"/>
       <w:r>
         <w:rPr>
           <w:lang w:val="es-ES"/>
@@ -25483,7 +25475,7 @@
         </w:rPr>
         <w:br w:type="page"/>
       </w:r>
-      <w:bookmarkStart w:id="40" w:name="_Toc242562261"/>
+      <w:bookmarkStart w:id="40" w:name="_Toc242563762"/>
       <w:r>
         <w:rPr>
           <w:lang w:val="es-ES"/>
@@ -27269,7 +27261,7 @@
         </w:rPr>
         <w:br w:type="page"/>
       </w:r>
-      <w:bookmarkStart w:id="41" w:name="_Toc242562262"/>
+      <w:bookmarkStart w:id="41" w:name="_Toc242563763"/>
       <w:r>
         <w:rPr>
           <w:lang w:val="es-ES"/>

</xml_diff>

<commit_message>
Corrige solicitudes de verificación y documentación de revisión
</commit_message>
<xml_diff>
--- a/FASE 2/Evidencias Proyecto/Evidencias de documentación/Documento de Arquitectura (DAS)/Documento_Arquitectura_Sistema_DAS_.docx
+++ b/FASE 2/Evidencias Proyecto/Evidencias de documentación/Documento de Arquitectura (DAS)/Documento_Arquitectura_Sistema_DAS_.docx
@@ -237,7 +237,7 @@
           <w:szCs w:val="36"/>
           <w:lang w:val="es-CL"/>
         </w:rPr>
-        <w:t>Versión 1.18</w:t>
+        <w:t>Versión 1.19</w:t>
       </w:r>
     </w:p>
     <w:p>
@@ -561,7 +561,7 @@
           </w:tcPr>
           <w:p>
             <w:r>
-              <w:t>1.18</w:t>
+              <w:t>1.19</w:t>
             </w:r>
           </w:p>
         </w:tc>
@@ -670,7 +670,7 @@
               <w:ind w:left="1440" w:hanging="1440"/>
             </w:pPr>
             <w:r>
-              <w:t>10-10-2026</w:t>
+              <w:t>11-10-2026</w:t>
             </w:r>
           </w:p>
         </w:tc>
@@ -2240,6 +2240,75 @@
           </w:p>
         </w:tc>
       </w:tr>
+      <w:tr>
+        <w:trPr>
+          <w:cantSplit/>
+        </w:trPr>
+        <w:tc>
+          <w:tcPr>
+            <w:tcW w:w="2196" w:type="dxa"/>
+          </w:tcPr>
+          <w:p>
+            <w:pPr>
+              <w:pStyle w:val="Tabletext"/>
+              <w:rPr>
+                <w:lang w:val="es-CL"/>
+              </w:rPr>
+            </w:pPr>
+            <w:r>
+              <w:t>11-10-2026</w:t>
+            </w:r>
+          </w:p>
+        </w:tc>
+        <w:tc>
+          <w:tcPr>
+            <w:tcW w:w="1152" w:type="dxa"/>
+          </w:tcPr>
+          <w:p>
+            <w:pPr>
+              <w:pStyle w:val="Tabletext"/>
+              <w:rPr>
+                <w:lang w:val="es-CL"/>
+              </w:rPr>
+            </w:pPr>
+            <w:r>
+              <w:t>1.19</w:t>
+            </w:r>
+          </w:p>
+        </w:tc>
+        <w:tc>
+          <w:tcPr>
+            <w:tcW w:w="3744" w:type="dxa"/>
+          </w:tcPr>
+          <w:p>
+            <w:pPr>
+              <w:pStyle w:val="Tabletext"/>
+              <w:rPr>
+                <w:lang w:val="es-CL"/>
+              </w:rPr>
+            </w:pPr>
+            <w:r>
+              <w:t>Correcciones del PR #19: sin_solicitud antes de enviar, adjuntos vigentes al recargar, históricos sin bloqueo y cambio de especialidad tratado como revocación. Migración correctiva y separación de rutas/servicios/modelos. 213 pruebas backend, 165 frontend y 49 comprobaciones con MySQL real. Drive pendiente hasta fusionar.</w:t>
+            </w:r>
+          </w:p>
+        </w:tc>
+        <w:tc>
+          <w:tcPr>
+            <w:tcW w:w="1908" w:type="dxa"/>
+          </w:tcPr>
+          <w:p>
+            <w:pPr>
+              <w:pStyle w:val="Tabletext"/>
+              <w:rPr>
+                <w:lang w:val="es-CL"/>
+              </w:rPr>
+            </w:pPr>
+            <w:r>
+              <w:t>Luis Méndez</w:t>
+            </w:r>
+          </w:p>
+        </w:tc>
+      </w:tr>
     </w:tbl>
     <w:p>
       <w:pPr>
@@ -2303,7 +2372,7 @@
         </w:rPr>
         <w:fldChar w:fldCharType="separate"/>
       </w:r>
-      <w:hyperlink w:anchor="_Toc242563733" w:history="1">
+      <w:hyperlink w:anchor="_Toc242571426" w:history="1">
         <w:r>
           <w:rPr>
             <w:rStyle w:val="Hipervnculo"/>
@@ -2354,7 +2423,7 @@
             <w:noProof/>
             <w:webHidden/>
           </w:rPr>
-          <w:instrText xml:space="preserve"> PAGEREF _Toc242563733 \h </w:instrText>
+          <w:instrText xml:space="preserve"> PAGEREF _Toc242571426 \h </w:instrText>
         </w:r>
         <w:r>
           <w:rPr>
@@ -2403,7 +2472,7 @@
           <w14:ligatures w14:val="standardContextual"/>
         </w:rPr>
       </w:pPr>
-      <w:hyperlink w:anchor="_Toc242563734" w:history="1">
+      <w:hyperlink w:anchor="_Toc242571427" w:history="1">
         <w:r>
           <w:rPr>
             <w:rStyle w:val="Hipervnculo"/>
@@ -2452,7 +2521,7 @@
             <w:noProof/>
             <w:webHidden/>
           </w:rPr>
-          <w:instrText xml:space="preserve"> PAGEREF _Toc242563734 \h </w:instrText>
+          <w:instrText xml:space="preserve"> PAGEREF _Toc242571427 \h </w:instrText>
         </w:r>
         <w:r>
           <w:rPr>
@@ -2501,7 +2570,7 @@
           <w14:ligatures w14:val="standardContextual"/>
         </w:rPr>
       </w:pPr>
-      <w:hyperlink w:anchor="_Toc242563735" w:history="1">
+      <w:hyperlink w:anchor="_Toc242571428" w:history="1">
         <w:r>
           <w:rPr>
             <w:rStyle w:val="Hipervnculo"/>
@@ -2550,7 +2619,7 @@
             <w:noProof/>
             <w:webHidden/>
           </w:rPr>
-          <w:instrText xml:space="preserve"> PAGEREF _Toc242563735 \h </w:instrText>
+          <w:instrText xml:space="preserve"> PAGEREF _Toc242571428 \h </w:instrText>
         </w:r>
         <w:r>
           <w:rPr>
@@ -2599,7 +2668,7 @@
           <w14:ligatures w14:val="standardContextual"/>
         </w:rPr>
       </w:pPr>
-      <w:hyperlink w:anchor="_Toc242563736" w:history="1">
+      <w:hyperlink w:anchor="_Toc242571429" w:history="1">
         <w:r>
           <w:rPr>
             <w:rStyle w:val="Hipervnculo"/>
@@ -2648,7 +2717,7 @@
             <w:noProof/>
             <w:webHidden/>
           </w:rPr>
-          <w:instrText xml:space="preserve"> PAGEREF _Toc242563736 \h </w:instrText>
+          <w:instrText xml:space="preserve"> PAGEREF _Toc242571429 \h </w:instrText>
         </w:r>
         <w:r>
           <w:rPr>
@@ -2697,7 +2766,7 @@
           <w14:ligatures w14:val="standardContextual"/>
         </w:rPr>
       </w:pPr>
-      <w:hyperlink w:anchor="_Toc242563737" w:history="1">
+      <w:hyperlink w:anchor="_Toc242571430" w:history="1">
         <w:r>
           <w:rPr>
             <w:rStyle w:val="Hipervnculo"/>
@@ -2746,7 +2815,7 @@
             <w:noProof/>
             <w:webHidden/>
           </w:rPr>
-          <w:instrText xml:space="preserve"> PAGEREF _Toc242563737 \h </w:instrText>
+          <w:instrText xml:space="preserve"> PAGEREF _Toc242571430 \h </w:instrText>
         </w:r>
         <w:r>
           <w:rPr>
@@ -2795,7 +2864,7 @@
           <w14:ligatures w14:val="standardContextual"/>
         </w:rPr>
       </w:pPr>
-      <w:hyperlink w:anchor="_Toc242563738" w:history="1">
+      <w:hyperlink w:anchor="_Toc242571431" w:history="1">
         <w:r>
           <w:rPr>
             <w:rStyle w:val="Hipervnculo"/>
@@ -2844,7 +2913,7 @@
             <w:noProof/>
             <w:webHidden/>
           </w:rPr>
-          <w:instrText xml:space="preserve"> PAGEREF _Toc242563738 \h </w:instrText>
+          <w:instrText xml:space="preserve"> PAGEREF _Toc242571431 \h </w:instrText>
         </w:r>
         <w:r>
           <w:rPr>
@@ -2893,7 +2962,7 @@
           <w14:ligatures w14:val="standardContextual"/>
         </w:rPr>
       </w:pPr>
-      <w:hyperlink w:anchor="_Toc242563739" w:history="1">
+      <w:hyperlink w:anchor="_Toc242571432" w:history="1">
         <w:r>
           <w:rPr>
             <w:rStyle w:val="Hipervnculo"/>
@@ -2942,7 +3011,7 @@
             <w:noProof/>
             <w:webHidden/>
           </w:rPr>
-          <w:instrText xml:space="preserve"> PAGEREF _Toc242563739 \h </w:instrText>
+          <w:instrText xml:space="preserve"> PAGEREF _Toc242571432 \h </w:instrText>
         </w:r>
         <w:r>
           <w:rPr>
@@ -2991,7 +3060,7 @@
           <w14:ligatures w14:val="standardContextual"/>
         </w:rPr>
       </w:pPr>
-      <w:hyperlink w:anchor="_Toc242563740" w:history="1">
+      <w:hyperlink w:anchor="_Toc242571433" w:history="1">
         <w:r>
           <w:rPr>
             <w:rStyle w:val="Hipervnculo"/>
@@ -3040,7 +3109,7 @@
             <w:noProof/>
             <w:webHidden/>
           </w:rPr>
-          <w:instrText xml:space="preserve"> PAGEREF _Toc242563740 \h </w:instrText>
+          <w:instrText xml:space="preserve"> PAGEREF _Toc242571433 \h </w:instrText>
         </w:r>
         <w:r>
           <w:rPr>
@@ -3091,7 +3160,7 @@
           <w14:ligatures w14:val="standardContextual"/>
         </w:rPr>
       </w:pPr>
-      <w:hyperlink w:anchor="_Toc242563741" w:history="1">
+      <w:hyperlink w:anchor="_Toc242571434" w:history="1">
         <w:r>
           <w:rPr>
             <w:rStyle w:val="Hipervnculo"/>
@@ -3142,7 +3211,7 @@
             <w:noProof/>
             <w:webHidden/>
           </w:rPr>
-          <w:instrText xml:space="preserve"> PAGEREF _Toc242563741 \h </w:instrText>
+          <w:instrText xml:space="preserve"> PAGEREF _Toc242571434 \h </w:instrText>
         </w:r>
         <w:r>
           <w:rPr>
@@ -3191,7 +3260,7 @@
           <w14:ligatures w14:val="standardContextual"/>
         </w:rPr>
       </w:pPr>
-      <w:hyperlink w:anchor="_Toc242563742" w:history="1">
+      <w:hyperlink w:anchor="_Toc242571435" w:history="1">
         <w:r>
           <w:rPr>
             <w:rStyle w:val="Hipervnculo"/>
@@ -3240,7 +3309,7 @@
             <w:noProof/>
             <w:webHidden/>
           </w:rPr>
-          <w:instrText xml:space="preserve"> PAGEREF _Toc242563742 \h </w:instrText>
+          <w:instrText xml:space="preserve"> PAGEREF _Toc242571435 \h </w:instrText>
         </w:r>
         <w:r>
           <w:rPr>
@@ -3289,7 +3358,7 @@
           <w14:ligatures w14:val="standardContextual"/>
         </w:rPr>
       </w:pPr>
-      <w:hyperlink w:anchor="_Toc242563743" w:history="1">
+      <w:hyperlink w:anchor="_Toc242571436" w:history="1">
         <w:r>
           <w:rPr>
             <w:rStyle w:val="Hipervnculo"/>
@@ -3338,7 +3407,7 @@
             <w:noProof/>
             <w:webHidden/>
           </w:rPr>
-          <w:instrText xml:space="preserve"> PAGEREF _Toc242563743 \h </w:instrText>
+          <w:instrText xml:space="preserve"> PAGEREF _Toc242571436 \h </w:instrText>
         </w:r>
         <w:r>
           <w:rPr>
@@ -3387,7 +3456,7 @@
           <w14:ligatures w14:val="standardContextual"/>
         </w:rPr>
       </w:pPr>
-      <w:hyperlink w:anchor="_Toc242563744" w:history="1">
+      <w:hyperlink w:anchor="_Toc242571437" w:history="1">
         <w:r>
           <w:rPr>
             <w:rStyle w:val="Hipervnculo"/>
@@ -3436,7 +3505,7 @@
             <w:noProof/>
             <w:webHidden/>
           </w:rPr>
-          <w:instrText xml:space="preserve"> PAGEREF _Toc242563744 \h </w:instrText>
+          <w:instrText xml:space="preserve"> PAGEREF _Toc242571437 \h </w:instrText>
         </w:r>
         <w:r>
           <w:rPr>
@@ -3487,7 +3556,7 @@
           <w14:ligatures w14:val="standardContextual"/>
         </w:rPr>
       </w:pPr>
-      <w:hyperlink w:anchor="_Toc242563745" w:history="1">
+      <w:hyperlink w:anchor="_Toc242571438" w:history="1">
         <w:r>
           <w:rPr>
             <w:rStyle w:val="Hipervnculo"/>
@@ -3538,7 +3607,7 @@
             <w:noProof/>
             <w:webHidden/>
           </w:rPr>
-          <w:instrText xml:space="preserve"> PAGEREF _Toc242563745 \h </w:instrText>
+          <w:instrText xml:space="preserve"> PAGEREF _Toc242571438 \h </w:instrText>
         </w:r>
         <w:r>
           <w:rPr>
@@ -3587,7 +3656,7 @@
           <w14:ligatures w14:val="standardContextual"/>
         </w:rPr>
       </w:pPr>
-      <w:hyperlink w:anchor="_Toc242563746" w:history="1">
+      <w:hyperlink w:anchor="_Toc242571439" w:history="1">
         <w:r>
           <w:rPr>
             <w:rStyle w:val="Hipervnculo"/>
@@ -3636,7 +3705,7 @@
             <w:noProof/>
             <w:webHidden/>
           </w:rPr>
-          <w:instrText xml:space="preserve"> PAGEREF _Toc242563746 \h </w:instrText>
+          <w:instrText xml:space="preserve"> PAGEREF _Toc242571439 \h </w:instrText>
         </w:r>
         <w:r>
           <w:rPr>
@@ -3685,7 +3754,7 @@
           <w14:ligatures w14:val="standardContextual"/>
         </w:rPr>
       </w:pPr>
-      <w:hyperlink w:anchor="_Toc242563747" w:history="1">
+      <w:hyperlink w:anchor="_Toc242571440" w:history="1">
         <w:r>
           <w:rPr>
             <w:rStyle w:val="Hipervnculo"/>
@@ -3734,7 +3803,7 @@
             <w:noProof/>
             <w:webHidden/>
           </w:rPr>
-          <w:instrText xml:space="preserve"> PAGEREF _Toc242563747 \h </w:instrText>
+          <w:instrText xml:space="preserve"> PAGEREF _Toc242571440 \h </w:instrText>
         </w:r>
         <w:r>
           <w:rPr>
@@ -3783,7 +3852,7 @@
           <w14:ligatures w14:val="standardContextual"/>
         </w:rPr>
       </w:pPr>
-      <w:hyperlink w:anchor="_Toc242563748" w:history="1">
+      <w:hyperlink w:anchor="_Toc242571441" w:history="1">
         <w:r>
           <w:rPr>
             <w:rStyle w:val="Hipervnculo"/>
@@ -3832,7 +3901,7 @@
             <w:noProof/>
             <w:webHidden/>
           </w:rPr>
-          <w:instrText xml:space="preserve"> PAGEREF _Toc242563748 \h </w:instrText>
+          <w:instrText xml:space="preserve"> PAGEREF _Toc242571441 \h </w:instrText>
         </w:r>
         <w:r>
           <w:rPr>
@@ -3882,7 +3951,7 @@
           <w14:ligatures w14:val="standardContextual"/>
         </w:rPr>
       </w:pPr>
-      <w:hyperlink w:anchor="_Toc242563749" w:history="1">
+      <w:hyperlink w:anchor="_Toc242571442" w:history="1">
         <w:r>
           <w:rPr>
             <w:rStyle w:val="Hipervnculo"/>
@@ -3910,7 +3979,7 @@
             <w:noProof/>
             <w:webHidden/>
           </w:rPr>
-          <w:instrText xml:space="preserve"> PAGEREF _Toc242563749 \h </w:instrText>
+          <w:instrText xml:space="preserve"> PAGEREF _Toc242571442 \h </w:instrText>
         </w:r>
         <w:r>
           <w:rPr>
@@ -3958,7 +4027,7 @@
           <w14:ligatures w14:val="standardContextual"/>
         </w:rPr>
       </w:pPr>
-      <w:hyperlink w:anchor="_Toc242563750" w:history="1">
+      <w:hyperlink w:anchor="_Toc242571443" w:history="1">
         <w:r>
           <w:rPr>
             <w:rStyle w:val="Hipervnculo"/>
@@ -3985,7 +4054,7 @@
             <w:noProof/>
             <w:webHidden/>
           </w:rPr>
-          <w:instrText xml:space="preserve"> PAGEREF _Toc242563750 \h </w:instrText>
+          <w:instrText xml:space="preserve"> PAGEREF _Toc242571443 \h </w:instrText>
         </w:r>
         <w:r>
           <w:rPr>
@@ -4033,7 +4102,7 @@
           <w14:ligatures w14:val="standardContextual"/>
         </w:rPr>
       </w:pPr>
-      <w:hyperlink w:anchor="_Toc242563751" w:history="1">
+      <w:hyperlink w:anchor="_Toc242571444" w:history="1">
         <w:r>
           <w:rPr>
             <w:rStyle w:val="Hipervnculo"/>
@@ -4060,7 +4129,7 @@
             <w:noProof/>
             <w:webHidden/>
           </w:rPr>
-          <w:instrText xml:space="preserve"> PAGEREF _Toc242563751 \h </w:instrText>
+          <w:instrText xml:space="preserve"> PAGEREF _Toc242571444 \h </w:instrText>
         </w:r>
         <w:r>
           <w:rPr>
@@ -4110,7 +4179,7 @@
           <w14:ligatures w14:val="standardContextual"/>
         </w:rPr>
       </w:pPr>
-      <w:hyperlink w:anchor="_Toc242563752" w:history="1">
+      <w:hyperlink w:anchor="_Toc242571445" w:history="1">
         <w:r>
           <w:rPr>
             <w:rStyle w:val="Hipervnculo"/>
@@ -4138,7 +4207,7 @@
             <w:noProof/>
             <w:webHidden/>
           </w:rPr>
-          <w:instrText xml:space="preserve"> PAGEREF _Toc242563752 \h </w:instrText>
+          <w:instrText xml:space="preserve"> PAGEREF _Toc242571445 \h </w:instrText>
         </w:r>
         <w:r>
           <w:rPr>
@@ -4186,7 +4255,7 @@
           <w14:ligatures w14:val="standardContextual"/>
         </w:rPr>
       </w:pPr>
-      <w:hyperlink w:anchor="_Toc242563753" w:history="1">
+      <w:hyperlink w:anchor="_Toc242571446" w:history="1">
         <w:r>
           <w:rPr>
             <w:rStyle w:val="Hipervnculo"/>
@@ -4213,7 +4282,7 @@
             <w:noProof/>
             <w:webHidden/>
           </w:rPr>
-          <w:instrText xml:space="preserve"> PAGEREF _Toc242563753 \h </w:instrText>
+          <w:instrText xml:space="preserve"> PAGEREF _Toc242571446 \h </w:instrText>
         </w:r>
         <w:r>
           <w:rPr>
@@ -4261,7 +4330,7 @@
           <w14:ligatures w14:val="standardContextual"/>
         </w:rPr>
       </w:pPr>
-      <w:hyperlink w:anchor="_Toc242563754" w:history="1">
+      <w:hyperlink w:anchor="_Toc242571447" w:history="1">
         <w:r>
           <w:rPr>
             <w:rStyle w:val="Hipervnculo"/>
@@ -4288,7 +4357,7 @@
             <w:noProof/>
             <w:webHidden/>
           </w:rPr>
-          <w:instrText xml:space="preserve"> PAGEREF _Toc242563754 \h </w:instrText>
+          <w:instrText xml:space="preserve"> PAGEREF _Toc242571447 \h </w:instrText>
         </w:r>
         <w:r>
           <w:rPr>
@@ -4336,7 +4405,7 @@
           <w14:ligatures w14:val="standardContextual"/>
         </w:rPr>
       </w:pPr>
-      <w:hyperlink w:anchor="_Toc242563755" w:history="1">
+      <w:hyperlink w:anchor="_Toc242571448" w:history="1">
         <w:r>
           <w:rPr>
             <w:rStyle w:val="Hipervnculo"/>
@@ -4363,7 +4432,7 @@
             <w:noProof/>
             <w:webHidden/>
           </w:rPr>
-          <w:instrText xml:space="preserve"> PAGEREF _Toc242563755 \h </w:instrText>
+          <w:instrText xml:space="preserve"> PAGEREF _Toc242571448 \h </w:instrText>
         </w:r>
         <w:r>
           <w:rPr>
@@ -4411,7 +4480,7 @@
           <w14:ligatures w14:val="standardContextual"/>
         </w:rPr>
       </w:pPr>
-      <w:hyperlink w:anchor="_Toc242563756" w:history="1">
+      <w:hyperlink w:anchor="_Toc242571449" w:history="1">
         <w:r>
           <w:rPr>
             <w:rStyle w:val="Hipervnculo"/>
@@ -4438,7 +4507,7 @@
             <w:noProof/>
             <w:webHidden/>
           </w:rPr>
-          <w:instrText xml:space="preserve"> PAGEREF _Toc242563756 \h </w:instrText>
+          <w:instrText xml:space="preserve"> PAGEREF _Toc242571449 \h </w:instrText>
         </w:r>
         <w:r>
           <w:rPr>
@@ -4486,7 +4555,7 @@
           <w14:ligatures w14:val="standardContextual"/>
         </w:rPr>
       </w:pPr>
-      <w:hyperlink w:anchor="_Toc242563757" w:history="1">
+      <w:hyperlink w:anchor="_Toc242571450" w:history="1">
         <w:r>
           <w:rPr>
             <w:rStyle w:val="Hipervnculo"/>
@@ -4513,7 +4582,7 @@
             <w:noProof/>
             <w:webHidden/>
           </w:rPr>
-          <w:instrText xml:space="preserve"> PAGEREF _Toc242563757 \h </w:instrText>
+          <w:instrText xml:space="preserve"> PAGEREF _Toc242571450 \h </w:instrText>
         </w:r>
         <w:r>
           <w:rPr>
@@ -4562,7 +4631,7 @@
           <w14:ligatures w14:val="standardContextual"/>
         </w:rPr>
       </w:pPr>
-      <w:hyperlink w:anchor="_Toc242563758" w:history="1">
+      <w:hyperlink w:anchor="_Toc242571451" w:history="1">
         <w:r>
           <w:rPr>
             <w:rStyle w:val="Hipervnculo"/>
@@ -4609,7 +4678,7 @@
             <w:noProof/>
             <w:webHidden/>
           </w:rPr>
-          <w:instrText xml:space="preserve"> PAGEREF _Toc242563758 \h </w:instrText>
+          <w:instrText xml:space="preserve"> PAGEREF _Toc242571451 \h </w:instrText>
         </w:r>
         <w:r>
           <w:rPr>
@@ -4659,7 +4728,7 @@
           <w14:ligatures w14:val="standardContextual"/>
         </w:rPr>
       </w:pPr>
-      <w:hyperlink w:anchor="_Toc242563759" w:history="1">
+      <w:hyperlink w:anchor="_Toc242571452" w:history="1">
         <w:r>
           <w:rPr>
             <w:rStyle w:val="Hipervnculo"/>
@@ -4687,7 +4756,7 @@
             <w:noProof/>
             <w:webHidden/>
           </w:rPr>
-          <w:instrText xml:space="preserve"> PAGEREF _Toc242563759 \h </w:instrText>
+          <w:instrText xml:space="preserve"> PAGEREF _Toc242571452 \h </w:instrText>
         </w:r>
         <w:r>
           <w:rPr>
@@ -4737,7 +4806,7 @@
           <w14:ligatures w14:val="standardContextual"/>
         </w:rPr>
       </w:pPr>
-      <w:hyperlink w:anchor="_Toc242563760" w:history="1">
+      <w:hyperlink w:anchor="_Toc242571453" w:history="1">
         <w:r>
           <w:rPr>
             <w:rStyle w:val="Hipervnculo"/>
@@ -4765,7 +4834,7 @@
             <w:noProof/>
             <w:webHidden/>
           </w:rPr>
-          <w:instrText xml:space="preserve"> PAGEREF _Toc242563760 \h </w:instrText>
+          <w:instrText xml:space="preserve"> PAGEREF _Toc242571453 \h </w:instrText>
         </w:r>
         <w:r>
           <w:rPr>
@@ -4815,7 +4884,7 @@
           <w14:ligatures w14:val="standardContextual"/>
         </w:rPr>
       </w:pPr>
-      <w:hyperlink w:anchor="_Toc242563761" w:history="1">
+      <w:hyperlink w:anchor="_Toc242571454" w:history="1">
         <w:r>
           <w:rPr>
             <w:rStyle w:val="Hipervnculo"/>
@@ -4843,7 +4912,7 @@
             <w:noProof/>
             <w:webHidden/>
           </w:rPr>
-          <w:instrText xml:space="preserve"> PAGEREF _Toc242563761 \h </w:instrText>
+          <w:instrText xml:space="preserve"> PAGEREF _Toc242571454 \h </w:instrText>
         </w:r>
         <w:r>
           <w:rPr>
@@ -4863,7 +4932,7 @@
             <w:noProof/>
             <w:webHidden/>
           </w:rPr>
-          <w:t>39</w:t>
+          <w:t>40</w:t>
         </w:r>
         <w:r>
           <w:rPr>
@@ -4894,7 +4963,7 @@
           <w14:ligatures w14:val="standardContextual"/>
         </w:rPr>
       </w:pPr>
-      <w:hyperlink w:anchor="_Toc242563762" w:history="1">
+      <w:hyperlink w:anchor="_Toc242571455" w:history="1">
         <w:r>
           <w:rPr>
             <w:rStyle w:val="Hipervnculo"/>
@@ -4945,7 +5014,7 @@
             <w:noProof/>
             <w:webHidden/>
           </w:rPr>
-          <w:instrText xml:space="preserve"> PAGEREF _Toc242563762 \h </w:instrText>
+          <w:instrText xml:space="preserve"> PAGEREF _Toc242571455 \h </w:instrText>
         </w:r>
         <w:r>
           <w:rPr>
@@ -4965,7 +5034,7 @@
             <w:noProof/>
             <w:webHidden/>
           </w:rPr>
-          <w:t>40</w:t>
+          <w:t>41</w:t>
         </w:r>
         <w:r>
           <w:rPr>
@@ -4996,7 +5065,7 @@
           <w14:ligatures w14:val="standardContextual"/>
         </w:rPr>
       </w:pPr>
-      <w:hyperlink w:anchor="_Toc242563763" w:history="1">
+      <w:hyperlink w:anchor="_Toc242571456" w:history="1">
         <w:r>
           <w:rPr>
             <w:rStyle w:val="Hipervnculo"/>
@@ -5047,7 +5116,7 @@
             <w:noProof/>
             <w:webHidden/>
           </w:rPr>
-          <w:instrText xml:space="preserve"> PAGEREF _Toc242563763 \h </w:instrText>
+          <w:instrText xml:space="preserve"> PAGEREF _Toc242571456 \h </w:instrText>
         </w:r>
         <w:r>
           <w:rPr>
@@ -5067,7 +5136,7 @@
             <w:noProof/>
             <w:webHidden/>
           </w:rPr>
-          <w:t>45</w:t>
+          <w:t>46</w:t>
         </w:r>
         <w:r>
           <w:rPr>
@@ -5119,7 +5188,7 @@
         </w:rPr>
         <w:br w:type="page"/>
       </w:r>
-      <w:bookmarkStart w:id="1" w:name="_Toc242563733"/>
+      <w:bookmarkStart w:id="1" w:name="_Toc242571426"/>
       <w:r>
         <w:rPr>
           <w:lang w:val="es-CL"/>
@@ -5142,7 +5211,7 @@
       <w:bookmarkStart w:id="4" w:name="_Toc324851941"/>
       <w:bookmarkStart w:id="5" w:name="_Toc324915524"/>
       <w:bookmarkStart w:id="6" w:name="_Toc433104437"/>
-      <w:bookmarkStart w:id="7" w:name="_Toc242563734"/>
+      <w:bookmarkStart w:id="7" w:name="_Toc242571427"/>
       <w:r>
         <w:rPr>
           <w:lang w:val="es-CL"/>
@@ -5180,7 +5249,7 @@
           <w:lang w:val="es-CL"/>
         </w:rPr>
       </w:pPr>
-      <w:bookmarkStart w:id="8" w:name="_Toc242563735"/>
+      <w:bookmarkStart w:id="8" w:name="_Toc242571428"/>
       <w:r>
         <w:rPr>
           <w:lang w:val="es-CL"/>
@@ -5229,7 +5298,7 @@
           <w:lang w:val="es-CL"/>
         </w:rPr>
       </w:pPr>
-      <w:bookmarkStart w:id="9" w:name="_Toc242563736"/>
+      <w:bookmarkStart w:id="9" w:name="_Toc242571429"/>
       <w:r>
         <w:rPr>
           <w:lang w:val="es-CL"/>
@@ -5398,7 +5467,7 @@
           <w:lang w:val="es-CL"/>
         </w:rPr>
       </w:pPr>
-      <w:bookmarkStart w:id="10" w:name="_Toc242563737"/>
+      <w:bookmarkStart w:id="10" w:name="_Toc242571430"/>
       <w:r>
         <w:rPr>
           <w:lang w:val="es-CL"/>
@@ -6188,7 +6257,7 @@
       <w:bookmarkStart w:id="13" w:name="_Toc324851945"/>
       <w:bookmarkStart w:id="14" w:name="_Toc324915528"/>
       <w:bookmarkStart w:id="15" w:name="_Toc433104441"/>
-      <w:bookmarkStart w:id="16" w:name="_Toc242563738"/>
+      <w:bookmarkStart w:id="16" w:name="_Toc242571431"/>
       <w:r>
         <w:rPr>
           <w:lang w:val="es-CL"/>
@@ -6322,10 +6391,7 @@
         <w:rPr>
           <w:b/>
         </w:rPr>
-        <w:t xml:space="preserve">Diagramas fuente: </w:t>
-      </w:r>
-      <w:r>
-        <w:t>tablero de Miro del equipo y carpetas Diagramas (Miro)/Actualización Sprint 2 y Actualización Sprint 3. La actualización DAS 1.18 incorpora el panel del PR #17 y el diagrama 11 de verificación administrativa. Los diagramas de reservas, alimentación e IA conservan su condición de diseño previsto.</w:t>
+        <w:t>Diagramas fuente: tablero de Miro del equipo y carpetas Diagramas (Miro)/Actualización Sprint 2 y Actualización Sprint 3. La actualización DAS 1.19 incorpora el panel del PR #19 y el diagrama 11 de verificación administrativa. Los diagramas de reservas, alimentación e IA conservan su condición de diseño previsto.</w:t>
       </w:r>
     </w:p>
     <w:p>
@@ -6335,7 +6401,7 @@
           <w:lang w:val="es-CL"/>
         </w:rPr>
       </w:pPr>
-      <w:bookmarkStart w:id="17" w:name="_Toc242563739"/>
+      <w:bookmarkStart w:id="17" w:name="_Toc242571432"/>
       <w:r>
         <w:rPr>
           <w:lang w:val="es-CL"/>
@@ -6364,7 +6430,7 @@
         </w:rPr>
       </w:pPr>
       <w:r>
-        <w:t>FitSearch es una aplicación cliente-servidor en capas: React/Vite consume una API REST Node.js/Express, con JWT, MySQL y Prisma compartido. La implementación de la rama del PR #17 incorpora Dashboard, Profesionales, Verificaciones, Usuarios y Reportes administrativos, revisión documental privada y gestión de cuentas, junto con autenticación, perfiles, directorio, favoritos, reseñas, Google y Open-Meteo. Configuración y Contenido quedan fuera del panel autorizado. Claude, mapas y despliegue Docker/Nginx son capacidades previstas. El PR #17 y la aceptación de FS-HU-12 permanecen pendientes de revisión del PO; esta versión documenta la rama, no una fusión en main.</w:t>
+        <w:t>FitSearch es una aplicación cliente-servidor en capas: React/Vite consume una API REST Node.js/Express, con JWT, MySQL y Prisma compartido. La implementación de la rama del PR #19 incorpora Dashboard, Profesionales, Verificaciones, Usuarios y Reportes administrativos, revisión documental privada y gestión de cuentas, junto con autenticación, perfiles, directorio, favoritos, reseñas, Google y Open-Meteo. Configuración y Contenido quedan fuera del panel autorizado. Claude, mapas y despliegue Docker/Nginx son capacidades previstas. El PR #19 y la aceptación de FS-HU-12 permanecen pendientes de revisión del PO; esta versión documenta la rama, no una fusión en main.</w:t>
       </w:r>
     </w:p>
     <w:p>
@@ -6385,7 +6451,7 @@
           <w:lang w:val="es-CL"/>
         </w:rPr>
       </w:pPr>
-      <w:bookmarkStart w:id="18" w:name="_Toc242563740"/>
+      <w:bookmarkStart w:id="18" w:name="_Toc242571433"/>
       <w:bookmarkEnd w:id="11"/>
       <w:bookmarkEnd w:id="12"/>
       <w:bookmarkEnd w:id="13"/>
@@ -6545,7 +6611,7 @@
         </w:rPr>
         <w:br w:type="page"/>
       </w:r>
-      <w:bookmarkStart w:id="19" w:name="_Toc242563741"/>
+      <w:bookmarkStart w:id="19" w:name="_Toc242571434"/>
       <w:r>
         <w:rPr>
           <w:lang w:val="es-CL"/>
@@ -6573,7 +6639,7 @@
           <w:lang w:val="es-CL"/>
         </w:rPr>
       </w:pPr>
-      <w:bookmarkStart w:id="20" w:name="_Toc242563742"/>
+      <w:bookmarkStart w:id="20" w:name="_Toc242571435"/>
       <w:r>
         <w:rPr>
           <w:lang w:val="es-CL"/>
@@ -6644,10 +6710,7 @@
         <w:rPr>
           <w:b/>
         </w:rPr>
-        <w:t xml:space="preserve">Seguridad: </w:t>
-      </w:r>
-      <w:r>
-        <w:t>bcrypt, JWT y autorización por rol, con comprobación de usuarios.activo y version_sesion en cada petición protegida. Desactivar una cuenta invalida sus sesiones; reactivar exige un ingreso nuevo. Los documentos de certificación se almacenan fuera del acceso público y solo los descarga su propietario profesional o el administrador. Se valida la firma de PDF/PNG/JPEG, con límites de 5 MB y 20 documentos por ficha; no hay análisis antivirus ni acreditación automática. Google se valida en el backend y la recuperación usa enlaces de un solo uso (QS6). Credenciales y claves permanecen en variables del servidor; los datos de salud y documentos personales requieren acceso restringido.</w:t>
+        <w:t>Seguridad: bcrypt, JWT y autorización por rol, con comprobación de usuarios.activo y version_sesion en cada petición protegida. Desactivar una cuenta invalida sus sesiones; reactivar exige un ingreso nuevo. Los documentos de certificación se almacenan fuera del acceso público y solo los descarga su propietario profesional o el administrador. Se valida la firma de PDF/PNG/JPEG, con límites de 5 MB por archivo y solo el último documento vigente de cada tipo; no hay análisis antivirus ni acreditación automática. Google se valida en el backend y la recuperación usa enlaces de un solo uso (QS6). Credenciales y claves permanecen en variables del servidor; los datos de salud y documentos personales requieren acceso restringido.</w:t>
       </w:r>
     </w:p>
     <w:p>
@@ -6717,7 +6780,7 @@
           <w:lang w:val="es-CL"/>
         </w:rPr>
       </w:pPr>
-      <w:bookmarkStart w:id="21" w:name="_Toc242563743"/>
+      <w:bookmarkStart w:id="21" w:name="_Toc242571436"/>
       <w:r>
         <w:rPr>
           <w:lang w:val="es-CL"/>
@@ -6861,7 +6924,7 @@
           <w:lang w:val="es-CL"/>
         </w:rPr>
       </w:pPr>
-      <w:bookmarkStart w:id="22" w:name="_Toc242563744"/>
+      <w:bookmarkStart w:id="22" w:name="_Toc242571437"/>
       <w:r>
         <w:rPr>
           <w:lang w:val="es-CL"/>
@@ -6941,14 +7004,11 @@
         <w:rPr>
           <w:b/>
         </w:rPr>
+        <w:lastRenderedPageBreak/>
         <w:t xml:space="preserve">Protección de datos: </w:t>
       </w:r>
       <w:r>
-        <w:t xml:space="preserve">el perfil almacena datos de salud; se aplica el principio de </w:t>
-      </w:r>
-      <w:r>
-        <w:lastRenderedPageBreak/>
-        <w:t>minimización de datos y se consideran las exigencias de la normativa chilena de protección de datos personales.</w:t>
+        <w:t>el perfil almacena datos de salud; se aplica el principio de minimización de datos y se consideran las exigencias de la normativa chilena de protección de datos personales.</w:t>
       </w:r>
     </w:p>
     <w:p>
@@ -6984,7 +7044,7 @@
         </w:rPr>
         <w:br w:type="page"/>
       </w:r>
-      <w:bookmarkStart w:id="23" w:name="_Toc242563745"/>
+      <w:bookmarkStart w:id="23" w:name="_Toc242571438"/>
       <w:r>
         <w:rPr>
           <w:lang w:val="es-ES"/>
@@ -7035,7 +7095,7 @@
           <w:lang w:val="es-ES"/>
         </w:rPr>
       </w:pPr>
-      <w:bookmarkStart w:id="24" w:name="_Toc242563746"/>
+      <w:bookmarkStart w:id="24" w:name="_Toc242571439"/>
       <w:r>
         <w:rPr>
           <w:lang w:val="es-CL"/>
@@ -7121,7 +7181,7 @@
           <w:lang w:val="es-CL"/>
         </w:rPr>
       </w:pPr>
-      <w:bookmarkStart w:id="25" w:name="_Toc242563747"/>
+      <w:bookmarkStart w:id="25" w:name="_Toc242571440"/>
       <w:r>
         <w:rPr>
           <w:lang w:val="es-CL"/>
@@ -8675,7 +8735,7 @@
           <w:lang w:val="es-CL"/>
         </w:rPr>
       </w:pPr>
-      <w:bookmarkStart w:id="26" w:name="_Toc242563748"/>
+      <w:bookmarkStart w:id="26" w:name="_Toc242571441"/>
       <w:r>
         <w:rPr>
           <w:lang w:val="es-CL"/>
@@ -9763,7 +9823,7 @@
           <w:lang w:val="es-ES"/>
         </w:rPr>
       </w:pPr>
-      <w:bookmarkStart w:id="27" w:name="_Toc242563749"/>
+      <w:bookmarkStart w:id="27" w:name="_Toc242571442"/>
       <w:r>
         <w:rPr>
           <w:lang w:val="es-ES"/>
@@ -10178,7 +10238,7 @@
           <w:numId w:val="0"/>
         </w:numPr>
       </w:pPr>
-      <w:bookmarkStart w:id="28" w:name="_Toc242563750"/>
+      <w:bookmarkStart w:id="28" w:name="_Toc242571443"/>
       <w:r>
         <w:t>Modelo de datos</w:t>
       </w:r>
@@ -10193,7 +10253,7 @@
         </w:rPr>
       </w:pPr>
       <w:r>
-        <w:t>El modelo objetivo comprende quince tablas de dominio: diez implementadas en el PR #17 y cinco previstas para conversaciones, mensajes, alimentación, disponibilidad y reservas. documentos_profesionales amplía la verificación con metadatos de archivos privados; las tablas existentes incorporan el estado de cuenta, versión de sesión e historial de revisión.</w:t>
+        <w:t>El modelo objetivo comprende quince tablas de dominio: diez implementadas en el PR #19 y cinco previstas para conversaciones, mensajes, alimentación, disponibilidad y reservas. documentos_profesionales amplía la verificación con metadatos de archivos privados; las tablas existentes incorporan el estado de cuenta, versión de sesión e historial de revisión.</w:t>
       </w:r>
     </w:p>
     <w:tbl>
@@ -11220,7 +11280,7 @@
           <w:numId w:val="0"/>
         </w:numPr>
       </w:pPr>
-      <w:bookmarkStart w:id="29" w:name="_Toc242563751"/>
+      <w:bookmarkStart w:id="29" w:name="_Toc242571444"/>
       <w:r>
         <w:t>Diccionario de datos</w:t>
       </w:r>
@@ -13471,7 +13531,7 @@
               <w:rPr>
                 <w:sz w:val="17"/>
               </w:rPr>
-              <w:t>NOT NULL, DEFAULT pendiente</w:t>
+              <w:t>NOT NULL, DEFAULT sin_solicitud</w:t>
             </w:r>
           </w:p>
         </w:tc>
@@ -13484,7 +13544,7 @@
               <w:rPr>
                 <w:sz w:val="17"/>
               </w:rPr>
-              <w:t>Estado de revisión: pendiente, verificado o rechazado.</w:t>
+              <w:t>Estados: sin_solicitud, pendiente, verificado o rechazado. Solo un envío explícito abre Pendientes.</w:t>
             </w:r>
           </w:p>
         </w:tc>
@@ -13793,7 +13853,7 @@
         <w:rPr>
           <w:b/>
         </w:rPr>
-        <w:t>Tabla documentos_profesionales (FS-HU-12; PR #17)</w:t>
+        <w:t>Tabla documentos_profesionales (FS-HU-12; PR #19)</w:t>
       </w:r>
     </w:p>
     <w:tbl>
@@ -19798,7 +19858,7 @@
           <w:lang w:val="es-CL"/>
         </w:rPr>
       </w:pPr>
-      <w:bookmarkStart w:id="30" w:name="_Toc242563752"/>
+      <w:bookmarkStart w:id="30" w:name="_Toc242571445"/>
       <w:r>
         <w:rPr>
           <w:lang w:val="es-CL"/>
@@ -19897,7 +19957,7 @@
           <w:numId w:val="0"/>
         </w:numPr>
       </w:pPr>
-      <w:bookmarkStart w:id="31" w:name="_Toc242563753"/>
+      <w:bookmarkStart w:id="31" w:name="_Toc242571446"/>
       <w:r>
         <w:t>Flujo de autenticación y perfil (Sprint 1)</w:t>
       </w:r>
@@ -20643,7 +20703,7 @@
           <w:numId w:val="0"/>
         </w:numPr>
       </w:pPr>
-      <w:bookmarkStart w:id="32" w:name="_Toc242563754"/>
+      <w:bookmarkStart w:id="32" w:name="_Toc242571447"/>
       <w:r>
         <w:t>Flujo de reserva de hora (Sprints 2 y 3)</w:t>
       </w:r>
@@ -21086,7 +21146,7 @@
           <w:numId w:val="0"/>
         </w:numPr>
       </w:pPr>
-      <w:bookmarkStart w:id="33" w:name="_Toc242563755"/>
+      <w:bookmarkStart w:id="33" w:name="_Toc242571448"/>
       <w:r>
         <w:t>Flujo de recuperación de contraseña y acceso con Google (Sprint 2)</w:t>
       </w:r>
@@ -21697,7 +21757,7 @@
           <w:numId w:val="0"/>
         </w:numPr>
       </w:pPr>
-      <w:bookmarkStart w:id="34" w:name="_Toc242563756"/>
+      <w:bookmarkStart w:id="34" w:name="_Toc242571449"/>
       <w:r>
         <w:t>Flujo de búsqueda de profesionales, favoritos y reseñas (Sprint 3)</w:t>
       </w:r>
@@ -22081,7 +22141,7 @@
           <w:numId w:val="0"/>
         </w:numPr>
       </w:pPr>
-      <w:bookmarkStart w:id="35" w:name="_Toc242563757"/>
+      <w:bookmarkStart w:id="35" w:name="_Toc242571450"/>
       <w:r>
         <w:t>Flujo del espacio del profesional (Sprint 3)</w:t>
       </w:r>
@@ -22467,7 +22527,7 @@
       <w:pPr>
         <w:pStyle w:val="EstiloTtulo2VerdanaJustificado"/>
       </w:pPr>
-      <w:bookmarkStart w:id="36" w:name="_Toc242563758"/>
+      <w:bookmarkStart w:id="36" w:name="_Toc242571451"/>
       <w:r>
         <w:t>Flujo de verificación de profesionales</w:t>
       </w:r>
@@ -22475,12 +22535,12 @@
     </w:p>
     <w:p>
       <w:r>
-        <w:t>FS-HU-12 y CU-07. El PR #15 fusionó la verificación básica; el PR #17 incorpora el panel solicitado por el PO, con revisión documental, cuentas y reportes. El PO autorizó todas las vistas del mockup salvo Configuración y Contenido y delegó las reglas de documentos, rechazo y desactivación. La revisión/fusión del PR #17 y la aceptación final siguen pendientes. El Product Backlog conserva Sprint 5, prioridad baja y 3 puntos.</w:t>
+        <w:t>FS-HU-12 y CU-07. El PR #15 fusionó la verificación básica; el PR #19 incorpora el panel solicitado por el PO, con revisión documental, cuentas y reportes. El PO autorizó todas las vistas del mockup salvo Configuración y Contenido y delegó las reglas de documentos, rechazo y desactivación. La revisión/fusión del PR #19 y la aceptación final siguen pendientes. El Product Backlog conserva Sprint 5, prioridad baja y 3 puntos.</w:t>
       </w:r>
     </w:p>
     <w:p>
       <w:r>
-        <w:t>Certificaciones muestra bloques independientes para identidad y título obligatorios y antecedentes opcionales, con botones azules para adjuntar y envío naranjo. El RUT agrega automáticamente el guion y valida su dígito verificador. Si la solicitud no está verificada, recargar o reabrir vacía los apartados; el envío exige adjuntar identidad y título en esa pantalla. Tras rechazo o revocación, los archivos previos dejan de contar y la API exige nuevas subidas. No se muestran versiones anteriores. Se admiten PDF, PNG y JPEG válidos de hasta 5 MB y 20 archivos por ficha. Los archivos permanecen privados; no hay correo automático ni acreditación externa de títulos.</w:t>
+        <w:t>Certificaciones presenta identidad y título obligatorios y antecedentes opcionales, con carga azul y envío naranjo. El RUT agrega el guion y valida el dígito verificador. Recargar conserva únicamente el último adjunto vigente de cada tipo. Rechazo, revocación y cambio de especialidad invalidan archivos anteriores y exigen documentos nuevos. Se admiten PDF, PNG y JPEG válidos de hasta 5 MB por archivo; las versiones históricas no bloquean nuevas cargas. Los documentos son privados; no hay correo automático ni acreditación externa de títulos.</w:t>
       </w:r>
     </w:p>
     <w:p>
@@ -22490,7 +22550,7 @@
     </w:p>
     <w:p>
       <w:r>
-        <w:t>La aprobación muestra el escudo y Verificado en PerfilProfesional, FichaProfesional y TarjetaProfesional. Rechazar o revocar retira la insignia; la revocación deja la solicitud rechazada y exige documentos nuevos; cambiar la especialidad devuelve la ficha a pendiente. El profesional ve el motivo y puede corregir y reenviar. Cualquier edición o carga incrementa la revisión para impedir decisiones sobre datos obsoletos. ResumenPerfil sigue reservado al usuario; el profesional no puede verificar su propia ficha.</w:t>
+        <w:t>La ficha comienza en sin_solicitud y no entra a Pendientes ni a su contador. Solo enviar con RUT e identidad/título vigentes habilita revisión. Aprobar muestra el escudo y Verificado en perfil y listado. Rechazar, revocar o cambiar especialidad retira la insignia, cierra la solicitud e invalida documentos anteriores. Nuevas cargas no reabren el trámite: se exige otro envío explícito. Cada edición incrementa la revisión; el profesional no puede verificarse por su ficha.</w:t>
       </w:r>
     </w:p>
     <w:p>
@@ -22500,7 +22560,7 @@
     </w:p>
     <w:p>
       <w:r>
-        <w:t>Validación final del PR #17 al 10-10-2026: 208 pruebas backend en 25 suites y 163 frontend en 21 archivos aprobadas; lint de ambas capas y build correctos. Incluye cierre tras rechazo/revocación y reapertura solo por reenvío, recarga con apartados vacíos, envío incompleto bloqueado, documentos independientes, formato del RUT y exclusión de archivos anteriores tras rechazo/revocación. Inicialmente se realizaron 17 comprobaciones con MySQL y cuentas/archivos temporales, además de revisión de las vistas en Edge a 1440 y 390 px. Los casos están en Plan de Pruebas/FS-HU-12_Verificacion.md. La aceptación del PO sigue pendiente.</w:t>
+        <w:t>Validación del PR #19 al 11-10-2026: 213 pruebas backend en 25 suites y 165 frontend en 21 archivos aprobadas; lint y build correctos. Regresión adicional: 49 comprobaciones sobre Express y MySQL reales, incluida recarga, más de veinte versiones, rechazo, reenvío y cambio de especialidad. Datos temporales eliminados al finalizar. Casos y límites en Plan de Pruebas/FS-HU-12_Verificacion.md. La aceptación del PO y la sincronización de Drive posterior a la fusión siguen pendientes.</w:t>
       </w:r>
     </w:p>
     <w:p>
@@ -22515,7 +22575,7 @@
           <w:lang w:val="es-ES"/>
         </w:rPr>
       </w:pPr>
-      <w:bookmarkStart w:id="37" w:name="_Toc242563759"/>
+      <w:bookmarkStart w:id="37" w:name="_Toc242571452"/>
       <w:r>
         <w:rPr>
           <w:lang w:val="es-ES"/>
@@ -23197,7 +23257,7 @@
         </w:rPr>
         <w:br w:type="page"/>
       </w:r>
-      <w:bookmarkStart w:id="38" w:name="_Toc242563760"/>
+      <w:bookmarkStart w:id="38" w:name="_Toc242571453"/>
       <w:r>
         <w:rPr>
           <w:lang w:val="es-ES"/>
@@ -23290,7 +23350,7 @@
         <w:lastRenderedPageBreak/>
         <w:drawing>
           <wp:inline distT="0" distB="0" distL="0" distR="0" wp14:anchorId="6152AB04" wp14:editId="3B7798A9">
-            <wp:extent cx="3060757" cy="6535672"/>
+            <wp:extent cx="3250357" cy="7100000"/>
             <wp:effectExtent l="0" t="0" r="0" b="0"/>
             <wp:docPr id="900" name="Flujo de verificación administrativa" descr="Solicitud con documentos privados, revisión, rechazo, aprobación y revocación."/>
             <wp:cNvGraphicFramePr>
@@ -23312,7 +23372,7 @@
                   <pic:spPr>
                     <a:xfrm>
                       <a:off x="0" y="0"/>
-                      <a:ext cx="3060757" cy="6535672"/>
+                      <a:ext cx="3250357" cy="7100000"/>
                     </a:xfrm>
                     <a:prstGeom prst="rect">
                       <a:avLst/>
@@ -23336,7 +23396,7 @@
         </w:rPr>
       </w:pPr>
       <w:r>
-        <w:t>Ilustración 11: Solicitud, revisión documental y decisiones administrativas (FS-HU-12; DAS 1.18)</w:t>
+        <w:t>Ilustración 11: Solicitud, revisión documental y decisiones administrativas (FS-HU-12; DAS 1.19)</w:t>
       </w:r>
     </w:p>
     <w:p>
@@ -23527,7 +23587,14 @@
               <w:rPr>
                 <w:sz w:val="17"/>
               </w:rPr>
-              <w:t>Sirve el build estático de React y reenvía las rutas /api al backend (proxy inverso).</w:t>
+              <w:t xml:space="preserve">Sirve el build estático de React y reenvía </w:t>
+            </w:r>
+            <w:r>
+              <w:rPr>
+                <w:sz w:val="17"/>
+              </w:rPr>
+              <w:lastRenderedPageBreak/>
+              <w:t>las rutas /api al backend (proxy inverso).</w:t>
             </w:r>
           </w:p>
         </w:tc>
@@ -23540,7 +23607,15 @@
               <w:rPr>
                 <w:sz w:val="17"/>
               </w:rPr>
-              <w:t>80 / 443 (expuesto)</w:t>
+              <w:lastRenderedPageBreak/>
+              <w:t xml:space="preserve">80 / 443 </w:t>
+            </w:r>
+            <w:r>
+              <w:rPr>
+                <w:sz w:val="17"/>
+              </w:rPr>
+              <w:lastRenderedPageBreak/>
+              <w:t>(expuesto)</w:t>
             </w:r>
           </w:p>
         </w:tc>
@@ -23556,6 +23631,7 @@
                 <w:b/>
                 <w:sz w:val="17"/>
               </w:rPr>
+              <w:lastRenderedPageBreak/>
               <w:t>Backend container</w:t>
             </w:r>
           </w:p>
@@ -23582,14 +23658,7 @@
               <w:rPr>
                 <w:sz w:val="17"/>
               </w:rPr>
-              <w:t xml:space="preserve">API REST, autenticación, lógica de negocio e integración con servicios </w:t>
-            </w:r>
-            <w:r>
-              <w:rPr>
-                <w:sz w:val="17"/>
-              </w:rPr>
-              <w:lastRenderedPageBreak/>
-              <w:t>externos.</w:t>
+              <w:t>API REST, autenticación, lógica de negocio e integración con servicios externos.</w:t>
             </w:r>
           </w:p>
         </w:tc>
@@ -23602,7 +23671,6 @@
               <w:rPr>
                 <w:sz w:val="17"/>
               </w:rPr>
-              <w:lastRenderedPageBreak/>
               <w:t>3000 (red interna)</w:t>
             </w:r>
           </w:p>
@@ -24643,6 +24711,7 @@
               <w:rPr>
                 <w:sz w:val="17"/>
               </w:rPr>
+              <w:lastRenderedPageBreak/>
               <w:t>Backend</w:t>
             </w:r>
           </w:p>
@@ -24719,7 +24788,7 @@
         </w:rPr>
         <w:br w:type="page"/>
       </w:r>
-      <w:bookmarkStart w:id="39" w:name="_Toc242563761"/>
+      <w:bookmarkStart w:id="39" w:name="_Toc242571454"/>
       <w:r>
         <w:rPr>
           <w:lang w:val="es-ES"/>
@@ -25475,7 +25544,7 @@
         </w:rPr>
         <w:br w:type="page"/>
       </w:r>
-      <w:bookmarkStart w:id="40" w:name="_Toc242563762"/>
+      <w:bookmarkStart w:id="40" w:name="_Toc242571455"/>
       <w:r>
         <w:rPr>
           <w:lang w:val="es-ES"/>
@@ -26947,7 +27016,7 @@
                 <w:sz w:val="17"/>
               </w:rPr>
               <w:lastRenderedPageBreak/>
-              <w:t>profesional) se elige una sola vez en una pantalla propia, "Elegir perfil" (/elegir-perfil), después de crear la cuenta y fuera del asistente de perfil. El usuario sigue con su asistente de 4 pasos y el profesional entra directo a su propio espacio (/profesional/...) con su menú e Inicio. Cada rol solo accede a sus pantallas y endpoints, y cambiar el rol queda en manos del administrador (CU-07). Reemplaza a D21. Ante 409 se descarta la sesión anterior y se solicita un nuevo ingreso para obtener el JWT del rol confirmado. Desde el PR #17 el administrador utiliza /admin/dashboard; /acceso-no-disponible queda para roles sin espacio reconocido. No se incorpora cambio general de roles desde el panel.</w:t>
+              <w:t>profesional) se elige una sola vez en una pantalla propia, "Elegir perfil" (/elegir-perfil), después de crear la cuenta y fuera del asistente de perfil. El usuario sigue con su asistente de 4 pasos y el profesional entra directo a su propio espacio (/profesional/...) con su menú e Inicio. Cada rol solo accede a sus pantallas y endpoints, y cambiar el rol queda en manos del administrador (CU-07). Reemplaza a D21. Ante 409 se descarta la sesión anterior y se solicita un nuevo ingreso para obtener el JWT del rol confirmado. Desde el PR #19 el administrador utiliza /admin/dashboard; /acceso-no-disponible queda para roles sin espacio reconocido. No se incorpora cambio general de roles desde el panel.</w:t>
             </w:r>
           </w:p>
         </w:tc>
@@ -27079,7 +27148,7 @@
                 <w:sz w:val="17"/>
               </w:rPr>
               <w:lastRenderedPageBreak/>
-              <w:t>verificada devuelve la ficha a pendiente.</w:t>
+              <w:t>invalida documentos; si estaba verificada o pendiente, cierra la solicitud y exige nuevo envío.</w:t>
             </w:r>
           </w:p>
         </w:tc>
@@ -27261,7 +27330,7 @@
         </w:rPr>
         <w:br w:type="page"/>
       </w:r>
-      <w:bookmarkStart w:id="41" w:name="_Toc242563763"/>
+      <w:bookmarkStart w:id="41" w:name="_Toc242571456"/>
       <w:r>
         <w:rPr>
           <w:lang w:val="es-ES"/>

</xml_diff>

<commit_message>
Implementa disponibilidad, reservas y mapa para Sprints 2 y 3
</commit_message>
<xml_diff>
--- a/FASE 2/Evidencias Proyecto/Evidencias de documentación/Documento de Arquitectura (DAS)/Documento_Arquitectura_Sistema_DAS_.docx
+++ b/FASE 2/Evidencias Proyecto/Evidencias de documentación/Documento de Arquitectura (DAS)/Documento_Arquitectura_Sistema_DAS_.docx
@@ -237,7 +237,7 @@
           <w:szCs w:val="36"/>
           <w:lang w:val="es-CL"/>
         </w:rPr>
-        <w:t>Versión 1.19</w:t>
+        <w:t>Versión 1.20</w:t>
       </w:r>
     </w:p>
     <w:p>
@@ -561,7 +561,7 @@
           </w:tcPr>
           <w:p>
             <w:r>
-              <w:t>1.19</w:t>
+              <w:t>1.20</w:t>
             </w:r>
           </w:p>
         </w:tc>
@@ -2309,6 +2309,75 @@
           </w:p>
         </w:tc>
       </w:tr>
+      <w:tr>
+        <w:trPr>
+          <w:cantSplit/>
+        </w:trPr>
+        <w:tc>
+          <w:tcPr>
+            <w:tcW w:w="2196" w:type="dxa"/>
+          </w:tcPr>
+          <w:p>
+            <w:pPr>
+              <w:pStyle w:val="Tabletext"/>
+              <w:rPr>
+                <w:lang w:val="es-CL"/>
+              </w:rPr>
+            </w:pPr>
+            <w:r>
+              <w:t>11-10-2026</w:t>
+            </w:r>
+          </w:p>
+        </w:tc>
+        <w:tc>
+          <w:tcPr>
+            <w:tcW w:w="1152" w:type="dxa"/>
+          </w:tcPr>
+          <w:p>
+            <w:pPr>
+              <w:pStyle w:val="Tabletext"/>
+              <w:rPr>
+                <w:lang w:val="es-CL"/>
+              </w:rPr>
+            </w:pPr>
+            <w:r>
+              <w:t>1.20</w:t>
+            </w:r>
+          </w:p>
+        </w:tc>
+        <w:tc>
+          <w:tcPr>
+            <w:tcW w:w="3744" w:type="dxa"/>
+          </w:tcPr>
+          <w:p>
+            <w:pPr>
+              <w:pStyle w:val="Tabletext"/>
+              <w:rPr>
+                <w:lang w:val="es-CL"/>
+              </w:rPr>
+            </w:pPr>
+            <w:r>
+              <w:t>Cuota e IDs del PR #20 fusionado. Disponibilidad FS-HU-13, reservas FS-HU-14 y mapa/lista FS-HU-06 implementados en rama nueva, pendientes de revisión. Doce tablas implementadas. 231 pruebas backend, 172 frontend y 25 comprobaciones MySQL. SMTP y Maps reales pendientes de configuración; Drive/Miro después de fusionar.</w:t>
+            </w:r>
+          </w:p>
+        </w:tc>
+        <w:tc>
+          <w:tcPr>
+            <w:tcW w:w="1908" w:type="dxa"/>
+          </w:tcPr>
+          <w:p>
+            <w:pPr>
+              <w:pStyle w:val="Tabletext"/>
+              <w:rPr>
+                <w:lang w:val="es-CL"/>
+              </w:rPr>
+            </w:pPr>
+            <w:r>
+              <w:t>Luis Méndez</w:t>
+            </w:r>
+          </w:p>
+        </w:tc>
+      </w:tr>
     </w:tbl>
     <w:p>
       <w:pPr>
@@ -2372,7 +2441,7 @@
         </w:rPr>
         <w:fldChar w:fldCharType="separate"/>
       </w:r>
-      <w:hyperlink w:anchor="_Toc242571426" w:history="1">
+      <w:hyperlink w:anchor="_Toc242654762" w:history="1">
         <w:r>
           <w:rPr>
             <w:rStyle w:val="Hipervnculo"/>
@@ -2423,7 +2492,7 @@
             <w:noProof/>
             <w:webHidden/>
           </w:rPr>
-          <w:instrText xml:space="preserve"> PAGEREF _Toc242571426 \h </w:instrText>
+          <w:instrText xml:space="preserve"> PAGEREF _Toc242654762 \h </w:instrText>
         </w:r>
         <w:r>
           <w:rPr>
@@ -2472,7 +2541,7 @@
           <w14:ligatures w14:val="standardContextual"/>
         </w:rPr>
       </w:pPr>
-      <w:hyperlink w:anchor="_Toc242571427" w:history="1">
+      <w:hyperlink w:anchor="_Toc242654763" w:history="1">
         <w:r>
           <w:rPr>
             <w:rStyle w:val="Hipervnculo"/>
@@ -2521,7 +2590,7 @@
             <w:noProof/>
             <w:webHidden/>
           </w:rPr>
-          <w:instrText xml:space="preserve"> PAGEREF _Toc242571427 \h </w:instrText>
+          <w:instrText xml:space="preserve"> PAGEREF _Toc242654763 \h </w:instrText>
         </w:r>
         <w:r>
           <w:rPr>
@@ -2570,7 +2639,7 @@
           <w14:ligatures w14:val="standardContextual"/>
         </w:rPr>
       </w:pPr>
-      <w:hyperlink w:anchor="_Toc242571428" w:history="1">
+      <w:hyperlink w:anchor="_Toc242654764" w:history="1">
         <w:r>
           <w:rPr>
             <w:rStyle w:val="Hipervnculo"/>
@@ -2619,7 +2688,7 @@
             <w:noProof/>
             <w:webHidden/>
           </w:rPr>
-          <w:instrText xml:space="preserve"> PAGEREF _Toc242571428 \h </w:instrText>
+          <w:instrText xml:space="preserve"> PAGEREF _Toc242654764 \h </w:instrText>
         </w:r>
         <w:r>
           <w:rPr>
@@ -2668,7 +2737,7 @@
           <w14:ligatures w14:val="standardContextual"/>
         </w:rPr>
       </w:pPr>
-      <w:hyperlink w:anchor="_Toc242571429" w:history="1">
+      <w:hyperlink w:anchor="_Toc242654765" w:history="1">
         <w:r>
           <w:rPr>
             <w:rStyle w:val="Hipervnculo"/>
@@ -2717,7 +2786,7 @@
             <w:noProof/>
             <w:webHidden/>
           </w:rPr>
-          <w:instrText xml:space="preserve"> PAGEREF _Toc242571429 \h </w:instrText>
+          <w:instrText xml:space="preserve"> PAGEREF _Toc242654765 \h </w:instrText>
         </w:r>
         <w:r>
           <w:rPr>
@@ -2766,7 +2835,7 @@
           <w14:ligatures w14:val="standardContextual"/>
         </w:rPr>
       </w:pPr>
-      <w:hyperlink w:anchor="_Toc242571430" w:history="1">
+      <w:hyperlink w:anchor="_Toc242654766" w:history="1">
         <w:r>
           <w:rPr>
             <w:rStyle w:val="Hipervnculo"/>
@@ -2815,7 +2884,7 @@
             <w:noProof/>
             <w:webHidden/>
           </w:rPr>
-          <w:instrText xml:space="preserve"> PAGEREF _Toc242571430 \h </w:instrText>
+          <w:instrText xml:space="preserve"> PAGEREF _Toc242654766 \h </w:instrText>
         </w:r>
         <w:r>
           <w:rPr>
@@ -2864,7 +2933,7 @@
           <w14:ligatures w14:val="standardContextual"/>
         </w:rPr>
       </w:pPr>
-      <w:hyperlink w:anchor="_Toc242571431" w:history="1">
+      <w:hyperlink w:anchor="_Toc242654767" w:history="1">
         <w:r>
           <w:rPr>
             <w:rStyle w:val="Hipervnculo"/>
@@ -2913,7 +2982,7 @@
             <w:noProof/>
             <w:webHidden/>
           </w:rPr>
-          <w:instrText xml:space="preserve"> PAGEREF _Toc242571431 \h </w:instrText>
+          <w:instrText xml:space="preserve"> PAGEREF _Toc242654767 \h </w:instrText>
         </w:r>
         <w:r>
           <w:rPr>
@@ -2962,7 +3031,7 @@
           <w14:ligatures w14:val="standardContextual"/>
         </w:rPr>
       </w:pPr>
-      <w:hyperlink w:anchor="_Toc242571432" w:history="1">
+      <w:hyperlink w:anchor="_Toc242654768" w:history="1">
         <w:r>
           <w:rPr>
             <w:rStyle w:val="Hipervnculo"/>
@@ -3011,7 +3080,7 @@
             <w:noProof/>
             <w:webHidden/>
           </w:rPr>
-          <w:instrText xml:space="preserve"> PAGEREF _Toc242571432 \h </w:instrText>
+          <w:instrText xml:space="preserve"> PAGEREF _Toc242654768 \h </w:instrText>
         </w:r>
         <w:r>
           <w:rPr>
@@ -3060,7 +3129,7 @@
           <w14:ligatures w14:val="standardContextual"/>
         </w:rPr>
       </w:pPr>
-      <w:hyperlink w:anchor="_Toc242571433" w:history="1">
+      <w:hyperlink w:anchor="_Toc242654769" w:history="1">
         <w:r>
           <w:rPr>
             <w:rStyle w:val="Hipervnculo"/>
@@ -3109,7 +3178,7 @@
             <w:noProof/>
             <w:webHidden/>
           </w:rPr>
-          <w:instrText xml:space="preserve"> PAGEREF _Toc242571433 \h </w:instrText>
+          <w:instrText xml:space="preserve"> PAGEREF _Toc242654769 \h </w:instrText>
         </w:r>
         <w:r>
           <w:rPr>
@@ -3160,7 +3229,7 @@
           <w14:ligatures w14:val="standardContextual"/>
         </w:rPr>
       </w:pPr>
-      <w:hyperlink w:anchor="_Toc242571434" w:history="1">
+      <w:hyperlink w:anchor="_Toc242654770" w:history="1">
         <w:r>
           <w:rPr>
             <w:rStyle w:val="Hipervnculo"/>
@@ -3211,7 +3280,7 @@
             <w:noProof/>
             <w:webHidden/>
           </w:rPr>
-          <w:instrText xml:space="preserve"> PAGEREF _Toc242571434 \h </w:instrText>
+          <w:instrText xml:space="preserve"> PAGEREF _Toc242654770 \h </w:instrText>
         </w:r>
         <w:r>
           <w:rPr>
@@ -3260,7 +3329,7 @@
           <w14:ligatures w14:val="standardContextual"/>
         </w:rPr>
       </w:pPr>
-      <w:hyperlink w:anchor="_Toc242571435" w:history="1">
+      <w:hyperlink w:anchor="_Toc242654771" w:history="1">
         <w:r>
           <w:rPr>
             <w:rStyle w:val="Hipervnculo"/>
@@ -3309,7 +3378,7 @@
             <w:noProof/>
             <w:webHidden/>
           </w:rPr>
-          <w:instrText xml:space="preserve"> PAGEREF _Toc242571435 \h </w:instrText>
+          <w:instrText xml:space="preserve"> PAGEREF _Toc242654771 \h </w:instrText>
         </w:r>
         <w:r>
           <w:rPr>
@@ -3358,7 +3427,7 @@
           <w14:ligatures w14:val="standardContextual"/>
         </w:rPr>
       </w:pPr>
-      <w:hyperlink w:anchor="_Toc242571436" w:history="1">
+      <w:hyperlink w:anchor="_Toc242654772" w:history="1">
         <w:r>
           <w:rPr>
             <w:rStyle w:val="Hipervnculo"/>
@@ -3407,7 +3476,7 @@
             <w:noProof/>
             <w:webHidden/>
           </w:rPr>
-          <w:instrText xml:space="preserve"> PAGEREF _Toc242571436 \h </w:instrText>
+          <w:instrText xml:space="preserve"> PAGEREF _Toc242654772 \h </w:instrText>
         </w:r>
         <w:r>
           <w:rPr>
@@ -3456,7 +3525,7 @@
           <w14:ligatures w14:val="standardContextual"/>
         </w:rPr>
       </w:pPr>
-      <w:hyperlink w:anchor="_Toc242571437" w:history="1">
+      <w:hyperlink w:anchor="_Toc242654773" w:history="1">
         <w:r>
           <w:rPr>
             <w:rStyle w:val="Hipervnculo"/>
@@ -3505,7 +3574,7 @@
             <w:noProof/>
             <w:webHidden/>
           </w:rPr>
-          <w:instrText xml:space="preserve"> PAGEREF _Toc242571437 \h </w:instrText>
+          <w:instrText xml:space="preserve"> PAGEREF _Toc242654773 \h </w:instrText>
         </w:r>
         <w:r>
           <w:rPr>
@@ -3556,7 +3625,7 @@
           <w14:ligatures w14:val="standardContextual"/>
         </w:rPr>
       </w:pPr>
-      <w:hyperlink w:anchor="_Toc242571438" w:history="1">
+      <w:hyperlink w:anchor="_Toc242654774" w:history="1">
         <w:r>
           <w:rPr>
             <w:rStyle w:val="Hipervnculo"/>
@@ -3607,7 +3676,7 @@
             <w:noProof/>
             <w:webHidden/>
           </w:rPr>
-          <w:instrText xml:space="preserve"> PAGEREF _Toc242571438 \h </w:instrText>
+          <w:instrText xml:space="preserve"> PAGEREF _Toc242654774 \h </w:instrText>
         </w:r>
         <w:r>
           <w:rPr>
@@ -3656,7 +3725,7 @@
           <w14:ligatures w14:val="standardContextual"/>
         </w:rPr>
       </w:pPr>
-      <w:hyperlink w:anchor="_Toc242571439" w:history="1">
+      <w:hyperlink w:anchor="_Toc242654775" w:history="1">
         <w:r>
           <w:rPr>
             <w:rStyle w:val="Hipervnculo"/>
@@ -3705,7 +3774,7 @@
             <w:noProof/>
             <w:webHidden/>
           </w:rPr>
-          <w:instrText xml:space="preserve"> PAGEREF _Toc242571439 \h </w:instrText>
+          <w:instrText xml:space="preserve"> PAGEREF _Toc242654775 \h </w:instrText>
         </w:r>
         <w:r>
           <w:rPr>
@@ -3754,7 +3823,7 @@
           <w14:ligatures w14:val="standardContextual"/>
         </w:rPr>
       </w:pPr>
-      <w:hyperlink w:anchor="_Toc242571440" w:history="1">
+      <w:hyperlink w:anchor="_Toc242654776" w:history="1">
         <w:r>
           <w:rPr>
             <w:rStyle w:val="Hipervnculo"/>
@@ -3803,7 +3872,7 @@
             <w:noProof/>
             <w:webHidden/>
           </w:rPr>
-          <w:instrText xml:space="preserve"> PAGEREF _Toc242571440 \h </w:instrText>
+          <w:instrText xml:space="preserve"> PAGEREF _Toc242654776 \h </w:instrText>
         </w:r>
         <w:r>
           <w:rPr>
@@ -3852,7 +3921,7 @@
           <w14:ligatures w14:val="standardContextual"/>
         </w:rPr>
       </w:pPr>
-      <w:hyperlink w:anchor="_Toc242571441" w:history="1">
+      <w:hyperlink w:anchor="_Toc242654777" w:history="1">
         <w:r>
           <w:rPr>
             <w:rStyle w:val="Hipervnculo"/>
@@ -3901,7 +3970,7 @@
             <w:noProof/>
             <w:webHidden/>
           </w:rPr>
-          <w:instrText xml:space="preserve"> PAGEREF _Toc242571441 \h </w:instrText>
+          <w:instrText xml:space="preserve"> PAGEREF _Toc242654777 \h </w:instrText>
         </w:r>
         <w:r>
           <w:rPr>
@@ -3951,7 +4020,7 @@
           <w14:ligatures w14:val="standardContextual"/>
         </w:rPr>
       </w:pPr>
-      <w:hyperlink w:anchor="_Toc242571442" w:history="1">
+      <w:hyperlink w:anchor="_Toc242654778" w:history="1">
         <w:r>
           <w:rPr>
             <w:rStyle w:val="Hipervnculo"/>
@@ -3979,7 +4048,7 @@
             <w:noProof/>
             <w:webHidden/>
           </w:rPr>
-          <w:instrText xml:space="preserve"> PAGEREF _Toc242571442 \h </w:instrText>
+          <w:instrText xml:space="preserve"> PAGEREF _Toc242654778 \h </w:instrText>
         </w:r>
         <w:r>
           <w:rPr>
@@ -4027,7 +4096,7 @@
           <w14:ligatures w14:val="standardContextual"/>
         </w:rPr>
       </w:pPr>
-      <w:hyperlink w:anchor="_Toc242571443" w:history="1">
+      <w:hyperlink w:anchor="_Toc242654779" w:history="1">
         <w:r>
           <w:rPr>
             <w:rStyle w:val="Hipervnculo"/>
@@ -4054,7 +4123,7 @@
             <w:noProof/>
             <w:webHidden/>
           </w:rPr>
-          <w:instrText xml:space="preserve"> PAGEREF _Toc242571443 \h </w:instrText>
+          <w:instrText xml:space="preserve"> PAGEREF _Toc242654779 \h </w:instrText>
         </w:r>
         <w:r>
           <w:rPr>
@@ -4102,7 +4171,7 @@
           <w14:ligatures w14:val="standardContextual"/>
         </w:rPr>
       </w:pPr>
-      <w:hyperlink w:anchor="_Toc242571444" w:history="1">
+      <w:hyperlink w:anchor="_Toc242654780" w:history="1">
         <w:r>
           <w:rPr>
             <w:rStyle w:val="Hipervnculo"/>
@@ -4129,7 +4198,7 @@
             <w:noProof/>
             <w:webHidden/>
           </w:rPr>
-          <w:instrText xml:space="preserve"> PAGEREF _Toc242571444 \h </w:instrText>
+          <w:instrText xml:space="preserve"> PAGEREF _Toc242654780 \h </w:instrText>
         </w:r>
         <w:r>
           <w:rPr>
@@ -4179,7 +4248,7 @@
           <w14:ligatures w14:val="standardContextual"/>
         </w:rPr>
       </w:pPr>
-      <w:hyperlink w:anchor="_Toc242571445" w:history="1">
+      <w:hyperlink w:anchor="_Toc242654781" w:history="1">
         <w:r>
           <w:rPr>
             <w:rStyle w:val="Hipervnculo"/>
@@ -4207,7 +4276,7 @@
             <w:noProof/>
             <w:webHidden/>
           </w:rPr>
-          <w:instrText xml:space="preserve"> PAGEREF _Toc242571445 \h </w:instrText>
+          <w:instrText xml:space="preserve"> PAGEREF _Toc242654781 \h </w:instrText>
         </w:r>
         <w:r>
           <w:rPr>
@@ -4255,7 +4324,7 @@
           <w14:ligatures w14:val="standardContextual"/>
         </w:rPr>
       </w:pPr>
-      <w:hyperlink w:anchor="_Toc242571446" w:history="1">
+      <w:hyperlink w:anchor="_Toc242654782" w:history="1">
         <w:r>
           <w:rPr>
             <w:rStyle w:val="Hipervnculo"/>
@@ -4282,7 +4351,7 @@
             <w:noProof/>
             <w:webHidden/>
           </w:rPr>
-          <w:instrText xml:space="preserve"> PAGEREF _Toc242571446 \h </w:instrText>
+          <w:instrText xml:space="preserve"> PAGEREF _Toc242654782 \h </w:instrText>
         </w:r>
         <w:r>
           <w:rPr>
@@ -4330,7 +4399,7 @@
           <w14:ligatures w14:val="standardContextual"/>
         </w:rPr>
       </w:pPr>
-      <w:hyperlink w:anchor="_Toc242571447" w:history="1">
+      <w:hyperlink w:anchor="_Toc242654783" w:history="1">
         <w:r>
           <w:rPr>
             <w:rStyle w:val="Hipervnculo"/>
@@ -4357,7 +4426,7 @@
             <w:noProof/>
             <w:webHidden/>
           </w:rPr>
-          <w:instrText xml:space="preserve"> PAGEREF _Toc242571447 \h </w:instrText>
+          <w:instrText xml:space="preserve"> PAGEREF _Toc242654783 \h </w:instrText>
         </w:r>
         <w:r>
           <w:rPr>
@@ -4405,7 +4474,7 @@
           <w14:ligatures w14:val="standardContextual"/>
         </w:rPr>
       </w:pPr>
-      <w:hyperlink w:anchor="_Toc242571448" w:history="1">
+      <w:hyperlink w:anchor="_Toc242654784" w:history="1">
         <w:r>
           <w:rPr>
             <w:rStyle w:val="Hipervnculo"/>
@@ -4432,7 +4501,7 @@
             <w:noProof/>
             <w:webHidden/>
           </w:rPr>
-          <w:instrText xml:space="preserve"> PAGEREF _Toc242571448 \h </w:instrText>
+          <w:instrText xml:space="preserve"> PAGEREF _Toc242654784 \h </w:instrText>
         </w:r>
         <w:r>
           <w:rPr>
@@ -4480,7 +4549,7 @@
           <w14:ligatures w14:val="standardContextual"/>
         </w:rPr>
       </w:pPr>
-      <w:hyperlink w:anchor="_Toc242571449" w:history="1">
+      <w:hyperlink w:anchor="_Toc242654785" w:history="1">
         <w:r>
           <w:rPr>
             <w:rStyle w:val="Hipervnculo"/>
@@ -4507,7 +4576,7 @@
             <w:noProof/>
             <w:webHidden/>
           </w:rPr>
-          <w:instrText xml:space="preserve"> PAGEREF _Toc242571449 \h </w:instrText>
+          <w:instrText xml:space="preserve"> PAGEREF _Toc242654785 \h </w:instrText>
         </w:r>
         <w:r>
           <w:rPr>
@@ -4555,7 +4624,7 @@
           <w14:ligatures w14:val="standardContextual"/>
         </w:rPr>
       </w:pPr>
-      <w:hyperlink w:anchor="_Toc242571450" w:history="1">
+      <w:hyperlink w:anchor="_Toc242654786" w:history="1">
         <w:r>
           <w:rPr>
             <w:rStyle w:val="Hipervnculo"/>
@@ -4582,7 +4651,7 @@
             <w:noProof/>
             <w:webHidden/>
           </w:rPr>
-          <w:instrText xml:space="preserve"> PAGEREF _Toc242571450 \h </w:instrText>
+          <w:instrText xml:space="preserve"> PAGEREF _Toc242654786 \h </w:instrText>
         </w:r>
         <w:r>
           <w:rPr>
@@ -4631,7 +4700,7 @@
           <w14:ligatures w14:val="standardContextual"/>
         </w:rPr>
       </w:pPr>
-      <w:hyperlink w:anchor="_Toc242571451" w:history="1">
+      <w:hyperlink w:anchor="_Toc242654787" w:history="1">
         <w:r>
           <w:rPr>
             <w:rStyle w:val="Hipervnculo"/>
@@ -4678,7 +4747,7 @@
             <w:noProof/>
             <w:webHidden/>
           </w:rPr>
-          <w:instrText xml:space="preserve"> PAGEREF _Toc242571451 \h </w:instrText>
+          <w:instrText xml:space="preserve"> PAGEREF _Toc242654787 \h </w:instrText>
         </w:r>
         <w:r>
           <w:rPr>
@@ -4728,7 +4797,7 @@
           <w14:ligatures w14:val="standardContextual"/>
         </w:rPr>
       </w:pPr>
-      <w:hyperlink w:anchor="_Toc242571452" w:history="1">
+      <w:hyperlink w:anchor="_Toc242654788" w:history="1">
         <w:r>
           <w:rPr>
             <w:rStyle w:val="Hipervnculo"/>
@@ -4756,7 +4825,7 @@
             <w:noProof/>
             <w:webHidden/>
           </w:rPr>
-          <w:instrText xml:space="preserve"> PAGEREF _Toc242571452 \h </w:instrText>
+          <w:instrText xml:space="preserve"> PAGEREF _Toc242654788 \h </w:instrText>
         </w:r>
         <w:r>
           <w:rPr>
@@ -4806,7 +4875,7 @@
           <w14:ligatures w14:val="standardContextual"/>
         </w:rPr>
       </w:pPr>
-      <w:hyperlink w:anchor="_Toc242571453" w:history="1">
+      <w:hyperlink w:anchor="_Toc242654789" w:history="1">
         <w:r>
           <w:rPr>
             <w:rStyle w:val="Hipervnculo"/>
@@ -4834,7 +4903,7 @@
             <w:noProof/>
             <w:webHidden/>
           </w:rPr>
-          <w:instrText xml:space="preserve"> PAGEREF _Toc242571453 \h </w:instrText>
+          <w:instrText xml:space="preserve"> PAGEREF _Toc242654789 \h </w:instrText>
         </w:r>
         <w:r>
           <w:rPr>
@@ -4884,7 +4953,7 @@
           <w14:ligatures w14:val="standardContextual"/>
         </w:rPr>
       </w:pPr>
-      <w:hyperlink w:anchor="_Toc242571454" w:history="1">
+      <w:hyperlink w:anchor="_Toc242654790" w:history="1">
         <w:r>
           <w:rPr>
             <w:rStyle w:val="Hipervnculo"/>
@@ -4912,7 +4981,7 @@
             <w:noProof/>
             <w:webHidden/>
           </w:rPr>
-          <w:instrText xml:space="preserve"> PAGEREF _Toc242571454 \h </w:instrText>
+          <w:instrText xml:space="preserve"> PAGEREF _Toc242654790 \h </w:instrText>
         </w:r>
         <w:r>
           <w:rPr>
@@ -4963,7 +5032,7 @@
           <w14:ligatures w14:val="standardContextual"/>
         </w:rPr>
       </w:pPr>
-      <w:hyperlink w:anchor="_Toc242571455" w:history="1">
+      <w:hyperlink w:anchor="_Toc242654791" w:history="1">
         <w:r>
           <w:rPr>
             <w:rStyle w:val="Hipervnculo"/>
@@ -5014,7 +5083,7 @@
             <w:noProof/>
             <w:webHidden/>
           </w:rPr>
-          <w:instrText xml:space="preserve"> PAGEREF _Toc242571455 \h </w:instrText>
+          <w:instrText xml:space="preserve"> PAGEREF _Toc242654791 \h </w:instrText>
         </w:r>
         <w:r>
           <w:rPr>
@@ -5065,7 +5134,7 @@
           <w14:ligatures w14:val="standardContextual"/>
         </w:rPr>
       </w:pPr>
-      <w:hyperlink w:anchor="_Toc242571456" w:history="1">
+      <w:hyperlink w:anchor="_Toc242654792" w:history="1">
         <w:r>
           <w:rPr>
             <w:rStyle w:val="Hipervnculo"/>
@@ -5116,7 +5185,7 @@
             <w:noProof/>
             <w:webHidden/>
           </w:rPr>
-          <w:instrText xml:space="preserve"> PAGEREF _Toc242571456 \h </w:instrText>
+          <w:instrText xml:space="preserve"> PAGEREF _Toc242654792 \h </w:instrText>
         </w:r>
         <w:r>
           <w:rPr>
@@ -5149,6 +5218,107 @@
     </w:p>
     <w:p>
       <w:pPr>
+        <w:pStyle w:val="TDC1"/>
+        <w:tabs>
+          <w:tab w:val="left" w:pos="400"/>
+          <w:tab w:val="right" w:leader="dot" w:pos="9030"/>
+        </w:tabs>
+        <w:rPr>
+          <w:rFonts w:asciiTheme="minorHAnsi" w:eastAsiaTheme="minorEastAsia" w:hAnsiTheme="minorHAnsi" w:cstheme="minorBidi"/>
+          <w:b w:val="0"/>
+          <w:bCs w:val="0"/>
+          <w:caps w:val="0"/>
+          <w:noProof/>
+          <w:kern w:val="2"/>
+          <w:sz w:val="24"/>
+          <w:szCs w:val="24"/>
+          <w:lang w:val="es-CL" w:eastAsia="es-CL"/>
+          <w14:ligatures w14:val="standardContextual"/>
+        </w:rPr>
+      </w:pPr>
+      <w:hyperlink w:anchor="_Toc242654793" w:history="1">
+        <w:r>
+          <w:rPr>
+            <w:rStyle w:val="Hipervnculo"/>
+            <w:noProof/>
+            <w:lang w:val="es-ES"/>
+          </w:rPr>
+          <w:t>6</w:t>
+        </w:r>
+        <w:r>
+          <w:rPr>
+            <w:rFonts w:asciiTheme="minorHAnsi" w:eastAsiaTheme="minorEastAsia" w:hAnsiTheme="minorHAnsi" w:cstheme="minorBidi"/>
+            <w:b w:val="0"/>
+            <w:bCs w:val="0"/>
+            <w:caps w:val="0"/>
+            <w:noProof/>
+            <w:kern w:val="2"/>
+            <w:sz w:val="24"/>
+            <w:szCs w:val="24"/>
+            <w:lang w:val="es-CL" w:eastAsia="es-CL"/>
+            <w14:ligatures w14:val="standardContextual"/>
+          </w:rPr>
+          <w:tab/>
+        </w:r>
+        <w:r>
+          <w:rPr>
+            <w:rStyle w:val="Hipervnculo"/>
+            <w:noProof/>
+          </w:rPr>
+          <w:t>Disponibilidad reservas y mapa del Sprint 3</w:t>
+        </w:r>
+        <w:r>
+          <w:rPr>
+            <w:noProof/>
+            <w:webHidden/>
+          </w:rPr>
+          <w:tab/>
+        </w:r>
+        <w:r>
+          <w:rPr>
+            <w:noProof/>
+            <w:webHidden/>
+          </w:rPr>
+          <w:fldChar w:fldCharType="begin"/>
+        </w:r>
+        <w:r>
+          <w:rPr>
+            <w:noProof/>
+            <w:webHidden/>
+          </w:rPr>
+          <w:instrText xml:space="preserve"> PAGEREF _Toc242654793 \h </w:instrText>
+        </w:r>
+        <w:r>
+          <w:rPr>
+            <w:noProof/>
+            <w:webHidden/>
+          </w:rPr>
+        </w:r>
+        <w:r>
+          <w:rPr>
+            <w:noProof/>
+            <w:webHidden/>
+          </w:rPr>
+          <w:fldChar w:fldCharType="separate"/>
+        </w:r>
+        <w:r>
+          <w:rPr>
+            <w:noProof/>
+            <w:webHidden/>
+          </w:rPr>
+          <w:t>47</w:t>
+        </w:r>
+        <w:r>
+          <w:rPr>
+            <w:noProof/>
+            <w:webHidden/>
+          </w:rPr>
+          <w:fldChar w:fldCharType="end"/>
+        </w:r>
+      </w:hyperlink>
+    </w:p>
+    <w:p>
+      <w:pPr>
         <w:jc w:val="center"/>
         <w:rPr>
           <w:rFonts w:ascii="Times New Roman" w:hAnsi="Times New Roman"/>
@@ -5188,7 +5358,7 @@
         </w:rPr>
         <w:br w:type="page"/>
       </w:r>
-      <w:bookmarkStart w:id="1" w:name="_Toc242571426"/>
+      <w:bookmarkStart w:id="1" w:name="_Toc242654762"/>
       <w:r>
         <w:rPr>
           <w:lang w:val="es-CL"/>
@@ -5211,7 +5381,7 @@
       <w:bookmarkStart w:id="4" w:name="_Toc324851941"/>
       <w:bookmarkStart w:id="5" w:name="_Toc324915524"/>
       <w:bookmarkStart w:id="6" w:name="_Toc433104437"/>
-      <w:bookmarkStart w:id="7" w:name="_Toc242571427"/>
+      <w:bookmarkStart w:id="7" w:name="_Toc242654763"/>
       <w:r>
         <w:rPr>
           <w:lang w:val="es-CL"/>
@@ -5249,7 +5419,7 @@
           <w:lang w:val="es-CL"/>
         </w:rPr>
       </w:pPr>
-      <w:bookmarkStart w:id="8" w:name="_Toc242571428"/>
+      <w:bookmarkStart w:id="8" w:name="_Toc242654764"/>
       <w:r>
         <w:rPr>
           <w:lang w:val="es-CL"/>
@@ -5298,7 +5468,7 @@
           <w:lang w:val="es-CL"/>
         </w:rPr>
       </w:pPr>
-      <w:bookmarkStart w:id="9" w:name="_Toc242571429"/>
+      <w:bookmarkStart w:id="9" w:name="_Toc242654765"/>
       <w:r>
         <w:rPr>
           <w:lang w:val="es-CL"/>
@@ -5467,7 +5637,7 @@
           <w:lang w:val="es-CL"/>
         </w:rPr>
       </w:pPr>
-      <w:bookmarkStart w:id="10" w:name="_Toc242571430"/>
+      <w:bookmarkStart w:id="10" w:name="_Toc242654766"/>
       <w:r>
         <w:rPr>
           <w:lang w:val="es-CL"/>
@@ -6257,7 +6427,7 @@
       <w:bookmarkStart w:id="13" w:name="_Toc324851945"/>
       <w:bookmarkStart w:id="14" w:name="_Toc324915528"/>
       <w:bookmarkStart w:id="15" w:name="_Toc433104441"/>
-      <w:bookmarkStart w:id="16" w:name="_Toc242571431"/>
+      <w:bookmarkStart w:id="16" w:name="_Toc242654767"/>
       <w:r>
         <w:rPr>
           <w:lang w:val="es-CL"/>
@@ -6401,7 +6571,7 @@
           <w:lang w:val="es-CL"/>
         </w:rPr>
       </w:pPr>
-      <w:bookmarkStart w:id="17" w:name="_Toc242571432"/>
+      <w:bookmarkStart w:id="17" w:name="_Toc242654768"/>
       <w:r>
         <w:rPr>
           <w:lang w:val="es-CL"/>
@@ -6430,7 +6600,7 @@
         </w:rPr>
       </w:pPr>
       <w:r>
-        <w:t>FitSearch es una aplicación cliente-servidor en capas: React/Vite consume una API REST Node.js/Express, con JWT, MySQL y Prisma compartido. La implementación de la rama del PR #19 incorpora Dashboard, Profesionales, Verificaciones, Usuarios y Reportes administrativos, revisión documental privada y gestión de cuentas, junto con autenticación, perfiles, directorio, favoritos, reseñas, Google y Open-Meteo. Configuración y Contenido quedan fuera del panel autorizado. Claude, mapas y despliegue Docker/Nginx son capacidades previstas. El PR #19 y la aceptación de FS-HU-12 permanecen pendientes de revisión del PO; esta versión documenta la rama, no una fusión en main.</w:t>
+        <w:t>FitSearch usa React/Vite, API REST Node.js/Express, JWT, MySQL y Prisma compartido. El panel administrativo, verificación documental privada y gestión de cuentas están fusionados en PR #19/#20. Disponibilidad, reservas y Google Maps/lista se incorporan en la rama nueva de los Sprints 2 y 3, pendiente de revisión y fusión. Google Maps real necesita clave; SMTP real necesita credenciales. Claude y despliegue Docker/Nginx siguen previstos. Configuración y Contenido quedan fuera del panel autorizado; la aceptación de historias sigue pendiente del PO.</w:t>
       </w:r>
     </w:p>
     <w:p>
@@ -6451,7 +6621,7 @@
           <w:lang w:val="es-CL"/>
         </w:rPr>
       </w:pPr>
-      <w:bookmarkStart w:id="18" w:name="_Toc242571433"/>
+      <w:bookmarkStart w:id="18" w:name="_Toc242654769"/>
       <w:bookmarkEnd w:id="11"/>
       <w:bookmarkEnd w:id="12"/>
       <w:bookmarkEnd w:id="13"/>
@@ -6611,7 +6781,7 @@
         </w:rPr>
         <w:br w:type="page"/>
       </w:r>
-      <w:bookmarkStart w:id="19" w:name="_Toc242571434"/>
+      <w:bookmarkStart w:id="19" w:name="_Toc242654770"/>
       <w:r>
         <w:rPr>
           <w:lang w:val="es-CL"/>
@@ -6639,7 +6809,7 @@
           <w:lang w:val="es-CL"/>
         </w:rPr>
       </w:pPr>
-      <w:bookmarkStart w:id="20" w:name="_Toc242571435"/>
+      <w:bookmarkStart w:id="20" w:name="_Toc242654771"/>
       <w:r>
         <w:rPr>
           <w:lang w:val="es-CL"/>
@@ -6780,7 +6950,7 @@
           <w:lang w:val="es-CL"/>
         </w:rPr>
       </w:pPr>
-      <w:bookmarkStart w:id="21" w:name="_Toc242571436"/>
+      <w:bookmarkStart w:id="21" w:name="_Toc242654772"/>
       <w:r>
         <w:rPr>
           <w:lang w:val="es-CL"/>
@@ -6924,7 +7094,7 @@
           <w:lang w:val="es-CL"/>
         </w:rPr>
       </w:pPr>
-      <w:bookmarkStart w:id="22" w:name="_Toc242571437"/>
+      <w:bookmarkStart w:id="22" w:name="_Toc242654773"/>
       <w:r>
         <w:rPr>
           <w:lang w:val="es-CL"/>
@@ -7044,7 +7214,7 @@
         </w:rPr>
         <w:br w:type="page"/>
       </w:r>
-      <w:bookmarkStart w:id="23" w:name="_Toc242571438"/>
+      <w:bookmarkStart w:id="23" w:name="_Toc242654774"/>
       <w:r>
         <w:rPr>
           <w:lang w:val="es-ES"/>
@@ -7095,7 +7265,7 @@
           <w:lang w:val="es-ES"/>
         </w:rPr>
       </w:pPr>
-      <w:bookmarkStart w:id="24" w:name="_Toc242571439"/>
+      <w:bookmarkStart w:id="24" w:name="_Toc242654775"/>
       <w:r>
         <w:rPr>
           <w:lang w:val="es-CL"/>
@@ -7181,7 +7351,7 @@
           <w:lang w:val="es-CL"/>
         </w:rPr>
       </w:pPr>
-      <w:bookmarkStart w:id="25" w:name="_Toc242571440"/>
+      <w:bookmarkStart w:id="25" w:name="_Toc242654776"/>
       <w:r>
         <w:rPr>
           <w:lang w:val="es-CL"/>
@@ -8735,7 +8905,7 @@
           <w:lang w:val="es-CL"/>
         </w:rPr>
       </w:pPr>
-      <w:bookmarkStart w:id="26" w:name="_Toc242571441"/>
+      <w:bookmarkStart w:id="26" w:name="_Toc242654777"/>
       <w:r>
         <w:rPr>
           <w:lang w:val="es-CL"/>
@@ -9823,7 +9993,7 @@
           <w:lang w:val="es-ES"/>
         </w:rPr>
       </w:pPr>
-      <w:bookmarkStart w:id="27" w:name="_Toc242571442"/>
+      <w:bookmarkStart w:id="27" w:name="_Toc242654778"/>
       <w:r>
         <w:rPr>
           <w:lang w:val="es-ES"/>
@@ -10069,7 +10239,7 @@
               <w:rPr>
                 <w:sz w:val="17"/>
               </w:rPr>
-              <w:t>Google Maps Platform, API de Claude, Google Identity Services, servidor SMTP (Gmail), Open-Meteo</w:t>
+              <w:t>Reutilizado; integrado, pendiente de clave</w:t>
             </w:r>
           </w:p>
         </w:tc>
@@ -10082,7 +10252,7 @@
               <w:rPr>
                 <w:sz w:val="17"/>
               </w:rPr>
-              <w:t>Geocodificación, lugares y mapas; procesamiento de lenguaje natural con function calling; acceso con cuenta de Google; envío de correos de recuperación de contraseña; clima actual del Inicio del profesional.</w:t>
+              <w:t>Mapa de resultados con marcadores y enlace a ficha. Prueba real pendiente de clave Google Maps.</w:t>
             </w:r>
           </w:p>
         </w:tc>
@@ -10238,7 +10408,7 @@
           <w:numId w:val="0"/>
         </w:numPr>
       </w:pPr>
-      <w:bookmarkStart w:id="28" w:name="_Toc242571443"/>
+      <w:bookmarkStart w:id="28" w:name="_Toc242654779"/>
       <w:r>
         <w:t>Modelo de datos</w:t>
       </w:r>
@@ -10253,7 +10423,7 @@
         </w:rPr>
       </w:pPr>
       <w:r>
-        <w:t>El modelo objetivo comprende quince tablas de dominio: diez implementadas en el PR #19 y cinco previstas para conversaciones, mensajes, alimentación, disponibilidad y reservas. documentos_profesionales amplía la verificación con metadatos de archivos privados; las tablas existentes incorporan el estado de cuenta, versión de sesión e historial de revisión.</w:t>
+        <w:t>El modelo objetivo comprende quince tablas de dominio: doce implementadas en esta rama y tres previstas (conversaciones, mensajes y registro_comida). Disponibilidades y reservas amplían las diez tablas de main. documentos_profesionales conserva metadatos de archivos privados; los binarios se almacenan fuera de MySQL.</w:t>
       </w:r>
     </w:p>
     <w:tbl>
@@ -11280,7 +11450,7 @@
           <w:numId w:val="0"/>
         </w:numPr>
       </w:pPr>
-      <w:bookmarkStart w:id="29" w:name="_Toc242571444"/>
+      <w:bookmarkStart w:id="29" w:name="_Toc242654780"/>
       <w:r>
         <w:t>Diccionario de datos</w:t>
       </w:r>
@@ -19776,7 +19946,7 @@
         </w:rPr>
         <w:drawing>
           <wp:inline distT="0" distB="0" distL="0" distR="0" wp14:anchorId="183C8A5F" wp14:editId="659525C4">
-            <wp:extent cx="5943600" cy="2186130"/>
+            <wp:extent cx="5943600" cy="2258568"/>
             <wp:effectExtent l="0" t="0" r="0" b="0"/>
             <wp:docPr id="5" name="Picture 5"/>
             <wp:cNvGraphicFramePr>
@@ -19798,7 +19968,7 @@
                   <pic:spPr>
                     <a:xfrm>
                       <a:off x="0" y="0"/>
-                      <a:ext cx="5943600" cy="2186130"/>
+                      <a:ext cx="5943600" cy="2258568"/>
                     </a:xfrm>
                     <a:prstGeom prst="rect">
                       <a:avLst/>
@@ -19822,7 +19992,7 @@
         </w:rPr>
       </w:pPr>
       <w:r>
-        <w:t>Ilustración 4: Relaciones de las diez tablas implementadas (DAS 1.18). Campos y reglas de FK en el diccionario y fuente completa 04_DER_Tablas_Implementadas.</w:t>
+        <w:t>Ilustración 4: Relaciones de las doce tablas implementadas en la rama de Sprints 2 y 3 (DAS 1.20). Campos y claves foráneas en el diccionario y fuente 04_DER_Tablas_Implementadas.</w:t>
       </w:r>
     </w:p>
     <w:p>
@@ -19833,7 +20003,7 @@
         </w:rPr>
       </w:pPr>
       <w:r>
-        <w:t>El modelo implementado incluye roles, usuarios, perfiles_usuario, tokens_recuperacion, informacion_salud, profesionales, establecimientos, favoritos, resenas y documentos_profesionales. Se representan las claves foráneas y las reglas de eliminación. El modelo objetivo de quince tablas mantiene cinco previstas; _prisma_migrations no es una tabla del dominio. Los documentos binarios no se guardan en MySQL: la base conserva metadatos y una clave privada.</w:t>
+        <w:t>El modelo implementado incluye roles, usuarios, perfiles_usuario, tokens_recuperacion, informacion_salud, profesionales, establecimientos, favoritos, resenas, documentos_profesionales, disponibilidades y reservas. Las nuevas tablas están pendientes de fusionar. El modelo objetivo mantiene tres previstas; _prisma_migrations no es una tabla de dominio. Los binarios de verificación se guardan en un directorio privado y persistente.</w:t>
       </w:r>
     </w:p>
     <w:p>
@@ -19858,7 +20028,7 @@
           <w:lang w:val="es-CL"/>
         </w:rPr>
       </w:pPr>
-      <w:bookmarkStart w:id="30" w:name="_Toc242571445"/>
+      <w:bookmarkStart w:id="30" w:name="_Toc242654781"/>
       <w:r>
         <w:rPr>
           <w:lang w:val="es-CL"/>
@@ -19957,7 +20127,7 @@
           <w:numId w:val="0"/>
         </w:numPr>
       </w:pPr>
-      <w:bookmarkStart w:id="31" w:name="_Toc242571446"/>
+      <w:bookmarkStart w:id="31" w:name="_Toc242654782"/>
       <w:r>
         <w:t>Flujo de autenticación y perfil (Sprint 1)</w:t>
       </w:r>
@@ -20703,7 +20873,7 @@
           <w:numId w:val="0"/>
         </w:numPr>
       </w:pPr>
-      <w:bookmarkStart w:id="32" w:name="_Toc242571447"/>
+      <w:bookmarkStart w:id="32" w:name="_Toc242654783"/>
       <w:r>
         <w:t>Flujo de reserva de hora (Sprints 2 y 3)</w:t>
       </w:r>
@@ -21146,7 +21316,7 @@
           <w:numId w:val="0"/>
         </w:numPr>
       </w:pPr>
-      <w:bookmarkStart w:id="33" w:name="_Toc242571448"/>
+      <w:bookmarkStart w:id="33" w:name="_Toc242654784"/>
       <w:r>
         <w:t>Flujo de recuperación de contraseña y acceso con Google (Sprint 2)</w:t>
       </w:r>
@@ -21757,7 +21927,7 @@
           <w:numId w:val="0"/>
         </w:numPr>
       </w:pPr>
-      <w:bookmarkStart w:id="34" w:name="_Toc242571449"/>
+      <w:bookmarkStart w:id="34" w:name="_Toc242654785"/>
       <w:r>
         <w:t>Flujo de búsqueda de profesionales, favoritos y reseñas (Sprint 3)</w:t>
       </w:r>
@@ -22141,7 +22311,7 @@
           <w:numId w:val="0"/>
         </w:numPr>
       </w:pPr>
-      <w:bookmarkStart w:id="35" w:name="_Toc242571450"/>
+      <w:bookmarkStart w:id="35" w:name="_Toc242654786"/>
       <w:r>
         <w:t>Flujo del espacio del profesional (Sprint 3)</w:t>
       </w:r>
@@ -22527,7 +22697,7 @@
       <w:pPr>
         <w:pStyle w:val="EstiloTtulo2VerdanaJustificado"/>
       </w:pPr>
-      <w:bookmarkStart w:id="36" w:name="_Toc242571451"/>
+      <w:bookmarkStart w:id="36" w:name="_Toc242654787"/>
       <w:r>
         <w:t>Flujo de verificación de profesionales</w:t>
       </w:r>
@@ -22540,7 +22710,7 @@
     </w:p>
     <w:p>
       <w:r>
-        <w:t>Certificaciones presenta identidad y título obligatorios y antecedentes opcionales, con carga azul y envío naranjo. El RUT agrega el guion y valida el dígito verificador. Recargar conserva únicamente el último adjunto vigente de cada tipo. Rechazo, revocación y cambio de especialidad invalidan archivos anteriores y exigen documentos nuevos. Se admiten PDF, PNG y JPEG válidos de hasta 5 MB por archivo; las versiones históricas no bloquean nuevas cargas. Los documentos son privados; no hay correo automático ni acreditación externa de títulos.</w:t>
+        <w:t>Certificaciones presenta identidad y título obligatorios y antecedentes opcionales, con carga azul y envío naranjo. El RUT agrega el guion y valida el dígito verificador. Recargar conserva únicamente el último adjunto vigente de cada tipo. Rechazo, revocación y cambio de especialidad invalidan archivos anteriores y exigen documentos nuevos. Se admiten PDF, PNG y JPEG válidos de hasta 5 MB por archivo; se admiten hasta diez cargas por tipo y trámite. La vigencia se determina por los IDs del último documento de cada tipo; los históricos no cuentan como adjuntos actuales. Los documentos son privados; no hay correo automático ni acreditación externa de títulos.</w:t>
       </w:r>
     </w:p>
     <w:p>
@@ -22560,7 +22730,7 @@
     </w:p>
     <w:p>
       <w:r>
-        <w:t>Validación del PR #19 al 11-10-2026: 213 pruebas backend en 25 suites y 165 frontend en 21 archivos aprobadas; lint y build correctos. Regresión adicional: 49 comprobaciones sobre Express y MySQL reales, incluida recarga, más de veinte versiones, rechazo, reenvío y cambio de especialidad. Datos temporales eliminados al finalizar. Casos y límites en Plan de Pruebas/FS-HU-12_Verificacion.md. La aceptación del PO y la sincronización de Drive posterior a la fusión siguen pendientes.</w:t>
+        <w:t>Los PR #19 y #20 están fusionados. El PR #20 aprobó 217 pruebas backend y 166 frontend y controla diez cargas por tipo y trámite, vigencia por IDs y Sin solicitud. La observación de reinicios reiterados de cuota por cambio de especialidad sigue pendiente. Esta versión 1.20 agrega disponibilidad, reservas y mapa/lista en una rama nueva, todavía pendiente de fusión y aceptación del PO: 231 pruebas backend, 172 frontend y 25 comprobaciones con MySQL real aprobadas. SMTP real y Google Maps real requieren credenciales y clave respectivamente.</w:t>
       </w:r>
     </w:p>
     <w:p>
@@ -22575,7 +22745,7 @@
           <w:lang w:val="es-ES"/>
         </w:rPr>
       </w:pPr>
-      <w:bookmarkStart w:id="37" w:name="_Toc242571452"/>
+      <w:bookmarkStart w:id="37" w:name="_Toc242654788"/>
       <w:r>
         <w:rPr>
           <w:lang w:val="es-ES"/>
@@ -22606,7 +22776,7 @@
         <w:lastRenderedPageBreak/>
         <w:drawing>
           <wp:inline distT="0" distB="0" distL="0" distR="0" wp14:anchorId="6152AB04" wp14:editId="3B7798A9">
-            <wp:extent cx="5760000" cy="3546000"/>
+            <wp:extent cx="5760000" cy="2887200"/>
             <wp:effectExtent l="0" t="0" r="0" b="0"/>
             <wp:docPr id="7" name="Picture 7"/>
             <wp:cNvGraphicFramePr>
@@ -22628,7 +22798,7 @@
                   <pic:spPr>
                     <a:xfrm>
                       <a:off x="0" y="0"/>
-                      <a:ext cx="5760000" cy="3546000"/>
+                      <a:ext cx="5760000" cy="2887200"/>
                     </a:xfrm>
                     <a:prstGeom prst="rect">
                       <a:avLst/>
@@ -22652,7 +22822,7 @@
         </w:rPr>
       </w:pPr>
       <w:r>
-        <w:t>Ilustración 9: Dependencias de frontend/backend, panel administrativo, sesiones, documentos privados y Prisma compartido (DAS 1.18)</w:t>
+        <w:t>Ilustración 9: Dependencias de frontend/backend, agenda, reservas, panel administrativo y Prisma compartido (DAS 1.20; pendiente de fusión).</w:t>
       </w:r>
     </w:p>
     <w:tbl>
@@ -23097,14 +23267,56 @@
               <w:rPr>
                 <w:sz w:val="17"/>
               </w:rPr>
-              <w:t xml:space="preserve">Autenticación, perfil, nutrición, directorio, ficha profesional, archivos privados, favoritos, reseñas y clima. Open-Meteo está integrado; Claude y Google </w:t>
+              <w:t>Autenticación, perfil, nutrición, directorio, ficha, documentos privados, favoritos, reseñas, agenda y reservas. Open-Meteo está integrado; Claude permanece previsto. Google Maps se integra desde el frontend, con validación real pendiente de clave.</w:t>
+            </w:r>
+          </w:p>
+        </w:tc>
+      </w:tr>
+      <w:tr>
+        <w:tc>
+          <w:tcPr>
+            <w:tcW w:w="2000" w:type="dxa"/>
+          </w:tcPr>
+          <w:p>
+            <w:r>
+              <w:rPr>
+                <w:b/>
+                <w:sz w:val="17"/>
+              </w:rPr>
+              <w:t>Models</w:t>
+            </w:r>
+          </w:p>
+        </w:tc>
+        <w:tc>
+          <w:tcPr>
+            <w:tcW w:w="2600" w:type="dxa"/>
+          </w:tcPr>
+          <w:p>
+            <w:r>
+              <w:rPr>
+                <w:sz w:val="17"/>
+              </w:rPr>
+              <w:t>backend/src/models</w:t>
+            </w:r>
+          </w:p>
+        </w:tc>
+        <w:tc>
+          <w:tcPr>
+            <w:tcW w:w="4400" w:type="dxa"/>
+          </w:tcPr>
+          <w:p>
+            <w:r>
+              <w:rPr>
+                <w:sz w:val="17"/>
+              </w:rPr>
+              <w:t xml:space="preserve">Consultas MySQL con Prisma compartido; agregados administrativos, estado de sesión y decisiones de </w:t>
             </w:r>
             <w:r>
               <w:rPr>
                 <w:sz w:val="17"/>
               </w:rPr>
               <w:lastRenderedPageBreak/>
-              <w:t>Maps permanecen previstos.</w:t>
+              <w:t>verificación con historial y control de revisión dentro de transacciones.</w:t>
             </w:r>
           </w:p>
         </w:tc>
@@ -23121,48 +23333,6 @@
                 <w:sz w:val="17"/>
               </w:rPr>
               <w:lastRenderedPageBreak/>
-              <w:t>Models</w:t>
-            </w:r>
-          </w:p>
-        </w:tc>
-        <w:tc>
-          <w:tcPr>
-            <w:tcW w:w="2600" w:type="dxa"/>
-          </w:tcPr>
-          <w:p>
-            <w:r>
-              <w:rPr>
-                <w:sz w:val="17"/>
-              </w:rPr>
-              <w:t>backend/src/models</w:t>
-            </w:r>
-          </w:p>
-        </w:tc>
-        <w:tc>
-          <w:tcPr>
-            <w:tcW w:w="4400" w:type="dxa"/>
-          </w:tcPr>
-          <w:p>
-            <w:r>
-              <w:rPr>
-                <w:sz w:val="17"/>
-              </w:rPr>
-              <w:t>Consultas MySQL con Prisma compartido; agregados administrativos, estado de sesión y decisiones de verificación con historial y control de revisión dentro de transacciones.</w:t>
-            </w:r>
-          </w:p>
-        </w:tc>
-      </w:tr>
-      <w:tr>
-        <w:tc>
-          <w:tcPr>
-            <w:tcW w:w="2000" w:type="dxa"/>
-          </w:tcPr>
-          <w:p>
-            <w:r>
-              <w:rPr>
-                <w:b/>
-                <w:sz w:val="17"/>
-              </w:rPr>
               <w:t>Prisma</w:t>
             </w:r>
           </w:p>
@@ -23257,7 +23427,7 @@
         </w:rPr>
         <w:br w:type="page"/>
       </w:r>
-      <w:bookmarkStart w:id="38" w:name="_Toc242571453"/>
+      <w:bookmarkStart w:id="38" w:name="_Toc242654789"/>
       <w:r>
         <w:rPr>
           <w:lang w:val="es-ES"/>
@@ -23275,7 +23445,7 @@
         </w:rPr>
       </w:pPr>
       <w:r>
-        <w:t>El estado local usa React/Vite, Express y MySQL, con Google Identity y Open-Meteo integrados. La API almacena documentos fuera de las rutas públicas; VERIFICATION_STORAGE_DIR debe apuntar a un directorio persistente y restringido, respaldado junto con MySQL. El despliegue objetivo Docker/Nginx con HTTPS corresponde a FS-HU-11 y sigue pendiente: requiere un volumen persistente para esos archivos. Claude y Google Maps son previstos; SMTP requiere configuración. La figura distingue las diez tablas actuales del modelo completo de quince.</w:t>
+        <w:t>El estado local usa React/Vite, Express y MySQL, Google Identity y Open-Meteo. Google Maps está integrado con prueba real pendiente de clave; SMTP requiere credenciales. Disponibilidad y reservas utilizan MySQL y Prisma compartido. VERIFICATION_STORAGE_DIR debe apuntar a un directorio persistente y restringido, respaldado junto con MySQL. Docker/Nginx con HTTPS pertenece a FS-HU-11 y sigue pendiente; Claude también sigue previsto. Esta rama representa doce tablas implementadas de quince.</w:t>
       </w:r>
     </w:p>
     <w:p>
@@ -23288,7 +23458,7 @@
         </w:rPr>
         <w:drawing>
           <wp:inline distT="0" distB="0" distL="0" distR="0" wp14:anchorId="76286DEC" wp14:editId="080DF178">
-            <wp:extent cx="5760000" cy="1897199"/>
+            <wp:extent cx="5760000" cy="1782000"/>
             <wp:effectExtent l="0" t="0" r="0" b="0"/>
             <wp:docPr id="8" name="Picture 8"/>
             <wp:cNvGraphicFramePr>
@@ -23310,7 +23480,7 @@
                   <pic:spPr>
                     <a:xfrm>
                       <a:off x="0" y="0"/>
-                      <a:ext cx="5760000" cy="1897199"/>
+                      <a:ext cx="5760000" cy="1782000"/>
                     </a:xfrm>
                     <a:prstGeom prst="rect">
                       <a:avLst/>
@@ -23334,7 +23504,7 @@
         </w:rPr>
       </w:pPr>
       <w:r>
-        <w:t>Ilustración 10: Estado local, documentos privados persistentes y despliegue objetivo Docker/Nginx (DAS 1.18)</w:t>
+        <w:t>Ilustración 10: Estado local con doce tablas, mapa pendiente de clave y despliegue objetivo Docker/Nginx (DAS 1.20; pendiente de fusión).</w:t>
       </w:r>
     </w:p>
     <w:p>
@@ -24788,7 +24958,7 @@
         </w:rPr>
         <w:br w:type="page"/>
       </w:r>
-      <w:bookmarkStart w:id="39" w:name="_Toc242571454"/>
+      <w:bookmarkStart w:id="39" w:name="_Toc242654790"/>
       <w:r>
         <w:rPr>
           <w:lang w:val="es-ES"/>
@@ -25544,7 +25714,7 @@
         </w:rPr>
         <w:br w:type="page"/>
       </w:r>
-      <w:bookmarkStart w:id="40" w:name="_Toc242571455"/>
+      <w:bookmarkStart w:id="40" w:name="_Toc242654791"/>
       <w:r>
         <w:rPr>
           <w:lang w:val="es-ES"/>
@@ -27330,7 +27500,7 @@
         </w:rPr>
         <w:br w:type="page"/>
       </w:r>
-      <w:bookmarkStart w:id="41" w:name="_Toc242571456"/>
+      <w:bookmarkStart w:id="41" w:name="_Toc242654792"/>
       <w:r>
         <w:rPr>
           <w:lang w:val="es-ES"/>
@@ -27780,7 +27950,7 @@
               <w:rPr>
                 <w:sz w:val="17"/>
               </w:rPr>
-              <w:t>Reutilizado (servicio externo) — previsto</w:t>
+              <w:t>Reutilizado; integrado, pendiente de clave</w:t>
             </w:r>
           </w:p>
         </w:tc>
@@ -27793,7 +27963,7 @@
               <w:rPr>
                 <w:sz w:val="17"/>
               </w:rPr>
-              <w:t>Mapas, geocodificación y búsqueda de lugares.</w:t>
+              <w:t>Mapa de resultados con marcadores y enlace a ficha. Prueba real pendiente de clave Google Maps.</w:t>
             </w:r>
           </w:p>
         </w:tc>
@@ -28074,7 +28244,7 @@
               <w:rPr>
                 <w:sz w:val="17"/>
               </w:rPr>
-              <w:t>Desarrollo previsto</w:t>
+              <w:t>Desarrollado en rama, pendiente de fusión</w:t>
             </w:r>
           </w:p>
         </w:tc>
@@ -28220,10 +28390,149 @@
       </w:tr>
     </w:tbl>
     <w:p/>
+    <w:p>
+      <w:pPr>
+        <w:pStyle w:val="EstiloTtulo1VerdanaJustificado"/>
+        <w:pageBreakBefore/>
+        <w:rPr>
+          <w:lang w:val="es-ES"/>
+        </w:rPr>
+      </w:pPr>
+      <w:bookmarkStart w:id="42" w:name="_Toc242654793"/>
+      <w:r>
+        <w:lastRenderedPageBreak/>
+        <w:t>Disponibilidad reservas y mapa del Sprint 3</w:t>
+      </w:r>
+      <w:bookmarkEnd w:id="42"/>
+    </w:p>
+    <w:p>
+      <w:pPr>
+        <w:spacing w:after="120"/>
+      </w:pPr>
+      <w:r>
+        <w:t>Esta sección describe los cambios de codex/completar-sprints-2-y-3 y no declara aceptación ni despliegue. Rodrigo autorizó completar los pendientes de ambos sprints. Disponibilidad y reservas se comprobaron con MySQL real. El mapa está integrado, pero su prueba con Google requiere la clave del proyecto. El correo real requiere credenciales SMTP; aún no se envió la prueba autorizada.</w:t>
+      </w:r>
+    </w:p>
+    <w:p>
+      <w:pPr>
+        <w:spacing w:after="120"/>
+      </w:pPr>
+      <w:r>
+        <w:t>El profesional publica bloques futuros dentro de 365 días, con fecha y horas locales de America/Santiago. Se rechazan duraciones inválidas y superposiciones. Los bloques contiguos se admiten. Un bloque que tuvo reservas no se edita ni elimina para conservar el historial.</w:t>
+      </w:r>
+    </w:p>
+    <w:p>
+      <w:pPr>
+        <w:spacing w:after="120"/>
+      </w:pPr>
+      <w:r>
+        <w:t>El usuario reserva desde la ficha con un mensaje de 10 a 500 caracteres. Solo el profesional puede confirmar; ambos participantes pueden cancelar. Cancelar libera el bloque, conserva la reserva y no permite reactivarla. Los horarios pasados permanecen en el historial. El mensaje solo aparece en las reservas privadas de los participantes.</w:t>
+      </w:r>
+    </w:p>
+    <w:p>
+      <w:pPr>
+        <w:spacing w:after="120"/>
+      </w:pPr>
+      <w:r>
+        <w:t>Las escrituras de agenda utilizan Prisma compartido, transacciones ReadCommitted y bloqueo del profesional. La reserva bloquea también el bloque, consulta activas bajo bloqueo y solo entonces inserta. Dos solicitudes concurrentes obtuvieron 201 y 409, con una sola reserva activa. Las comparaciones de superposición usan parámetros CAST a TIME para respetar los tipos MySQL.</w:t>
+      </w:r>
+    </w:p>
+    <w:p>
+      <w:pPr>
+        <w:spacing w:after="120"/>
+      </w:pPr>
+      <w:r>
+        <w:t>Rutas: GET/POST /api/disponibilidades y PUT/DELETE /api/disponibilidades/:id para el profesional dueño; GET /api/profesionales/:id/disponibilidades para horarios públicos; GET/POST /api/reservas y PATCH /api/reservas/:id para los participantes. El cliente no asigna usuarioId ni profesionalId. Errores 400, 401, 403, 404 y 409 según validación, sesión, propiedad, existencia y conflicto.</w:t>
+      </w:r>
+    </w:p>
+    <w:p>
+      <w:pPr>
+        <w:spacing w:after="120"/>
+      </w:pPr>
+      <w:r>
+        <w:t>Google Maps conserva filtros y página al alternar Lista/Mapa. Usa carga diferida del SDK y AdvancedMarkerElement. Sin clave o ante fallo mantiene los resultados accesibles y ofrece reintentar. VITE_GOOGLE_MAPS_API_KEY y VITE_GOOGLE_MAPS_MAP_ID se configuran en frontend/.env. Las pruebas del SDK son simuladas y no acreditan conexión real.</w:t>
+      </w:r>
+    </w:p>
+    <w:p>
+      <w:pPr>
+        <w:spacing w:after="120"/>
+      </w:pPr>
+      <w:r>
+        <w:t>La migración 20261012010000_disponibilidad_reservas agrega disponibilidades y reservas: doce tablas implementadas de quince. Conversaciones, mensajes y registro_comida siguen previstos. La prueba SMTP se prepara con npm run smtp:comprobar; usuario y contraseña aún faltan en el entorno local.</w:t>
+      </w:r>
+    </w:p>
+    <w:p>
+      <w:pPr>
+        <w:spacing w:after="120"/>
+      </w:pPr>
+      <w:r>
+        <w:t>Fuentes: Sprint 3/Disponibilidad_Reservas_Mapa.md, Plan de Pruebas/FS-HU-06_13_14.md y Agenda_MySQL_2026-10-11.json. El nuevo flujo 12_Disponibilidad_y_Reservas representa esta implementación; los diseños 09 y 10 anteriores son antecedentes. Actualizar Drive y Miro solo después de la fusión. Las horas, estimaciones y aceptación del PO siguen pendientes.</w:t>
+      </w:r>
+    </w:p>
+    <w:p>
+      <w:pPr>
+        <w:jc w:val="center"/>
+      </w:pPr>
+      <w:r>
+        <w:rPr>
+          <w:noProof/>
+        </w:rPr>
+        <w:lastRenderedPageBreak/>
+        <w:drawing>
+          <wp:inline distT="0" distB="0" distL="0" distR="0" wp14:anchorId="7BCADAB0" wp14:editId="30348CBF">
+            <wp:extent cx="5943600" cy="5291661"/>
+            <wp:effectExtent l="0" t="0" r="0" b="0"/>
+            <wp:docPr id="950" name="Flujo disponibilidad y reservas"/>
+            <wp:cNvGraphicFramePr>
+              <a:graphicFrameLocks xmlns:a="http://schemas.openxmlformats.org/drawingml/2006/main" noChangeAspect="1"/>
+            </wp:cNvGraphicFramePr>
+            <a:graphic xmlns:a="http://schemas.openxmlformats.org/drawingml/2006/main">
+              <a:graphicData uri="http://schemas.openxmlformats.org/drawingml/2006/picture">
+                <pic:pic xmlns:pic="http://schemas.openxmlformats.org/drawingml/2006/picture">
+                  <pic:nvPicPr>
+                    <pic:cNvPr id="0" name="cu.png"/>
+                    <pic:cNvPicPr/>
+                  </pic:nvPicPr>
+                  <pic:blipFill>
+                    <a:blip r:embed="rId20"/>
+                    <a:stretch>
+                      <a:fillRect/>
+                    </a:stretch>
+                  </pic:blipFill>
+                  <pic:spPr>
+                    <a:xfrm>
+                      <a:off x="0" y="0"/>
+                      <a:ext cx="5943600" cy="5291661"/>
+                    </a:xfrm>
+                    <a:prstGeom prst="rect">
+                      <a:avLst/>
+                    </a:prstGeom>
+                  </pic:spPr>
+                </pic:pic>
+              </a:graphicData>
+            </a:graphic>
+          </wp:inline>
+        </w:drawing>
+      </w:r>
+    </w:p>
+    <w:p>
+      <w:pPr>
+        <w:pStyle w:val="Epgrafe"/>
+        <w:jc w:val="center"/>
+        <w:rPr>
+          <w:i/>
+          <w:iCs/>
+          <w:lang w:val="es-ES"/>
+        </w:rPr>
+      </w:pPr>
+      <w:r>
+        <w:t>Ilustración 12: Publicación de disponibilidad, reserva concurrente y decisiones de los participantes (FS-HU-13 y FS-HU-14; DAS 1.20).</w:t>
+      </w:r>
+    </w:p>
     <w:sectPr>
-      <w:headerReference w:type="default" r:id="rId20"/>
-      <w:footerReference w:type="default" r:id="rId21"/>
-      <w:headerReference w:type="first" r:id="rId22"/>
+      <w:headerReference w:type="default" r:id="rId21"/>
+      <w:footerReference w:type="default" r:id="rId22"/>
+      <w:headerReference w:type="first" r:id="rId23"/>
       <w:type w:val="continuous"/>
       <w:pgSz w:w="12240" w:h="15840" w:code="1"/>
       <w:pgMar w:top="1440" w:right="1440" w:bottom="1440" w:left="1760" w:header="720" w:footer="720" w:gutter="0"/>

</xml_diff>

<commit_message>
Corrige superposición de horas, retiro de horarios y notas del backlog
</commit_message>
<xml_diff>
--- a/FASE 2/Evidencias Proyecto/Evidencias de documentación/Documento de Arquitectura (DAS)/Documento_Arquitectura_Sistema_DAS_.docx
+++ b/FASE 2/Evidencias Proyecto/Evidencias de documentación/Documento de Arquitectura (DAS)/Documento_Arquitectura_Sistema_DAS_.docx
@@ -237,7 +237,7 @@
           <w:szCs w:val="36"/>
           <w:lang w:val="es-CL"/>
         </w:rPr>
-        <w:t>Versión 1.20</w:t>
+        <w:t>Versión 1.21</w:t>
       </w:r>
     </w:p>
     <w:p>
@@ -561,7 +561,7 @@
           </w:tcPr>
           <w:p>
             <w:r>
-              <w:t>1.20</w:t>
+              <w:t>1.21</w:t>
             </w:r>
           </w:p>
         </w:tc>
@@ -670,7 +670,7 @@
               <w:ind w:left="1440" w:hanging="1440"/>
             </w:pPr>
             <w:r>
-              <w:t>11-10-2026</w:t>
+              <w:t>12-10-2026</w:t>
             </w:r>
           </w:p>
         </w:tc>
@@ -2378,6 +2378,75 @@
           </w:p>
         </w:tc>
       </w:tr>
+      <w:tr>
+        <w:trPr>
+          <w:cantSplit/>
+        </w:trPr>
+        <w:tc>
+          <w:tcPr>
+            <w:tcW w:w="2196" w:type="dxa"/>
+          </w:tcPr>
+          <w:p>
+            <w:pPr>
+              <w:pStyle w:val="Tabletext"/>
+              <w:rPr>
+                <w:lang w:val="es-CL"/>
+              </w:rPr>
+            </w:pPr>
+            <w:r>
+              <w:t>12-10-2026</w:t>
+            </w:r>
+          </w:p>
+        </w:tc>
+        <w:tc>
+          <w:tcPr>
+            <w:tcW w:w="1152" w:type="dxa"/>
+          </w:tcPr>
+          <w:p>
+            <w:pPr>
+              <w:pStyle w:val="Tabletext"/>
+              <w:rPr>
+                <w:lang w:val="es-CL"/>
+              </w:rPr>
+            </w:pPr>
+            <w:r>
+              <w:t>1.21</w:t>
+            </w:r>
+          </w:p>
+        </w:tc>
+        <w:tc>
+          <w:tcPr>
+            <w:tcW w:w="3744" w:type="dxa"/>
+          </w:tcPr>
+          <w:p>
+            <w:pPr>
+              <w:pStyle w:val="Tabletext"/>
+              <w:rPr>
+                <w:lang w:val="es-CL"/>
+              </w:rPr>
+            </w:pPr>
+            <w:r>
+              <w:t>Corrección del PR #21: horas en punto mediante comparación de segundos, retiro de horarios con historial cancelado, migración aditiva y restauración de notas originales del Product Backlog. 231 pruebas backend, 173 frontend y 39 comprobaciones con MySQL real. Pendiente de revisión y fusión; Drive/Miro después de fusionar.</w:t>
+            </w:r>
+          </w:p>
+        </w:tc>
+        <w:tc>
+          <w:tcPr>
+            <w:tcW w:w="1908" w:type="dxa"/>
+          </w:tcPr>
+          <w:p>
+            <w:pPr>
+              <w:pStyle w:val="Tabletext"/>
+              <w:rPr>
+                <w:lang w:val="es-CL"/>
+              </w:rPr>
+            </w:pPr>
+            <w:r>
+              <w:t>Luis Méndez</w:t>
+            </w:r>
+          </w:p>
+        </w:tc>
+      </w:tr>
     </w:tbl>
     <w:p>
       <w:pPr>
@@ -2441,7 +2510,7 @@
         </w:rPr>
         <w:fldChar w:fldCharType="separate"/>
       </w:r>
-      <w:hyperlink w:anchor="_Toc242654762" w:history="1">
+      <w:hyperlink w:anchor="_Toc242659983" w:history="1">
         <w:r>
           <w:rPr>
             <w:rStyle w:val="Hipervnculo"/>
@@ -2492,7 +2561,7 @@
             <w:noProof/>
             <w:webHidden/>
           </w:rPr>
-          <w:instrText xml:space="preserve"> PAGEREF _Toc242654762 \h </w:instrText>
+          <w:instrText xml:space="preserve"> PAGEREF _Toc242659983 \h </w:instrText>
         </w:r>
         <w:r>
           <w:rPr>
@@ -2541,7 +2610,7 @@
           <w14:ligatures w14:val="standardContextual"/>
         </w:rPr>
       </w:pPr>
-      <w:hyperlink w:anchor="_Toc242654763" w:history="1">
+      <w:hyperlink w:anchor="_Toc242659984" w:history="1">
         <w:r>
           <w:rPr>
             <w:rStyle w:val="Hipervnculo"/>
@@ -2590,7 +2659,7 @@
             <w:noProof/>
             <w:webHidden/>
           </w:rPr>
-          <w:instrText xml:space="preserve"> PAGEREF _Toc242654763 \h </w:instrText>
+          <w:instrText xml:space="preserve"> PAGEREF _Toc242659984 \h </w:instrText>
         </w:r>
         <w:r>
           <w:rPr>
@@ -2639,7 +2708,7 @@
           <w14:ligatures w14:val="standardContextual"/>
         </w:rPr>
       </w:pPr>
-      <w:hyperlink w:anchor="_Toc242654764" w:history="1">
+      <w:hyperlink w:anchor="_Toc242659985" w:history="1">
         <w:r>
           <w:rPr>
             <w:rStyle w:val="Hipervnculo"/>
@@ -2688,7 +2757,7 @@
             <w:noProof/>
             <w:webHidden/>
           </w:rPr>
-          <w:instrText xml:space="preserve"> PAGEREF _Toc242654764 \h </w:instrText>
+          <w:instrText xml:space="preserve"> PAGEREF _Toc242659985 \h </w:instrText>
         </w:r>
         <w:r>
           <w:rPr>
@@ -2737,7 +2806,7 @@
           <w14:ligatures w14:val="standardContextual"/>
         </w:rPr>
       </w:pPr>
-      <w:hyperlink w:anchor="_Toc242654765" w:history="1">
+      <w:hyperlink w:anchor="_Toc242659986" w:history="1">
         <w:r>
           <w:rPr>
             <w:rStyle w:val="Hipervnculo"/>
@@ -2786,7 +2855,7 @@
             <w:noProof/>
             <w:webHidden/>
           </w:rPr>
-          <w:instrText xml:space="preserve"> PAGEREF _Toc242654765 \h </w:instrText>
+          <w:instrText xml:space="preserve"> PAGEREF _Toc242659986 \h </w:instrText>
         </w:r>
         <w:r>
           <w:rPr>
@@ -2835,7 +2904,7 @@
           <w14:ligatures w14:val="standardContextual"/>
         </w:rPr>
       </w:pPr>
-      <w:hyperlink w:anchor="_Toc242654766" w:history="1">
+      <w:hyperlink w:anchor="_Toc242659987" w:history="1">
         <w:r>
           <w:rPr>
             <w:rStyle w:val="Hipervnculo"/>
@@ -2884,7 +2953,7 @@
             <w:noProof/>
             <w:webHidden/>
           </w:rPr>
-          <w:instrText xml:space="preserve"> PAGEREF _Toc242654766 \h </w:instrText>
+          <w:instrText xml:space="preserve"> PAGEREF _Toc242659987 \h </w:instrText>
         </w:r>
         <w:r>
           <w:rPr>
@@ -2933,7 +3002,7 @@
           <w14:ligatures w14:val="standardContextual"/>
         </w:rPr>
       </w:pPr>
-      <w:hyperlink w:anchor="_Toc242654767" w:history="1">
+      <w:hyperlink w:anchor="_Toc242659988" w:history="1">
         <w:r>
           <w:rPr>
             <w:rStyle w:val="Hipervnculo"/>
@@ -2982,7 +3051,7 @@
             <w:noProof/>
             <w:webHidden/>
           </w:rPr>
-          <w:instrText xml:space="preserve"> PAGEREF _Toc242654767 \h </w:instrText>
+          <w:instrText xml:space="preserve"> PAGEREF _Toc242659988 \h </w:instrText>
         </w:r>
         <w:r>
           <w:rPr>
@@ -3031,7 +3100,7 @@
           <w14:ligatures w14:val="standardContextual"/>
         </w:rPr>
       </w:pPr>
-      <w:hyperlink w:anchor="_Toc242654768" w:history="1">
+      <w:hyperlink w:anchor="_Toc242659989" w:history="1">
         <w:r>
           <w:rPr>
             <w:rStyle w:val="Hipervnculo"/>
@@ -3080,7 +3149,7 @@
             <w:noProof/>
             <w:webHidden/>
           </w:rPr>
-          <w:instrText xml:space="preserve"> PAGEREF _Toc242654768 \h </w:instrText>
+          <w:instrText xml:space="preserve"> PAGEREF _Toc242659989 \h </w:instrText>
         </w:r>
         <w:r>
           <w:rPr>
@@ -3129,7 +3198,7 @@
           <w14:ligatures w14:val="standardContextual"/>
         </w:rPr>
       </w:pPr>
-      <w:hyperlink w:anchor="_Toc242654769" w:history="1">
+      <w:hyperlink w:anchor="_Toc242659990" w:history="1">
         <w:r>
           <w:rPr>
             <w:rStyle w:val="Hipervnculo"/>
@@ -3178,7 +3247,7 @@
             <w:noProof/>
             <w:webHidden/>
           </w:rPr>
-          <w:instrText xml:space="preserve"> PAGEREF _Toc242654769 \h </w:instrText>
+          <w:instrText xml:space="preserve"> PAGEREF _Toc242659990 \h </w:instrText>
         </w:r>
         <w:r>
           <w:rPr>
@@ -3229,7 +3298,7 @@
           <w14:ligatures w14:val="standardContextual"/>
         </w:rPr>
       </w:pPr>
-      <w:hyperlink w:anchor="_Toc242654770" w:history="1">
+      <w:hyperlink w:anchor="_Toc242659991" w:history="1">
         <w:r>
           <w:rPr>
             <w:rStyle w:val="Hipervnculo"/>
@@ -3280,7 +3349,7 @@
             <w:noProof/>
             <w:webHidden/>
           </w:rPr>
-          <w:instrText xml:space="preserve"> PAGEREF _Toc242654770 \h </w:instrText>
+          <w:instrText xml:space="preserve"> PAGEREF _Toc242659991 \h </w:instrText>
         </w:r>
         <w:r>
           <w:rPr>
@@ -3329,7 +3398,7 @@
           <w14:ligatures w14:val="standardContextual"/>
         </w:rPr>
       </w:pPr>
-      <w:hyperlink w:anchor="_Toc242654771" w:history="1">
+      <w:hyperlink w:anchor="_Toc242659992" w:history="1">
         <w:r>
           <w:rPr>
             <w:rStyle w:val="Hipervnculo"/>
@@ -3378,7 +3447,7 @@
             <w:noProof/>
             <w:webHidden/>
           </w:rPr>
-          <w:instrText xml:space="preserve"> PAGEREF _Toc242654771 \h </w:instrText>
+          <w:instrText xml:space="preserve"> PAGEREF _Toc242659992 \h </w:instrText>
         </w:r>
         <w:r>
           <w:rPr>
@@ -3427,7 +3496,7 @@
           <w14:ligatures w14:val="standardContextual"/>
         </w:rPr>
       </w:pPr>
-      <w:hyperlink w:anchor="_Toc242654772" w:history="1">
+      <w:hyperlink w:anchor="_Toc242659993" w:history="1">
         <w:r>
           <w:rPr>
             <w:rStyle w:val="Hipervnculo"/>
@@ -3476,7 +3545,7 @@
             <w:noProof/>
             <w:webHidden/>
           </w:rPr>
-          <w:instrText xml:space="preserve"> PAGEREF _Toc242654772 \h </w:instrText>
+          <w:instrText xml:space="preserve"> PAGEREF _Toc242659993 \h </w:instrText>
         </w:r>
         <w:r>
           <w:rPr>
@@ -3525,7 +3594,7 @@
           <w14:ligatures w14:val="standardContextual"/>
         </w:rPr>
       </w:pPr>
-      <w:hyperlink w:anchor="_Toc242654773" w:history="1">
+      <w:hyperlink w:anchor="_Toc242659994" w:history="1">
         <w:r>
           <w:rPr>
             <w:rStyle w:val="Hipervnculo"/>
@@ -3574,7 +3643,7 @@
             <w:noProof/>
             <w:webHidden/>
           </w:rPr>
-          <w:instrText xml:space="preserve"> PAGEREF _Toc242654773 \h </w:instrText>
+          <w:instrText xml:space="preserve"> PAGEREF _Toc242659994 \h </w:instrText>
         </w:r>
         <w:r>
           <w:rPr>
@@ -3625,7 +3694,7 @@
           <w14:ligatures w14:val="standardContextual"/>
         </w:rPr>
       </w:pPr>
-      <w:hyperlink w:anchor="_Toc242654774" w:history="1">
+      <w:hyperlink w:anchor="_Toc242659995" w:history="1">
         <w:r>
           <w:rPr>
             <w:rStyle w:val="Hipervnculo"/>
@@ -3676,7 +3745,7 @@
             <w:noProof/>
             <w:webHidden/>
           </w:rPr>
-          <w:instrText xml:space="preserve"> PAGEREF _Toc242654774 \h </w:instrText>
+          <w:instrText xml:space="preserve"> PAGEREF _Toc242659995 \h </w:instrText>
         </w:r>
         <w:r>
           <w:rPr>
@@ -3725,7 +3794,7 @@
           <w14:ligatures w14:val="standardContextual"/>
         </w:rPr>
       </w:pPr>
-      <w:hyperlink w:anchor="_Toc242654775" w:history="1">
+      <w:hyperlink w:anchor="_Toc242659996" w:history="1">
         <w:r>
           <w:rPr>
             <w:rStyle w:val="Hipervnculo"/>
@@ -3774,7 +3843,7 @@
             <w:noProof/>
             <w:webHidden/>
           </w:rPr>
-          <w:instrText xml:space="preserve"> PAGEREF _Toc242654775 \h </w:instrText>
+          <w:instrText xml:space="preserve"> PAGEREF _Toc242659996 \h </w:instrText>
         </w:r>
         <w:r>
           <w:rPr>
@@ -3823,7 +3892,7 @@
           <w14:ligatures w14:val="standardContextual"/>
         </w:rPr>
       </w:pPr>
-      <w:hyperlink w:anchor="_Toc242654776" w:history="1">
+      <w:hyperlink w:anchor="_Toc242659997" w:history="1">
         <w:r>
           <w:rPr>
             <w:rStyle w:val="Hipervnculo"/>
@@ -3872,7 +3941,7 @@
             <w:noProof/>
             <w:webHidden/>
           </w:rPr>
-          <w:instrText xml:space="preserve"> PAGEREF _Toc242654776 \h </w:instrText>
+          <w:instrText xml:space="preserve"> PAGEREF _Toc242659997 \h </w:instrText>
         </w:r>
         <w:r>
           <w:rPr>
@@ -3921,7 +3990,7 @@
           <w14:ligatures w14:val="standardContextual"/>
         </w:rPr>
       </w:pPr>
-      <w:hyperlink w:anchor="_Toc242654777" w:history="1">
+      <w:hyperlink w:anchor="_Toc242659998" w:history="1">
         <w:r>
           <w:rPr>
             <w:rStyle w:val="Hipervnculo"/>
@@ -3970,7 +4039,7 @@
             <w:noProof/>
             <w:webHidden/>
           </w:rPr>
-          <w:instrText xml:space="preserve"> PAGEREF _Toc242654777 \h </w:instrText>
+          <w:instrText xml:space="preserve"> PAGEREF _Toc242659998 \h </w:instrText>
         </w:r>
         <w:r>
           <w:rPr>
@@ -4020,7 +4089,7 @@
           <w14:ligatures w14:val="standardContextual"/>
         </w:rPr>
       </w:pPr>
-      <w:hyperlink w:anchor="_Toc242654778" w:history="1">
+      <w:hyperlink w:anchor="_Toc242659999" w:history="1">
         <w:r>
           <w:rPr>
             <w:rStyle w:val="Hipervnculo"/>
@@ -4048,7 +4117,7 @@
             <w:noProof/>
             <w:webHidden/>
           </w:rPr>
-          <w:instrText xml:space="preserve"> PAGEREF _Toc242654778 \h </w:instrText>
+          <w:instrText xml:space="preserve"> PAGEREF _Toc242659999 \h </w:instrText>
         </w:r>
         <w:r>
           <w:rPr>
@@ -4096,7 +4165,7 @@
           <w14:ligatures w14:val="standardContextual"/>
         </w:rPr>
       </w:pPr>
-      <w:hyperlink w:anchor="_Toc242654779" w:history="1">
+      <w:hyperlink w:anchor="_Toc242660000" w:history="1">
         <w:r>
           <w:rPr>
             <w:rStyle w:val="Hipervnculo"/>
@@ -4123,7 +4192,7 @@
             <w:noProof/>
             <w:webHidden/>
           </w:rPr>
-          <w:instrText xml:space="preserve"> PAGEREF _Toc242654779 \h </w:instrText>
+          <w:instrText xml:space="preserve"> PAGEREF _Toc242660000 \h </w:instrText>
         </w:r>
         <w:r>
           <w:rPr>
@@ -4171,7 +4240,7 @@
           <w14:ligatures w14:val="standardContextual"/>
         </w:rPr>
       </w:pPr>
-      <w:hyperlink w:anchor="_Toc242654780" w:history="1">
+      <w:hyperlink w:anchor="_Toc242660001" w:history="1">
         <w:r>
           <w:rPr>
             <w:rStyle w:val="Hipervnculo"/>
@@ -4198,7 +4267,7 @@
             <w:noProof/>
             <w:webHidden/>
           </w:rPr>
-          <w:instrText xml:space="preserve"> PAGEREF _Toc242654780 \h </w:instrText>
+          <w:instrText xml:space="preserve"> PAGEREF _Toc242660001 \h </w:instrText>
         </w:r>
         <w:r>
           <w:rPr>
@@ -4248,7 +4317,7 @@
           <w14:ligatures w14:val="standardContextual"/>
         </w:rPr>
       </w:pPr>
-      <w:hyperlink w:anchor="_Toc242654781" w:history="1">
+      <w:hyperlink w:anchor="_Toc242660002" w:history="1">
         <w:r>
           <w:rPr>
             <w:rStyle w:val="Hipervnculo"/>
@@ -4276,7 +4345,7 @@
             <w:noProof/>
             <w:webHidden/>
           </w:rPr>
-          <w:instrText xml:space="preserve"> PAGEREF _Toc242654781 \h </w:instrText>
+          <w:instrText xml:space="preserve"> PAGEREF _Toc242660002 \h </w:instrText>
         </w:r>
         <w:r>
           <w:rPr>
@@ -4324,7 +4393,7 @@
           <w14:ligatures w14:val="standardContextual"/>
         </w:rPr>
       </w:pPr>
-      <w:hyperlink w:anchor="_Toc242654782" w:history="1">
+      <w:hyperlink w:anchor="_Toc242660003" w:history="1">
         <w:r>
           <w:rPr>
             <w:rStyle w:val="Hipervnculo"/>
@@ -4351,7 +4420,7 @@
             <w:noProof/>
             <w:webHidden/>
           </w:rPr>
-          <w:instrText xml:space="preserve"> PAGEREF _Toc242654782 \h </w:instrText>
+          <w:instrText xml:space="preserve"> PAGEREF _Toc242660003 \h </w:instrText>
         </w:r>
         <w:r>
           <w:rPr>
@@ -4399,7 +4468,7 @@
           <w14:ligatures w14:val="standardContextual"/>
         </w:rPr>
       </w:pPr>
-      <w:hyperlink w:anchor="_Toc242654783" w:history="1">
+      <w:hyperlink w:anchor="_Toc242660004" w:history="1">
         <w:r>
           <w:rPr>
             <w:rStyle w:val="Hipervnculo"/>
@@ -4426,7 +4495,7 @@
             <w:noProof/>
             <w:webHidden/>
           </w:rPr>
-          <w:instrText xml:space="preserve"> PAGEREF _Toc242654783 \h </w:instrText>
+          <w:instrText xml:space="preserve"> PAGEREF _Toc242660004 \h </w:instrText>
         </w:r>
         <w:r>
           <w:rPr>
@@ -4474,7 +4543,7 @@
           <w14:ligatures w14:val="standardContextual"/>
         </w:rPr>
       </w:pPr>
-      <w:hyperlink w:anchor="_Toc242654784" w:history="1">
+      <w:hyperlink w:anchor="_Toc242660005" w:history="1">
         <w:r>
           <w:rPr>
             <w:rStyle w:val="Hipervnculo"/>
@@ -4501,7 +4570,7 @@
             <w:noProof/>
             <w:webHidden/>
           </w:rPr>
-          <w:instrText xml:space="preserve"> PAGEREF _Toc242654784 \h </w:instrText>
+          <w:instrText xml:space="preserve"> PAGEREF _Toc242660005 \h </w:instrText>
         </w:r>
         <w:r>
           <w:rPr>
@@ -4549,7 +4618,7 @@
           <w14:ligatures w14:val="standardContextual"/>
         </w:rPr>
       </w:pPr>
-      <w:hyperlink w:anchor="_Toc242654785" w:history="1">
+      <w:hyperlink w:anchor="_Toc242660006" w:history="1">
         <w:r>
           <w:rPr>
             <w:rStyle w:val="Hipervnculo"/>
@@ -4576,7 +4645,7 @@
             <w:noProof/>
             <w:webHidden/>
           </w:rPr>
-          <w:instrText xml:space="preserve"> PAGEREF _Toc242654785 \h </w:instrText>
+          <w:instrText xml:space="preserve"> PAGEREF _Toc242660006 \h </w:instrText>
         </w:r>
         <w:r>
           <w:rPr>
@@ -4624,7 +4693,7 @@
           <w14:ligatures w14:val="standardContextual"/>
         </w:rPr>
       </w:pPr>
-      <w:hyperlink w:anchor="_Toc242654786" w:history="1">
+      <w:hyperlink w:anchor="_Toc242660007" w:history="1">
         <w:r>
           <w:rPr>
             <w:rStyle w:val="Hipervnculo"/>
@@ -4651,7 +4720,7 @@
             <w:noProof/>
             <w:webHidden/>
           </w:rPr>
-          <w:instrText xml:space="preserve"> PAGEREF _Toc242654786 \h </w:instrText>
+          <w:instrText xml:space="preserve"> PAGEREF _Toc242660007 \h </w:instrText>
         </w:r>
         <w:r>
           <w:rPr>
@@ -4700,7 +4769,7 @@
           <w14:ligatures w14:val="standardContextual"/>
         </w:rPr>
       </w:pPr>
-      <w:hyperlink w:anchor="_Toc242654787" w:history="1">
+      <w:hyperlink w:anchor="_Toc242660008" w:history="1">
         <w:r>
           <w:rPr>
             <w:rStyle w:val="Hipervnculo"/>
@@ -4747,7 +4816,7 @@
             <w:noProof/>
             <w:webHidden/>
           </w:rPr>
-          <w:instrText xml:space="preserve"> PAGEREF _Toc242654787 \h </w:instrText>
+          <w:instrText xml:space="preserve"> PAGEREF _Toc242660008 \h </w:instrText>
         </w:r>
         <w:r>
           <w:rPr>
@@ -4797,7 +4866,7 @@
           <w14:ligatures w14:val="standardContextual"/>
         </w:rPr>
       </w:pPr>
-      <w:hyperlink w:anchor="_Toc242654788" w:history="1">
+      <w:hyperlink w:anchor="_Toc242660009" w:history="1">
         <w:r>
           <w:rPr>
             <w:rStyle w:val="Hipervnculo"/>
@@ -4825,7 +4894,7 @@
             <w:noProof/>
             <w:webHidden/>
           </w:rPr>
-          <w:instrText xml:space="preserve"> PAGEREF _Toc242654788 \h </w:instrText>
+          <w:instrText xml:space="preserve"> PAGEREF _Toc242660009 \h </w:instrText>
         </w:r>
         <w:r>
           <w:rPr>
@@ -4875,7 +4944,7 @@
           <w14:ligatures w14:val="standardContextual"/>
         </w:rPr>
       </w:pPr>
-      <w:hyperlink w:anchor="_Toc242654789" w:history="1">
+      <w:hyperlink w:anchor="_Toc242660010" w:history="1">
         <w:r>
           <w:rPr>
             <w:rStyle w:val="Hipervnculo"/>
@@ -4903,7 +4972,7 @@
             <w:noProof/>
             <w:webHidden/>
           </w:rPr>
-          <w:instrText xml:space="preserve"> PAGEREF _Toc242654789 \h </w:instrText>
+          <w:instrText xml:space="preserve"> PAGEREF _Toc242660010 \h </w:instrText>
         </w:r>
         <w:r>
           <w:rPr>
@@ -4953,7 +5022,7 @@
           <w14:ligatures w14:val="standardContextual"/>
         </w:rPr>
       </w:pPr>
-      <w:hyperlink w:anchor="_Toc242654790" w:history="1">
+      <w:hyperlink w:anchor="_Toc242660011" w:history="1">
         <w:r>
           <w:rPr>
             <w:rStyle w:val="Hipervnculo"/>
@@ -4981,7 +5050,7 @@
             <w:noProof/>
             <w:webHidden/>
           </w:rPr>
-          <w:instrText xml:space="preserve"> PAGEREF _Toc242654790 \h </w:instrText>
+          <w:instrText xml:space="preserve"> PAGEREF _Toc242660011 \h </w:instrText>
         </w:r>
         <w:r>
           <w:rPr>
@@ -5032,7 +5101,7 @@
           <w14:ligatures w14:val="standardContextual"/>
         </w:rPr>
       </w:pPr>
-      <w:hyperlink w:anchor="_Toc242654791" w:history="1">
+      <w:hyperlink w:anchor="_Toc242660012" w:history="1">
         <w:r>
           <w:rPr>
             <w:rStyle w:val="Hipervnculo"/>
@@ -5083,7 +5152,7 @@
             <w:noProof/>
             <w:webHidden/>
           </w:rPr>
-          <w:instrText xml:space="preserve"> PAGEREF _Toc242654791 \h </w:instrText>
+          <w:instrText xml:space="preserve"> PAGEREF _Toc242660012 \h </w:instrText>
         </w:r>
         <w:r>
           <w:rPr>
@@ -5134,7 +5203,7 @@
           <w14:ligatures w14:val="standardContextual"/>
         </w:rPr>
       </w:pPr>
-      <w:hyperlink w:anchor="_Toc242654792" w:history="1">
+      <w:hyperlink w:anchor="_Toc242660013" w:history="1">
         <w:r>
           <w:rPr>
             <w:rStyle w:val="Hipervnculo"/>
@@ -5185,7 +5254,7 @@
             <w:noProof/>
             <w:webHidden/>
           </w:rPr>
-          <w:instrText xml:space="preserve"> PAGEREF _Toc242654792 \h </w:instrText>
+          <w:instrText xml:space="preserve"> PAGEREF _Toc242660013 \h </w:instrText>
         </w:r>
         <w:r>
           <w:rPr>
@@ -5236,7 +5305,7 @@
           <w14:ligatures w14:val="standardContextual"/>
         </w:rPr>
       </w:pPr>
-      <w:hyperlink w:anchor="_Toc242654793" w:history="1">
+      <w:hyperlink w:anchor="_Toc242660014" w:history="1">
         <w:r>
           <w:rPr>
             <w:rStyle w:val="Hipervnculo"/>
@@ -5286,7 +5355,7 @@
             <w:noProof/>
             <w:webHidden/>
           </w:rPr>
-          <w:instrText xml:space="preserve"> PAGEREF _Toc242654793 \h </w:instrText>
+          <w:instrText xml:space="preserve"> PAGEREF _Toc242660014 \h </w:instrText>
         </w:r>
         <w:r>
           <w:rPr>
@@ -5358,7 +5427,7 @@
         </w:rPr>
         <w:br w:type="page"/>
       </w:r>
-      <w:bookmarkStart w:id="1" w:name="_Toc242654762"/>
+      <w:bookmarkStart w:id="1" w:name="_Toc242659983"/>
       <w:r>
         <w:rPr>
           <w:lang w:val="es-CL"/>
@@ -5381,7 +5450,7 @@
       <w:bookmarkStart w:id="4" w:name="_Toc324851941"/>
       <w:bookmarkStart w:id="5" w:name="_Toc324915524"/>
       <w:bookmarkStart w:id="6" w:name="_Toc433104437"/>
-      <w:bookmarkStart w:id="7" w:name="_Toc242654763"/>
+      <w:bookmarkStart w:id="7" w:name="_Toc242659984"/>
       <w:r>
         <w:rPr>
           <w:lang w:val="es-CL"/>
@@ -5419,7 +5488,7 @@
           <w:lang w:val="es-CL"/>
         </w:rPr>
       </w:pPr>
-      <w:bookmarkStart w:id="8" w:name="_Toc242654764"/>
+      <w:bookmarkStart w:id="8" w:name="_Toc242659985"/>
       <w:r>
         <w:rPr>
           <w:lang w:val="es-CL"/>
@@ -5468,7 +5537,7 @@
           <w:lang w:val="es-CL"/>
         </w:rPr>
       </w:pPr>
-      <w:bookmarkStart w:id="9" w:name="_Toc242654765"/>
+      <w:bookmarkStart w:id="9" w:name="_Toc242659986"/>
       <w:r>
         <w:rPr>
           <w:lang w:val="es-CL"/>
@@ -5637,7 +5706,7 @@
           <w:lang w:val="es-CL"/>
         </w:rPr>
       </w:pPr>
-      <w:bookmarkStart w:id="10" w:name="_Toc242654766"/>
+      <w:bookmarkStart w:id="10" w:name="_Toc242659987"/>
       <w:r>
         <w:rPr>
           <w:lang w:val="es-CL"/>
@@ -6427,7 +6496,7 @@
       <w:bookmarkStart w:id="13" w:name="_Toc324851945"/>
       <w:bookmarkStart w:id="14" w:name="_Toc324915528"/>
       <w:bookmarkStart w:id="15" w:name="_Toc433104441"/>
-      <w:bookmarkStart w:id="16" w:name="_Toc242654767"/>
+      <w:bookmarkStart w:id="16" w:name="_Toc242659988"/>
       <w:r>
         <w:rPr>
           <w:lang w:val="es-CL"/>
@@ -6571,7 +6640,7 @@
           <w:lang w:val="es-CL"/>
         </w:rPr>
       </w:pPr>
-      <w:bookmarkStart w:id="17" w:name="_Toc242654768"/>
+      <w:bookmarkStart w:id="17" w:name="_Toc242659989"/>
       <w:r>
         <w:rPr>
           <w:lang w:val="es-CL"/>
@@ -6621,7 +6690,7 @@
           <w:lang w:val="es-CL"/>
         </w:rPr>
       </w:pPr>
-      <w:bookmarkStart w:id="18" w:name="_Toc242654769"/>
+      <w:bookmarkStart w:id="18" w:name="_Toc242659990"/>
       <w:bookmarkEnd w:id="11"/>
       <w:bookmarkEnd w:id="12"/>
       <w:bookmarkEnd w:id="13"/>
@@ -6781,7 +6850,7 @@
         </w:rPr>
         <w:br w:type="page"/>
       </w:r>
-      <w:bookmarkStart w:id="19" w:name="_Toc242654770"/>
+      <w:bookmarkStart w:id="19" w:name="_Toc242659991"/>
       <w:r>
         <w:rPr>
           <w:lang w:val="es-CL"/>
@@ -6809,7 +6878,7 @@
           <w:lang w:val="es-CL"/>
         </w:rPr>
       </w:pPr>
-      <w:bookmarkStart w:id="20" w:name="_Toc242654771"/>
+      <w:bookmarkStart w:id="20" w:name="_Toc242659992"/>
       <w:r>
         <w:rPr>
           <w:lang w:val="es-CL"/>
@@ -6950,7 +7019,7 @@
           <w:lang w:val="es-CL"/>
         </w:rPr>
       </w:pPr>
-      <w:bookmarkStart w:id="21" w:name="_Toc242654772"/>
+      <w:bookmarkStart w:id="21" w:name="_Toc242659993"/>
       <w:r>
         <w:rPr>
           <w:lang w:val="es-CL"/>
@@ -7094,7 +7163,7 @@
           <w:lang w:val="es-CL"/>
         </w:rPr>
       </w:pPr>
-      <w:bookmarkStart w:id="22" w:name="_Toc242654773"/>
+      <w:bookmarkStart w:id="22" w:name="_Toc242659994"/>
       <w:r>
         <w:rPr>
           <w:lang w:val="es-CL"/>
@@ -7214,7 +7283,7 @@
         </w:rPr>
         <w:br w:type="page"/>
       </w:r>
-      <w:bookmarkStart w:id="23" w:name="_Toc242654774"/>
+      <w:bookmarkStart w:id="23" w:name="_Toc242659995"/>
       <w:r>
         <w:rPr>
           <w:lang w:val="es-ES"/>
@@ -7265,7 +7334,7 @@
           <w:lang w:val="es-ES"/>
         </w:rPr>
       </w:pPr>
-      <w:bookmarkStart w:id="24" w:name="_Toc242654775"/>
+      <w:bookmarkStart w:id="24" w:name="_Toc242659996"/>
       <w:r>
         <w:rPr>
           <w:lang w:val="es-CL"/>
@@ -7351,7 +7420,7 @@
           <w:lang w:val="es-CL"/>
         </w:rPr>
       </w:pPr>
-      <w:bookmarkStart w:id="25" w:name="_Toc242654776"/>
+      <w:bookmarkStart w:id="25" w:name="_Toc242659997"/>
       <w:r>
         <w:rPr>
           <w:lang w:val="es-CL"/>
@@ -8905,7 +8974,7 @@
           <w:lang w:val="es-CL"/>
         </w:rPr>
       </w:pPr>
-      <w:bookmarkStart w:id="26" w:name="_Toc242654777"/>
+      <w:bookmarkStart w:id="26" w:name="_Toc242659998"/>
       <w:r>
         <w:rPr>
           <w:lang w:val="es-CL"/>
@@ -9993,7 +10062,7 @@
           <w:lang w:val="es-ES"/>
         </w:rPr>
       </w:pPr>
-      <w:bookmarkStart w:id="27" w:name="_Toc242654778"/>
+      <w:bookmarkStart w:id="27" w:name="_Toc242659999"/>
       <w:r>
         <w:rPr>
           <w:lang w:val="es-ES"/>
@@ -10408,7 +10477,7 @@
           <w:numId w:val="0"/>
         </w:numPr>
       </w:pPr>
-      <w:bookmarkStart w:id="28" w:name="_Toc242654779"/>
+      <w:bookmarkStart w:id="28" w:name="_Toc242660000"/>
       <w:r>
         <w:t>Modelo de datos</w:t>
       </w:r>
@@ -11450,7 +11519,7 @@
           <w:numId w:val="0"/>
         </w:numPr>
       </w:pPr>
-      <w:bookmarkStart w:id="29" w:name="_Toc242654780"/>
+      <w:bookmarkStart w:id="29" w:name="_Toc242660001"/>
       <w:r>
         <w:t>Diccionario de datos</w:t>
       </w:r>
@@ -16592,6 +16661,61 @@
           </w:p>
         </w:tc>
       </w:tr>
+      <w:tr>
+        <w:tc>
+          <w:tcPr>
+            <w:tcW w:w="1900" w:type="dxa"/>
+          </w:tcPr>
+          <w:p>
+            <w:r>
+              <w:rPr>
+                <w:b/>
+                <w:sz w:val="17"/>
+              </w:rPr>
+              <w:t>retirado</w:t>
+            </w:r>
+          </w:p>
+        </w:tc>
+        <w:tc>
+          <w:tcPr>
+            <w:tcW w:w="1600" w:type="dxa"/>
+          </w:tcPr>
+          <w:p>
+            <w:r>
+              <w:rPr>
+                <w:sz w:val="17"/>
+              </w:rPr>
+              <w:t>BOOLEAN</w:t>
+            </w:r>
+          </w:p>
+        </w:tc>
+        <w:tc>
+          <w:tcPr>
+            <w:tcW w:w="2500" w:type="dxa"/>
+          </w:tcPr>
+          <w:p>
+            <w:r>
+              <w:rPr>
+                <w:sz w:val="17"/>
+              </w:rPr>
+              <w:t>NOT NULL, DEFAULT false</w:t>
+            </w:r>
+          </w:p>
+        </w:tc>
+        <w:tc>
+          <w:tcPr>
+            <w:tcW w:w="3000" w:type="dxa"/>
+          </w:tcPr>
+          <w:p>
+            <w:r>
+              <w:rPr>
+                <w:sz w:val="17"/>
+              </w:rPr>
+              <w:t>Excluye el bloque de nuevas reservas, conservando el historial.</w:t>
+            </w:r>
+          </w:p>
+        </w:tc>
+      </w:tr>
     </w:tbl>
     <w:p/>
     <w:p>
@@ -17730,14 +17854,14 @@
               <w:rPr>
                 <w:sz w:val="17"/>
               </w:rPr>
-              <w:t xml:space="preserve">Lista de condiciones del catálogo (diabetes, hipertension, cardiovascular, respiratoria, tiroides, colesterol, musculoesqueletica, </w:t>
+              <w:t xml:space="preserve">Lista de condiciones del catálogo (diabetes, hipertension, </w:t>
             </w:r>
             <w:r>
               <w:rPr>
                 <w:sz w:val="17"/>
               </w:rPr>
               <w:lastRenderedPageBreak/>
-              <w:t>embarazo_lactancia, otra) o ["ninguna"].</w:t>
+              <w:t>cardiovascular, respiratoria, tiroides, colesterol, musculoesqueletica, embarazo_lactancia, otra) o ["ninguna"].</w:t>
             </w:r>
           </w:p>
         </w:tc>
@@ -18923,7 +19047,14 @@
               <w:rPr>
                 <w:sz w:val="17"/>
               </w:rPr>
-              <w:t>FK rol_id → roles: ON DELETE RESTRICT</w:t>
+              <w:t xml:space="preserve">FK rol_id → roles: ON DELETE </w:t>
+            </w:r>
+            <w:r>
+              <w:rPr>
+                <w:sz w:val="17"/>
+              </w:rPr>
+              <w:lastRenderedPageBreak/>
+              <w:t>RESTRICT</w:t>
             </w:r>
           </w:p>
         </w:tc>
@@ -18936,6 +19067,7 @@
               <w:rPr>
                 <w:sz w:val="17"/>
               </w:rPr>
+              <w:lastRenderedPageBreak/>
               <w:t>No permitir eliminar un rol en uso.</w:t>
             </w:r>
           </w:p>
@@ -18964,14 +19096,7 @@
               <w:rPr>
                 <w:sz w:val="17"/>
               </w:rPr>
-              <w:t xml:space="preserve">UNIQUE (usuario_id); FK ON DELETE </w:t>
-            </w:r>
-            <w:r>
-              <w:rPr>
-                <w:sz w:val="17"/>
-              </w:rPr>
-              <w:lastRenderedPageBreak/>
-              <w:t>CASCADE</w:t>
+              <w:t>UNIQUE (usuario_id); FK ON DELETE CASCADE</w:t>
             </w:r>
           </w:p>
         </w:tc>
@@ -18984,15 +19109,7 @@
               <w:rPr>
                 <w:sz w:val="17"/>
               </w:rPr>
-              <w:lastRenderedPageBreak/>
-              <w:t xml:space="preserve">Garantizar la relación 1 : 1 y eliminar el </w:t>
-            </w:r>
-            <w:r>
-              <w:rPr>
-                <w:sz w:val="17"/>
-              </w:rPr>
-              <w:lastRenderedPageBreak/>
-              <w:t>perfil junto con su usuario.</w:t>
+              <w:t>Garantizar la relación 1 : 1 y eliminar el perfil junto con su usuario.</w:t>
             </w:r>
           </w:p>
         </w:tc>
@@ -19007,7 +19124,6 @@
               <w:rPr>
                 <w:sz w:val="17"/>
               </w:rPr>
-              <w:lastRenderedPageBreak/>
               <w:t>profesionales</w:t>
             </w:r>
           </w:p>
@@ -19640,7 +19756,11 @@
         </w:rPr>
       </w:pPr>
       <w:r>
-        <w:t>Con el perfil completo, el backend (servicio nutricion.service) calcula la tasa metabólica basal con la ecuación de Mifflin-St Jeor: 10 × peso (kg) + 6,25 × altura (cm) − 5 × edad + 5 si el sexo es masculino, o − 161 si es femenino. El requerimiento calórico diario estimado es la tasa basal multiplicada por el factor de actividad física. El valor se calcula en cada consulta y no se almacena; se muestra como estimación referencial que no reemplaza la evaluación de un profesional y será la base del objetivo diario de FS-HU-10.</w:t>
+        <w:t xml:space="preserve">Con el perfil completo, el backend (servicio nutricion.service) calcula la tasa metabólica basal con la ecuación de Mifflin-St Jeor: 10 × peso (kg) + 6,25 × altura (cm) − 5 × edad + 5 si el sexo es masculino, o − 161 si es femenino. El requerimiento calórico diario estimado es la tasa basal multiplicada por el factor de actividad física. El valor se calcula en cada consulta y no se almacena; se muestra como estimación referencial que no reemplaza la evaluación de un profesional y será la base del objetivo </w:t>
+      </w:r>
+      <w:r>
+        <w:lastRenderedPageBreak/>
+        <w:t>diario de FS-HU-10.</w:t>
       </w:r>
     </w:p>
     <w:tbl>
@@ -19677,7 +19797,6 @@
                 <w:b/>
                 <w:sz w:val="17"/>
               </w:rPr>
-              <w:lastRenderedPageBreak/>
               <w:t>Actividad física</w:t>
             </w:r>
           </w:p>
@@ -20028,7 +20147,7 @@
           <w:lang w:val="es-CL"/>
         </w:rPr>
       </w:pPr>
-      <w:bookmarkStart w:id="30" w:name="_Toc242654781"/>
+      <w:bookmarkStart w:id="30" w:name="_Toc242660002"/>
       <w:r>
         <w:rPr>
           <w:lang w:val="es-CL"/>
@@ -20127,7 +20246,7 @@
           <w:numId w:val="0"/>
         </w:numPr>
       </w:pPr>
-      <w:bookmarkStart w:id="31" w:name="_Toc242654782"/>
+      <w:bookmarkStart w:id="31" w:name="_Toc242660003"/>
       <w:r>
         <w:t>Flujo de autenticación y perfil (Sprint 1)</w:t>
       </w:r>
@@ -20873,7 +20992,7 @@
           <w:numId w:val="0"/>
         </w:numPr>
       </w:pPr>
-      <w:bookmarkStart w:id="32" w:name="_Toc242654783"/>
+      <w:bookmarkStart w:id="32" w:name="_Toc242660004"/>
       <w:r>
         <w:t>Flujo de reserva de hora (Sprints 2 y 3)</w:t>
       </w:r>
@@ -21316,7 +21435,7 @@
           <w:numId w:val="0"/>
         </w:numPr>
       </w:pPr>
-      <w:bookmarkStart w:id="33" w:name="_Toc242654784"/>
+      <w:bookmarkStart w:id="33" w:name="_Toc242660005"/>
       <w:r>
         <w:t>Flujo de recuperación de contraseña y acceso con Google (Sprint 2)</w:t>
       </w:r>
@@ -21927,7 +22046,7 @@
           <w:numId w:val="0"/>
         </w:numPr>
       </w:pPr>
-      <w:bookmarkStart w:id="34" w:name="_Toc242654785"/>
+      <w:bookmarkStart w:id="34" w:name="_Toc242660006"/>
       <w:r>
         <w:t>Flujo de búsqueda de profesionales, favoritos y reseñas (Sprint 3)</w:t>
       </w:r>
@@ -22311,7 +22430,7 @@
           <w:numId w:val="0"/>
         </w:numPr>
       </w:pPr>
-      <w:bookmarkStart w:id="35" w:name="_Toc242654786"/>
+      <w:bookmarkStart w:id="35" w:name="_Toc242660007"/>
       <w:r>
         <w:t>Flujo del espacio del profesional (Sprint 3)</w:t>
       </w:r>
@@ -22697,7 +22816,7 @@
       <w:pPr>
         <w:pStyle w:val="EstiloTtulo2VerdanaJustificado"/>
       </w:pPr>
-      <w:bookmarkStart w:id="36" w:name="_Toc242654787"/>
+      <w:bookmarkStart w:id="36" w:name="_Toc242660008"/>
       <w:r>
         <w:t>Flujo de verificación de profesionales</w:t>
       </w:r>
@@ -22730,7 +22849,7 @@
     </w:p>
     <w:p>
       <w:r>
-        <w:t>Los PR #19 y #20 están fusionados. El PR #20 aprobó 217 pruebas backend y 166 frontend y controla diez cargas por tipo y trámite, vigencia por IDs y Sin solicitud. La observación de reinicios reiterados de cuota por cambio de especialidad sigue pendiente. Esta versión 1.20 agrega disponibilidad, reservas y mapa/lista en una rama nueva, todavía pendiente de fusión y aceptación del PO: 231 pruebas backend, 172 frontend y 25 comprobaciones con MySQL real aprobadas. SMTP real y Google Maps real requieren credenciales y clave respectivamente.</w:t>
+        <w:t>Los PR #19 y #20 están fusionados. El PR #20 aprobó 217 pruebas backend y 166 frontend y controla diez cargas por tipo y trámite, vigencia por IDs y Sin solicitud. La observación de reinicios reiterados de cuota por cambio de especialidad sigue pendiente. Esta versión 1.21 agrega disponibilidad, reservas y mapa/lista en una rama nueva, todavía pendiente de fusión y aceptación del PO: 231 pruebas backend, 173 frontend y 39 comprobaciones con MySQL real aprobadas. SMTP real y Google Maps real requieren credenciales y clave respectivamente.</w:t>
       </w:r>
     </w:p>
     <w:p>
@@ -22745,7 +22864,7 @@
           <w:lang w:val="es-ES"/>
         </w:rPr>
       </w:pPr>
-      <w:bookmarkStart w:id="37" w:name="_Toc242654788"/>
+      <w:bookmarkStart w:id="37" w:name="_Toc242660009"/>
       <w:r>
         <w:rPr>
           <w:lang w:val="es-ES"/>
@@ -23427,7 +23546,7 @@
         </w:rPr>
         <w:br w:type="page"/>
       </w:r>
-      <w:bookmarkStart w:id="38" w:name="_Toc242654789"/>
+      <w:bookmarkStart w:id="38" w:name="_Toc242660010"/>
       <w:r>
         <w:rPr>
           <w:lang w:val="es-ES"/>
@@ -24958,7 +25077,7 @@
         </w:rPr>
         <w:br w:type="page"/>
       </w:r>
-      <w:bookmarkStart w:id="39" w:name="_Toc242654790"/>
+      <w:bookmarkStart w:id="39" w:name="_Toc242660011"/>
       <w:r>
         <w:rPr>
           <w:lang w:val="es-ES"/>
@@ -25714,7 +25833,7 @@
         </w:rPr>
         <w:br w:type="page"/>
       </w:r>
-      <w:bookmarkStart w:id="40" w:name="_Toc242654791"/>
+      <w:bookmarkStart w:id="40" w:name="_Toc242660012"/>
       <w:r>
         <w:rPr>
           <w:lang w:val="es-ES"/>
@@ -27500,7 +27619,7 @@
         </w:rPr>
         <w:br w:type="page"/>
       </w:r>
-      <w:bookmarkStart w:id="41" w:name="_Toc242654792"/>
+      <w:bookmarkStart w:id="41" w:name="_Toc242660013"/>
       <w:r>
         <w:rPr>
           <w:lang w:val="es-ES"/>
@@ -28398,7 +28517,7 @@
           <w:lang w:val="es-ES"/>
         </w:rPr>
       </w:pPr>
-      <w:bookmarkStart w:id="42" w:name="_Toc242654793"/>
+      <w:bookmarkStart w:id="42" w:name="_Toc242660014"/>
       <w:r>
         <w:lastRenderedPageBreak/>
         <w:t>Disponibilidad reservas y mapa del Sprint 3</w:t>
@@ -28418,7 +28537,7 @@
         <w:spacing w:after="120"/>
       </w:pPr>
       <w:r>
-        <w:t>El profesional publica bloques futuros dentro de 365 días, con fecha y horas locales de America/Santiago. Se rechazan duraciones inválidas y superposiciones. Los bloques contiguos se admiten. Un bloque que tuvo reservas no se edita ni elimina para conservar el historial.</w:t>
+        <w:t>El profesional publica bloques futuros dentro de 365 días, con fecha y horas locales de America/Santiago. Se rechazan duraciones inválidas y superposiciones. Los bloques contiguos se admiten. Un bloque que tuvo reservas no se edita ni elimina para conservar el historial. Los bloques con todas sus reservas canceladas pueden retirarse con DELETE: retirado=true los excluye de nuevas reservas y de superposición, conservando fechas y mensajes históricos. Con una reserva activa responde 409; hay que cancelarla primero. Sin historial se elimina el bloque. Retiro y reserva comparten el bloqueo del profesional.</w:t>
       </w:r>
     </w:p>
     <w:p>
@@ -28434,7 +28553,7 @@
         <w:spacing w:after="120"/>
       </w:pPr>
       <w:r>
-        <w:t>Las escrituras de agenda utilizan Prisma compartido, transacciones ReadCommitted y bloqueo del profesional. La reserva bloquea también el bloque, consulta activas bajo bloqueo y solo entonces inserta. Dos solicitudes concurrentes obtuvieron 201 y 409, con una sola reserva activa. Las comparaciones de superposición usan parámetros CAST a TIME para respetar los tipos MySQL.</w:t>
+        <w:t>Las escrituras de agenda utilizan Prisma compartido, transacciones ReadCommitted y bloqueo del profesional. La reserva bloquea también el bloque, consulta activas bajo bloqueo y solo entonces inserta. Dos solicitudes concurrentes obtuvieron 201 y 409, con una sola reserva activa. La superposición compara TIME_TO_SEC con segundos numéricos. La regresión con MySQL rechaza duplicados y cruces con horas en punto y permite bloques libres; evita la conversión incorrecta de parámetros CAST a TIME.</w:t>
       </w:r>
     </w:p>
     <w:p>
@@ -28458,7 +28577,7 @@
         <w:spacing w:after="120"/>
       </w:pPr>
       <w:r>
-        <w:t>La migración 20261012010000_disponibilidad_reservas agrega disponibilidades y reservas: doce tablas implementadas de quince. Conversaciones, mensajes y registro_comida siguen previstos. La prueba SMTP se prepara con npm run smtp:comprobar; usuario y contraseña aún faltan en el entorno local.</w:t>
+        <w:t>La migración 20261012010000_disponibilidad_reservas agrega disponibilidades y reservas: doce tablas implementadas de quince. Conversaciones, mensajes y registro_comida siguen previstos. La prueba SMTP se prepara con npm run smtp:comprobar; usuario y contraseña aún faltan en el entorno local. La migración 20261012040000_retirar_disponibilidad agrega retirado BOOLEAN DEFAULT false sin borrar datos. La prueba npm run test:mysql:agenda reproduce los escenarios con horas en punto y retiro; solo crea y elimina sus cuentas temporales.</w:t>
       </w:r>
     </w:p>
     <w:p>
@@ -28480,7 +28599,7 @@
         <w:lastRenderedPageBreak/>
         <w:drawing>
           <wp:inline distT="0" distB="0" distL="0" distR="0" wp14:anchorId="7BCADAB0" wp14:editId="30348CBF">
-            <wp:extent cx="5943600" cy="5291661"/>
+            <wp:extent cx="5943600" cy="7058025"/>
             <wp:effectExtent l="0" t="0" r="0" b="0"/>
             <wp:docPr id="950" name="Flujo disponibilidad y reservas"/>
             <wp:cNvGraphicFramePr>
@@ -28502,7 +28621,7 @@
                   <pic:spPr>
                     <a:xfrm>
                       <a:off x="0" y="0"/>
-                      <a:ext cx="5943600" cy="5291661"/>
+                      <a:ext cx="5943600" cy="7058025"/>
                     </a:xfrm>
                     <a:prstGeom prst="rect">
                       <a:avLst/>
@@ -28526,7 +28645,7 @@
         </w:rPr>
       </w:pPr>
       <w:r>
-        <w:t>Ilustración 12: Publicación de disponibilidad, reserva concurrente y decisiones de los participantes (FS-HU-13 y FS-HU-14; DAS 1.20).</w:t>
+        <w:t>Ilustración 12: Publicación de disponibilidad, reserva concurrente y decisiones de los participantes (FS-HU-13 y FS-HU-14; DAS 1.21).</w:t>
       </w:r>
     </w:p>
     <w:sectPr>

</xml_diff>

<commit_message>
Corrige el límite de reservas para no contar citas pasadas y ajustes de la revisión del PR 22
El límite de una reserva activa por usuario con cada profesional cuenta solo horarios futuros (defecto 26) y el 409 indica su motivo. La ficha avisa antes si ya hay una reserva activa y conserva la hora ante el límite. El mapa no dibuja oculto ni aparece con 0 resultados. comprobar-smtp sin aviso de contraseña en errores de uso. Tildes del JSON de evidencia, DAS 1.22 y documentos de seguimiento. Backend 233, frontend 183, MySQL real 55.
</commit_message>
<xml_diff>
--- a/FASE 2/Evidencias Proyecto/Evidencias de documentación/Documento de Arquitectura (DAS)/Documento_Arquitectura_Sistema_DAS_.docx
+++ b/FASE 2/Evidencias Proyecto/Evidencias de documentación/Documento de Arquitectura (DAS)/Documento_Arquitectura_Sistema_DAS_.docx
@@ -2495,7 +2495,7 @@
               </w:rPr>
             </w:pPr>
             <w:r>
-              <w:t>Diagrama UML formal y ajustes posteriores al PR #21: límite de reservas por usuario/profesional, reutilización de Maps, carga tardía del SDK, privacidad de historial, avisos de agenda y comprobador SMTP. 233 pruebas backend, 178 frontend y 51 comprobaciones MySQL. DAS 1.21 publicado; Sprint 2 cerrado. DAS 1.22 en revisión.</w:t>
+              <w:t>Diagrama UML formal y ajustes posteriores al PR #21: límite de reservas por usuario/profesional (solo citas futuras), reutilización de Maps, carga tardía del SDK, privacidad de historial, avisos de agenda y comprobador SMTP. 233 pruebas backend, 183 frontend y 55 comprobaciones MySQL. DAS 1.21 publicado; Sprint 2 cerrado. DAS 1.22 en revisión.</w:t>
             </w:r>
           </w:p>
         </w:tc>
@@ -28755,7 +28755,7 @@
         <w:spacing w:after="120"/>
       </w:pPr>
       <w:r>
-        <w:t>Fuentes: Sprint 3/Disponibilidad_Reservas_Mapa.md y Sprint 3/Pendientes_de_Cierre.md. Validación actual: 233 pruebas backend, 178 frontend y 51 comprobaciones MySQL, lint y build correctos. SMTP/recuperación y mapa integrado comprobados; origen Google OAuth y aceptación del PO pendientes.</w:t>
+        <w:t>Fuentes: Sprint 3/Disponibilidad_Reservas_Mapa.md y Sprint 3/Pendientes_de_Cierre.md. Validación actual: 233 pruebas backend, 183 frontend y 55 comprobaciones MySQL, lint y build correctos. SMTP/recuperación y mapa integrado comprobados; origen Google OAuth y aceptación del PO pendientes.</w:t>
       </w:r>
     </w:p>
     <w:p>
@@ -28824,7 +28824,7 @@
         <w:spacing w:after="120"/>
       </w:pPr>
       <w:r>
-        <w:t>Revisión posterior: una reserva activa por usuario/profesional (409), también con solicitudes simultáneas. Maps conserva una instancia y el callback tardío. La consulta filtra fechas y oculta historial público. Agenda corrige avisos y edición; Inicio consulta horarios; SMTP explica el permiso de envío. Validación: 233 pruebas backend, 178 frontend y 51 comprobaciones MySQL; lint y build correctos.</w:t>
+        <w:t>Revisión posterior: una reserva activa y futura por usuario/profesional (409; las citas que ya pasaron quedan en el historial y no cuentan), también con solicitudes simultáneas. Maps conserva una instancia y el callback tardío. La consulta filtra fechas y oculta historial público. Agenda corrige avisos y edición; Inicio consulta horarios; SMTP explica el permiso de envío. Validación: 233 pruebas backend, 183 frontend y 55 comprobaciones MySQL; lint y build correctos.</w:t>
       </w:r>
     </w:p>
     <w:p>

</xml_diff>

<commit_message>
Actualiza estados tras fusionar el PR #22: README, DAS 1.22, backlogs y documentos del Sprint 3
</commit_message>
<xml_diff>
--- a/FASE 2/Evidencias Proyecto/Evidencias de documentación/Documento de Arquitectura (DAS)/Documento_Arquitectura_Sistema_DAS_.docx
+++ b/FASE 2/Evidencias Proyecto/Evidencias de documentación/Documento de Arquitectura (DAS)/Documento_Arquitectura_Sistema_DAS_.docx
@@ -2495,7 +2495,7 @@
               </w:rPr>
             </w:pPr>
             <w:r>
-              <w:t>Diagrama UML formal y ajustes posteriores al PR #21: límite de reservas por usuario/profesional (solo citas futuras), reutilización de Maps, carga tardía del SDK, privacidad de historial, avisos de agenda y comprobador SMTP. 233 pruebas backend, 183 frontend y 55 comprobaciones MySQL. DAS 1.21 publicado; Sprint 2 cerrado. DAS 1.22 en revisión.</w:t>
+              <w:t>Diagrama UML formal y ajustes posteriores al PR #21: límite de reservas por usuario/profesional (solo citas futuras), reutilización de Maps, carga tardía del SDK, privacidad de historial, avisos de agenda y comprobador SMTP. 233 pruebas backend, 183 frontend y 55 comprobaciones MySQL. Sprint 2 cerrado. PR #22 fusionado el 12-10-2026 (merge 662e79c) y DAS 1.22 publicado en Drive.</w:t>
             </w:r>
           </w:p>
         </w:tc>
@@ -28699,7 +28699,7 @@
         <w:spacing w:after="120"/>
       </w:pPr>
       <w:r>
-        <w:t>Esta sección documenta el PR #21 aprobado y fusionado y los ajustes de su revisión posterior desde main. DAS 1.22 y sus ajustes se fusionaron el 12-10-2026 (PR #22) y se publican en Drive/Miro después de la fusión. El Sprint Backlog 2 conserva la versión oficial de cierre de Rodrigo. SMTP: entrega y recuperación reales comprobadas. Maps Demo Key: mapa, filtros y páginas comprobados. Google OAuth: origen localhost:5173 pendiente.</w:t>
+        <w:t>Esta sección documenta el PR #21 aprobado y fusionado y los ajustes de su revisión posterior desde main. DAS 1.22 y sus ajustes se fusionaron el 12-10-2026 (PR #22, merge 662e79c) y quedaron publicados en Drive ese mismo día; falta actualizar los marcos de Miro. El Sprint Backlog 2 conserva la versión oficial de cierre de Rodrigo. SMTP: entrega y recuperación reales comprobadas. Maps Demo Key: mapa, filtros y páginas comprobados. Google OAuth: origen localhost:5173 pendiente.</w:t>
       </w:r>
     </w:p>
     <w:p>
@@ -28847,7 +28847,7 @@
         <w:spacing w:after="120"/>
       </w:pPr>
       <w:r>
-        <w:t>El diagrama UML identifica componentes lógicos de frontend, API, servicios, modelos y persistencia, con interfaces provistas y requeridas. Las rutas delegan en servicios y Prisma es compartido. Su fuente es 13_Componentes_UML.json y su exportación 13_Componentes_UML.svg. Maps Demo Key y SMTP comprobados con proveedores reales; Google OAuth exige autorizar localhost:5173. DAS 1.21 está publicado; esta figura forma parte de la revisión DAS 1.22.</w:t>
+        <w:t>El diagrama UML identifica componentes lógicos de frontend, API, servicios, modelos y persistencia, con interfaces provistas y requeridas. Las rutas delegan en servicios y Prisma es compartido. Su fuente es 13_Componentes_UML.json y su exportación 13_Componentes_UML.svg. Maps Demo Key y SMTP comprobados con proveedores reales; Google OAuth exige autorizar localhost:5173. Esta figura se incorporó en el DAS 1.22, fusionado el 12-10-2026 (PR #22) y publicado en Drive.</w:t>
       </w:r>
     </w:p>
     <w:p>

</xml_diff>

<commit_message>
FS-HU-07 y SC-25: asistente IA con Groq, DAS 1.25 y documentacion
</commit_message>
<xml_diff>
--- a/FASE 2/Evidencias Proyecto/Evidencias de documentación/Documento de Arquitectura (DAS)/Documento_Arquitectura_Sistema_DAS_.docx
+++ b/FASE 2/Evidencias Proyecto/Evidencias de documentación/Documento de Arquitectura (DAS)/Documento_Arquitectura_Sistema_DAS_.docx
@@ -237,7 +237,7 @@
           <w:szCs w:val="36"/>
           <w:lang w:val="es-CL"/>
         </w:rPr>
-        <w:t>Versión 1.24</w:t>
+        <w:t>Versión 1.25</w:t>
       </w:r>
     </w:p>
     <w:p>
@@ -2634,6 +2634,75 @@
             </w:pPr>
             <w:r>
               <w:t>SC-24: dirección de atención propia del profesional (profesionales.direccion VARCHAR(150) NULL, migración aditiva 20261019120000_direccion_profesional), obligatoria si atiende presencial o de ambas formas y opcional si atiende solo online; se muestra en la ficha pública, en la ventana del marcador del mapa y en el lugar de la reserva. Las coordenadas de la ficha deben estar en Chile, con el mismo recuadro que limita el mapa desde la corrección del defecto 35. Decisión D32; restricciones, diccionario de datos, reglas, flujo del profesional y módulo shared actualizados, y fuentes integrales 02, 03 y 04 regeneradas (la Ilustración 4 resume relaciones, que no cambian). 241 pruebas backend, 231 frontend y 6 comprobaciones en Edge con MySQL real.</w:t>
+            </w:r>
+          </w:p>
+        </w:tc>
+        <w:tc>
+          <w:tcPr>
+            <w:tcW w:w="1908" w:type="dxa"/>
+          </w:tcPr>
+          <w:p>
+            <w:pPr>
+              <w:pStyle w:val="Tabletext"/>
+              <w:rPr>
+                <w:lang w:val="es-CL"/>
+              </w:rPr>
+            </w:pPr>
+            <w:r>
+              <w:t>Rodrigo Cárcamo Rojas</w:t>
+            </w:r>
+          </w:p>
+        </w:tc>
+      </w:tr>
+      <w:tr>
+        <w:trPr>
+          <w:cantSplit/>
+        </w:trPr>
+        <w:tc>
+          <w:tcPr>
+            <w:tcW w:w="2196" w:type="dxa"/>
+          </w:tcPr>
+          <w:p>
+            <w:pPr>
+              <w:pStyle w:val="Tabletext"/>
+              <w:rPr>
+                <w:lang w:val="es-CL"/>
+              </w:rPr>
+            </w:pPr>
+            <w:r>
+              <w:t>21-10-2026</w:t>
+            </w:r>
+          </w:p>
+        </w:tc>
+        <w:tc>
+          <w:tcPr>
+            <w:tcW w:w="1152" w:type="dxa"/>
+          </w:tcPr>
+          <w:p>
+            <w:pPr>
+              <w:pStyle w:val="Tabletext"/>
+              <w:rPr>
+                <w:lang w:val="es-CL"/>
+              </w:rPr>
+            </w:pPr>
+            <w:r>
+              <w:t>1.25</w:t>
+            </w:r>
+          </w:p>
+        </w:tc>
+        <w:tc>
+          <w:tcPr>
+            <w:tcW w:w="3744" w:type="dxa"/>
+          </w:tcPr>
+          <w:p>
+            <w:pPr>
+              <w:pStyle w:val="Tabletext"/>
+              <w:rPr>
+                <w:lang w:val="es-CL"/>
+              </w:rPr>
+            </w:pPr>
+            <w:r>
+              <w:t>FS-HU-07: asistente IA implementado. Decisión D33, que reemplaza a D7: cliente genérico compatible con la API de OpenAI, configurable por variables de entorno, con Groq por defecto en su plan gratuito y modo simulado sin clave. Tablas conversaciones (con titulo, fijada y fecha_actualizacion), mensajes y uso_asistente (migración 20261021120000_asistente_ia): quince tablas implementadas de dieciséis. Restricciones, desempeño, QS2, uso responsable, vistas de procesos, desarrollo y física, componentes y trazabilidad actualizados; flujo del asistente nuevo; Ilustraciones 1, 2, 4, 9 y 10 regeneradas y fuente 14_Asistente_IA nueva. 267 pruebas backend, 245 frontend y 7 comprobaciones en Edge con MySQL real.</w:t>
             </w:r>
           </w:p>
         </w:tc>
@@ -6977,7 +7046,7 @@
         </w:rPr>
       </w:pPr>
       <w:r>
-        <w:t>FitSearch usa React/Vite, API REST Node.js/Express, JWT, MySQL y Prisma compartido. El panel administrativo, verificación documental privada y gestión de cuentas están fusionados en PR #19/#20. Disponibilidad, reservas y mapa/lista están fusionados en PR #21/#22 (12-10-2026). Desde el 15-10-2026 el mapa usa MapLibre GL JS con teselas de OpenFreeMap, sin clave, en vez de Google Maps (SC-18, PR #27, D31). SMTP real se comprobó el 12-10-2026; el ingreso con Google requiere autorizar el origen localhost en el cliente OAuth. Claude y despliegue Docker/Nginx siguen previstos. Configuración y Contenido quedan fuera del panel autorizado; FS-HU-06 sigue pendiente de CP-078 y de la aceptación del PO.</w:t>
+        <w:t>FitSearch usa React/Vite, API REST Node.js/Express, JWT, MySQL y Prisma compartido. El panel administrativo, verificación documental privada y gestión de cuentas están fusionados en PR #19/#20. Disponibilidad, reservas y mapa/lista están fusionados en PR #21/#22 (12-10-2026). Desde el 15-10-2026 el mapa usa MapLibre GL JS con teselas de OpenFreeMap, sin clave, en vez de Google Maps (SC-18, PR #27, D31). SMTP real se comprobó el 12-10-2026; el ingreso con Google requiere autorizar el origen localhost en el cliente OAuth. Desde el 21-10-2026 el asistente IA (FS-HU-07) usa Groq, compatible con la API de OpenAI, en su plan gratuito (D33); el despliegue Docker/Nginx sigue previsto. Configuración y Contenido quedan fuera del panel autorizado; FS-HU-06 sigue pendiente de CP-078 y de la aceptación del PO.</w:t>
       </w:r>
     </w:p>
     <w:p>
@@ -7223,7 +7292,7 @@
         <w:t xml:space="preserve">Desempeño: </w:t>
       </w:r>
       <w:r>
-        <w:t>las operaciones de la API (autenticación, perfil, listado y búsqueda) deben responder en menos de 2 segundos con los datos de prueba; las respuestas del asistente dependen de la API de Claude y deben mostrar un indicador de carga mientras se procesan.</w:t>
+        <w:t>las operaciones de la API (autenticación, perfil, listado y búsqueda) deben responder en menos de 2 segundos con los datos de prueba; las respuestas del asistente dependen del proveedor de IA (Groq, D33), esperan como máximo 20 segundos y muestran «El asistente está escribiendo…» mientras se procesan.</w:t>
       </w:r>
     </w:p>
     <w:p>
@@ -7240,7 +7309,7 @@
         <w:rPr>
           <w:b/>
         </w:rPr>
-        <w:t>Tolerancia a fallos: una falla de un servicio externo (API de Claude, OpenFreeMap u Open-Meteo) no debe detener el backend ni afectar las funcionalidades que no dependen de él; el usuario recibe un mensaje claro.</w:t>
+        <w:t>Tolerancia a fallos: una falla de un servicio externo (proveedor de IA, OpenFreeMap u Open-Meteo) no debe detener el backend ni afectar las funcionalidades que no dependen de él; el usuario recibe un mensaje claro.</w:t>
       </w:r>
     </w:p>
     <w:p>
@@ -7421,7 +7490,7 @@
         <w:rPr>
           <w:b/>
         </w:rPr>
-        <w:t>Otros componentes de software: solo se utilizan bibliotecas de código abierto y el plan de bajo costo de la API de Claude, con límites de uso conservadores, y los servicios gratuitos sin clave OpenFreeMap, para las teselas del mapa (D31), y Open-Meteo, para el clima del Inicio del profesional (D26).</w:t>
+        <w:t>Otros componentes de software: solo se utilizan bibliotecas de código abierto y el plan gratuito de Groq para el asistente IA, con un límite diario de mensajes por usuario (D33), y los servicios gratuitos sin clave OpenFreeMap, para las teselas del mapa (D31), y Open-Meteo, para el clima del Inicio del profesional (D26).</w:t>
       </w:r>
     </w:p>
     <w:p>
@@ -7589,10 +7658,7 @@
         <w:rPr>
           <w:b/>
         </w:rPr>
-        <w:t xml:space="preserve">Uso responsable de IA: </w:t>
-      </w:r>
-      <w:r>
-        <w:t>el asistente entrega orientación general, aclara que no reemplaza a un profesional de salud y solo puede ejecutar funciones acotadas definidas y validadas por el backend.</w:t>
+        <w:t>Uso responsable de IA: el asistente entrega orientación general, aclara que no reemplaza a un profesional de salud y solo puede ejecutar funciones acotadas definidas y validadas por el backend. Al proveedor de IA solo viajan las instrucciones y los últimos mensajes de la conversación, nunca el perfil ni la información de salud de la persona; ante señales de emergencia o de riesgo, la respuesta siempre indica llamar al SAMU (131) o a la línea de prevención del suicidio *4141.</w:t>
       </w:r>
     </w:p>
     <w:p>
@@ -7735,7 +7801,7 @@
         </w:rPr>
       </w:pPr>
       <w:r>
-        <w:t>Ilustración 1: Diagrama de casos de uso de FitSearch con «include» y «extend» (actualizado al 15-10-2026, Sprint 3; SC-18)</w:t>
+        <w:t>Ilustración 1: Diagrama de casos de uso de FitSearch con «include» y «extend» (actualizado al 21-10-2026; asistente IA con Groq, D33)</w:t>
       </w:r>
     </w:p>
     <w:p>
@@ -9514,7 +9580,7 @@
         <w:rPr>
           <w:b/>
         </w:rPr>
-        <w:t>Sinopsis: Una falla de la API de Claude, de OpenFreeMap o de Open-Meteo no debe botar el sistema.</w:t>
+        <w:t>Sinopsis: Una falla del proveedor de IA (Groq), de OpenFreeMap o de Open-Meteo no debe botar el sistema.</w:t>
       </w:r>
     </w:p>
     <w:p>
@@ -9548,7 +9614,7 @@
         <w:t xml:space="preserve">Cambio en el entorno: </w:t>
       </w:r>
       <w:r>
-        <w:t>La API de Claude no responde o retorna error (o se supera la cuota de uso).</w:t>
+        <w:t>El proveedor de IA no responde, retorna error o se supera su cuota de uso: el asistente responde 503 con un mensaje claro y el resto de FitSearch sigue funcionando.</w:t>
       </w:r>
     </w:p>
     <w:p>
@@ -10675,7 +10741,7 @@
         <w:lastRenderedPageBreak/>
         <w:drawing>
           <wp:inline distT="0" distB="0" distL="0" distR="0" wp14:anchorId="6B084A22" wp14:editId="3810F6E2">
-            <wp:extent cx="5943600" cy="2633757"/>
+            <wp:extent cx="5943600" cy="2994088"/>
             <wp:effectExtent l="0" t="0" r="0" b="0"/>
             <wp:docPr id="4" name="Picture 4"/>
             <wp:cNvGraphicFramePr>
@@ -10697,7 +10763,7 @@
                   <pic:spPr>
                     <a:xfrm>
                       <a:off x="0" y="0"/>
-                      <a:ext cx="5943600" cy="2633757"/>
+                      <a:ext cx="5943600" cy="2994088"/>
                     </a:xfrm>
                     <a:prstGeom prst="rect">
                       <a:avLst/>
@@ -10721,7 +10787,7 @@
         </w:rPr>
       </w:pPr>
       <w:r>
-        <w:t>Ilustración 2: Asociaciones del modelo de clases (DAS 1.18; 10-10-2026). Atributos en el diccionario y fuente completa 02_Diagrama_de_Clases.</w:t>
+        <w:t>Ilustración 2: Asociaciones del modelo de clases (DAS 1.25; 21-10-2026, con UsoAsistente). Atributos en el diccionario y fuente completa 02_Diagrama_de_Clases.</w:t>
       </w:r>
     </w:p>
     <w:p>
@@ -15479,7 +15545,7 @@
         <w:t xml:space="preserve">Tabla conversaciones: </w:t>
       </w:r>
       <w:r>
-        <w:t>Hilos de conversación con el asistente de IA.</w:t>
+        <w:t>Hilos de conversación con el asistente de IA (FS-HU-07, implementada el 21-10-2026). Solo su dueño la ve; puede fijarla o borrarla y se elimina junto con la cuenta.</w:t>
       </w:r>
     </w:p>
     <w:tbl>
@@ -15659,7 +15725,7 @@
               <w:rPr>
                 <w:sz w:val="17"/>
               </w:rPr>
-              <w:t>FK → usuarios.id, NOT NULL</w:t>
+              <w:t>FK → usuarios.id, NOT NULL, ON DELETE CASCADE</w:t>
             </w:r>
           </w:p>
         </w:tc>
@@ -15688,6 +15754,116 @@
                 <w:b/>
                 <w:sz w:val="17"/>
               </w:rPr>
+              <w:t>titulo</w:t>
+            </w:r>
+          </w:p>
+        </w:tc>
+        <w:tc>
+          <w:tcPr>
+            <w:tcW w:w="1600" w:type="dxa"/>
+          </w:tcPr>
+          <w:p>
+            <w:r>
+              <w:rPr>
+                <w:sz w:val="17"/>
+              </w:rPr>
+              <w:t>VARCHAR(80)</w:t>
+            </w:r>
+          </w:p>
+        </w:tc>
+        <w:tc>
+          <w:tcPr>
+            <w:tcW w:w="2500" w:type="dxa"/>
+          </w:tcPr>
+          <w:p>
+            <w:r>
+              <w:rPr>
+                <w:sz w:val="17"/>
+              </w:rPr>
+              <w:t>NOT NULL</w:t>
+            </w:r>
+          </w:p>
+        </w:tc>
+        <w:tc>
+          <w:tcPr>
+            <w:tcW w:w="3000" w:type="dxa"/>
+          </w:tcPr>
+          <w:p>
+            <w:r>
+              <w:rPr>
+                <w:sz w:val="17"/>
+              </w:rPr>
+              <w:t>Título del historial: el primer mensaje, recortado a 80 caracteres.</w:t>
+            </w:r>
+          </w:p>
+        </w:tc>
+      </w:tr>
+      <w:tr>
+        <w:tc>
+          <w:tcPr>
+            <w:tcW w:w="1900" w:type="dxa"/>
+          </w:tcPr>
+          <w:p>
+            <w:r>
+              <w:rPr>
+                <w:b/>
+                <w:sz w:val="17"/>
+              </w:rPr>
+              <w:t>fijada</w:t>
+            </w:r>
+          </w:p>
+        </w:tc>
+        <w:tc>
+          <w:tcPr>
+            <w:tcW w:w="1600" w:type="dxa"/>
+          </w:tcPr>
+          <w:p>
+            <w:r>
+              <w:rPr>
+                <w:sz w:val="17"/>
+              </w:rPr>
+              <w:t>BOOLEAN</w:t>
+            </w:r>
+          </w:p>
+        </w:tc>
+        <w:tc>
+          <w:tcPr>
+            <w:tcW w:w="2500" w:type="dxa"/>
+          </w:tcPr>
+          <w:p>
+            <w:r>
+              <w:rPr>
+                <w:sz w:val="17"/>
+              </w:rPr>
+              <w:t>NOT NULL, DEFAULT FALSE</w:t>
+            </w:r>
+          </w:p>
+        </w:tc>
+        <w:tc>
+          <w:tcPr>
+            <w:tcW w:w="3000" w:type="dxa"/>
+          </w:tcPr>
+          <w:p>
+            <w:r>
+              <w:rPr>
+                <w:sz w:val="17"/>
+              </w:rPr>
+              <w:t>Si la persona la fijó: aparece en «Chats fijados» (máximo 5, shared/reglas.json).</w:t>
+            </w:r>
+          </w:p>
+        </w:tc>
+      </w:tr>
+      <w:tr>
+        <w:tc>
+          <w:tcPr>
+            <w:tcW w:w="1900" w:type="dxa"/>
+          </w:tcPr>
+          <w:p>
+            <w:r>
+              <w:rPr>
+                <w:b/>
+                <w:sz w:val="17"/>
+              </w:rPr>
               <w:t>fecha_inicio</w:t>
             </w:r>
           </w:p>
@@ -15728,6 +15904,61 @@
                 <w:sz w:val="17"/>
               </w:rPr>
               <w:t>Fecha y hora de inicio.</w:t>
+            </w:r>
+          </w:p>
+        </w:tc>
+      </w:tr>
+      <w:tr>
+        <w:tc>
+          <w:tcPr>
+            <w:tcW w:w="1900" w:type="dxa"/>
+          </w:tcPr>
+          <w:p>
+            <w:r>
+              <w:rPr>
+                <w:b/>
+                <w:sz w:val="17"/>
+              </w:rPr>
+              <w:t>fecha_actualizacion</w:t>
+            </w:r>
+          </w:p>
+        </w:tc>
+        <w:tc>
+          <w:tcPr>
+            <w:tcW w:w="1600" w:type="dxa"/>
+          </w:tcPr>
+          <w:p>
+            <w:r>
+              <w:rPr>
+                <w:sz w:val="17"/>
+              </w:rPr>
+              <w:t>DATETIME</w:t>
+            </w:r>
+          </w:p>
+        </w:tc>
+        <w:tc>
+          <w:tcPr>
+            <w:tcW w:w="2500" w:type="dxa"/>
+          </w:tcPr>
+          <w:p>
+            <w:r>
+              <w:rPr>
+                <w:sz w:val="17"/>
+              </w:rPr>
+              <w:t>NOT NULL, DEFAULT NOW()</w:t>
+            </w:r>
+          </w:p>
+        </w:tc>
+        <w:tc>
+          <w:tcPr>
+            <w:tcW w:w="3000" w:type="dxa"/>
+          </w:tcPr>
+          <w:p>
+            <w:r>
+              <w:rPr>
+                <w:sz w:val="17"/>
+              </w:rPr>
+              <w:t>Fecha del último mensaje; ordena el historial.</w:t>
             </w:r>
           </w:p>
         </w:tc>
@@ -15930,7 +16161,7 @@
               <w:rPr>
                 <w:sz w:val="17"/>
               </w:rPr>
-              <w:t>FK → conversaciones.id, NOT NULL</w:t>
+              <w:t>FK → conversaciones.id, NOT NULL, ON DELETE CASCADE</w:t>
             </w:r>
           </w:p>
         </w:tc>
@@ -15972,7 +16203,7 @@
               <w:rPr>
                 <w:sz w:val="17"/>
               </w:rPr>
-              <w:t>ENUM('usuario','asistente')</w:t>
+              <w:t>VARCHAR(20)</w:t>
             </w:r>
           </w:p>
         </w:tc>
@@ -15985,6 +16216,61 @@
               <w:rPr>
                 <w:sz w:val="17"/>
               </w:rPr>
+              <w:t>NOT NULL, CHECK IN ('usuario', 'asistente')</w:t>
+            </w:r>
+          </w:p>
+        </w:tc>
+        <w:tc>
+          <w:tcPr>
+            <w:tcW w:w="3000" w:type="dxa"/>
+          </w:tcPr>
+          <w:p>
+            <w:r>
+              <w:rPr>
+                <w:sz w:val="17"/>
+              </w:rPr>
+              <w:t>Quién envió el mensaje.</w:t>
+            </w:r>
+          </w:p>
+        </w:tc>
+      </w:tr>
+      <w:tr>
+        <w:tc>
+          <w:tcPr>
+            <w:tcW w:w="1900" w:type="dxa"/>
+          </w:tcPr>
+          <w:p>
+            <w:r>
+              <w:rPr>
+                <w:b/>
+                <w:sz w:val="17"/>
+              </w:rPr>
+              <w:t>contenido</w:t>
+            </w:r>
+          </w:p>
+        </w:tc>
+        <w:tc>
+          <w:tcPr>
+            <w:tcW w:w="1600" w:type="dxa"/>
+          </w:tcPr>
+          <w:p>
+            <w:r>
+              <w:rPr>
+                <w:sz w:val="17"/>
+              </w:rPr>
+              <w:t>TEXT</w:t>
+            </w:r>
+          </w:p>
+        </w:tc>
+        <w:tc>
+          <w:tcPr>
+            <w:tcW w:w="2500" w:type="dxa"/>
+          </w:tcPr>
+          <w:p>
+            <w:r>
+              <w:rPr>
+                <w:sz w:val="17"/>
+              </w:rPr>
               <w:t>NOT NULL</w:t>
             </w:r>
           </w:p>
@@ -15998,7 +16284,7 @@
               <w:rPr>
                 <w:sz w:val="17"/>
               </w:rPr>
-              <w:t>Quién envió el mensaje.</w:t>
+              <w:t>Texto del mensaje (hasta 1.000 caracteres el del usuario). La interfaz lo muestra como texto, sin interpretar HTML.</w:t>
             </w:r>
           </w:p>
         </w:tc>
@@ -16014,7 +16300,7 @@
                 <w:b/>
                 <w:sz w:val="17"/>
               </w:rPr>
-              <w:t>contenido</w:t>
+              <w:t>fecha</w:t>
             </w:r>
           </w:p>
         </w:tc>
@@ -16027,7 +16313,7 @@
               <w:rPr>
                 <w:sz w:val="17"/>
               </w:rPr>
-              <w:t>TEXT</w:t>
+              <w:t>DATETIME</w:t>
             </w:r>
           </w:p>
         </w:tc>
@@ -16040,7 +16326,7 @@
               <w:rPr>
                 <w:sz w:val="17"/>
               </w:rPr>
-              <w:t>NOT NULL</w:t>
+              <w:t>NOT NULL, DEFAULT NOW()</w:t>
             </w:r>
           </w:p>
         </w:tc>
@@ -16053,68 +16339,12 @@
               <w:rPr>
                 <w:sz w:val="17"/>
               </w:rPr>
-              <w:t>Texto del mensaje.</w:t>
-            </w:r>
-          </w:p>
-        </w:tc>
-      </w:tr>
-      <w:tr>
-        <w:tc>
-          <w:tcPr>
-            <w:tcW w:w="1900" w:type="dxa"/>
-          </w:tcPr>
-          <w:p>
-            <w:r>
-              <w:rPr>
-                <w:b/>
-                <w:sz w:val="17"/>
-              </w:rPr>
-              <w:t>fecha</w:t>
-            </w:r>
-          </w:p>
-        </w:tc>
-        <w:tc>
-          <w:tcPr>
-            <w:tcW w:w="1600" w:type="dxa"/>
-          </w:tcPr>
-          <w:p>
-            <w:r>
-              <w:rPr>
-                <w:sz w:val="17"/>
-              </w:rPr>
-              <w:t>DATETIME</w:t>
-            </w:r>
-          </w:p>
-        </w:tc>
-        <w:tc>
-          <w:tcPr>
-            <w:tcW w:w="2500" w:type="dxa"/>
-          </w:tcPr>
-          <w:p>
-            <w:r>
-              <w:rPr>
-                <w:sz w:val="17"/>
-              </w:rPr>
-              <w:t>NOT NULL, DEFAULT NOW()</w:t>
-            </w:r>
-          </w:p>
-        </w:tc>
-        <w:tc>
-          <w:tcPr>
-            <w:tcW w:w="3000" w:type="dxa"/>
-          </w:tcPr>
-          <w:p>
-            <w:r>
-              <w:rPr>
-                <w:sz w:val="17"/>
-              </w:rPr>
               <w:t>Fecha y hora de envío.</w:t>
             </w:r>
           </w:p>
         </w:tc>
       </w:tr>
     </w:tbl>
-    <w:p/>
     <w:p>
       <w:pPr>
         <w:keepNext/>
@@ -16128,10 +16358,7 @@
         <w:rPr>
           <w:b/>
         </w:rPr>
-        <w:t xml:space="preserve">Tabla registro_comida: </w:t>
-      </w:r>
-      <w:r>
-        <w:t>Alimentos registrados por el usuario y su estimación nutricional.</w:t>
+        <w:t>Tabla uso_asistente: Mensajes que cada usuario envió al asistente en el día, para el límite diario (FS-HU-07, D33). Una fila por usuario, sin contenido: borrar una conversación no devuelve el cupo.</w:t>
       </w:r>
     </w:p>
     <w:tbl>
@@ -16230,7 +16457,7 @@
                 <w:b/>
                 <w:sz w:val="17"/>
               </w:rPr>
-              <w:t>id</w:t>
+              <w:t>usuario_id</w:t>
             </w:r>
           </w:p>
         </w:tc>
@@ -16256,7 +16483,7 @@
               <w:rPr>
                 <w:sz w:val="17"/>
               </w:rPr>
-              <w:t>PK, AUTO_INCREMENT</w:t>
+              <w:t>PK, FK → usuarios.id, ON DELETE CASCADE</w:t>
             </w:r>
           </w:p>
         </w:tc>
@@ -16269,7 +16496,7 @@
               <w:rPr>
                 <w:sz w:val="17"/>
               </w:rPr>
-              <w:t>Identificador del registro.</w:t>
+              <w:t>Usuario al que corresponde el contador.</w:t>
             </w:r>
           </w:p>
         </w:tc>
@@ -16285,7 +16512,7 @@
                 <w:b/>
                 <w:sz w:val="17"/>
               </w:rPr>
-              <w:t>usuario_id</w:t>
+              <w:t>fecha</w:t>
             </w:r>
           </w:p>
         </w:tc>
@@ -16298,7 +16525,7 @@
               <w:rPr>
                 <w:sz w:val="17"/>
               </w:rPr>
-              <w:t>INT</w:t>
+              <w:t>DATE</w:t>
             </w:r>
           </w:p>
         </w:tc>
@@ -16311,7 +16538,7 @@
               <w:rPr>
                 <w:sz w:val="17"/>
               </w:rPr>
-              <w:t>FK → usuarios.id, NOT NULL</w:t>
+              <w:t>NOT NULL</w:t>
             </w:r>
           </w:p>
         </w:tc>
@@ -16324,7 +16551,7 @@
               <w:rPr>
                 <w:sz w:val="17"/>
               </w:rPr>
-              <w:t>Usuario que registró la comida.</w:t>
+              <w:t>Día en Chile (America/Santiago) al que corresponde el contador.</w:t>
             </w:r>
           </w:p>
         </w:tc>
@@ -16340,7 +16567,7 @@
                 <w:b/>
                 <w:sz w:val="17"/>
               </w:rPr>
-              <w:t>fecha</w:t>
+              <w:t>mensajes</w:t>
             </w:r>
           </w:p>
         </w:tc>
@@ -16353,7 +16580,7 @@
               <w:rPr>
                 <w:sz w:val="17"/>
               </w:rPr>
-              <w:t>DATE</w:t>
+              <w:t>SMALLINT</w:t>
             </w:r>
           </w:p>
         </w:tc>
@@ -16366,7 +16593,7 @@
               <w:rPr>
                 <w:sz w:val="17"/>
               </w:rPr>
-              <w:t>NOT NULL</w:t>
+              <w:t>NOT NULL, DEFAULT 0</w:t>
             </w:r>
           </w:p>
         </w:tc>
@@ -16379,282 +16606,7 @@
               <w:rPr>
                 <w:sz w:val="17"/>
               </w:rPr>
-              <w:t>Día de consumo.</w:t>
-            </w:r>
-          </w:p>
-        </w:tc>
-      </w:tr>
-      <w:tr>
-        <w:tc>
-          <w:tcPr>
-            <w:tcW w:w="1900" w:type="dxa"/>
-          </w:tcPr>
-          <w:p>
-            <w:r>
-              <w:rPr>
-                <w:b/>
-                <w:sz w:val="17"/>
-              </w:rPr>
-              <w:t>descripcion_alimento</w:t>
-            </w:r>
-          </w:p>
-        </w:tc>
-        <w:tc>
-          <w:tcPr>
-            <w:tcW w:w="1600" w:type="dxa"/>
-          </w:tcPr>
-          <w:p>
-            <w:r>
-              <w:rPr>
-                <w:sz w:val="17"/>
-              </w:rPr>
-              <w:t>VARCHAR(255)</w:t>
-            </w:r>
-          </w:p>
-        </w:tc>
-        <w:tc>
-          <w:tcPr>
-            <w:tcW w:w="2500" w:type="dxa"/>
-          </w:tcPr>
-          <w:p>
-            <w:r>
-              <w:rPr>
-                <w:sz w:val="17"/>
-              </w:rPr>
-              <w:t>NOT NULL</w:t>
-            </w:r>
-          </w:p>
-        </w:tc>
-        <w:tc>
-          <w:tcPr>
-            <w:tcW w:w="3000" w:type="dxa"/>
-          </w:tcPr>
-          <w:p>
-            <w:r>
-              <w:rPr>
-                <w:sz w:val="17"/>
-              </w:rPr>
-              <w:t>Alimento y cantidad (por ejemplo: 2 huevos).</w:t>
-            </w:r>
-          </w:p>
-        </w:tc>
-      </w:tr>
-      <w:tr>
-        <w:tc>
-          <w:tcPr>
-            <w:tcW w:w="1900" w:type="dxa"/>
-          </w:tcPr>
-          <w:p>
-            <w:r>
-              <w:rPr>
-                <w:b/>
-                <w:sz w:val="17"/>
-              </w:rPr>
-              <w:t>calorias</w:t>
-            </w:r>
-          </w:p>
-        </w:tc>
-        <w:tc>
-          <w:tcPr>
-            <w:tcW w:w="1600" w:type="dxa"/>
-          </w:tcPr>
-          <w:p>
-            <w:r>
-              <w:rPr>
-                <w:sz w:val="17"/>
-              </w:rPr>
-              <w:t>INT</w:t>
-            </w:r>
-          </w:p>
-        </w:tc>
-        <w:tc>
-          <w:tcPr>
-            <w:tcW w:w="2500" w:type="dxa"/>
-          </w:tcPr>
-          <w:p>
-            <w:r>
-              <w:rPr>
-                <w:sz w:val="17"/>
-              </w:rPr>
-              <w:t>NULL</w:t>
-            </w:r>
-          </w:p>
-        </w:tc>
-        <w:tc>
-          <w:tcPr>
-            <w:tcW w:w="3000" w:type="dxa"/>
-          </w:tcPr>
-          <w:p>
-            <w:r>
-              <w:rPr>
-                <w:sz w:val="17"/>
-              </w:rPr>
-              <w:t>Calorías estimadas (kcal).</w:t>
-            </w:r>
-          </w:p>
-        </w:tc>
-      </w:tr>
-      <w:tr>
-        <w:tc>
-          <w:tcPr>
-            <w:tcW w:w="1900" w:type="dxa"/>
-          </w:tcPr>
-          <w:p>
-            <w:r>
-              <w:rPr>
-                <w:b/>
-                <w:sz w:val="17"/>
-              </w:rPr>
-              <w:t>proteinas_g</w:t>
-            </w:r>
-          </w:p>
-        </w:tc>
-        <w:tc>
-          <w:tcPr>
-            <w:tcW w:w="1600" w:type="dxa"/>
-          </w:tcPr>
-          <w:p>
-            <w:r>
-              <w:rPr>
-                <w:sz w:val="17"/>
-              </w:rPr>
-              <w:t>DECIMAL(6,2)</w:t>
-            </w:r>
-          </w:p>
-        </w:tc>
-        <w:tc>
-          <w:tcPr>
-            <w:tcW w:w="2500" w:type="dxa"/>
-          </w:tcPr>
-          <w:p>
-            <w:r>
-              <w:rPr>
-                <w:sz w:val="17"/>
-              </w:rPr>
-              <w:t>NULL</w:t>
-            </w:r>
-          </w:p>
-        </w:tc>
-        <w:tc>
-          <w:tcPr>
-            <w:tcW w:w="3000" w:type="dxa"/>
-          </w:tcPr>
-          <w:p>
-            <w:r>
-              <w:rPr>
-                <w:sz w:val="17"/>
-              </w:rPr>
-              <w:t>Proteínas estimadas en gramos.</w:t>
-            </w:r>
-          </w:p>
-        </w:tc>
-      </w:tr>
-      <w:tr>
-        <w:tc>
-          <w:tcPr>
-            <w:tcW w:w="1900" w:type="dxa"/>
-          </w:tcPr>
-          <w:p>
-            <w:r>
-              <w:rPr>
-                <w:b/>
-                <w:sz w:val="17"/>
-              </w:rPr>
-              <w:t>carbohidratos_g</w:t>
-            </w:r>
-          </w:p>
-        </w:tc>
-        <w:tc>
-          <w:tcPr>
-            <w:tcW w:w="1600" w:type="dxa"/>
-          </w:tcPr>
-          <w:p>
-            <w:r>
-              <w:rPr>
-                <w:sz w:val="17"/>
-              </w:rPr>
-              <w:t>DECIMAL(6,2)</w:t>
-            </w:r>
-          </w:p>
-        </w:tc>
-        <w:tc>
-          <w:tcPr>
-            <w:tcW w:w="2500" w:type="dxa"/>
-          </w:tcPr>
-          <w:p>
-            <w:r>
-              <w:rPr>
-                <w:sz w:val="17"/>
-              </w:rPr>
-              <w:t>NULL</w:t>
-            </w:r>
-          </w:p>
-        </w:tc>
-        <w:tc>
-          <w:tcPr>
-            <w:tcW w:w="3000" w:type="dxa"/>
-          </w:tcPr>
-          <w:p>
-            <w:r>
-              <w:rPr>
-                <w:sz w:val="17"/>
-              </w:rPr>
-              <w:t>Carbohidratos estimados en gramos.</w:t>
-            </w:r>
-          </w:p>
-        </w:tc>
-      </w:tr>
-      <w:tr>
-        <w:tc>
-          <w:tcPr>
-            <w:tcW w:w="1900" w:type="dxa"/>
-          </w:tcPr>
-          <w:p>
-            <w:r>
-              <w:rPr>
-                <w:b/>
-                <w:sz w:val="17"/>
-              </w:rPr>
-              <w:t>grasas_g</w:t>
-            </w:r>
-          </w:p>
-        </w:tc>
-        <w:tc>
-          <w:tcPr>
-            <w:tcW w:w="1600" w:type="dxa"/>
-          </w:tcPr>
-          <w:p>
-            <w:r>
-              <w:rPr>
-                <w:sz w:val="17"/>
-              </w:rPr>
-              <w:t>DECIMAL(6,2)</w:t>
-            </w:r>
-          </w:p>
-        </w:tc>
-        <w:tc>
-          <w:tcPr>
-            <w:tcW w:w="2500" w:type="dxa"/>
-          </w:tcPr>
-          <w:p>
-            <w:r>
-              <w:rPr>
-                <w:sz w:val="17"/>
-              </w:rPr>
-              <w:t>NULL</w:t>
-            </w:r>
-          </w:p>
-        </w:tc>
-        <w:tc>
-          <w:tcPr>
-            <w:tcW w:w="3000" w:type="dxa"/>
-          </w:tcPr>
-          <w:p>
-            <w:r>
-              <w:rPr>
-                <w:sz w:val="17"/>
-              </w:rPr>
-              <w:t>Grasas estimadas en gramos.</w:t>
+              <w:t>Mensajes enviados ese día; al cambiar de día vuelve a 1. El límite (30 por defecto) se configura con IA_MENSAJES_POR_DIA.</w:t>
             </w:r>
           </w:p>
         </w:tc>
@@ -16674,10 +16626,10 @@
         <w:rPr>
           <w:b/>
         </w:rPr>
-        <w:t xml:space="preserve">Tabla disponibilidades: </w:t>
-      </w:r>
-      <w:r>
-        <w:t>Bloques de horario que un profesional publica para recibir reservas (FS-HU-13).</w:t>
+        <w:t xml:space="preserve">Tabla registro_comida: </w:t>
+      </w:r>
+      <w:r>
+        <w:t>Alimentos registrados por el usuario y su estimación nutricional.</w:t>
       </w:r>
     </w:p>
     <w:tbl>
@@ -16815,7 +16767,7 @@
               <w:rPr>
                 <w:sz w:val="17"/>
               </w:rPr>
-              <w:t>Identificador del bloque.</w:t>
+              <w:t>Identificador del registro.</w:t>
             </w:r>
           </w:p>
         </w:tc>
@@ -16831,8 +16783,7 @@
                 <w:b/>
                 <w:sz w:val="17"/>
               </w:rPr>
-              <w:lastRenderedPageBreak/>
-              <w:t>profesional_id</w:t>
+              <w:t>usuario_id</w:t>
             </w:r>
           </w:p>
         </w:tc>
@@ -16858,7 +16809,7 @@
               <w:rPr>
                 <w:sz w:val="17"/>
               </w:rPr>
-              <w:t>FK → profesionales.id, NOT NULL</w:t>
+              <w:t>FK → usuarios.id, NOT NULL</w:t>
             </w:r>
           </w:p>
         </w:tc>
@@ -16871,7 +16822,7 @@
               <w:rPr>
                 <w:sz w:val="17"/>
               </w:rPr>
-              <w:t>Profesional que ofrece el horario.</w:t>
+              <w:t>Usuario que registró la comida.</w:t>
             </w:r>
           </w:p>
         </w:tc>
@@ -16926,7 +16877,7 @@
               <w:rPr>
                 <w:sz w:val="17"/>
               </w:rPr>
-              <w:t>Día de atención.</w:t>
+              <w:t>Día de consumo.</w:t>
             </w:r>
           </w:p>
         </w:tc>
@@ -16942,7 +16893,7 @@
                 <w:b/>
                 <w:sz w:val="17"/>
               </w:rPr>
-              <w:t>hora_inicio</w:t>
+              <w:t>descripcion_alimento</w:t>
             </w:r>
           </w:p>
         </w:tc>
@@ -16955,7 +16906,7 @@
               <w:rPr>
                 <w:sz w:val="17"/>
               </w:rPr>
-              <w:t>TIME</w:t>
+              <w:t>VARCHAR(255)</w:t>
             </w:r>
           </w:p>
         </w:tc>
@@ -16981,7 +16932,7 @@
               <w:rPr>
                 <w:sz w:val="17"/>
               </w:rPr>
-              <w:t>Hora de inicio del bloque.</w:t>
+              <w:t>Alimento y cantidad (por ejemplo: 2 huevos).</w:t>
             </w:r>
           </w:p>
         </w:tc>
@@ -16997,7 +16948,7 @@
                 <w:b/>
                 <w:sz w:val="17"/>
               </w:rPr>
-              <w:t>hora_fin</w:t>
+              <w:t>calorias</w:t>
             </w:r>
           </w:p>
         </w:tc>
@@ -17010,7 +16961,7 @@
               <w:rPr>
                 <w:sz w:val="17"/>
               </w:rPr>
-              <w:t>TIME</w:t>
+              <w:t>INT</w:t>
             </w:r>
           </w:p>
         </w:tc>
@@ -17023,7 +16974,7 @@
               <w:rPr>
                 <w:sz w:val="17"/>
               </w:rPr>
-              <w:t>NOT NULL</w:t>
+              <w:t>NULL</w:t>
             </w:r>
           </w:p>
         </w:tc>
@@ -17036,7 +16987,7 @@
               <w:rPr>
                 <w:sz w:val="17"/>
               </w:rPr>
-              <w:t>Hora de término del bloque (posterior a la hora de inicio).</w:t>
+              <w:t>Calorías estimadas (kcal).</w:t>
             </w:r>
           </w:p>
         </w:tc>
@@ -17052,7 +17003,7 @@
                 <w:b/>
                 <w:sz w:val="17"/>
               </w:rPr>
-              <w:t>retirado</w:t>
+              <w:t>proteinas_g</w:t>
             </w:r>
           </w:p>
         </w:tc>
@@ -17065,7 +17016,7 @@
               <w:rPr>
                 <w:sz w:val="17"/>
               </w:rPr>
-              <w:t>BOOLEAN</w:t>
+              <w:t>DECIMAL(6,2)</w:t>
             </w:r>
           </w:p>
         </w:tc>
@@ -17078,7 +17029,7 @@
               <w:rPr>
                 <w:sz w:val="17"/>
               </w:rPr>
-              <w:t>NOT NULL, DEFAULT false</w:t>
+              <w:t>NULL</w:t>
             </w:r>
           </w:p>
         </w:tc>
@@ -17091,7 +17042,117 @@
               <w:rPr>
                 <w:sz w:val="17"/>
               </w:rPr>
-              <w:t>Excluye el bloque de nuevas reservas, conservando el historial.</w:t>
+              <w:t>Proteínas estimadas en gramos.</w:t>
+            </w:r>
+          </w:p>
+        </w:tc>
+      </w:tr>
+      <w:tr>
+        <w:tc>
+          <w:tcPr>
+            <w:tcW w:w="1900" w:type="dxa"/>
+          </w:tcPr>
+          <w:p>
+            <w:r>
+              <w:rPr>
+                <w:b/>
+                <w:sz w:val="17"/>
+              </w:rPr>
+              <w:t>carbohidratos_g</w:t>
+            </w:r>
+          </w:p>
+        </w:tc>
+        <w:tc>
+          <w:tcPr>
+            <w:tcW w:w="1600" w:type="dxa"/>
+          </w:tcPr>
+          <w:p>
+            <w:r>
+              <w:rPr>
+                <w:sz w:val="17"/>
+              </w:rPr>
+              <w:t>DECIMAL(6,2)</w:t>
+            </w:r>
+          </w:p>
+        </w:tc>
+        <w:tc>
+          <w:tcPr>
+            <w:tcW w:w="2500" w:type="dxa"/>
+          </w:tcPr>
+          <w:p>
+            <w:r>
+              <w:rPr>
+                <w:sz w:val="17"/>
+              </w:rPr>
+              <w:t>NULL</w:t>
+            </w:r>
+          </w:p>
+        </w:tc>
+        <w:tc>
+          <w:tcPr>
+            <w:tcW w:w="3000" w:type="dxa"/>
+          </w:tcPr>
+          <w:p>
+            <w:r>
+              <w:rPr>
+                <w:sz w:val="17"/>
+              </w:rPr>
+              <w:t>Carbohidratos estimados en gramos.</w:t>
+            </w:r>
+          </w:p>
+        </w:tc>
+      </w:tr>
+      <w:tr>
+        <w:tc>
+          <w:tcPr>
+            <w:tcW w:w="1900" w:type="dxa"/>
+          </w:tcPr>
+          <w:p>
+            <w:r>
+              <w:rPr>
+                <w:b/>
+                <w:sz w:val="17"/>
+              </w:rPr>
+              <w:t>grasas_g</w:t>
+            </w:r>
+          </w:p>
+        </w:tc>
+        <w:tc>
+          <w:tcPr>
+            <w:tcW w:w="1600" w:type="dxa"/>
+          </w:tcPr>
+          <w:p>
+            <w:r>
+              <w:rPr>
+                <w:sz w:val="17"/>
+              </w:rPr>
+              <w:t>DECIMAL(6,2)</w:t>
+            </w:r>
+          </w:p>
+        </w:tc>
+        <w:tc>
+          <w:tcPr>
+            <w:tcW w:w="2500" w:type="dxa"/>
+          </w:tcPr>
+          <w:p>
+            <w:r>
+              <w:rPr>
+                <w:sz w:val="17"/>
+              </w:rPr>
+              <w:t>NULL</w:t>
+            </w:r>
+          </w:p>
+        </w:tc>
+        <w:tc>
+          <w:tcPr>
+            <w:tcW w:w="3000" w:type="dxa"/>
+          </w:tcPr>
+          <w:p>
+            <w:r>
+              <w:rPr>
+                <w:sz w:val="17"/>
+              </w:rPr>
+              <w:t>Grasas estimadas en gramos.</w:t>
             </w:r>
           </w:p>
         </w:tc>
@@ -17111,10 +17172,10 @@
         <w:rPr>
           <w:b/>
         </w:rPr>
-        <w:t xml:space="preserve">Tabla reservas: </w:t>
-      </w:r>
-      <w:r>
-        <w:t>Reservas de horas realizadas por los usuarios (FS-HU-14). Un bloque admite como máximo una reserva activa, validado en una transacción del backend (QS5).</w:t>
+        <w:t xml:space="preserve">Tabla disponibilidades: </w:t>
+      </w:r>
+      <w:r>
+        <w:t>Bloques de horario que un profesional publica para recibir reservas (FS-HU-13).</w:t>
       </w:r>
     </w:p>
     <w:tbl>
@@ -17252,7 +17313,7 @@
               <w:rPr>
                 <w:sz w:val="17"/>
               </w:rPr>
-              <w:t>Identificador de la reserva.</w:t>
+              <w:t>Identificador del bloque.</w:t>
             </w:r>
           </w:p>
         </w:tc>
@@ -17268,7 +17329,8 @@
                 <w:b/>
                 <w:sz w:val="17"/>
               </w:rPr>
-              <w:t>usuario_id</w:t>
+              <w:lastRenderedPageBreak/>
+              <w:t>profesional_id</w:t>
             </w:r>
           </w:p>
         </w:tc>
@@ -17294,7 +17356,7 @@
               <w:rPr>
                 <w:sz w:val="17"/>
               </w:rPr>
-              <w:t>FK → usuarios.id, NOT NULL</w:t>
+              <w:t>FK → profesionales.id, NOT NULL</w:t>
             </w:r>
           </w:p>
         </w:tc>
@@ -17307,7 +17369,7 @@
               <w:rPr>
                 <w:sz w:val="17"/>
               </w:rPr>
-              <w:t>Usuario que reserva.</w:t>
+              <w:t>Profesional que ofrece el horario.</w:t>
             </w:r>
           </w:p>
         </w:tc>
@@ -17323,7 +17385,7 @@
                 <w:b/>
                 <w:sz w:val="17"/>
               </w:rPr>
-              <w:t>disponibilidad_id</w:t>
+              <w:t>fecha</w:t>
             </w:r>
           </w:p>
         </w:tc>
@@ -17336,7 +17398,7 @@
               <w:rPr>
                 <w:sz w:val="17"/>
               </w:rPr>
-              <w:t>INT</w:t>
+              <w:t>DATE</w:t>
             </w:r>
           </w:p>
         </w:tc>
@@ -17349,7 +17411,7 @@
               <w:rPr>
                 <w:sz w:val="17"/>
               </w:rPr>
-              <w:t>FK → disponibilidades.id, NOT NULL</w:t>
+              <w:t>NOT NULL</w:t>
             </w:r>
           </w:p>
         </w:tc>
@@ -17362,7 +17424,7 @@
               <w:rPr>
                 <w:sz w:val="17"/>
               </w:rPr>
-              <w:t>Bloque de horario reservado (identifica al profesional, la fecha y la hora).</w:t>
+              <w:t>Día de atención.</w:t>
             </w:r>
           </w:p>
         </w:tc>
@@ -17378,7 +17440,7 @@
                 <w:b/>
                 <w:sz w:val="17"/>
               </w:rPr>
-              <w:t>mensaje</w:t>
+              <w:t>hora_inicio</w:t>
             </w:r>
           </w:p>
         </w:tc>
@@ -17391,7 +17453,7 @@
               <w:rPr>
                 <w:sz w:val="17"/>
               </w:rPr>
-              <w:t>VARCHAR(500)</w:t>
+              <w:t>TIME</w:t>
             </w:r>
           </w:p>
         </w:tc>
@@ -17417,7 +17479,7 @@
               <w:rPr>
                 <w:sz w:val="17"/>
               </w:rPr>
-              <w:t>Mensaje breve del usuario sobre lo que necesita (10 a 500 caracteres), visible para el profesional.</w:t>
+              <w:t>Hora de inicio del bloque.</w:t>
             </w:r>
           </w:p>
         </w:tc>
@@ -17433,7 +17495,7 @@
                 <w:b/>
                 <w:sz w:val="17"/>
               </w:rPr>
-              <w:t>estado</w:t>
+              <w:t>hora_fin</w:t>
             </w:r>
           </w:p>
         </w:tc>
@@ -17446,7 +17508,7 @@
               <w:rPr>
                 <w:sz w:val="17"/>
               </w:rPr>
-              <w:t>ENUM('pendiente','confirmada','cancelada')</w:t>
+              <w:t>TIME</w:t>
             </w:r>
           </w:p>
         </w:tc>
@@ -17459,7 +17521,7 @@
               <w:rPr>
                 <w:sz w:val="17"/>
               </w:rPr>
-              <w:t>NOT NULL, DEFAULT 'pendiente'</w:t>
+              <w:t>NOT NULL</w:t>
             </w:r>
           </w:p>
         </w:tc>
@@ -17472,7 +17534,7 @@
               <w:rPr>
                 <w:sz w:val="17"/>
               </w:rPr>
-              <w:t>Estado de la reserva.</w:t>
+              <w:t>Hora de término del bloque (posterior a la hora de inicio).</w:t>
             </w:r>
           </w:p>
         </w:tc>
@@ -17488,7 +17550,7 @@
                 <w:b/>
                 <w:sz w:val="17"/>
               </w:rPr>
-              <w:t>fecha_creacion</w:t>
+              <w:t>retirado</w:t>
             </w:r>
           </w:p>
         </w:tc>
@@ -17501,7 +17563,7 @@
               <w:rPr>
                 <w:sz w:val="17"/>
               </w:rPr>
-              <w:t>DATETIME</w:t>
+              <w:t>BOOLEAN</w:t>
             </w:r>
           </w:p>
         </w:tc>
@@ -17514,7 +17576,7 @@
               <w:rPr>
                 <w:sz w:val="17"/>
               </w:rPr>
-              <w:t>NOT NULL, DEFAULT NOW()</w:t>
+              <w:t>NOT NULL, DEFAULT false</w:t>
             </w:r>
           </w:p>
         </w:tc>
@@ -17527,7 +17589,7 @@
               <w:rPr>
                 <w:sz w:val="17"/>
               </w:rPr>
-              <w:t>Fecha y hora en que se realizó la reserva.</w:t>
+              <w:t>Excluye el bloque de nuevas reservas, conservando el historial.</w:t>
             </w:r>
           </w:p>
         </w:tc>
@@ -17547,10 +17609,10 @@
         <w:rPr>
           <w:b/>
         </w:rPr>
-        <w:t xml:space="preserve">Tabla tokens_recuperacion: </w:t>
-      </w:r>
-      <w:r>
-        <w:t>Códigos de un solo uso para restablecer la contraseña (FS-HU-15). Solo se guarda el hash SHA-256 del código; el código original viaja únicamente en el enlace enviado al correo (QS6).</w:t>
+        <w:t xml:space="preserve">Tabla reservas: </w:t>
+      </w:r>
+      <w:r>
+        <w:t>Reservas de horas realizadas por los usuarios (FS-HU-14). Un bloque admite como máximo una reserva activa, validado en una transacción del backend (QS5).</w:t>
       </w:r>
     </w:p>
     <w:tbl>
@@ -17688,7 +17750,7 @@
               <w:rPr>
                 <w:sz w:val="17"/>
               </w:rPr>
-              <w:t>Identificador del código.</w:t>
+              <w:t>Identificador de la reserva.</w:t>
             </w:r>
           </w:p>
         </w:tc>
@@ -17743,7 +17805,7 @@
               <w:rPr>
                 <w:sz w:val="17"/>
               </w:rPr>
-              <w:t>Usuario que solicitó la recuperación.</w:t>
+              <w:t>Usuario que reserva.</w:t>
             </w:r>
           </w:p>
         </w:tc>
@@ -17759,7 +17821,7 @@
                 <w:b/>
                 <w:sz w:val="17"/>
               </w:rPr>
-              <w:t>token_hash</w:t>
+              <w:t>disponibilidad_id</w:t>
             </w:r>
           </w:p>
         </w:tc>
@@ -17772,7 +17834,7 @@
               <w:rPr>
                 <w:sz w:val="17"/>
               </w:rPr>
-              <w:t>CHAR(64)</w:t>
+              <w:t>INT</w:t>
             </w:r>
           </w:p>
         </w:tc>
@@ -17785,7 +17847,7 @@
               <w:rPr>
                 <w:sz w:val="17"/>
               </w:rPr>
-              <w:t>NOT NULL, UNIQUE</w:t>
+              <w:t>FK → disponibilidades.id, NOT NULL</w:t>
             </w:r>
           </w:p>
         </w:tc>
@@ -17798,7 +17860,7 @@
               <w:rPr>
                 <w:sz w:val="17"/>
               </w:rPr>
-              <w:t>Hash SHA-256 del código aleatorio de 32 bytes enviado en el enlace.</w:t>
+              <w:t>Bloque de horario reservado (identifica al profesional, la fecha y la hora).</w:t>
             </w:r>
           </w:p>
         </w:tc>
@@ -17814,7 +17876,7 @@
                 <w:b/>
                 <w:sz w:val="17"/>
               </w:rPr>
-              <w:t>fecha_expiracion</w:t>
+              <w:t>mensaje</w:t>
             </w:r>
           </w:p>
         </w:tc>
@@ -17827,6 +17889,116 @@
               <w:rPr>
                 <w:sz w:val="17"/>
               </w:rPr>
+              <w:t>VARCHAR(500)</w:t>
+            </w:r>
+          </w:p>
+        </w:tc>
+        <w:tc>
+          <w:tcPr>
+            <w:tcW w:w="2500" w:type="dxa"/>
+          </w:tcPr>
+          <w:p>
+            <w:r>
+              <w:rPr>
+                <w:sz w:val="17"/>
+              </w:rPr>
+              <w:t>NOT NULL</w:t>
+            </w:r>
+          </w:p>
+        </w:tc>
+        <w:tc>
+          <w:tcPr>
+            <w:tcW w:w="3000" w:type="dxa"/>
+          </w:tcPr>
+          <w:p>
+            <w:r>
+              <w:rPr>
+                <w:sz w:val="17"/>
+              </w:rPr>
+              <w:t>Mensaje breve del usuario sobre lo que necesita (10 a 500 caracteres), visible para el profesional.</w:t>
+            </w:r>
+          </w:p>
+        </w:tc>
+      </w:tr>
+      <w:tr>
+        <w:tc>
+          <w:tcPr>
+            <w:tcW w:w="1900" w:type="dxa"/>
+          </w:tcPr>
+          <w:p>
+            <w:r>
+              <w:rPr>
+                <w:b/>
+                <w:sz w:val="17"/>
+              </w:rPr>
+              <w:t>estado</w:t>
+            </w:r>
+          </w:p>
+        </w:tc>
+        <w:tc>
+          <w:tcPr>
+            <w:tcW w:w="1600" w:type="dxa"/>
+          </w:tcPr>
+          <w:p>
+            <w:r>
+              <w:rPr>
+                <w:sz w:val="17"/>
+              </w:rPr>
+              <w:t>ENUM('pendiente','confirmada','cancelada')</w:t>
+            </w:r>
+          </w:p>
+        </w:tc>
+        <w:tc>
+          <w:tcPr>
+            <w:tcW w:w="2500" w:type="dxa"/>
+          </w:tcPr>
+          <w:p>
+            <w:r>
+              <w:rPr>
+                <w:sz w:val="17"/>
+              </w:rPr>
+              <w:t>NOT NULL, DEFAULT 'pendiente'</w:t>
+            </w:r>
+          </w:p>
+        </w:tc>
+        <w:tc>
+          <w:tcPr>
+            <w:tcW w:w="3000" w:type="dxa"/>
+          </w:tcPr>
+          <w:p>
+            <w:r>
+              <w:rPr>
+                <w:sz w:val="17"/>
+              </w:rPr>
+              <w:t>Estado de la reserva.</w:t>
+            </w:r>
+          </w:p>
+        </w:tc>
+      </w:tr>
+      <w:tr>
+        <w:tc>
+          <w:tcPr>
+            <w:tcW w:w="1900" w:type="dxa"/>
+          </w:tcPr>
+          <w:p>
+            <w:r>
+              <w:rPr>
+                <w:b/>
+                <w:sz w:val="17"/>
+              </w:rPr>
+              <w:t>fecha_creacion</w:t>
+            </w:r>
+          </w:p>
+        </w:tc>
+        <w:tc>
+          <w:tcPr>
+            <w:tcW w:w="1600" w:type="dxa"/>
+          </w:tcPr>
+          <w:p>
+            <w:r>
+              <w:rPr>
+                <w:sz w:val="17"/>
+              </w:rPr>
               <w:t>DATETIME</w:t>
             </w:r>
           </w:p>
@@ -17840,7 +18012,7 @@
               <w:rPr>
                 <w:sz w:val="17"/>
               </w:rPr>
-              <w:t>NOT NULL</w:t>
+              <w:t>NOT NULL, DEFAULT NOW()</w:t>
             </w:r>
           </w:p>
         </w:tc>
@@ -17853,117 +18025,7 @@
               <w:rPr>
                 <w:sz w:val="17"/>
               </w:rPr>
-              <w:t>Vencimiento del código: 60 minutos después de la solicitud.</w:t>
-            </w:r>
-          </w:p>
-        </w:tc>
-      </w:tr>
-      <w:tr>
-        <w:tc>
-          <w:tcPr>
-            <w:tcW w:w="1900" w:type="dxa"/>
-          </w:tcPr>
-          <w:p>
-            <w:r>
-              <w:rPr>
-                <w:b/>
-                <w:sz w:val="17"/>
-              </w:rPr>
-              <w:t>fecha_uso</w:t>
-            </w:r>
-          </w:p>
-        </w:tc>
-        <w:tc>
-          <w:tcPr>
-            <w:tcW w:w="1600" w:type="dxa"/>
-          </w:tcPr>
-          <w:p>
-            <w:r>
-              <w:rPr>
-                <w:sz w:val="17"/>
-              </w:rPr>
-              <w:t>DATETIME</w:t>
-            </w:r>
-          </w:p>
-        </w:tc>
-        <w:tc>
-          <w:tcPr>
-            <w:tcW w:w="2500" w:type="dxa"/>
-          </w:tcPr>
-          <w:p>
-            <w:r>
-              <w:rPr>
-                <w:sz w:val="17"/>
-              </w:rPr>
-              <w:t>NULL</w:t>
-            </w:r>
-          </w:p>
-        </w:tc>
-        <w:tc>
-          <w:tcPr>
-            <w:tcW w:w="3000" w:type="dxa"/>
-          </w:tcPr>
-          <w:p>
-            <w:r>
-              <w:rPr>
-                <w:sz w:val="17"/>
-              </w:rPr>
-              <w:t>Fecha y hora en que se usó el código; si no es nulo, el código ya no sirve.</w:t>
-            </w:r>
-          </w:p>
-        </w:tc>
-      </w:tr>
-      <w:tr>
-        <w:tc>
-          <w:tcPr>
-            <w:tcW w:w="1900" w:type="dxa"/>
-          </w:tcPr>
-          <w:p>
-            <w:r>
-              <w:rPr>
-                <w:b/>
-                <w:sz w:val="17"/>
-              </w:rPr>
-              <w:t>fecha_creacion</w:t>
-            </w:r>
-          </w:p>
-        </w:tc>
-        <w:tc>
-          <w:tcPr>
-            <w:tcW w:w="1600" w:type="dxa"/>
-          </w:tcPr>
-          <w:p>
-            <w:r>
-              <w:rPr>
-                <w:sz w:val="17"/>
-              </w:rPr>
-              <w:t>DATETIME</w:t>
-            </w:r>
-          </w:p>
-        </w:tc>
-        <w:tc>
-          <w:tcPr>
-            <w:tcW w:w="2500" w:type="dxa"/>
-          </w:tcPr>
-          <w:p>
-            <w:r>
-              <w:rPr>
-                <w:sz w:val="17"/>
-              </w:rPr>
-              <w:t>NOT NULL, DEFAULT NOW()</w:t>
-            </w:r>
-          </w:p>
-        </w:tc>
-        <w:tc>
-          <w:tcPr>
-            <w:tcW w:w="3000" w:type="dxa"/>
-          </w:tcPr>
-          <w:p>
-            <w:r>
-              <w:rPr>
-                <w:sz w:val="17"/>
-              </w:rPr>
-              <w:t>Fecha y hora de la solicitud.</w:t>
+              <w:t>Fecha y hora en que se realizó la reserva.</w:t>
             </w:r>
           </w:p>
         </w:tc>
@@ -17983,10 +18045,10 @@
         <w:rPr>
           <w:b/>
         </w:rPr>
-        <w:t xml:space="preserve">Tabla informacion_salud: </w:t>
-      </w:r>
-      <w:r>
-        <w:t>Información de salud declarada por el usuario (FS-HU-19). Es un dato sensible: se guarda separada del perfil, solo con valores de los catálogos de shared/reglas.json (sin texto libre) y solo la consulta su dueño (QS7).</w:t>
+        <w:t xml:space="preserve">Tabla tokens_recuperacion: </w:t>
+      </w:r>
+      <w:r>
+        <w:t>Códigos de un solo uso para restablecer la contraseña (FS-HU-15). Solo se guarda el hash SHA-256 del código; el código original viaja únicamente en el enlace enviado al correo (QS6).</w:t>
       </w:r>
     </w:p>
     <w:tbl>
@@ -18124,7 +18186,7 @@
               <w:rPr>
                 <w:sz w:val="17"/>
               </w:rPr>
-              <w:t>Identificador del registro.</w:t>
+              <w:t>Identificador del código.</w:t>
             </w:r>
           </w:p>
         </w:tc>
@@ -18166,7 +18228,7 @@
               <w:rPr>
                 <w:sz w:val="17"/>
               </w:rPr>
-              <w:t>FK → usuarios.id, UNIQUE, NOT NULL</w:t>
+              <w:t>FK → usuarios.id, NOT NULL</w:t>
             </w:r>
           </w:p>
         </w:tc>
@@ -18179,7 +18241,7 @@
               <w:rPr>
                 <w:sz w:val="17"/>
               </w:rPr>
-              <w:t>Usuario dueño de la información (relación 1 : 0..1).</w:t>
+              <w:t>Usuario que solicitó la recuperación.</w:t>
             </w:r>
           </w:p>
         </w:tc>
@@ -18195,7 +18257,7 @@
                 <w:b/>
                 <w:sz w:val="17"/>
               </w:rPr>
-              <w:t>condiciones_medicas</w:t>
+              <w:t>token_hash</w:t>
             </w:r>
           </w:p>
         </w:tc>
@@ -18208,7 +18270,7 @@
               <w:rPr>
                 <w:sz w:val="17"/>
               </w:rPr>
-              <w:t>JSON</w:t>
+              <w:t>CHAR(64)</w:t>
             </w:r>
           </w:p>
         </w:tc>
@@ -18221,6 +18283,61 @@
               <w:rPr>
                 <w:sz w:val="17"/>
               </w:rPr>
+              <w:t>NOT NULL, UNIQUE</w:t>
+            </w:r>
+          </w:p>
+        </w:tc>
+        <w:tc>
+          <w:tcPr>
+            <w:tcW w:w="3000" w:type="dxa"/>
+          </w:tcPr>
+          <w:p>
+            <w:r>
+              <w:rPr>
+                <w:sz w:val="17"/>
+              </w:rPr>
+              <w:t>Hash SHA-256 del código aleatorio de 32 bytes enviado en el enlace.</w:t>
+            </w:r>
+          </w:p>
+        </w:tc>
+      </w:tr>
+      <w:tr>
+        <w:tc>
+          <w:tcPr>
+            <w:tcW w:w="1900" w:type="dxa"/>
+          </w:tcPr>
+          <w:p>
+            <w:r>
+              <w:rPr>
+                <w:b/>
+                <w:sz w:val="17"/>
+              </w:rPr>
+              <w:t>fecha_expiracion</w:t>
+            </w:r>
+          </w:p>
+        </w:tc>
+        <w:tc>
+          <w:tcPr>
+            <w:tcW w:w="1600" w:type="dxa"/>
+          </w:tcPr>
+          <w:p>
+            <w:r>
+              <w:rPr>
+                <w:sz w:val="17"/>
+              </w:rPr>
+              <w:t>DATETIME</w:t>
+            </w:r>
+          </w:p>
+        </w:tc>
+        <w:tc>
+          <w:tcPr>
+            <w:tcW w:w="2500" w:type="dxa"/>
+          </w:tcPr>
+          <w:p>
+            <w:r>
+              <w:rPr>
+                <w:sz w:val="17"/>
+              </w:rPr>
               <w:t>NOT NULL</w:t>
             </w:r>
           </w:p>
@@ -18234,14 +18351,7 @@
               <w:rPr>
                 <w:sz w:val="17"/>
               </w:rPr>
-              <w:t xml:space="preserve">Lista de condiciones del catálogo (diabetes, hipertension, </w:t>
-            </w:r>
-            <w:r>
-              <w:rPr>
-                <w:sz w:val="17"/>
-              </w:rPr>
-              <w:lastRenderedPageBreak/>
-              <w:t>cardiovascular, respiratoria, tiroides, colesterol, musculoesqueletica, embarazo_lactancia, otra) o ["ninguna"].</w:t>
+              <w:t>Vencimiento del código: 60 minutos después de la solicitud.</w:t>
             </w:r>
           </w:p>
         </w:tc>
@@ -18257,8 +18367,7 @@
                 <w:b/>
                 <w:sz w:val="17"/>
               </w:rPr>
-              <w:lastRenderedPageBreak/>
-              <w:t>toma_medicamentos</w:t>
+              <w:t>fecha_uso</w:t>
             </w:r>
           </w:p>
         </w:tc>
@@ -18271,7 +18380,7 @@
               <w:rPr>
                 <w:sz w:val="17"/>
               </w:rPr>
-              <w:t>BOOLEAN</w:t>
+              <w:t>DATETIME</w:t>
             </w:r>
           </w:p>
         </w:tc>
@@ -18284,7 +18393,7 @@
               <w:rPr>
                 <w:sz w:val="17"/>
               </w:rPr>
-              <w:t>NOT NULL</w:t>
+              <w:t>NULL</w:t>
             </w:r>
           </w:p>
         </w:tc>
@@ -18297,7 +18406,7 @@
               <w:rPr>
                 <w:sz w:val="17"/>
               </w:rPr>
-              <w:t>Indica si toma algún medicamento regularmente.</w:t>
+              <w:t>Fecha y hora en que se usó el código; si no es nulo, el código ya no sirve.</w:t>
             </w:r>
           </w:p>
         </w:tc>
@@ -18313,7 +18422,7 @@
                 <w:b/>
                 <w:sz w:val="17"/>
               </w:rPr>
-              <w:t>medicamentos</w:t>
+              <w:t>fecha_creacion</w:t>
             </w:r>
           </w:p>
         </w:tc>
@@ -18326,7 +18435,7 @@
               <w:rPr>
                 <w:sz w:val="17"/>
               </w:rPr>
-              <w:t>JSON</w:t>
+              <w:t>DATETIME</w:t>
             </w:r>
           </w:p>
         </w:tc>
@@ -18339,7 +18448,7 @@
               <w:rPr>
                 <w:sz w:val="17"/>
               </w:rPr>
-              <w:t>NOT NULL</w:t>
+              <w:t>NOT NULL, DEFAULT NOW()</w:t>
             </w:r>
           </w:p>
         </w:tc>
@@ -18352,117 +18461,7 @@
               <w:rPr>
                 <w:sz w:val="17"/>
               </w:rPr>
-              <w:t>Tipos de medicamento del catálogo (presion, diabetes, anticoagulantes, corticoides, salud_mental, hormonas, suplementos, otro); lista vacía si no toma.</w:t>
-            </w:r>
-          </w:p>
-        </w:tc>
-      </w:tr>
-      <w:tr>
-        <w:tc>
-          <w:tcPr>
-            <w:tcW w:w="1900" w:type="dxa"/>
-          </w:tcPr>
-          <w:p>
-            <w:r>
-              <w:rPr>
-                <w:b/>
-                <w:sz w:val="17"/>
-              </w:rPr>
-              <w:t>alergias</w:t>
-            </w:r>
-          </w:p>
-        </w:tc>
-        <w:tc>
-          <w:tcPr>
-            <w:tcW w:w="1600" w:type="dxa"/>
-          </w:tcPr>
-          <w:p>
-            <w:r>
-              <w:rPr>
-                <w:sz w:val="17"/>
-              </w:rPr>
-              <w:t>JSON</w:t>
-            </w:r>
-          </w:p>
-        </w:tc>
-        <w:tc>
-          <w:tcPr>
-            <w:tcW w:w="2500" w:type="dxa"/>
-          </w:tcPr>
-          <w:p>
-            <w:r>
-              <w:rPr>
-                <w:sz w:val="17"/>
-              </w:rPr>
-              <w:t>NOT NULL</w:t>
-            </w:r>
-          </w:p>
-        </w:tc>
-        <w:tc>
-          <w:tcPr>
-            <w:tcW w:w="3000" w:type="dxa"/>
-          </w:tcPr>
-          <w:p>
-            <w:r>
-              <w:rPr>
-                <w:sz w:val="17"/>
-              </w:rPr>
-              <w:t>Lista del catálogo (alimentarias, medicamentosas, ambientales) o ["ninguna"].</w:t>
-            </w:r>
-          </w:p>
-        </w:tc>
-      </w:tr>
-      <w:tr>
-        <w:tc>
-          <w:tcPr>
-            <w:tcW w:w="1900" w:type="dxa"/>
-          </w:tcPr>
-          <w:p>
-            <w:r>
-              <w:rPr>
-                <w:b/>
-                <w:sz w:val="17"/>
-              </w:rPr>
-              <w:t>fecha_actualizacion</w:t>
-            </w:r>
-          </w:p>
-        </w:tc>
-        <w:tc>
-          <w:tcPr>
-            <w:tcW w:w="1600" w:type="dxa"/>
-          </w:tcPr>
-          <w:p>
-            <w:r>
-              <w:rPr>
-                <w:sz w:val="17"/>
-              </w:rPr>
-              <w:t>DATETIME</w:t>
-            </w:r>
-          </w:p>
-        </w:tc>
-        <w:tc>
-          <w:tcPr>
-            <w:tcW w:w="2500" w:type="dxa"/>
-          </w:tcPr>
-          <w:p>
-            <w:r>
-              <w:rPr>
-                <w:sz w:val="17"/>
-              </w:rPr>
-              <w:t>NOT NULL</w:t>
-            </w:r>
-          </w:p>
-        </w:tc>
-        <w:tc>
-          <w:tcPr>
-            <w:tcW w:w="3000" w:type="dxa"/>
-          </w:tcPr>
-          <w:p>
-            <w:r>
-              <w:rPr>
-                <w:sz w:val="17"/>
-              </w:rPr>
-              <w:t>Fecha y hora de la última modificación.</w:t>
+              <w:t>Fecha y hora de la solicitud.</w:t>
             </w:r>
           </w:p>
         </w:tc>
@@ -18482,7 +18481,10 @@
         <w:rPr>
           <w:b/>
         </w:rPr>
-        <w:t>Tabla favoritos: Profesionales que cada usuario guarda para volver a encontrarlos (FS-HU-23). Agregar dos veces el mismo favorito no lo duplica.</w:t>
+        <w:t xml:space="preserve">Tabla informacion_salud: </w:t>
+      </w:r>
+      <w:r>
+        <w:t>Información de salud declarada por el usuario (FS-HU-19). Es un dato sensible: se guarda separada del perfil, solo con valores de los catálogos de shared/reglas.json (sin texto libre) y solo la consulta su dueño (QS7).</w:t>
       </w:r>
     </w:p>
     <w:tbl>
@@ -18620,7 +18622,7 @@
               <w:rPr>
                 <w:sz w:val="17"/>
               </w:rPr>
-              <w:t>Identificador del favorito.</w:t>
+              <w:t>Identificador del registro.</w:t>
             </w:r>
           </w:p>
         </w:tc>
@@ -18662,7 +18664,7 @@
               <w:rPr>
                 <w:sz w:val="17"/>
               </w:rPr>
-              <w:t>FK → usuarios.id, NOT NULL</w:t>
+              <w:t>FK → usuarios.id, UNIQUE, NOT NULL</w:t>
             </w:r>
           </w:p>
         </w:tc>
@@ -18675,7 +18677,7 @@
               <w:rPr>
                 <w:sz w:val="17"/>
               </w:rPr>
-              <w:t>Usuario que guardó el favorito.</w:t>
+              <w:t>Usuario dueño de la información (relación 1 : 0..1).</w:t>
             </w:r>
           </w:p>
         </w:tc>
@@ -18691,7 +18693,7 @@
                 <w:b/>
                 <w:sz w:val="17"/>
               </w:rPr>
-              <w:t>profesional_id</w:t>
+              <w:t>condiciones_medicas</w:t>
             </w:r>
           </w:p>
         </w:tc>
@@ -18704,7 +18706,7 @@
               <w:rPr>
                 <w:sz w:val="17"/>
               </w:rPr>
-              <w:t>INT</w:t>
+              <w:t>JSON</w:t>
             </w:r>
           </w:p>
         </w:tc>
@@ -18717,7 +18719,7 @@
               <w:rPr>
                 <w:sz w:val="17"/>
               </w:rPr>
-              <w:t>FK → profesionales.id, NOT NULL</w:t>
+              <w:t>NOT NULL</w:t>
             </w:r>
           </w:p>
         </w:tc>
@@ -18730,7 +18732,14 @@
               <w:rPr>
                 <w:sz w:val="17"/>
               </w:rPr>
-              <w:t>Profesional guardado. UNIQUE (usuario_id, profesional_id).</w:t>
+              <w:t xml:space="preserve">Lista de condiciones del catálogo (diabetes, hipertension, </w:t>
+            </w:r>
+            <w:r>
+              <w:rPr>
+                <w:sz w:val="17"/>
+              </w:rPr>
+              <w:lastRenderedPageBreak/>
+              <w:t>cardiovascular, respiratoria, tiroides, colesterol, musculoesqueletica, embarazo_lactancia, otra) o ["ninguna"].</w:t>
             </w:r>
           </w:p>
         </w:tc>
@@ -18746,7 +18755,8 @@
                 <w:b/>
                 <w:sz w:val="17"/>
               </w:rPr>
-              <w:t>fecha_creacion</w:t>
+              <w:lastRenderedPageBreak/>
+              <w:t>toma_medicamentos</w:t>
             </w:r>
           </w:p>
         </w:tc>
@@ -18759,6 +18769,171 @@
               <w:rPr>
                 <w:sz w:val="17"/>
               </w:rPr>
+              <w:t>BOOLEAN</w:t>
+            </w:r>
+          </w:p>
+        </w:tc>
+        <w:tc>
+          <w:tcPr>
+            <w:tcW w:w="2500" w:type="dxa"/>
+          </w:tcPr>
+          <w:p>
+            <w:r>
+              <w:rPr>
+                <w:sz w:val="17"/>
+              </w:rPr>
+              <w:t>NOT NULL</w:t>
+            </w:r>
+          </w:p>
+        </w:tc>
+        <w:tc>
+          <w:tcPr>
+            <w:tcW w:w="3000" w:type="dxa"/>
+          </w:tcPr>
+          <w:p>
+            <w:r>
+              <w:rPr>
+                <w:sz w:val="17"/>
+              </w:rPr>
+              <w:t>Indica si toma algún medicamento regularmente.</w:t>
+            </w:r>
+          </w:p>
+        </w:tc>
+      </w:tr>
+      <w:tr>
+        <w:tc>
+          <w:tcPr>
+            <w:tcW w:w="1900" w:type="dxa"/>
+          </w:tcPr>
+          <w:p>
+            <w:r>
+              <w:rPr>
+                <w:b/>
+                <w:sz w:val="17"/>
+              </w:rPr>
+              <w:t>medicamentos</w:t>
+            </w:r>
+          </w:p>
+        </w:tc>
+        <w:tc>
+          <w:tcPr>
+            <w:tcW w:w="1600" w:type="dxa"/>
+          </w:tcPr>
+          <w:p>
+            <w:r>
+              <w:rPr>
+                <w:sz w:val="17"/>
+              </w:rPr>
+              <w:t>JSON</w:t>
+            </w:r>
+          </w:p>
+        </w:tc>
+        <w:tc>
+          <w:tcPr>
+            <w:tcW w:w="2500" w:type="dxa"/>
+          </w:tcPr>
+          <w:p>
+            <w:r>
+              <w:rPr>
+                <w:sz w:val="17"/>
+              </w:rPr>
+              <w:t>NOT NULL</w:t>
+            </w:r>
+          </w:p>
+        </w:tc>
+        <w:tc>
+          <w:tcPr>
+            <w:tcW w:w="3000" w:type="dxa"/>
+          </w:tcPr>
+          <w:p>
+            <w:r>
+              <w:rPr>
+                <w:sz w:val="17"/>
+              </w:rPr>
+              <w:t>Tipos de medicamento del catálogo (presion, diabetes, anticoagulantes, corticoides, salud_mental, hormonas, suplementos, otro); lista vacía si no toma.</w:t>
+            </w:r>
+          </w:p>
+        </w:tc>
+      </w:tr>
+      <w:tr>
+        <w:tc>
+          <w:tcPr>
+            <w:tcW w:w="1900" w:type="dxa"/>
+          </w:tcPr>
+          <w:p>
+            <w:r>
+              <w:rPr>
+                <w:b/>
+                <w:sz w:val="17"/>
+              </w:rPr>
+              <w:t>alergias</w:t>
+            </w:r>
+          </w:p>
+        </w:tc>
+        <w:tc>
+          <w:tcPr>
+            <w:tcW w:w="1600" w:type="dxa"/>
+          </w:tcPr>
+          <w:p>
+            <w:r>
+              <w:rPr>
+                <w:sz w:val="17"/>
+              </w:rPr>
+              <w:t>JSON</w:t>
+            </w:r>
+          </w:p>
+        </w:tc>
+        <w:tc>
+          <w:tcPr>
+            <w:tcW w:w="2500" w:type="dxa"/>
+          </w:tcPr>
+          <w:p>
+            <w:r>
+              <w:rPr>
+                <w:sz w:val="17"/>
+              </w:rPr>
+              <w:t>NOT NULL</w:t>
+            </w:r>
+          </w:p>
+        </w:tc>
+        <w:tc>
+          <w:tcPr>
+            <w:tcW w:w="3000" w:type="dxa"/>
+          </w:tcPr>
+          <w:p>
+            <w:r>
+              <w:rPr>
+                <w:sz w:val="17"/>
+              </w:rPr>
+              <w:t>Lista del catálogo (alimentarias, medicamentosas, ambientales) o ["ninguna"].</w:t>
+            </w:r>
+          </w:p>
+        </w:tc>
+      </w:tr>
+      <w:tr>
+        <w:tc>
+          <w:tcPr>
+            <w:tcW w:w="1900" w:type="dxa"/>
+          </w:tcPr>
+          <w:p>
+            <w:r>
+              <w:rPr>
+                <w:b/>
+                <w:sz w:val="17"/>
+              </w:rPr>
+              <w:t>fecha_actualizacion</w:t>
+            </w:r>
+          </w:p>
+        </w:tc>
+        <w:tc>
+          <w:tcPr>
+            <w:tcW w:w="1600" w:type="dxa"/>
+          </w:tcPr>
+          <w:p>
+            <w:r>
+              <w:rPr>
+                <w:sz w:val="17"/>
+              </w:rPr>
               <w:t>DATETIME</w:t>
             </w:r>
           </w:p>
@@ -18772,7 +18947,7 @@
               <w:rPr>
                 <w:sz w:val="17"/>
               </w:rPr>
-              <w:t>NOT NULL, DEFAULT NOW()</w:t>
+              <w:t>NOT NULL</w:t>
             </w:r>
           </w:p>
         </w:tc>
@@ -18785,7 +18960,7 @@
               <w:rPr>
                 <w:sz w:val="17"/>
               </w:rPr>
-              <w:t>Fecha en que se guardó.</w:t>
+              <w:t>Fecha y hora de la última modificación.</w:t>
             </w:r>
           </w:p>
         </w:tc>
@@ -18805,7 +18980,7 @@
         <w:rPr>
           <w:b/>
         </w:rPr>
-        <w:t>Tabla resenas: Calificaciones y comentarios de los usuarios sobre los profesionales (FS-HU-24). Calificar de nuevo reemplaza la reseña anterior del mismo usuario.</w:t>
+        <w:t>Tabla favoritos: Profesionales que cada usuario guarda para volver a encontrarlos (FS-HU-23). Agregar dos veces el mismo favorito no lo duplica.</w:t>
       </w:r>
     </w:p>
     <w:tbl>
@@ -18943,6 +19118,329 @@
               <w:rPr>
                 <w:sz w:val="17"/>
               </w:rPr>
+              <w:t>Identificador del favorito.</w:t>
+            </w:r>
+          </w:p>
+        </w:tc>
+      </w:tr>
+      <w:tr>
+        <w:tc>
+          <w:tcPr>
+            <w:tcW w:w="1900" w:type="dxa"/>
+          </w:tcPr>
+          <w:p>
+            <w:r>
+              <w:rPr>
+                <w:b/>
+                <w:sz w:val="17"/>
+              </w:rPr>
+              <w:t>usuario_id</w:t>
+            </w:r>
+          </w:p>
+        </w:tc>
+        <w:tc>
+          <w:tcPr>
+            <w:tcW w:w="1600" w:type="dxa"/>
+          </w:tcPr>
+          <w:p>
+            <w:r>
+              <w:rPr>
+                <w:sz w:val="17"/>
+              </w:rPr>
+              <w:t>INT</w:t>
+            </w:r>
+          </w:p>
+        </w:tc>
+        <w:tc>
+          <w:tcPr>
+            <w:tcW w:w="2500" w:type="dxa"/>
+          </w:tcPr>
+          <w:p>
+            <w:r>
+              <w:rPr>
+                <w:sz w:val="17"/>
+              </w:rPr>
+              <w:t>FK → usuarios.id, NOT NULL</w:t>
+            </w:r>
+          </w:p>
+        </w:tc>
+        <w:tc>
+          <w:tcPr>
+            <w:tcW w:w="3000" w:type="dxa"/>
+          </w:tcPr>
+          <w:p>
+            <w:r>
+              <w:rPr>
+                <w:sz w:val="17"/>
+              </w:rPr>
+              <w:t>Usuario que guardó el favorito.</w:t>
+            </w:r>
+          </w:p>
+        </w:tc>
+      </w:tr>
+      <w:tr>
+        <w:tc>
+          <w:tcPr>
+            <w:tcW w:w="1900" w:type="dxa"/>
+          </w:tcPr>
+          <w:p>
+            <w:r>
+              <w:rPr>
+                <w:b/>
+                <w:sz w:val="17"/>
+              </w:rPr>
+              <w:t>profesional_id</w:t>
+            </w:r>
+          </w:p>
+        </w:tc>
+        <w:tc>
+          <w:tcPr>
+            <w:tcW w:w="1600" w:type="dxa"/>
+          </w:tcPr>
+          <w:p>
+            <w:r>
+              <w:rPr>
+                <w:sz w:val="17"/>
+              </w:rPr>
+              <w:t>INT</w:t>
+            </w:r>
+          </w:p>
+        </w:tc>
+        <w:tc>
+          <w:tcPr>
+            <w:tcW w:w="2500" w:type="dxa"/>
+          </w:tcPr>
+          <w:p>
+            <w:r>
+              <w:rPr>
+                <w:sz w:val="17"/>
+              </w:rPr>
+              <w:t>FK → profesionales.id, NOT NULL</w:t>
+            </w:r>
+          </w:p>
+        </w:tc>
+        <w:tc>
+          <w:tcPr>
+            <w:tcW w:w="3000" w:type="dxa"/>
+          </w:tcPr>
+          <w:p>
+            <w:r>
+              <w:rPr>
+                <w:sz w:val="17"/>
+              </w:rPr>
+              <w:t>Profesional guardado. UNIQUE (usuario_id, profesional_id).</w:t>
+            </w:r>
+          </w:p>
+        </w:tc>
+      </w:tr>
+      <w:tr>
+        <w:tc>
+          <w:tcPr>
+            <w:tcW w:w="1900" w:type="dxa"/>
+          </w:tcPr>
+          <w:p>
+            <w:r>
+              <w:rPr>
+                <w:b/>
+                <w:sz w:val="17"/>
+              </w:rPr>
+              <w:t>fecha_creacion</w:t>
+            </w:r>
+          </w:p>
+        </w:tc>
+        <w:tc>
+          <w:tcPr>
+            <w:tcW w:w="1600" w:type="dxa"/>
+          </w:tcPr>
+          <w:p>
+            <w:r>
+              <w:rPr>
+                <w:sz w:val="17"/>
+              </w:rPr>
+              <w:t>DATETIME</w:t>
+            </w:r>
+          </w:p>
+        </w:tc>
+        <w:tc>
+          <w:tcPr>
+            <w:tcW w:w="2500" w:type="dxa"/>
+          </w:tcPr>
+          <w:p>
+            <w:r>
+              <w:rPr>
+                <w:sz w:val="17"/>
+              </w:rPr>
+              <w:t>NOT NULL, DEFAULT NOW()</w:t>
+            </w:r>
+          </w:p>
+        </w:tc>
+        <w:tc>
+          <w:tcPr>
+            <w:tcW w:w="3000" w:type="dxa"/>
+          </w:tcPr>
+          <w:p>
+            <w:r>
+              <w:rPr>
+                <w:sz w:val="17"/>
+              </w:rPr>
+              <w:t>Fecha en que se guardó.</w:t>
+            </w:r>
+          </w:p>
+        </w:tc>
+      </w:tr>
+    </w:tbl>
+    <w:p/>
+    <w:p>
+      <w:pPr>
+        <w:keepNext/>
+        <w:keepLines/>
+        <w:jc w:val="both"/>
+        <w:rPr>
+          <w:lang w:val="es-ES"/>
+        </w:rPr>
+      </w:pPr>
+      <w:r>
+        <w:rPr>
+          <w:b/>
+        </w:rPr>
+        <w:t>Tabla resenas: Calificaciones y comentarios de los usuarios sobre los profesionales (FS-HU-24). Calificar de nuevo reemplaza la reseña anterior del mismo usuario.</w:t>
+      </w:r>
+    </w:p>
+    <w:tbl>
+      <w:tblPr>
+        <w:tblW w:w="9000" w:type="dxa"/>
+        <w:tblBorders>
+          <w:top w:val="single" w:sz="4" w:space="0" w:color="000000"/>
+          <w:left w:val="single" w:sz="4" w:space="0" w:color="000000"/>
+          <w:bottom w:val="single" w:sz="4" w:space="0" w:color="000000"/>
+          <w:right w:val="single" w:sz="4" w:space="0" w:color="000000"/>
+          <w:insideH w:val="single" w:sz="4" w:space="0" w:color="000000"/>
+          <w:insideV w:val="single" w:sz="4" w:space="0" w:color="000000"/>
+        </w:tblBorders>
+        <w:tblLayout w:type="fixed"/>
+        <w:tblLook w:val="04A0" w:firstRow="1" w:lastRow="0" w:firstColumn="1" w:lastColumn="0" w:noHBand="0" w:noVBand="1"/>
+      </w:tblPr>
+      <w:tblGrid>
+        <w:gridCol w:w="1900"/>
+        <w:gridCol w:w="1600"/>
+        <w:gridCol w:w="2500"/>
+        <w:gridCol w:w="3000"/>
+      </w:tblGrid>
+      <w:tr>
+        <w:trPr>
+          <w:tblHeader/>
+        </w:trPr>
+        <w:tc>
+          <w:tcPr>
+            <w:tcW w:w="1900" w:type="dxa"/>
+            <w:shd w:val="clear" w:color="auto" w:fill="C6D9F1"/>
+          </w:tcPr>
+          <w:p>
+            <w:r>
+              <w:rPr>
+                <w:b/>
+                <w:sz w:val="17"/>
+              </w:rPr>
+              <w:t>Columna</w:t>
+            </w:r>
+          </w:p>
+        </w:tc>
+        <w:tc>
+          <w:tcPr>
+            <w:tcW w:w="1600" w:type="dxa"/>
+            <w:shd w:val="clear" w:color="auto" w:fill="C6D9F1"/>
+          </w:tcPr>
+          <w:p>
+            <w:r>
+              <w:rPr>
+                <w:b/>
+                <w:sz w:val="17"/>
+              </w:rPr>
+              <w:t>Tipo</w:t>
+            </w:r>
+          </w:p>
+        </w:tc>
+        <w:tc>
+          <w:tcPr>
+            <w:tcW w:w="2500" w:type="dxa"/>
+            <w:shd w:val="clear" w:color="auto" w:fill="C6D9F1"/>
+          </w:tcPr>
+          <w:p>
+            <w:r>
+              <w:rPr>
+                <w:b/>
+                <w:sz w:val="17"/>
+              </w:rPr>
+              <w:t>Restricciones</w:t>
+            </w:r>
+          </w:p>
+        </w:tc>
+        <w:tc>
+          <w:tcPr>
+            <w:tcW w:w="3000" w:type="dxa"/>
+            <w:shd w:val="clear" w:color="auto" w:fill="C6D9F1"/>
+          </w:tcPr>
+          <w:p>
+            <w:r>
+              <w:rPr>
+                <w:b/>
+                <w:sz w:val="17"/>
+              </w:rPr>
+              <w:t>Descripción</w:t>
+            </w:r>
+          </w:p>
+        </w:tc>
+      </w:tr>
+      <w:tr>
+        <w:tc>
+          <w:tcPr>
+            <w:tcW w:w="1900" w:type="dxa"/>
+          </w:tcPr>
+          <w:p>
+            <w:r>
+              <w:rPr>
+                <w:b/>
+                <w:sz w:val="17"/>
+              </w:rPr>
+              <w:t>id</w:t>
+            </w:r>
+          </w:p>
+        </w:tc>
+        <w:tc>
+          <w:tcPr>
+            <w:tcW w:w="1600" w:type="dxa"/>
+          </w:tcPr>
+          <w:p>
+            <w:r>
+              <w:rPr>
+                <w:sz w:val="17"/>
+              </w:rPr>
+              <w:t>INT</w:t>
+            </w:r>
+          </w:p>
+        </w:tc>
+        <w:tc>
+          <w:tcPr>
+            <w:tcW w:w="2500" w:type="dxa"/>
+          </w:tcPr>
+          <w:p>
+            <w:r>
+              <w:rPr>
+                <w:sz w:val="17"/>
+              </w:rPr>
+              <w:t>PK, AUTO_INCREMENT</w:t>
+            </w:r>
+          </w:p>
+        </w:tc>
+        <w:tc>
+          <w:tcPr>
+            <w:tcW w:w="3000" w:type="dxa"/>
+          </w:tcPr>
+          <w:p>
+            <w:r>
+              <w:rPr>
+                <w:sz w:val="17"/>
+              </w:rPr>
               <w:t>Identificador de la reseña.</w:t>
             </w:r>
           </w:p>
@@ -19640,7 +20138,7 @@
               <w:rPr>
                 <w:sz w:val="17"/>
               </w:rPr>
-              <w:t>FK usuario_id ON DELETE CASCADE</w:t>
+              <w:t>INDEX (usuario_id, fecha_actualizacion); FK usuario_id ON DELETE CASCADE</w:t>
             </w:r>
           </w:p>
         </w:tc>
@@ -19653,7 +20151,7 @@
               <w:rPr>
                 <w:sz w:val="17"/>
               </w:rPr>
-              <w:t>Eliminar el historial del asistente junto con la cuenta.</w:t>
+              <w:t>Listar el historial del asistente por fecha y eliminarlo junto con la cuenta (FS-HU-07).</w:t>
             </w:r>
           </w:p>
         </w:tc>
@@ -19681,7 +20179,7 @@
               <w:rPr>
                 <w:sz w:val="17"/>
               </w:rPr>
-              <w:t>INDEX (conversacion_id, fecha); FK ON DELETE CASCADE</w:t>
+              <w:t>INDEX (conversacion_id, fecha); FK ON DELETE CASCADE; CHECK remitente IN ('usuario', 'asistente')</w:t>
             </w:r>
           </w:p>
         </w:tc>
@@ -19695,6 +20193,47 @@
                 <w:sz w:val="17"/>
               </w:rPr>
               <w:t>Cargar un hilo completo en orden cronológico.</w:t>
+            </w:r>
+          </w:p>
+        </w:tc>
+      </w:tr>
+      <w:tr>
+        <w:tc>
+          <w:tcPr>
+            <w:tcW w:w="2100" w:type="dxa"/>
+          </w:tcPr>
+          <w:p>
+            <w:r>
+              <w:rPr>
+                <w:sz w:val="17"/>
+              </w:rPr>
+              <w:t>uso_asistente</w:t>
+            </w:r>
+          </w:p>
+        </w:tc>
+        <w:tc>
+          <w:tcPr>
+            <w:tcW w:w="3400" w:type="dxa"/>
+          </w:tcPr>
+          <w:p>
+            <w:r>
+              <w:rPr>
+                <w:sz w:val="17"/>
+              </w:rPr>
+              <w:t>PRIMARY KEY (usuario_id); FK ON DELETE CASCADE</w:t>
+            </w:r>
+          </w:p>
+        </w:tc>
+        <w:tc>
+          <w:tcPr>
+            <w:tcW w:w="3500" w:type="dxa"/>
+          </w:tcPr>
+          <w:p>
+            <w:r>
+              <w:rPr>
+                <w:sz w:val="17"/>
+              </w:rPr>
+              <w:t>Una fila por usuario con los mensajes del día: el límite diario no se recupera al borrar conversaciones.</w:t>
             </w:r>
           </w:p>
         </w:tc>
@@ -20486,7 +21025,7 @@
         </w:rPr>
         <w:drawing>
           <wp:inline distT="0" distB="0" distL="0" distR="0" wp14:anchorId="183C8A5F" wp14:editId="659525C4">
-            <wp:extent cx="5943600" cy="2258568"/>
+            <wp:extent cx="5943600" cy="2032603"/>
             <wp:effectExtent l="0" t="0" r="0" b="0"/>
             <wp:docPr id="5" name="Picture 5"/>
             <wp:cNvGraphicFramePr>
@@ -20508,7 +21047,7 @@
                   <pic:spPr>
                     <a:xfrm>
                       <a:off x="0" y="0"/>
-                      <a:ext cx="5943600" cy="2258568"/>
+                      <a:ext cx="5943600" cy="2032603"/>
                     </a:xfrm>
                     <a:prstGeom prst="rect">
                       <a:avLst/>
@@ -20532,7 +21071,7 @@
         </w:rPr>
       </w:pPr>
       <w:r>
-        <w:t>Ilustración 4: Relaciones de las doce tablas implementadas en la rama de Sprints 2 y 3 (DAS 1.20). Campos y claves foráneas en el diccionario y fuente 04_DER_Tablas_Implementadas.</w:t>
+        <w:t>Ilustración 4: Relaciones de las quince tablas implementadas (DAS 1.25; asistente IA de FS-HU-07). Campos y claves foráneas en el diccionario y fuente 04_DER_Tablas_Implementadas.</w:t>
       </w:r>
     </w:p>
     <w:p>
@@ -20543,7 +21082,7 @@
         </w:rPr>
       </w:pPr>
       <w:r>
-        <w:t>El modelo implementado incluye roles, usuarios, perfiles_usuario, tokens_recuperacion, informacion_salud, profesionales, establecimientos, favoritos, resenas, documentos_profesionales, disponibilidades y reservas. Las nuevas tablas están pendientes de fusionar. El modelo objetivo mantiene tres previstas; _prisma_migrations no es una tabla de dominio. Los binarios de verificación se guardan en un directorio privado y persistente.</w:t>
+        <w:t>El modelo implementado incluye roles, usuarios, perfiles_usuario, tokens_recuperacion, informacion_salud, profesionales, establecimientos, favoritos, resenas, documentos_profesionales, disponibilidades, reservas, conversaciones, mensajes y uso_asistente. Las nuevas tablas están pendientes de fusionar. El modelo objetivo mantiene tres previstas; _prisma_migrations no es una tabla de dominio. Los binarios de verificación se guardan en un directorio privado y persistente.</w:t>
       </w:r>
     </w:p>
     <w:p>
@@ -20554,7 +21093,7 @@
         </w:rPr>
       </w:pPr>
       <w:r>
-        <w:t>Implementación por sprint: el Sprint 1 crea las tablas roles, usuarios y perfiles_usuario (con los roles iniciales cargados por script) y, en una segunda migración, agrega la columna sexo a perfiles_usuario. El Sprint 2 agrega a usuarios las columnas google_id y rol_confirmado y deja password_hash como opcional, crea la tabla tokens_recuperacion, agrega a perfiles_usuario las columnas objetivo_principal, comidas_dia y horas_sueno, y crea las tablas informacion_salud, establecimientos y profesionales (FS-HU-03). El 03-10-2026 se agregan a profesionales las columnas comuna y modalidad y se crean las tablas favoritos y resenas (FS-HU-22 a FS-HU-24). Las tablas restantes se crean en el sprint de la épica que las utiliza (disponibilidades con FS-HU-13; reservas en el Sprint 3; conversaciones y mensajes en el Sprint 4; registro_comida en el Sprint 5). La migración aditiva 20261010203000_panel_administrativo agrega documentos_profesionales y los campos administrativos; conserva datos y verificaciones anteriores. La implementación autorizada no cambia por sí sola la planificación del Product Backlog.</w:t>
+        <w:t>Implementación por sprint: el Sprint 1 crea las tablas roles, usuarios y perfiles_usuario (con los roles iniciales cargados por script) y, en una segunda migración, agrega la columna sexo a perfiles_usuario. El Sprint 2 agrega a usuarios las columnas google_id y rol_confirmado y deja password_hash como opcional, crea la tabla tokens_recuperacion, agrega a perfiles_usuario las columnas objetivo_principal, comidas_dia y horas_sueno, y crea las tablas informacion_salud, establecimientos y profesionales (FS-HU-03). El 03-10-2026 se agregan a profesionales las columnas comuna y modalidad y se crean las tablas favoritos y resenas (FS-HU-22 a FS-HU-24). Las tablas restantes se crean en el sprint de la épica que las utiliza (disponibilidades con FS-HU-13; reservas en el Sprint 3; conversaciones y mensajes en el Sprint 4; registro_comida en el Sprint 5). La migración aditiva 20261010203000_panel_administrativo agrega documentos_profesionales y los campos administrativos; conserva datos y verificaciones anteriores. La implementación autorizada no cambia por sí sola la planificación del Product Backlog. El Sprint 4 agrega conversaciones, mensajes y uso_asistente para el asistente IA (FS-HU-07, migración 20261021120000_asistente_ia).</w:t>
       </w:r>
     </w:p>
     <w:p>
@@ -20585,7 +21124,7 @@
         </w:rPr>
       </w:pPr>
       <w:r>
-        <w:t>La vista de procesos describe cómo colaboran los componentes en tiempo de ejecución. El flujo de mayor complejidad es el registro de una comida escrita en lenguaje natural, que involucra al frontend, el backend, la API de Claude y la base de datos:</w:t>
+        <w:t>La vista de procesos describe cómo colaboran los componentes en tiempo de ejecución. El flujo de mayor complejidad es el registro de una comida escrita en lenguaje natural, que involucra al frontend, el backend, el proveedor de IA (D33) y la base de datos:</w:t>
       </w:r>
     </w:p>
     <w:p>
@@ -20645,7 +21184,7 @@
         </w:rPr>
       </w:pPr>
       <w:r>
-        <w:t>Ilustración 5: Diagrama de secuencia del registro de comida por lenguaje natural (diseño previsto, pendiente de implementación)</w:t>
+        <w:t>Ilustración 5: Diagrama de secuencia del registro de comida por lenguaje natural (diseño previsto, pendiente de implementación; desde D33 el proveedor de IA es configurable, Groq por defecto)</w:t>
       </w:r>
     </w:p>
     <w:p>
@@ -20656,7 +21195,7 @@
         </w:rPr>
       </w:pPr>
       <w:r>
-        <w:t>El backend envía el mensaje del usuario a la API de Claude junto con la definición de funciones permitidas. Cuando el modelo solicita ejecutar guardar_comida con los alimentos y cantidades interpretados, el backend valida los datos, inserta los registros en registro_comida y devuelve al frontend la confirmación con la estimación nutricional. La IA nunca accede directamente a la base de datos.</w:t>
+        <w:t>El backend envía el mensaje del usuario al proveedor de IA (D33) junto con la definición de funciones permitidas. Cuando el modelo solicita ejecutar guardar_comida con los alimentos y cantidades interpretados, el backend valida los datos, inserta los registros en registro_comida y devuelve al frontend la confirmación con la estimación nutricional. La IA nunca accede directamente a la base de datos.</w:t>
       </w:r>
     </w:p>
     <w:p>
@@ -23232,6 +23771,470 @@
         </w:tc>
       </w:tr>
     </w:tbl>
+    <w:p>
+      <w:pPr>
+        <w:pStyle w:val="EstiloTtulo2VerdanaJustificado"/>
+        <w:numPr>
+          <w:ilvl w:val="1"/>
+          <w:numId w:val="0"/>
+        </w:numPr>
+      </w:pPr>
+      <w:bookmarkStart w:id="35" w:name="_Toc242714920"/>
+      <w:r>
+        <w:t>Flujo del asistente IA (Sprint 4)</w:t>
+      </w:r>
+      <w:bookmarkEnd w:id="35"/>
+    </w:p>
+    <w:p>
+      <w:pPr>
+        <w:jc w:val="both"/>
+        <w:rPr>
+          <w:lang w:val="es-ES"/>
+        </w:rPr>
+      </w:pPr>
+      <w:r>
+        <w:t>Implementa FS-HU-07 y D33. Todas las rutas exigen sesión de usuario (Bearer JWT) y se exponen bajo el prefijo /api. Estado al 21-10-2026: los nueve pasos están implementados y probados en modo simulado contra MySQL (CP-103 a CP-108); con IA_API_KEY el mismo flujo usa Groq (CP-109, pendiente de la clave). La secuencia completa está en la fuente 14_Asistente_IA de Diagramas (Miro).</w:t>
+      </w:r>
+    </w:p>
+    <w:tbl>
+      <w:tblPr>
+        <w:tblW w:w="9000" w:type="dxa"/>
+        <w:tblBorders>
+          <w:top w:val="single" w:sz="4" w:space="0" w:color="000000"/>
+          <w:left w:val="single" w:sz="4" w:space="0" w:color="000000"/>
+          <w:bottom w:val="single" w:sz="4" w:space="0" w:color="000000"/>
+          <w:right w:val="single" w:sz="4" w:space="0" w:color="000000"/>
+          <w:insideH w:val="single" w:sz="4" w:space="0" w:color="000000"/>
+          <w:insideV w:val="single" w:sz="4" w:space="0" w:color="000000"/>
+        </w:tblBorders>
+        <w:tblLayout w:type="fixed"/>
+        <w:tblLook w:val="04A0" w:firstRow="1" w:lastRow="0" w:firstColumn="1" w:lastColumn="0" w:noHBand="0" w:noVBand="1"/>
+      </w:tblPr>
+      <w:tblGrid>
+        <w:gridCol w:w="700"/>
+        <w:gridCol w:w="2100"/>
+        <w:gridCol w:w="6200"/>
+      </w:tblGrid>
+      <w:tr>
+        <w:trPr>
+          <w:tblHeader/>
+        </w:trPr>
+        <w:tc>
+          <w:tcPr>
+            <w:tcW w:w="700" w:type="dxa"/>
+            <w:shd w:val="clear" w:color="auto" w:fill="C6D9F1"/>
+          </w:tcPr>
+          <w:p>
+            <w:r>
+              <w:rPr>
+                <w:b/>
+                <w:sz w:val="17"/>
+              </w:rPr>
+              <w:t>Paso</w:t>
+            </w:r>
+          </w:p>
+        </w:tc>
+        <w:tc>
+          <w:tcPr>
+            <w:tcW w:w="2100" w:type="dxa"/>
+            <w:shd w:val="clear" w:color="auto" w:fill="C6D9F1"/>
+          </w:tcPr>
+          <w:p>
+            <w:r>
+              <w:rPr>
+                <w:b/>
+                <w:sz w:val="17"/>
+              </w:rPr>
+              <w:t>Origen → Destino</w:t>
+            </w:r>
+          </w:p>
+        </w:tc>
+        <w:tc>
+          <w:tcPr>
+            <w:tcW w:w="6200" w:type="dxa"/>
+            <w:shd w:val="clear" w:color="auto" w:fill="C6D9F1"/>
+          </w:tcPr>
+          <w:p>
+            <w:r>
+              <w:rPr>
+                <w:b/>
+                <w:sz w:val="17"/>
+              </w:rPr>
+              <w:t>Interacción</w:t>
+            </w:r>
+          </w:p>
+        </w:tc>
+      </w:tr>
+      <w:tr>
+        <w:tc>
+          <w:tcPr>
+            <w:tcW w:w="700" w:type="dxa"/>
+          </w:tcPr>
+          <w:p>
+            <w:r>
+              <w:rPr>
+                <w:sz w:val="17"/>
+              </w:rPr>
+              <w:t>1</w:t>
+            </w:r>
+          </w:p>
+        </w:tc>
+        <w:tc>
+          <w:tcPr>
+            <w:tcW w:w="2100" w:type="dxa"/>
+          </w:tcPr>
+          <w:p>
+            <w:r>
+              <w:rPr>
+                <w:sz w:val="17"/>
+              </w:rPr>
+              <w:t>Usuario → Frontend</w:t>
+            </w:r>
+          </w:p>
+        </w:tc>
+        <w:tc>
+          <w:tcPr>
+            <w:tcW w:w="6200" w:type="dxa"/>
+          </w:tcPr>
+          <w:p>
+            <w:r>
+              <w:rPr>
+                <w:sz w:val="17"/>
+              </w:rPr>
+              <w:t>Abre /asistente: bienvenida con su nombre, sugerencias, categorías e historial (fijadas y recientes).</w:t>
+            </w:r>
+          </w:p>
+        </w:tc>
+      </w:tr>
+      <w:tr>
+        <w:tc>
+          <w:tcPr>
+            <w:tcW w:w="700" w:type="dxa"/>
+          </w:tcPr>
+          <w:p>
+            <w:r>
+              <w:rPr>
+                <w:sz w:val="17"/>
+              </w:rPr>
+              <w:t>2</w:t>
+            </w:r>
+          </w:p>
+        </w:tc>
+        <w:tc>
+          <w:tcPr>
+            <w:tcW w:w="2100" w:type="dxa"/>
+          </w:tcPr>
+          <w:p>
+            <w:r>
+              <w:rPr>
+                <w:sz w:val="17"/>
+              </w:rPr>
+              <w:t>Frontend → Backend</w:t>
+            </w:r>
+          </w:p>
+        </w:tc>
+        <w:tc>
+          <w:tcPr>
+            <w:tcW w:w="6200" w:type="dxa"/>
+          </w:tcPr>
+          <w:p>
+            <w:r>
+              <w:rPr>
+                <w:sz w:val="17"/>
+              </w:rPr>
+              <w:t>GET /api/asistente/estado y GET /api/asistente/conversaciones. Un profesional recibe 403.</w:t>
+            </w:r>
+          </w:p>
+        </w:tc>
+      </w:tr>
+      <w:tr>
+        <w:tc>
+          <w:tcPr>
+            <w:tcW w:w="700" w:type="dxa"/>
+          </w:tcPr>
+          <w:p>
+            <w:r>
+              <w:rPr>
+                <w:sz w:val="17"/>
+              </w:rPr>
+              <w:t>3</w:t>
+            </w:r>
+          </w:p>
+        </w:tc>
+        <w:tc>
+          <w:tcPr>
+            <w:tcW w:w="2100" w:type="dxa"/>
+          </w:tcPr>
+          <w:p>
+            <w:r>
+              <w:rPr>
+                <w:sz w:val="17"/>
+              </w:rPr>
+              <w:t>Usuario → Frontend</w:t>
+            </w:r>
+          </w:p>
+        </w:tc>
+        <w:tc>
+          <w:tcPr>
+            <w:tcW w:w="6200" w:type="dxa"/>
+          </w:tcPr>
+          <w:p>
+            <w:r>
+              <w:rPr>
+                <w:sz w:val="17"/>
+              </w:rPr>
+              <w:t>Escribe un mensaje o elige una sugerencia; Enter envía y Shift+Enter hace un salto de línea.</w:t>
+            </w:r>
+          </w:p>
+        </w:tc>
+      </w:tr>
+      <w:tr>
+        <w:tc>
+          <w:tcPr>
+            <w:tcW w:w="700" w:type="dxa"/>
+          </w:tcPr>
+          <w:p>
+            <w:r>
+              <w:rPr>
+                <w:sz w:val="17"/>
+              </w:rPr>
+              <w:t>4</w:t>
+            </w:r>
+          </w:p>
+        </w:tc>
+        <w:tc>
+          <w:tcPr>
+            <w:tcW w:w="2100" w:type="dxa"/>
+          </w:tcPr>
+          <w:p>
+            <w:r>
+              <w:rPr>
+                <w:sz w:val="17"/>
+              </w:rPr>
+              <w:t>Frontend → Backend</w:t>
+            </w:r>
+          </w:p>
+        </w:tc>
+        <w:tc>
+          <w:tcPr>
+            <w:tcW w:w="6200" w:type="dxa"/>
+          </w:tcPr>
+          <w:p>
+            <w:r>
+              <w:rPr>
+                <w:sz w:val="17"/>
+              </w:rPr>
+              <w:t>POST /api/asistente/conversaciones (primer mensaje) o POST /api/asistente/conversaciones/:id/mensajes.</w:t>
+            </w:r>
+          </w:p>
+        </w:tc>
+      </w:tr>
+      <w:tr>
+        <w:tc>
+          <w:tcPr>
+            <w:tcW w:w="700" w:type="dxa"/>
+          </w:tcPr>
+          <w:p>
+            <w:r>
+              <w:rPr>
+                <w:sz w:val="17"/>
+              </w:rPr>
+              <w:t>5</w:t>
+            </w:r>
+          </w:p>
+        </w:tc>
+        <w:tc>
+          <w:tcPr>
+            <w:tcW w:w="2100" w:type="dxa"/>
+          </w:tcPr>
+          <w:p>
+            <w:r>
+              <w:rPr>
+                <w:sz w:val="17"/>
+              </w:rPr>
+              <w:t>Backend → MySQL</w:t>
+            </w:r>
+          </w:p>
+        </w:tc>
+        <w:tc>
+          <w:tcPr>
+            <w:tcW w:w="6200" w:type="dxa"/>
+          </w:tcPr>
+          <w:p>
+            <w:r>
+              <w:rPr>
+                <w:sz w:val="17"/>
+              </w:rPr>
+              <w:t>Comprueba que la conversación sea propia y el uso del día (uso_asistente); sin cupo responde 429.</w:t>
+            </w:r>
+          </w:p>
+        </w:tc>
+      </w:tr>
+      <w:tr>
+        <w:tc>
+          <w:tcPr>
+            <w:tcW w:w="700" w:type="dxa"/>
+          </w:tcPr>
+          <w:p>
+            <w:r>
+              <w:rPr>
+                <w:sz w:val="17"/>
+              </w:rPr>
+              <w:t>6</w:t>
+            </w:r>
+          </w:p>
+        </w:tc>
+        <w:tc>
+          <w:tcPr>
+            <w:tcW w:w="2100" w:type="dxa"/>
+          </w:tcPr>
+          <w:p>
+            <w:r>
+              <w:rPr>
+                <w:sz w:val="17"/>
+              </w:rPr>
+              <w:t>Backend → Groq</w:t>
+            </w:r>
+          </w:p>
+        </w:tc>
+        <w:tc>
+          <w:tcPr>
+            <w:tcW w:w="6200" w:type="dxa"/>
+          </w:tcPr>
+          <w:p>
+            <w:r>
+              <w:rPr>
+                <w:sz w:val="17"/>
+              </w:rPr>
+              <w:t>chat/completions con las instrucciones y los últimos 10 mensajes, sin perfil ni datos de salud. Si falla o tarda más de 20 s, responde 503 y no guarda nada.</w:t>
+            </w:r>
+          </w:p>
+        </w:tc>
+      </w:tr>
+      <w:tr>
+        <w:tc>
+          <w:tcPr>
+            <w:tcW w:w="700" w:type="dxa"/>
+          </w:tcPr>
+          <w:p>
+            <w:r>
+              <w:rPr>
+                <w:sz w:val="17"/>
+              </w:rPr>
+              <w:t>7</w:t>
+            </w:r>
+          </w:p>
+        </w:tc>
+        <w:tc>
+          <w:tcPr>
+            <w:tcW w:w="2100" w:type="dxa"/>
+          </w:tcPr>
+          <w:p>
+            <w:r>
+              <w:rPr>
+                <w:sz w:val="17"/>
+              </w:rPr>
+              <w:t>Backend → MySQL</w:t>
+            </w:r>
+          </w:p>
+        </w:tc>
+        <w:tc>
+          <w:tcPr>
+            <w:tcW w:w="6200" w:type="dxa"/>
+          </w:tcPr>
+          <w:p>
+            <w:r>
+              <w:rPr>
+                <w:sz w:val="17"/>
+              </w:rPr>
+              <w:t>Guarda el mensaje y la respuesta (con SAMU 131 o *4141 si hay señales de riesgo) y suma 1 al uso del día.</w:t>
+            </w:r>
+          </w:p>
+        </w:tc>
+      </w:tr>
+      <w:tr>
+        <w:tc>
+          <w:tcPr>
+            <w:tcW w:w="700" w:type="dxa"/>
+          </w:tcPr>
+          <w:p>
+            <w:r>
+              <w:rPr>
+                <w:sz w:val="17"/>
+              </w:rPr>
+              <w:t>8</w:t>
+            </w:r>
+          </w:p>
+        </w:tc>
+        <w:tc>
+          <w:tcPr>
+            <w:tcW w:w="2100" w:type="dxa"/>
+          </w:tcPr>
+          <w:p>
+            <w:r>
+              <w:rPr>
+                <w:sz w:val="17"/>
+              </w:rPr>
+              <w:t>Backend → Frontend</w:t>
+            </w:r>
+          </w:p>
+        </w:tc>
+        <w:tc>
+          <w:tcPr>
+            <w:tcW w:w="6200" w:type="dxa"/>
+          </w:tcPr>
+          <w:p>
+            <w:r>
+              <w:rPr>
+                <w:sz w:val="17"/>
+              </w:rPr>
+              <w:t>201 con los mensajes y los restantes del día; la respuesta se muestra como texto, sin interpretar HTML.</w:t>
+            </w:r>
+          </w:p>
+        </w:tc>
+      </w:tr>
+      <w:tr>
+        <w:tc>
+          <w:tcPr>
+            <w:tcW w:w="700" w:type="dxa"/>
+          </w:tcPr>
+          <w:p>
+            <w:r>
+              <w:rPr>
+                <w:sz w:val="17"/>
+              </w:rPr>
+              <w:t>9</w:t>
+            </w:r>
+          </w:p>
+        </w:tc>
+        <w:tc>
+          <w:tcPr>
+            <w:tcW w:w="2100" w:type="dxa"/>
+          </w:tcPr>
+          <w:p>
+            <w:r>
+              <w:rPr>
+                <w:sz w:val="17"/>
+              </w:rPr>
+              <w:t>Usuario → Backend</w:t>
+            </w:r>
+          </w:p>
+        </w:tc>
+        <w:tc>
+          <w:tcPr>
+            <w:tcW w:w="6200" w:type="dxa"/>
+          </w:tcPr>
+          <w:p>
+            <w:r>
+              <w:rPr>
+                <w:sz w:val="17"/>
+              </w:rPr>
+              <w:t>Fija (PATCH, máximo 5) o borra (DELETE, con confirmación) sus conversaciones; borrar no devuelve el cupo.</w:t>
+            </w:r>
+          </w:p>
+        </w:tc>
+      </w:tr>
+    </w:tbl>
     <w:p/>
     <w:p>
       <w:pPr>
@@ -23270,7 +24273,7 @@
     </w:p>
     <w:p>
       <w:r>
-        <w:t>Los PR #19 y #20 están fusionados. El PR #20 aprobó 217 pruebas backend y 166 frontend y controla diez cargas por tipo y trámite, vigencia por IDs y Sin solicitud. La observación de reinicios reiterados de cuota por cambio de especialidad sigue pendiente. La versión 1.21 agregó disponibilidad, reservas y mapa/lista (PR #21) y la 1.22 sus ajustes y el límite de una reserva activa por usuario con cada profesional, sin contar las citas pasadas (PR #22); ambos PR se fusionaron el 12-10-2026: 233 pruebas backend, 183 frontend y 55 comprobaciones con MySQL real aprobadas. La versión 1.23 registra la SC-18: desde el 15-10-2026 el mapa usa MapLibre GL JS con teselas de OpenFreeMap (PR #27, D31); 233 pruebas backend y 189 frontend. La versión 1.24 registra la SC-24 (19-10-2026): dirección de atención propia del profesional y coordenadas de la ficha limitadas a Chile (D32); 241 pruebas backend y 231 frontend. FS-HU-12, FS-HU-13 y FS-HU-14 se aceptaron el 12-10-2026; FS-HU-06 sigue pendiente de CP-078.</w:t>
+        <w:t>Los PR #19 y #20 están fusionados. El PR #20 aprobó 217 pruebas backend y 166 frontend y controla diez cargas por tipo y trámite, vigencia por IDs y Sin solicitud. La observación de reinicios reiterados de cuota por cambio de especialidad sigue pendiente. La versión 1.21 agregó disponibilidad, reservas y mapa/lista (PR #21) y la 1.22 sus ajustes y el límite de una reserva activa por usuario con cada profesional, sin contar las citas pasadas (PR #22); ambos PR se fusionaron el 12-10-2026: 233 pruebas backend, 183 frontend y 55 comprobaciones con MySQL real aprobadas. La versión 1.23 registra la SC-18: desde el 15-10-2026 el mapa usa MapLibre GL JS con teselas de OpenFreeMap (PR #27, D31); 233 pruebas backend y 189 frontend. La versión 1.24 registra la SC-24 (19-10-2026): dirección de atención propia del profesional y coordenadas de la ficha limitadas a Chile (D32); 241 pruebas backend y 231 frontend. La versión 1.25 registra FS-HU-07 (21-10-2026): asistente IA con Groq y modo simulado (D33); 267 pruebas backend y 245 frontend. FS-HU-12, FS-HU-13 y FS-HU-14 se aceptaron el 12-10-2026; FS-HU-06 sigue pendiente de CP-078.</w:t>
       </w:r>
     </w:p>
     <w:p>
@@ -23316,7 +24319,7 @@
         <w:lastRenderedPageBreak/>
         <w:drawing>
           <wp:inline distT="0" distB="0" distL="0" distR="0" wp14:anchorId="6152AB04" wp14:editId="3B7798A9">
-            <wp:extent cx="5760000" cy="2705400"/>
+            <wp:extent cx="5760000" cy="2310122"/>
             <wp:effectExtent l="0" t="0" r="0" b="0"/>
             <wp:docPr id="7" name="Picture 7"/>
             <wp:cNvGraphicFramePr>
@@ -23338,7 +24341,7 @@
                   <pic:spPr>
                     <a:xfrm>
                       <a:off x="0" y="0"/>
-                      <a:ext cx="5760000" cy="2705400"/>
+                      <a:ext cx="5760000" cy="2310122"/>
                     </a:xfrm>
                     <a:prstGeom prst="rect">
                       <a:avLst/>
@@ -23362,7 +24365,7 @@
         </w:rPr>
       </w:pPr>
       <w:r>
-        <w:t>Ilustración 9: Dependencias de frontend/backend, agenda, reservas, panel administrativo y Prisma compartido (DAS 1.20; base aprobada PR #21; corrección incorporada en 1.22; mapa con MapLibre y OpenFreeMap en 1.23, SC-18).</w:t>
+        <w:t>Ilustración 9: Dependencias de frontend/backend, agenda, reservas, panel administrativo y Prisma compartido (DAS 1.20; base aprobada PR #21; corrección incorporada en 1.22; mapa con MapLibre y OpenFreeMap en 1.23, SC-18; asistente IA con Groq en 1.25, D33).</w:t>
       </w:r>
     </w:p>
     <w:tbl>
@@ -23807,7 +24810,7 @@
               <w:rPr>
                 <w:sz w:val="17"/>
               </w:rPr>
-              <w:t>Autenticación, perfil, nutrición, directorio, ficha, documentos privados, favoritos, reseñas, agenda y reservas. Open-Meteo está integrado; Claude permanece previsto. El mapa (MapLibre GL JS y OpenFreeMap) se integra desde el frontend, sin clave (D31).</w:t>
+              <w:t>Autenticación, perfil, nutrición, directorio, ficha, documentos privados, favoritos, reseñas, agenda, reservas y asistente IA. Open-Meteo y el proveedor de IA (Groq, compatible con OpenAI, en proveedorIa.service; D33) están integrados. El mapa (MapLibre GL JS y OpenFreeMap) se integra desde el frontend, sin clave (D31).</w:t>
             </w:r>
           </w:p>
         </w:tc>
@@ -23941,7 +24944,7 @@
               <w:rPr>
                 <w:sz w:val="17"/>
               </w:rPr>
-              <w:t>Reglas y catálogos comunes a frontend y backend (reglas.json): roles, límites de campos, niveles de actividad física, especialidades y modalidades de los profesionales, largo de la dirección y recuadro de Chile para las coordenadas de la ficha y el mapa (SC-24), distancias, órdenes del buscador y límites de las reseñas.</w:t>
+              <w:t>Reglas y catálogos comunes a frontend y backend (reglas.json): roles, límites de campos, niveles de actividad física, especialidades y modalidades de los profesionales, largo de la dirección y recuadro de Chile para las coordenadas de la ficha y el mapa (SC-24), distancias, órdenes del buscador límites de las reseñas y del asistente IA (largo del mensaje, mensajes por día, mensajes enviados al proveedor y conversaciones fijadas).</w:t>
             </w:r>
           </w:p>
         </w:tc>
@@ -23985,7 +24988,7 @@
         </w:rPr>
       </w:pPr>
       <w:r>
-        <w:t>El estado local usa React/Vite, Express y MySQL, Google Identity y Open-Meteo. El mapa usa MapLibre GL JS con teselas de OpenFreeMap, sin clave (D31); SMTP requiere credenciales. Disponibilidad y reservas utilizan MySQL y Prisma compartido. VERIFICATION_STORAGE_DIR debe apuntar a un directorio persistente y restringido, respaldado junto con MySQL. Docker/Nginx con HTTPS pertenece a FS-HU-11 y sigue pendiente; Claude también sigue previsto. Esta rama representa doce tablas implementadas de quince.</w:t>
+        <w:t>El estado local usa React/Vite, Express y MySQL, Google Identity y Open-Meteo. El mapa usa MapLibre GL JS con teselas de OpenFreeMap, sin clave (D31); SMTP requiere credenciales. Disponibilidad y reservas utilizan MySQL y Prisma compartido. VERIFICATION_STORAGE_DIR debe apuntar a un directorio persistente y restringido, respaldado junto con MySQL. Docker/Nginx con HTTPS pertenece a FS-HU-11 y sigue pendiente; el asistente IA usa Groq por HTTPS (D33). Esta rama representa quince tablas implementadas de dieciséis.</w:t>
       </w:r>
     </w:p>
     <w:p>
@@ -23998,7 +25001,7 @@
         </w:rPr>
         <w:drawing>
           <wp:inline distT="0" distB="0" distL="0" distR="0" wp14:anchorId="76286DEC" wp14:editId="080DF178">
-            <wp:extent cx="5760000" cy="1782000"/>
+            <wp:extent cx="5760000" cy="2558600"/>
             <wp:effectExtent l="0" t="0" r="0" b="0"/>
             <wp:docPr id="8" name="Picture 8"/>
             <wp:cNvGraphicFramePr>
@@ -24020,7 +25023,7 @@
                   <pic:spPr>
                     <a:xfrm>
                       <a:off x="0" y="0"/>
-                      <a:ext cx="5760000" cy="1782000"/>
+                      <a:ext cx="5760000" cy="2558600"/>
                     </a:xfrm>
                     <a:prstGeom prst="rect">
                       <a:avLst/>
@@ -24044,7 +25047,7 @@
         </w:rPr>
       </w:pPr>
       <w:r>
-        <w:t>Ilustración 10: Estado local con doce tablas, mapa con MapLibre y OpenFreeMap sin clave y despliegue objetivo Docker/Nginx (DAS 1.23; SC-18).</w:t>
+        <w:t>Ilustración 10: Estado local con quince tablas, asistente IA con Groq (D33), mapa con MapLibre y OpenFreeMap sin clave y despliegue objetivo Docker/Nginx (DAS 1.25).</w:t>
       </w:r>
     </w:p>
     <w:p>
@@ -24507,7 +25510,7 @@
                 <w:b/>
                 <w:sz w:val="17"/>
               </w:rPr>
-              <w:t>API de Claude</w:t>
+              <w:t>Groq (proveedor de IA)</w:t>
             </w:r>
           </w:p>
         </w:tc>
@@ -24520,7 +25523,7 @@
               <w:rPr>
                 <w:sz w:val="17"/>
               </w:rPr>
-              <w:t>Servicio externo (Anthropic)</w:t>
+              <w:t>Servicio externo, API compatible con OpenAI (plan gratuito)</w:t>
             </w:r>
           </w:p>
         </w:tc>
@@ -24533,7 +25536,7 @@
               <w:rPr>
                 <w:sz w:val="17"/>
               </w:rPr>
-              <w:t>Asistente de IA con function calling.</w:t>
+              <w:t>Respuestas del asistente IA (FS-HU-07, D33); configurable con IA_URL_BASE, IA_MODELO e IA_API_KEY.</w:t>
             </w:r>
           </w:p>
         </w:tc>
@@ -25053,7 +26056,7 @@
               <w:rPr>
                 <w:sz w:val="17"/>
               </w:rPr>
-              <w:t>API de Claude</w:t>
+              <w:t>Groq (proveedor de IA)</w:t>
             </w:r>
           </w:p>
         </w:tc>
@@ -25079,7 +26082,7 @@
               <w:rPr>
                 <w:sz w:val="17"/>
               </w:rPr>
-              <w:t>JSON; la clave de API vive solo en variables de entorno del backend.</w:t>
+              <w:t>JSON compatible con OpenAI (chat/completions); la clave vive solo en variables de entorno del backend. Viajan las instrucciones y los últimos 10 mensajes, sin perfil ni datos de salud; espera máxima de 20 segundos.</w:t>
             </w:r>
           </w:p>
         </w:tc>
@@ -25922,7 +26925,7 @@
               <w:rPr>
                 <w:sz w:val="17"/>
               </w:rPr>
-              <w:t>conversaciones, mensajes</w:t>
+              <w:t>conversaciones, mensajes, uso_asistente</w:t>
             </w:r>
           </w:p>
         </w:tc>
@@ -25948,7 +26951,7 @@
               <w:rPr>
                 <w:sz w:val="17"/>
               </w:rPr>
-              <w:t>Todos + API de Claude</w:t>
+              <w:t>Navegador, Frontend, Backend, MySQL + Groq (D33)</w:t>
             </w:r>
           </w:p>
         </w:tc>
@@ -25961,7 +26964,7 @@
               <w:rPr>
                 <w:sz w:val="17"/>
               </w:rPr>
-              <w:t>4</w:t>
+              <w:t>4 (implementado el 21-10-2026)</w:t>
             </w:r>
           </w:p>
         </w:tc>
@@ -26016,7 +27019,7 @@
               <w:rPr>
                 <w:sz w:val="17"/>
               </w:rPr>
-              <w:t>Todos + API de Claude</w:t>
+              <w:t>Todos + proveedor de IA (D33)</w:t>
             </w:r>
           </w:p>
         </w:tc>
@@ -26707,7 +27710,7 @@
               <w:rPr>
                 <w:sz w:val="17"/>
               </w:rPr>
-              <w:t>Asistente con la API de Claude y function calling</w:t>
+              <w:t>Reemplazada por D33 desde el 21-10-2026. Asistente con la API de Claude y function calling</w:t>
             </w:r>
           </w:p>
         </w:tc>
@@ -28111,6 +29114,51 @@
           <w:p>
             <w:r>
               <w:t>Antes la dirección escrita solo existía en 4 de las 12 fichas de demostración, a través de su establecimiento, y la ventana del mapa solo podía mostrar la comuna (SC-22). Una columna propia y nula es una migración aditiva que no afecta las fichas existentes. Sin geocodificación (D31), la dirección es un texto declarado y las coordenadas siguen ubicando el marcador. Un solo recuadro para validar y para el mapa evita que una ficha con coordenadas erróneas (-90, -90) aleje el mapa (defecto 35). Rapa Nui (longitud cercana a -109) queda fuera porque incluirla obligaría a mostrar casi todo el Pacífico; se reevaluará si se suman profesionales de la isla.</w:t>
+            </w:r>
+          </w:p>
+        </w:tc>
+      </w:tr>
+      <w:tr>
+        <w:trPr>
+          <w:cantSplit/>
+        </w:trPr>
+        <w:tc>
+          <w:tcPr>
+            <w:tcW w:w="600" w:type="dxa"/>
+          </w:tcPr>
+          <w:p>
+            <w:r>
+              <w:t>D33</w:t>
+            </w:r>
+          </w:p>
+        </w:tc>
+        <w:tc>
+          <w:tcPr>
+            <w:tcW w:w="2400" w:type="dxa"/>
+          </w:tcPr>
+          <w:p>
+            <w:r>
+              <w:t>Asistente IA (FS-HU-07) con un cliente genérico para cualquier proveedor compatible con la API de OpenAI, configurable por variables de entorno (IA_URL_BASE, IA_MODELO, IA_API_KEY y IA_MENSAJES_POR_DIA); Groq por defecto, en su plan gratuito. Sin clave responde en modo simulado. Reemplaza a D7.</w:t>
+            </w:r>
+          </w:p>
+        </w:tc>
+        <w:tc>
+          <w:tcPr>
+            <w:tcW w:w="2400" w:type="dxa"/>
+          </w:tcPr>
+          <w:p>
+            <w:r>
+              <w:t>API de Claude con su SDK (D7; de pago, aunque de bajo costo); Gemini en su plan gratuito; un modelo local con Ollama; usar el SDK de un proveedor específico.</w:t>
+            </w:r>
+          </w:p>
+        </w:tc>
+        <w:tc>
+          <w:tcPr>
+            <w:tcW w:w="3600" w:type="dxa"/>
+          </w:tcPr>
+          <w:p>
+            <w:r>
+              <w:t>El Product Owner pidió una opción gratuita para un asistente de orientación simple. El plan gratuito de Groq no pide tarjeta y su política indica que no entrena con los datos de sus clientes, algo importante en una aplicación de salud; el plan gratuito de Gemini, en cambio, usa los datos para mejorar sus productos, y un modelo local exige hardware y complica el despliegue. Con el formato compatible con OpenAI se cambia de proveedor editando el .env, sin tocar código. Al proveedor solo viajan las instrucciones y los últimos 10 mensajes de la conversación, nunca el perfil ni la información de salud (QS7). Un límite diario por usuario (uso_asistente) protege la cuota gratuita y no se recupera al borrar conversaciones. Las funciones acotadas de FS-HU-09 (registro de comida) se definirán sobre el mismo cliente.</w:t>
             </w:r>
           </w:p>
         </w:tc>
@@ -28525,7 +29573,7 @@
                 <w:b/>
                 <w:sz w:val="17"/>
               </w:rPr>
-              <w:t>SDK de Anthropic</w:t>
+              <w:t>fetch de Node.js y API compatible con OpenAI</w:t>
             </w:r>
           </w:p>
         </w:tc>
@@ -28538,7 +29586,7 @@
               <w:rPr>
                 <w:sz w:val="17"/>
               </w:rPr>
-              <w:t>Reutilizado (biblioteca) — previsto</w:t>
+              <w:t>Reutilizado (plataforma y servicio externo)</w:t>
             </w:r>
           </w:p>
         </w:tc>
@@ -28551,7 +29599,7 @@
               <w:rPr>
                 <w:sz w:val="17"/>
               </w:rPr>
-              <w:t>Cliente de la API de Claude.</w:t>
+              <w:t>Cliente del proveedor de IA sin SDK (D33): Groq por defecto; cambiar de proveedor es editar el .env.</w:t>
             </w:r>
           </w:p>
         </w:tc>
@@ -28903,7 +29951,7 @@
                 <w:b/>
                 <w:sz w:val="17"/>
               </w:rPr>
-              <w:t>Orquestador del asistente de IA</w:t>
+              <w:t>Asistente de IA</w:t>
             </w:r>
           </w:p>
         </w:tc>
@@ -28916,7 +29964,7 @@
               <w:rPr>
                 <w:sz w:val="17"/>
               </w:rPr>
-              <w:t>Desarrollo previsto</w:t>
+              <w:t>Desarrollado (FS-HU-07)</w:t>
             </w:r>
           </w:p>
         </w:tc>
@@ -28929,7 +29977,7 @@
               <w:rPr>
                 <w:sz w:val="17"/>
               </w:rPr>
-              <w:t>Prompt del sistema, definición y ejecución validada de funciones.</w:t>
+              <w:t>Instrucciones del sistema, historial propio con conversaciones fijadas, límite diario, red de seguridad (SAMU 131 y *4141) y modo simulado sin clave; las funciones acotadas llegan con FS-HU-09.</w:t>
             </w:r>
           </w:p>
         </w:tc>
@@ -29088,7 +30136,7 @@
         <w:spacing w:after="120"/>
       </w:pPr>
       <w:r>
-        <w:t>La migración 20261012010000_disponibilidad_reservas agrega disponibilidades y reservas: doce tablas implementadas de quince. Conversaciones, mensajes y registro_comida siguen previstos. La prueba SMTP se prepara con npm run smtp:comprobar; la entrega a bandeja y recuperación con cuenta temporal ya se comprobaron. La migración 20261012040000_retirar_disponibilidad agrega retirado BOOLEAN DEFAULT false sin borrar datos. La prueba npm run test:mysql:agenda reproduce los escenarios con horas en punto y retiro; solo crea y elimina sus cuentas temporales.</w:t>
+        <w:t>La migración 20261012010000_disponibilidad_reservas agrega disponibilidades y reservas: doce tablas implementadas de quince. Desde el 21-10-2026 la migración 20261021120000_asistente_ia agrega conversaciones, mensajes y uso_asistente (FS-HU-07): quince tablas implementadas de dieciséis; solo registro_comida sigue prevista. La prueba SMTP se prepara con npm run smtp:comprobar; la entrega a bandeja y recuperación con cuenta temporal ya se comprobaron. La migración 20261012040000_retirar_disponibilidad agrega retirado BOOLEAN DEFAULT false sin borrar datos. La prueba npm run test:mysql:agenda reproduce los escenarios con horas en punto y retiro; solo crea y elimina sus cuentas temporales.</w:t>
       </w:r>
     </w:p>
     <w:p>

</xml_diff>

<commit_message>
FS-HU-08 y SC-26: recomendacion de profesional y SAMU solo en situaciones criticas (DAS 1.26)
</commit_message>
<xml_diff>
--- a/FASE 2/Evidencias Proyecto/Evidencias de documentación/Documento de Arquitectura (DAS)/Documento_Arquitectura_Sistema_DAS_.docx
+++ b/FASE 2/Evidencias Proyecto/Evidencias de documentación/Documento de Arquitectura (DAS)/Documento_Arquitectura_Sistema_DAS_.docx
@@ -237,7 +237,7 @@
           <w:szCs w:val="36"/>
           <w:lang w:val="es-CL"/>
         </w:rPr>
-        <w:t>Versión 1.25</w:t>
+        <w:t>Versión 1.26</w:t>
       </w:r>
     </w:p>
     <w:p>
@@ -2703,6 +2703,75 @@
             </w:pPr>
             <w:r>
               <w:t>FS-HU-07: asistente IA implementado. Decisión D33, que reemplaza a D7: cliente genérico compatible con la API de OpenAI, configurable por variables de entorno, con Groq por defecto en su plan gratuito y modo simulado sin clave. Tablas conversaciones (con titulo, fijada y fecha_actualizacion), mensajes y uso_asistente (migración 20261021120000_asistente_ia): quince tablas implementadas de dieciséis. Restricciones, desempeño, QS2, uso responsable, vistas de procesos, desarrollo y física, componentes y trazabilidad actualizados; flujo del asistente nuevo; Ilustraciones 1, 2, 4, 9 y 10 regeneradas y fuente 14_Asistente_IA nueva. 267 pruebas backend, 245 frontend y 7 comprobaciones en Edge con MySQL real.</w:t>
+            </w:r>
+          </w:p>
+        </w:tc>
+        <w:tc>
+          <w:tcPr>
+            <w:tcW w:w="1908" w:type="dxa"/>
+          </w:tcPr>
+          <w:p>
+            <w:pPr>
+              <w:pStyle w:val="Tabletext"/>
+              <w:rPr>
+                <w:lang w:val="es-CL"/>
+              </w:rPr>
+            </w:pPr>
+            <w:r>
+              <w:t>Rodrigo Cárcamo Rojas</w:t>
+            </w:r>
+          </w:p>
+        </w:tc>
+      </w:tr>
+      <w:tr>
+        <w:trPr>
+          <w:cantSplit/>
+        </w:trPr>
+        <w:tc>
+          <w:tcPr>
+            <w:tcW w:w="2196" w:type="dxa"/>
+          </w:tcPr>
+          <w:p>
+            <w:pPr>
+              <w:pStyle w:val="Tabletext"/>
+              <w:rPr>
+                <w:lang w:val="es-CL"/>
+              </w:rPr>
+            </w:pPr>
+            <w:r>
+              <w:t>22-10-2026</w:t>
+            </w:r>
+          </w:p>
+        </w:tc>
+        <w:tc>
+          <w:tcPr>
+            <w:tcW w:w="1152" w:type="dxa"/>
+          </w:tcPr>
+          <w:p>
+            <w:pPr>
+              <w:pStyle w:val="Tabletext"/>
+              <w:rPr>
+                <w:lang w:val="es-CL"/>
+              </w:rPr>
+            </w:pPr>
+            <w:r>
+              <w:t>1.26</w:t>
+            </w:r>
+          </w:p>
+        </w:tc>
+        <w:tc>
+          <w:tcPr>
+            <w:tcW w:w="3744" w:type="dxa"/>
+          </w:tcPr>
+          <w:p>
+            <w:pPr>
+              <w:pStyle w:val="Tabletext"/>
+              <w:rPr>
+                <w:lang w:val="es-CL"/>
+              </w:rPr>
+            </w:pPr>
+            <w:r>
+              <w:t>FS-HU-08: recomendación de profesional. Decisión D34: el modelo marca la especialidad recomendada en una línea final, el backend la valida contra el catálogo de shared/reglas.json, la quita del texto y la guarda en la columna nueva mensajes.especialidad (migración 20261022120000_recomendacion_profesional); la interfaz la muestra como tarjeta con acceso al buscador filtrado. SC-26 (decisión del PO): el SAMU (131) solo ante situaciones críticas, no en molestias leves ni fijo en la pantalla. CP-109 aprobado con Groq real (modelo openai/gpt-oss-120b; el anterior, retirado por Groq, fue el defecto 36). Uso responsable, diccionario de datos, flujo del asistente, decisiones, componentes y trazabilidad actualizados; fuentes 02, 03, 04 y 14 de Diagramas (Miro) actualizadas, sin cambios en las ilustraciones. 295 pruebas backend, 250 frontend y 10 comprobaciones en Edge con Groq real.</w:t>
             </w:r>
           </w:p>
         </w:tc>
@@ -7658,7 +7727,7 @@
         <w:rPr>
           <w:b/>
         </w:rPr>
-        <w:t>Uso responsable de IA: el asistente entrega orientación general, aclara que no reemplaza a un profesional de salud y solo puede ejecutar funciones acotadas definidas y validadas por el backend. Al proveedor de IA solo viajan las instrucciones y los últimos mensajes de la conversación, nunca el perfil ni la información de salud de la persona; ante señales de emergencia o de riesgo, la respuesta siempre indica llamar al SAMU (131) o a la línea de prevención del suicidio *4141.</w:t>
+        <w:t>Uso responsable de IA: el asistente entrega orientación general, aclara que no reemplaza a un profesional de salud y solo puede ejecutar funciones acotadas definidas y validadas por el backend. Al proveedor de IA solo viajan las instrucciones y los últimos mensajes de la conversación, nunca el perfil ni la información de salud de la persona; ante una situación crítica (por ejemplo, un hueso roto, dificultad para respirar o dolor fuerte en el pecho) la respuesta indica llamar al SAMU (131), y ante señales de riesgo suicida, a la línea de prevención del suicidio *4141; las molestias leves no llevan ese aviso (SC-26, 22-10-2026). Cuando corresponde, el asistente recomienda un tipo de profesional del catálogo, que el backend valida antes de mostrarlo (D34).</w:t>
       </w:r>
     </w:p>
     <w:p>
@@ -16300,6 +16369,61 @@
                 <w:b/>
                 <w:sz w:val="17"/>
               </w:rPr>
+              <w:t>especialidad</w:t>
+            </w:r>
+          </w:p>
+        </w:tc>
+        <w:tc>
+          <w:tcPr>
+            <w:tcW w:w="1600" w:type="dxa"/>
+          </w:tcPr>
+          <w:p>
+            <w:r>
+              <w:rPr>
+                <w:sz w:val="17"/>
+              </w:rPr>
+              <w:t>VARCHAR(100)</w:t>
+            </w:r>
+          </w:p>
+        </w:tc>
+        <w:tc>
+          <w:tcPr>
+            <w:tcW w:w="2500" w:type="dxa"/>
+          </w:tcPr>
+          <w:p>
+            <w:r>
+              <w:rPr>
+                <w:sz w:val="17"/>
+              </w:rPr>
+              <w:t>NULL</w:t>
+            </w:r>
+          </w:p>
+        </w:tc>
+        <w:tc>
+          <w:tcPr>
+            <w:tcW w:w="3000" w:type="dxa"/>
+          </w:tcPr>
+          <w:p>
+            <w:r>
+              <w:rPr>
+                <w:sz w:val="17"/>
+              </w:rPr>
+              <w:t>Especialidad del catálogo que el asistente recomendó en esa respuesta (FS-HU-08, D34). Vacía en los mensajes del usuario y cuando no hay recomendación.</w:t>
+            </w:r>
+          </w:p>
+        </w:tc>
+      </w:tr>
+      <w:tr>
+        <w:tc>
+          <w:tcPr>
+            <w:tcW w:w="1900" w:type="dxa"/>
+          </w:tcPr>
+          <w:p>
+            <w:r>
+              <w:rPr>
+                <w:b/>
+                <w:sz w:val="17"/>
+              </w:rPr>
               <w:t>fecha</w:t>
             </w:r>
           </w:p>
@@ -23793,7 +23917,7 @@
         </w:rPr>
       </w:pPr>
       <w:r>
-        <w:t>Implementa FS-HU-07 y D33. Todas las rutas exigen sesión de usuario (Bearer JWT) y se exponen bajo el prefijo /api. Estado al 21-10-2026: los nueve pasos están implementados y probados en modo simulado contra MySQL (CP-103 a CP-108); con IA_API_KEY el mismo flujo usa Groq (CP-109, pendiente de la clave). La secuencia completa está en la fuente 14_Asistente_IA de Diagramas (Miro).</w:t>
+        <w:t>Implementa FS-HU-07, FS-HU-08, D33 y D34. Todas las rutas exigen sesión de usuario (Bearer JWT) y se exponen bajo el prefijo /api. Estado al 22-10-2026: los nueve pasos están implementados y probados en modo simulado contra MySQL (CP-103 a CP-108) y con Groq real (CP-109 a CP-114, modelo openai/gpt-oss-120b). La secuencia completa está en la fuente 14_Asistente_IA de Diagramas (Miro).</w:t>
       </w:r>
     </w:p>
     <w:tbl>
@@ -24106,7 +24230,7 @@
               <w:rPr>
                 <w:sz w:val="17"/>
               </w:rPr>
-              <w:t>chat/completions con las instrucciones y los últimos 10 mensajes, sin perfil ni datos de salud. Si falla o tarda más de 20 s, responde 503 y no guarda nada.</w:t>
+              <w:t>chat/completions con las instrucciones y los últimos 10 mensajes, sin perfil ni datos de salud. Las instrucciones incluyen el catálogo de especialidades y piden marcar la recomendada en una línea final (D34). Si falla o tarda más de 20 s, responde 503 y no guarda nada.</w:t>
             </w:r>
           </w:p>
         </w:tc>
@@ -24147,7 +24271,7 @@
               <w:rPr>
                 <w:sz w:val="17"/>
               </w:rPr>
-              <w:t>Guarda el mensaje y la respuesta (con SAMU 131 o *4141 si hay señales de riesgo) y suma 1 al uso del día.</w:t>
+              <w:t>Valida la especialidad marcada contra el catálogo y la quita del texto (D34). Guarda el mensaje y la respuesta, con la especialidad en mensajes.especialidad y el aviso del SAMU (131) solo ante situaciones críticas o el *4141 ante señales de riesgo (SC-26), y suma 1 al uso del día.</w:t>
             </w:r>
           </w:p>
         </w:tc>
@@ -24188,7 +24312,7 @@
               <w:rPr>
                 <w:sz w:val="17"/>
               </w:rPr>
-              <w:t>201 con los mensajes y los restantes del día; la respuesta se muestra como texto, sin interpretar HTML.</w:t>
+              <w:t>201 con los mensajes y los restantes del día; la respuesta se muestra como texto, sin interpretar HTML. Si trae una especialidad, una tarjeta «Ver …» abre /profesionales filtrado por ella (FS-HU-08).</w:t>
             </w:r>
           </w:p>
         </w:tc>
@@ -26938,7 +27062,7 @@
               <w:rPr>
                 <w:sz w:val="17"/>
               </w:rPr>
-              <w:t>asistente</w:t>
+              <w:t>asistente, profesionales</w:t>
             </w:r>
           </w:p>
         </w:tc>
@@ -26964,7 +27088,7 @@
               <w:rPr>
                 <w:sz w:val="17"/>
               </w:rPr>
-              <w:t>4 (implementado el 21-10-2026)</w:t>
+              <w:t>4 (FS-HU-07 el 21-10-2026 y FS-HU-08 el 22-10-2026)</w:t>
             </w:r>
           </w:p>
         </w:tc>
@@ -29163,6 +29287,51 @@
           </w:p>
         </w:tc>
       </w:tr>
+      <w:tr>
+        <w:trPr>
+          <w:cantSplit/>
+        </w:trPr>
+        <w:tc>
+          <w:tcPr>
+            <w:tcW w:w="600" w:type="dxa"/>
+          </w:tcPr>
+          <w:p>
+            <w:r>
+              <w:t>D34</w:t>
+            </w:r>
+          </w:p>
+        </w:tc>
+        <w:tc>
+          <w:tcPr>
+            <w:tcW w:w="2400" w:type="dxa"/>
+          </w:tcPr>
+          <w:p>
+            <w:r>
+              <w:t>Recomendación de profesional (FS-HU-08): el modelo marca la especialidad recomendada en una línea final («ESPECIALIDAD: &lt;nombre&gt;»); el backend la valida contra el catálogo de shared/reglas.json, la quita del texto visible y la guarda en mensajes.especialidad; la interfaz la muestra como tarjeta con acceso al buscador filtrado (FS-HU-22).</w:t>
+            </w:r>
+          </w:p>
+        </w:tc>
+        <w:tc>
+          <w:tcPr>
+            <w:tcW w:w="2400" w:type="dxa"/>
+          </w:tcPr>
+          <w:p>
+            <w:r>
+              <w:t>Function calling (herramientas) del proveedor; respuesta en JSON estructurado; reglas fijas por palabras clave en el backend.</w:t>
+            </w:r>
+          </w:p>
+        </w:tc>
+        <w:tc>
+          <w:tcPr>
+            <w:tcW w:w="3600" w:type="dxa"/>
+          </w:tcPr>
+          <w:p>
+            <w:r>
+              <w:t>La marca funciona con cualquier proveedor compatible con OpenAI (D33), sin llamadas extra ni costo, y el backend solo acepta especialidades del catálogo, así que el modelo no puede inventar una ni enlazar a otra parte. Function calling y el JSON estructurado dependen de que cada proveedor los soporte igual. Las palabras clave fijas se equivocan con frases ambiguas (un «me duele» puede ser kinesiología o medicina), por eso solo se usan en el modo simulado, para probar la tarjeta sin clave. Si el modelo omite la marca, la respuesta se muestra igual, sin tarjeta.</w:t>
+            </w:r>
+          </w:p>
+        </w:tc>
+      </w:tr>
     </w:tbl>
     <w:p/>
     <w:p>
@@ -29964,7 +30133,7 @@
               <w:rPr>
                 <w:sz w:val="17"/>
               </w:rPr>
-              <w:t>Desarrollado (FS-HU-07)</w:t>
+              <w:t>Desarrollado (FS-HU-07 y FS-HU-08)</w:t>
             </w:r>
           </w:p>
         </w:tc>
@@ -29977,7 +30146,7 @@
               <w:rPr>
                 <w:sz w:val="17"/>
               </w:rPr>
-              <w:t>Instrucciones del sistema, historial propio con conversaciones fijadas, límite diario, red de seguridad (SAMU 131 y *4141) y modo simulado sin clave; las funciones acotadas llegan con FS-HU-09.</w:t>
+              <w:t>Instrucciones del sistema, historial propio con conversaciones fijadas, límite diario, red de seguridad (SAMU 131 solo en situaciones críticas y *4141), recomendación de profesional validada contra el catálogo (D34) y modo simulado sin clave; las funciones acotadas llegan con FS-HU-09.</w:t>
             </w:r>
           </w:p>
         </w:tc>

</xml_diff>

<commit_message>
SC-27 y defecto 37: lista y mapa juntos en Profesionales (DAS 1.27)
Lista y mapa lado a lado, detalle bajo el mapa, Ver en el mapa, accesos por especialidad, filtros en barra y opcion de ocultar el mapa. CP-115 a CP-120.
</commit_message>
<xml_diff>
--- a/FASE 2/Evidencias Proyecto/Evidencias de documentación/Documento de Arquitectura (DAS)/Documento_Arquitectura_Sistema_DAS_.docx
+++ b/FASE 2/Evidencias Proyecto/Evidencias de documentación/Documento de Arquitectura (DAS)/Documento_Arquitectura_Sistema_DAS_.docx
@@ -237,7 +237,7 @@
           <w:szCs w:val="36"/>
           <w:lang w:val="es-CL"/>
         </w:rPr>
-        <w:t>Versión 1.26</w:t>
+        <w:t>Versión 1.27</w:t>
       </w:r>
     </w:p>
     <w:p>
@@ -2772,6 +2772,75 @@
             </w:pPr>
             <w:r>
               <w:t>FS-HU-08: recomendación de profesional. Decisión D34: el modelo marca la especialidad recomendada en una línea final, el backend la valida contra el catálogo de shared/reglas.json, la quita del texto y la guarda en la columna nueva mensajes.especialidad (migración 20261022120000_recomendacion_profesional); la interfaz la muestra como tarjeta con acceso al buscador filtrado. SC-26 (decisión del PO): el SAMU (131) solo ante situaciones críticas, no en molestias leves ni fijo en la pantalla. CP-109 aprobado con Groq real (modelo openai/gpt-oss-120b; el anterior, retirado por Groq, fue el defecto 36). Uso responsable, diccionario de datos, flujo del asistente, decisiones, componentes y trazabilidad actualizados; fuentes 02, 03, 04 y 14 de Diagramas (Miro) actualizadas, sin cambios en las ilustraciones. 295 pruebas backend, 250 frontend y 10 comprobaciones en Edge con Groq real.</w:t>
+            </w:r>
+          </w:p>
+        </w:tc>
+        <w:tc>
+          <w:tcPr>
+            <w:tcW w:w="1908" w:type="dxa"/>
+          </w:tcPr>
+          <w:p>
+            <w:pPr>
+              <w:pStyle w:val="Tabletext"/>
+              <w:rPr>
+                <w:lang w:val="es-CL"/>
+              </w:rPr>
+            </w:pPr>
+            <w:r>
+              <w:t>Rodrigo Cárcamo Rojas</w:t>
+            </w:r>
+          </w:p>
+        </w:tc>
+      </w:tr>
+      <w:tr>
+        <w:trPr>
+          <w:cantSplit/>
+        </w:trPr>
+        <w:tc>
+          <w:tcPr>
+            <w:tcW w:w="2196" w:type="dxa"/>
+          </w:tcPr>
+          <w:p>
+            <w:pPr>
+              <w:pStyle w:val="Tabletext"/>
+              <w:rPr>
+                <w:lang w:val="es-CL"/>
+              </w:rPr>
+            </w:pPr>
+            <w:r>
+              <w:t>22-10-2026</w:t>
+            </w:r>
+          </w:p>
+        </w:tc>
+        <w:tc>
+          <w:tcPr>
+            <w:tcW w:w="1152" w:type="dxa"/>
+          </w:tcPr>
+          <w:p>
+            <w:pPr>
+              <w:pStyle w:val="Tabletext"/>
+              <w:rPr>
+                <w:lang w:val="es-CL"/>
+              </w:rPr>
+            </w:pPr>
+            <w:r>
+              <w:t>1.27</w:t>
+            </w:r>
+          </w:p>
+        </w:tc>
+        <w:tc>
+          <w:tcPr>
+            <w:tcW w:w="3744" w:type="dxa"/>
+          </w:tcPr>
+          <w:p>
+            <w:pPr>
+              <w:pStyle w:val="Tabletext"/>
+              <w:rPr>
+                <w:lang w:val="es-CL"/>
+              </w:rPr>
+            </w:pPr>
+            <w:r>
+              <w:t>SC-27 (decisión del PO): lista y mapa juntos en Profesionales según el mockup del PO, solo con los datos que ya existen. Decisión D35: en escritorio la lista a la izquierda y el mapa fijo a la derecha, y en celular el mapa arriba de la lista; el detalle del marcador elegido pasa de una ventana sobre el marcador (SC-22) a un panel bajo el mapa; «Ver en el mapa» en cada tarjeta, resaltado entre tarjeta y marcador, accesos por especialidad, filtros en una barra y opción de ocultar el mapa. Defecto 37 corregido: en una pestaña oculta el plazo de carga del mapa espera a que la pestaña se vea. Sección del Sprint 3, comunicaciones, componentes, diccionario de datos y decisiones actualizados (esa sección aún daba por abiertos los defectos 27 y 29, corregidos el 21-10-2026). Sin cambios en la API, los datos ni los diagramas. 295 pruebas backend, 264 frontend y 15 comprobaciones en Edge (CP-115 a CP-120).</w:t>
             </w:r>
           </w:p>
         </w:tc>
@@ -10781,7 +10850,7 @@
               <w:rPr>
                 <w:sz w:val="17"/>
               </w:rPr>
-              <w:t>Mapa de resultados con marcadores y enlace a ficha (D31, SC-18). Google Maps con Demo Key se comprobó el 12-10-2026 y se reemplazó el 15-10-2026.</w:t>
+              <w:t>Mapa de resultados junto a la lista, con marcadores conectados a sus tarjetas, detalle del elegido bajo el mapa y enlace a ficha (D35, SC-27) (D31, SC-18). Google Maps con Demo Key se comprobó el 12-10-2026 y se reemplazó el 15-10-2026.</w:t>
             </w:r>
           </w:p>
         </w:tc>
@@ -14185,7 +14254,7 @@
               <w:rPr>
                 <w:sz w:val="17"/>
               </w:rPr>
-              <w:t>Dirección de atención escrita por el profesional (SC-24, 19-10-2026; D32). Obligatoria al guardar la ficha si atiende presencial o de ambas formas; opcional si atiende solo online (se guarda nula). Se muestra en la ficha pública, en la ventana del marcador del mapa y en el lugar de la reserva; si falta, se usa la del establecimiento asociado. Las fichas anteriores quedan nulas hasta que el profesional la agregue.</w:t>
+              <w:t>Dirección de atención escrita por el profesional (SC-24, 19-10-2026; D32). Obligatoria al guardar la ficha si atiende presencial o de ambas formas; opcional si atiende solo online (se guarda nula). Se muestra en la ficha pública, en el detalle del marcador elegido bajo el mapa y en el lugar de la reserva; si falta, se usa la del establecimiento asociado. Las fichas anteriores quedan nulas hasta que el profesional la agregue.</w:t>
             </w:r>
           </w:p>
         </w:tc>
@@ -26260,7 +26329,7 @@
               <w:rPr>
                 <w:sz w:val="17"/>
               </w:rPr>
-              <w:t>Descarga del SDK al abrir la vista Mapa; versión fija y huella SRI.</w:t>
+              <w:t>Descarga del SDK cuando se muestra el mapa en Profesionales (no si está oculto); versión fija y huella SRI.</w:t>
             </w:r>
           </w:p>
         </w:tc>
@@ -29192,7 +29261,7 @@
           </w:tcPr>
           <w:p>
             <w:r>
-              <w:t>Gratuito, sin clave, cuenta ni tarjeta, lo que permite ejecutar CP-078 y cerrar FS-HU-06. El SDK se descarga solo al abrir la vista Mapa, con versión fija y huella SRI; si el proveedor falla, la lista de resultados sigue disponible. No hay geocodificación ni búsqueda de lugares: las coordenadas vienen de la ficha del profesional. El mapa muestra la atribución de OpenFreeMap, OpenMapTiles y OpenStreetMap.</w:t>
+              <w:t>Gratuito, sin clave, cuenta ni tarjeta, lo que permite ejecutar CP-078 y cerrar FS-HU-06. El SDK se descarga solo cuando se muestra el mapa (desde la SC-27, junto a la lista), con versión fija y huella SRI; si el proveedor falla, la lista de resultados sigue disponible. No hay geocodificación ni búsqueda de lugares: las coordenadas vienen de la ficha del profesional. El mapa muestra la atribución de OpenFreeMap, OpenMapTiles y OpenStreetMap.</w:t>
             </w:r>
           </w:p>
         </w:tc>
@@ -29328,6 +29397,51 @@
           <w:p>
             <w:r>
               <w:t>La marca funciona con cualquier proveedor compatible con OpenAI (D33), sin llamadas extra ni costo, y el backend solo acepta especialidades del catálogo, así que el modelo no puede inventar una ni enlazar a otra parte. Function calling y el JSON estructurado dependen de que cada proveedor los soporte igual. Las palabras clave fijas se equivocan con frases ambiguas (un «me duele» puede ser kinesiología o medicina), por eso solo se usan en el modo simulado, para probar la tarjeta sin clave. Si el modelo omite la marca, la respuesta se muestra igual, sin tarjeta.</w:t>
+            </w:r>
+          </w:p>
+        </w:tc>
+      </w:tr>
+      <w:tr>
+        <w:trPr>
+          <w:cantSplit/>
+        </w:trPr>
+        <w:tc>
+          <w:tcPr>
+            <w:tcW w:w="600" w:type="dxa"/>
+          </w:tcPr>
+          <w:p>
+            <w:r>
+              <w:t>D35</w:t>
+            </w:r>
+          </w:p>
+        </w:tc>
+        <w:tc>
+          <w:tcPr>
+            <w:tcW w:w="2400" w:type="dxa"/>
+          </w:tcPr>
+          <w:p>
+            <w:r>
+              <w:t>Lista y mapa juntos en Profesionales (SC-27, FS-HU-06): en escritorio la lista a la izquierda y el mapa fijo a la derecha, y en celular el mapa arriba de la lista. La selección (un marcador o «Ver en el mapa» en una tarjeta) es un estado de la página que comparten la lista, el mapa y el detalle, que se muestra bajo el mapa. Cada marcador es un botón. El mapa se puede ocultar (?mapa=oculto) y queda montado para volver a mostrarlo sin descargarlo de nuevo.</w:t>
+            </w:r>
+          </w:p>
+        </w:tc>
+        <w:tc>
+          <w:tcPr>
+            <w:tcW w:w="2400" w:type="dxa"/>
+          </w:tcPr>
+          <w:p>
+            <w:r>
+              <w:t>Mantener las vistas Lista y Mapa separadas con un botón para alternar (SC-18 y SC-22); mapa a pantalla completa con la lista superpuesta; ventana emergente de MapLibre sobre el marcador para el detalle.</w:t>
+            </w:r>
+          </w:p>
+        </w:tc>
+        <w:tc>
+          <w:tcPr>
+            <w:tcW w:w="3600" w:type="dxa"/>
+          </w:tcPr>
+          <w:p>
+            <w:r>
+              <w:t>Comparar opciones (FS-HU-06) pide ver a la vez dónde atiende cada profesional y sus datos; con vistas separadas había que cambiar de vista y se perdía la tarjeta. El detalle bajo el mapa no tapa otros marcadores ni queda cortado en pantallas angostas, como la ventana emergente. Con marcadores como botones el mapa se recorre con Tab y Enter sin código extra. La lista va primero en el orden del documento y del teclado y sigue disponible si el mapa no carga. El costo es descargar MapLibre al abrir Profesionales, salvo con el mapa oculto. Sin cambios en la API ni en los datos: precio, etiquetas, horario semanal y fotos del mockup quedan fuera hasta que existan.</w:t>
             </w:r>
           </w:p>
         </w:tc>
@@ -29810,7 +29924,7 @@
               <w:rPr>
                 <w:sz w:val="17"/>
               </w:rPr>
-              <w:t>Mapa de resultados con marcadores y enlace a ficha (D31, SC-18); reemplaza a Google Maps desde el 15-10-2026.</w:t>
+              <w:t>Mapa de resultados junto a la lista, con marcadores conectados a sus tarjetas, detalle del elegido bajo el mapa y enlace a ficha (D35, SC-27) (D31, SC-18); reemplaza a Google Maps desde el 15-10-2026.</w:t>
             </w:r>
           </w:p>
         </w:tc>
@@ -30297,7 +30411,7 @@
         <w:spacing w:after="120"/>
       </w:pPr>
       <w:r>
-        <w:t>La vista Mapa conserva filtros y página al alternar Lista/Mapa. Desde el 15-10-2026 (SC-18, PR #27, D31) usa MapLibre GL JS 5.24.0, que se descarga solo al abrir la vista con versión fija y huella SRI, y las teselas de OpenFreeMap (datos de OpenStreetMap), sin clave ni facturación; ya no se configuran variables de mapa en frontend/.env. Ante una falla mantiene los resultados accesibles y ofrece reintentar. Las suites usan un SDK simulado. Google Maps con Demo Key se comprobó el 12-10-2026; el mapa nuevo se comprobó en el navegador el 15-10-2026 y CP-078 sobre main sigue pendiente. Defectos abiertos 27 y 29: reintento cuando falla el estilo y textos de los controles en inglés. El 19-10-2026 se corrigieron, pendientes de fusionar a main, el 28 (selección con teclado, SC-22) y el 35 (una ficha con coordenadas fuera de Chile alejaba el mapa): el mapa se limita a Chile y, desde la SC-24, la ficha solo acepta coordenadas dentro del país (D32). La ventana de cada marcador muestra el tipo de profesional, si está verificado, su dirección y su próxima hora.</w:t>
+        <w:t>Desde el 22-10-2026 (SC-27, D35) la lista y el mapa se ven juntos, y el mapa se puede ocultar sin perder filtros ni página. Desde el 15-10-2026 (SC-18, PR #27, D31) usa MapLibre GL JS 5.24.0, que se descarga solo cuando el mapa se muestra, con versión fija y huella SRI, y las teselas de OpenFreeMap (datos de OpenStreetMap), sin clave ni facturación; ya no se configuran variables de mapa en frontend/.env. Ante una falla mantiene los resultados accesibles y ofrece reintentar. Las suites usan un SDK simulado. Google Maps con Demo Key se comprobó el 12-10-2026; el mapa nuevo se comprobó en el navegador el 15-10-2026 y CP-078 sobre main sigue pendiente. Los defectos 27 y 29 (reintento cuando falla el estilo y textos de los controles en inglés) se corrigieron el 21-10-2026. El 19-10-2026 se corrigieron, pendientes de fusionar a main, el 28 (selección con teclado, SC-22) y el 35 (una ficha con coordenadas fuera de Chile alejaba el mapa): el mapa se limita a Chile y, desde la SC-24, la ficha solo acepta coordenadas dentro del país (D32). El detalle del marcador elegido (desde la SC-27, en un panel bajo el mapa en vez de una ventana sobre el marcador) muestra el tipo de profesional, si está verificado, su dirección y su próxima hora. En una pestaña oculta, el plazo de carga del mapa empieza cuando la pestaña se ve (defecto 37).</w:t>
       </w:r>
     </w:p>
     <w:p>

</xml_diff>

<commit_message>
SC-28: ubicacion de la ficha profesional por direccion con Nominatim (DAS 1.28)
La ficha ya no pide latitud ni longitud: la API ubica la comuna y la direccion y el formulario muestra un mapa con marcador ajustable. CP-123 a CP-125, diagramas 07 y 08, Matriz, control, Product Backlog y README.
</commit_message>
<xml_diff>
--- a/FASE 2/Evidencias Proyecto/Evidencias de documentación/Documento de Arquitectura (DAS)/Documento_Arquitectura_Sistema_DAS_.docx
+++ b/FASE 2/Evidencias Proyecto/Evidencias de documentación/Documento de Arquitectura (DAS)/Documento_Arquitectura_Sistema_DAS_.docx
@@ -237,7 +237,7 @@
           <w:szCs w:val="36"/>
           <w:lang w:val="es-CL"/>
         </w:rPr>
-        <w:t>Versión 1.27</w:t>
+        <w:t>Versión 1.28</w:t>
       </w:r>
     </w:p>
     <w:p>
@@ -561,7 +561,7 @@
           </w:tcPr>
           <w:p>
             <w:r>
-              <w:t>1.23</w:t>
+              <w:t>1.28</w:t>
             </w:r>
           </w:p>
         </w:tc>
@@ -2841,6 +2841,75 @@
             </w:pPr>
             <w:r>
               <w:t>SC-27 (decisión del PO): lista y mapa juntos en Profesionales según el mockup del PO, solo con los datos que ya existen. Decisión D35: en escritorio la lista a la izquierda y el mapa fijo a la derecha, y en celular el mapa arriba de la lista; el detalle del marcador elegido pasa de una ventana sobre el marcador (SC-22) a un panel bajo el mapa; «Ver en el mapa» en cada tarjeta, resaltado entre tarjeta y marcador, accesos por especialidad, filtros en una barra y opción de ocultar el mapa. Defecto 37 corregido: en una pestaña oculta el plazo de carga del mapa espera a que la pestaña se vea. Sección del Sprint 3, comunicaciones, componentes, diccionario de datos y decisiones actualizados (esa sección aún daba por abiertos los defectos 27 y 29, corregidos el 21-10-2026). Sin cambios en la API, los datos ni los diagramas. 295 pruebas backend, 264 frontend y 15 comprobaciones en Edge (CP-115 a CP-120).</w:t>
+            </w:r>
+          </w:p>
+        </w:tc>
+        <w:tc>
+          <w:tcPr>
+            <w:tcW w:w="1908" w:type="dxa"/>
+          </w:tcPr>
+          <w:p>
+            <w:pPr>
+              <w:pStyle w:val="Tabletext"/>
+              <w:rPr>
+                <w:lang w:val="es-CL"/>
+              </w:rPr>
+            </w:pPr>
+            <w:r>
+              <w:t>Rodrigo Cárcamo Rojas</w:t>
+            </w:r>
+          </w:p>
+        </w:tc>
+      </w:tr>
+      <w:tr>
+        <w:trPr>
+          <w:cantSplit/>
+        </w:trPr>
+        <w:tc>
+          <w:tcPr>
+            <w:tcW w:w="2196" w:type="dxa"/>
+          </w:tcPr>
+          <w:p>
+            <w:pPr>
+              <w:pStyle w:val="Tabletext"/>
+              <w:rPr>
+                <w:lang w:val="es-CL"/>
+              </w:rPr>
+            </w:pPr>
+            <w:r>
+              <w:t>24-10-2026</w:t>
+            </w:r>
+          </w:p>
+        </w:tc>
+        <w:tc>
+          <w:tcPr>
+            <w:tcW w:w="1152" w:type="dxa"/>
+          </w:tcPr>
+          <w:p>
+            <w:pPr>
+              <w:pStyle w:val="Tabletext"/>
+              <w:rPr>
+                <w:lang w:val="es-CL"/>
+              </w:rPr>
+            </w:pPr>
+            <w:r>
+              <w:t>1.28</w:t>
+            </w:r>
+          </w:p>
+        </w:tc>
+        <w:tc>
+          <w:tcPr>
+            <w:tcW w:w="3744" w:type="dxa"/>
+          </w:tcPr>
+          <w:p>
+            <w:pPr>
+              <w:pStyle w:val="Tabletext"/>
+              <w:rPr>
+                <w:lang w:val="es-CL"/>
+              </w:rPr>
+            </w:pPr>
+            <w:r>
+              <w:t>SC-28 (decisión del PO): el profesional ya no escribe latitud ni longitud en su ficha. Decisión D36: el backend convierte la comuna y la dirección en coordenadas con Nominatim, el buscador de direcciones de OpenStreetMap (gratuito y sin clave), por la nueva ruta GET /api/profesionales/mi-ficha/ubicacion (solo rol profesional), con una consulta por segundo, caché de 24 horas e identificación de la aplicación; el formulario muestra el lugar encontrado en un mapa (MapLibre y OpenFreeMap, D31) cuyo marcador el profesional puede ajustar. Retoma la geocodificación que D32 había descartado; el recuadro de Chile sigue validando las coordenadas. Restricciones, tolerancia a fallos, diccionario de datos, reglas, flujo del profesional, componentes, vista física y reutilización actualizados; diagramas 07 y 08 (Ilustraciones 9 y 10) regenerados con el nodo Nominatim. La tabla de identificación decía 1.23 desde la SC-18 y se corrige a 1.28. Sin cambios en la base de datos. 316 pruebas backend, 277 frontend y 10 comprobaciones en Edge con MySQL y Nominatim real (CP-123 a CP-125).</w:t>
             </w:r>
           </w:p>
         </w:tc>
@@ -7184,7 +7253,7 @@
         </w:rPr>
       </w:pPr>
       <w:r>
-        <w:t>FitSearch usa React/Vite, API REST Node.js/Express, JWT, MySQL y Prisma compartido. El panel administrativo, verificación documental privada y gestión de cuentas están fusionados en PR #19/#20. Disponibilidad, reservas y mapa/lista están fusionados en PR #21/#22 (12-10-2026). Desde el 15-10-2026 el mapa usa MapLibre GL JS con teselas de OpenFreeMap, sin clave, en vez de Google Maps (SC-18, PR #27, D31). SMTP real se comprobó el 12-10-2026; el ingreso con Google requiere autorizar el origen localhost en el cliente OAuth. Desde el 21-10-2026 el asistente IA (FS-HU-07) usa Groq, compatible con la API de OpenAI, en su plan gratuito (D33); el despliegue Docker/Nginx sigue previsto. Configuración y Contenido quedan fuera del panel autorizado; FS-HU-06 sigue pendiente de CP-078 y de la aceptación del PO.</w:t>
+        <w:t>FitSearch usa React/Vite, API REST Node.js/Express, JWT, MySQL y Prisma compartido. El panel administrativo, verificación documental privada y gestión de cuentas están fusionados en PR #19/#20. Disponibilidad, reservas y mapa/lista están fusionados en PR #21/#22 (12-10-2026). Desde el 15-10-2026 el mapa usa MapLibre GL JS con teselas de OpenFreeMap, sin clave, en vez de Google Maps (SC-18, PR #27, D31). SMTP real se comprobó el 12-10-2026; el ingreso con Google requiere autorizar el origen localhost en el cliente OAuth. Desde el 21-10-2026 el asistente IA (FS-HU-07) usa Groq, compatible con la API de OpenAI, en su plan gratuito (D33); el despliegue Docker/Nginx sigue previsto. Desde el 24-10-2026 el profesional ubica su ficha con la comuna y la dirección, sin escribir coordenadas: el backend las busca en Nominatim (SC-28, D36). Configuración y Contenido quedan fuera del panel autorizado; FS-HU-06 sigue pendiente de CP-078 y de la aceptación del PO.</w:t>
       </w:r>
     </w:p>
     <w:p>
@@ -7447,7 +7516,7 @@
         <w:rPr>
           <w:b/>
         </w:rPr>
-        <w:t>Tolerancia a fallos: una falla de un servicio externo (proveedor de IA, OpenFreeMap u Open-Meteo) no debe detener el backend ni afectar las funcionalidades que no dependen de él; el usuario recibe un mensaje claro.</w:t>
+        <w:t>Tolerancia a fallos: una falla de un servicio externo (proveedor de IA, OpenFreeMap, Open-Meteo o Nominatim) no debe detener el backend ni afectar las funcionalidades que no dependen de él; el usuario recibe un mensaje claro.</w:t>
       </w:r>
     </w:p>
     <w:p>
@@ -7628,7 +7697,7 @@
         <w:rPr>
           <w:b/>
         </w:rPr>
-        <w:t>Otros componentes de software: solo se utilizan bibliotecas de código abierto y el plan gratuito de Groq para el asistente IA, con un límite diario de mensajes por usuario (D33), y los servicios gratuitos sin clave OpenFreeMap, para las teselas del mapa (D31), y Open-Meteo, para el clima del Inicio del profesional (D26).</w:t>
+        <w:t>Otros componentes de software: solo se utilizan bibliotecas de código abierto y el plan gratuito de Groq para el asistente IA, con un límite diario de mensajes por usuario (D33), y los servicios gratuitos sin clave OpenFreeMap, para las teselas del mapa (D31), Open-Meteo, para el clima del Inicio del profesional (D26), y Nominatim (el buscador de direcciones de OpenStreetMap), para ubicar la ficha del profesional según su política de uso (D36).</w:t>
       </w:r>
     </w:p>
     <w:p>
@@ -9718,7 +9787,7 @@
         <w:rPr>
           <w:b/>
         </w:rPr>
-        <w:t>Sinopsis: Una falla del proveedor de IA (Groq), de OpenFreeMap o de Open-Meteo no debe botar el sistema.</w:t>
+        <w:t>Sinopsis: Una falla del proveedor de IA (Groq), de OpenFreeMap, de Open-Meteo o de Nominatim no debe botar el sistema.</w:t>
       </w:r>
     </w:p>
     <w:p>
@@ -9766,8 +9835,7 @@
         <w:rPr>
           <w:b/>
         </w:rPr>
-        <w:lastRenderedPageBreak/>
-        <w:t>Comportamiento esperado: El backend responde con un mensaje de error controlado; el perfil, el listado y el resto de la plataforma siguen disponibles. Si el clima no responde (espera máxima de 4 segundos), el Inicio del profesional se muestra sin esa tarjeta (D26).</w:t>
+        <w:t>Comportamiento esperado: El backend responde con un mensaje de error controlado; el perfil, el listado y el resto de la plataforma siguen disponibles. Si el clima no responde (espera máxima de 4 segundos), el Inicio del profesional se muestra sin esa tarjeta (D26). Si Nominatim no responde (espera máxima de 5 segundos), la búsqueda de la dirección de la ficha responde 503 y el formulario ofrece buscar de nuevo; una ficha ya ubicada se edita y guarda sin consultarlo mientras no cambie su dirección (D36).</w:t>
       </w:r>
     </w:p>
     <w:p>
@@ -10850,7 +10918,7 @@
               <w:rPr>
                 <w:sz w:val="17"/>
               </w:rPr>
-              <w:t>Mapa de resultados junto a la lista, con marcadores conectados a sus tarjetas, detalle del elegido bajo el mapa y enlace a ficha (D35, SC-27) (D31, SC-18). Google Maps con Demo Key se comprobó el 12-10-2026 y se reemplazó el 15-10-2026.</w:t>
+              <w:t>Mapa de resultados junto a la lista, con marcadores conectados a sus tarjetas, detalle del elegido bajo el mapa y enlace a ficha (D35, SC-27) (D31, SC-18). Google Maps con Demo Key se comprobó el 12-10-2026 y se reemplazó el 15-10-2026. Desde la SC-28 el mismo mapa muestra en la ficha del profesional el lugar de atención ubicado con Nominatim (D36).</w:t>
             </w:r>
           </w:p>
         </w:tc>
@@ -14089,7 +14157,7 @@
               <w:rPr>
                 <w:sz w:val="17"/>
               </w:rPr>
-              <w:t>Latitud de atención. Desde la SC-24 (19-10-2026) debe estar en Chile: entre -56,5 y -17 (recuadro ubicacionChile de shared/reglas.json, D32).</w:t>
+              <w:t>Latitud de atención. Desde la SC-24 (19-10-2026) debe estar en Chile: entre -56,5 y -17 (recuadro ubicacionChile de shared/reglas.json, D32). Desde la SC-28 (24-10-2026) no se escribe a mano: la calcula el backend desde la comuna y la dirección con Nominatim y el profesional puede ajustar el marcador (D36).</w:t>
             </w:r>
           </w:p>
         </w:tc>
@@ -14144,7 +14212,7 @@
               <w:rPr>
                 <w:sz w:val="17"/>
               </w:rPr>
-              <w:t>Longitud de atención. Desde la SC-24 debe estar en Chile: entre -81 y -65,5. Una ficha anterior con coordenadas fuera del recuadro no se dibuja en el mapa y debe corregirlas al editarse.</w:t>
+              <w:t>Longitud de atención. Desde la SC-24 debe estar en Chile: entre -81 y -65,5. Una ficha anterior con coordenadas fuera del recuadro no se dibuja en el mapa y debe corregirlas al editarse. Se obtiene igual que la latitud (D36).</w:t>
             </w:r>
           </w:p>
         </w:tc>
@@ -20754,7 +20822,7 @@
               <w:rPr>
                 <w:sz w:val="17"/>
               </w:rPr>
-              <w:t>La API la valida en PUT /api/profesionales/mi-ficha y el formulario con los mismos mensajes, desde el recuadro de shared/reglas.json que también limita el mapa: una ficha ya no puede guardar coordenadas que alejen el mapa (defecto 35).</w:t>
+              <w:t>La API la valida en PUT /api/profesionales/mi-ficha, desde el recuadro de shared/reglas.json que también limita el mapa: una ficha ya no puede guardar coordenadas que alejen el mapa (defecto 35). El formulario valida la dirección; desde la SC-28 las coordenadas ya no se escriben: las obtiene la API con Nominatim, que solo acepta lugares de Chile (D36).</w:t>
             </w:r>
           </w:p>
         </w:tc>
@@ -23869,7 +23937,7 @@
               <w:rPr>
                 <w:sz w:val="17"/>
               </w:rPr>
-              <w:t>En /profesional/perfil completa o edita su ficha: PUT /api/profesionales/mi-ficha con especialidad (del catálogo), descripción opcional, comuna, dirección (obligatoria salvo que atienda solo online, SC-24), modalidad y ubicación en Chile; el backend valida los datos y crea o actualiza la fila de profesionales (D27).</w:t>
+              <w:t>En /profesional/perfil completa o edita su ficha: PUT /api/profesionales/mi-ficha con especialidad (del catálogo), descripción opcional, comuna, dirección (obligatoria salvo que atienda solo online, SC-24), modalidad y ubicación en Chile, que desde la SC-28 obtiene el formulario con GET /api/profesionales/mi-ficha/ubicacion al salir de los campos de comuna y dirección (el backend la busca en Nominatim, D36) y que el profesional puede ajustar en el mapa; el backend valida los datos y crea o actualiza la fila de profesionales (D27).</w:t>
             </w:r>
           </w:p>
         </w:tc>
@@ -24512,7 +24580,7 @@
         <w:lastRenderedPageBreak/>
         <w:drawing>
           <wp:inline distT="0" distB="0" distL="0" distR="0" wp14:anchorId="6152AB04" wp14:editId="3B7798A9">
-            <wp:extent cx="5760000" cy="2310122"/>
+            <wp:extent cx="5760000" cy="2289600"/>
             <wp:effectExtent l="0" t="0" r="0" b="0"/>
             <wp:docPr id="7" name="Picture 7"/>
             <wp:cNvGraphicFramePr>
@@ -24534,7 +24602,7 @@
                   <pic:spPr>
                     <a:xfrm>
                       <a:off x="0" y="0"/>
-                      <a:ext cx="5760000" cy="2310122"/>
+                      <a:ext cx="5760000" cy="2289600"/>
                     </a:xfrm>
                     <a:prstGeom prst="rect">
                       <a:avLst/>
@@ -24558,7 +24626,7 @@
         </w:rPr>
       </w:pPr>
       <w:r>
-        <w:t>Ilustración 9: Dependencias de frontend/backend, agenda, reservas, panel administrativo y Prisma compartido (DAS 1.20; base aprobada PR #21; corrección incorporada en 1.22; mapa con MapLibre y OpenFreeMap en 1.23, SC-18; asistente IA con Groq en 1.25, D33).</w:t>
+        <w:t>Ilustración 9: Dependencias de frontend/backend, agenda, reservas, panel administrativo y Prisma compartido (DAS 1.20; base aprobada PR #21; corrección incorporada en 1.22; mapa con MapLibre y OpenFreeMap en 1.23, SC-18; asistente IA con Groq en 1.25, D33; ubicación de la ficha con Nominatim en 1.28, D36).</w:t>
       </w:r>
     </w:p>
     <w:tbl>
@@ -25003,7 +25071,7 @@
               <w:rPr>
                 <w:sz w:val="17"/>
               </w:rPr>
-              <w:t>Autenticación, perfil, nutrición, directorio, ficha, documentos privados, favoritos, reseñas, agenda, reservas y asistente IA. Open-Meteo y el proveedor de IA (Groq, compatible con OpenAI, en proveedorIa.service; D33) están integrados. El mapa (MapLibre GL JS y OpenFreeMap) se integra desde el frontend, sin clave (D31).</w:t>
+              <w:t>Autenticación, perfil, nutrición, directorio, ficha, documentos privados, favoritos, reseñas, agenda, reservas y asistente IA. Open-Meteo, Nominatim (búsqueda de la dirección de la ficha, en geocodificacion.service; D36) y el proveedor de IA (Groq, compatible con OpenAI, en proveedorIa.service; D33) están integrados. El mapa (MapLibre GL JS y OpenFreeMap) se integra desde el frontend, sin clave (D31).</w:t>
             </w:r>
           </w:p>
         </w:tc>
@@ -25181,7 +25249,7 @@
         </w:rPr>
       </w:pPr>
       <w:r>
-        <w:t>El estado local usa React/Vite, Express y MySQL, Google Identity y Open-Meteo. El mapa usa MapLibre GL JS con teselas de OpenFreeMap, sin clave (D31); SMTP requiere credenciales. Disponibilidad y reservas utilizan MySQL y Prisma compartido. VERIFICATION_STORAGE_DIR debe apuntar a un directorio persistente y restringido, respaldado junto con MySQL. Docker/Nginx con HTTPS pertenece a FS-HU-11 y sigue pendiente; el asistente IA usa Groq por HTTPS (D33). Esta rama representa quince tablas implementadas de dieciséis.</w:t>
+        <w:t>El estado local usa React/Vite, Express y MySQL, Google Identity, Open-Meteo y Nominatim (búsqueda de la dirección de la ficha, D36). El mapa usa MapLibre GL JS con teselas de OpenFreeMap, sin clave (D31); SMTP requiere credenciales. Disponibilidad y reservas utilizan MySQL y Prisma compartido. VERIFICATION_STORAGE_DIR debe apuntar a un directorio persistente y restringido, respaldado junto con MySQL. Docker/Nginx con HTTPS pertenece a FS-HU-11 y sigue pendiente; el asistente IA usa Groq por HTTPS (D33). Esta rama representa quince tablas implementadas de dieciséis.</w:t>
       </w:r>
     </w:p>
     <w:p>
@@ -25194,7 +25262,7 @@
         </w:rPr>
         <w:drawing>
           <wp:inline distT="0" distB="0" distL="0" distR="0" wp14:anchorId="76286DEC" wp14:editId="080DF178">
-            <wp:extent cx="5760000" cy="2558600"/>
+            <wp:extent cx="5760000" cy="2939400"/>
             <wp:effectExtent l="0" t="0" r="0" b="0"/>
             <wp:docPr id="8" name="Picture 8"/>
             <wp:cNvGraphicFramePr>
@@ -25216,7 +25284,7 @@
                   <pic:spPr>
                     <a:xfrm>
                       <a:off x="0" y="0"/>
-                      <a:ext cx="5760000" cy="2558600"/>
+                      <a:ext cx="5760000" cy="2939400"/>
                     </a:xfrm>
                     <a:prstGeom prst="rect">
                       <a:avLst/>
@@ -25240,7 +25308,7 @@
         </w:rPr>
       </w:pPr>
       <w:r>
-        <w:t>Ilustración 10: Estado local con quince tablas, asistente IA con Groq (D33), mapa con MapLibre y OpenFreeMap sin clave y despliegue objetivo Docker/Nginx (DAS 1.25).</w:t>
+        <w:t>Ilustración 10: Estado local con quince tablas, asistente IA con Groq (D33), mapa con MapLibre y OpenFreeMap sin clave, búsqueda de direcciones con Nominatim (D36) y despliegue objetivo Docker/Nginx (DAS 1.28).</w:t>
       </w:r>
     </w:p>
     <w:p>
@@ -25912,6 +25980,61 @@
           </w:p>
         </w:tc>
       </w:tr>
+      <w:tr>
+        <w:tc>
+          <w:tcPr>
+            <w:tcW w:w="2000" w:type="dxa"/>
+          </w:tcPr>
+          <w:p>
+            <w:r>
+              <w:rPr>
+                <w:b/>
+                <w:sz w:val="17"/>
+              </w:rPr>
+              <w:t>Nominatim (OpenStreetMap)</w:t>
+            </w:r>
+          </w:p>
+        </w:tc>
+        <w:tc>
+          <w:tcPr>
+            <w:tcW w:w="2000" w:type="dxa"/>
+          </w:tcPr>
+          <w:p>
+            <w:r>
+              <w:rPr>
+                <w:sz w:val="17"/>
+              </w:rPr>
+              <w:t>Servicio externo (gratuito, sin clave)</w:t>
+            </w:r>
+          </w:p>
+        </w:tc>
+        <w:tc>
+          <w:tcPr>
+            <w:tcW w:w="3500" w:type="dxa"/>
+          </w:tcPr>
+          <w:p>
+            <w:r>
+              <w:rPr>
+                <w:sz w:val="17"/>
+              </w:rPr>
+              <w:t>Convierte la comuna y la dirección de la ficha del profesional en coordenadas (D36). Su política de uso pide identificar la aplicación, no pasar de una consulta por segundo y guardar las respuestas.</w:t>
+            </w:r>
+          </w:p>
+        </w:tc>
+        <w:tc>
+          <w:tcPr>
+            <w:tcW w:w="1500" w:type="dxa"/>
+          </w:tcPr>
+          <w:p>
+            <w:r>
+              <w:rPr>
+                <w:sz w:val="17"/>
+              </w:rPr>
+              <w:t>443</w:t>
+            </w:r>
+          </w:p>
+        </w:tc>
+      </w:tr>
     </w:tbl>
     <w:p/>
     <w:p>
@@ -26600,6 +26723,60 @@
                 <w:sz w:val="17"/>
               </w:rPr>
               <w:t>JSON sin clave; solo viaja la ubicación aproximada (2 decimales); respuesta en caché 30 minutos y espera máxima de 4 segundos.</w:t>
+            </w:r>
+          </w:p>
+        </w:tc>
+      </w:tr>
+      <w:tr>
+        <w:tc>
+          <w:tcPr>
+            <w:tcW w:w="1700" w:type="dxa"/>
+          </w:tcPr>
+          <w:p>
+            <w:r>
+              <w:rPr>
+                <w:sz w:val="17"/>
+              </w:rPr>
+              <w:t>Backend</w:t>
+            </w:r>
+          </w:p>
+        </w:tc>
+        <w:tc>
+          <w:tcPr>
+            <w:tcW w:w="2500" w:type="dxa"/>
+          </w:tcPr>
+          <w:p>
+            <w:r>
+              <w:rPr>
+                <w:sz w:val="17"/>
+              </w:rPr>
+              <w:t>Nominatim (OpenStreetMap)</w:t>
+            </w:r>
+          </w:p>
+        </w:tc>
+        <w:tc>
+          <w:tcPr>
+            <w:tcW w:w="2100" w:type="dxa"/>
+          </w:tcPr>
+          <w:p>
+            <w:r>
+              <w:rPr>
+                <w:sz w:val="17"/>
+              </w:rPr>
+              <w:t>HTTPS, REST</w:t>
+            </w:r>
+          </w:p>
+        </w:tc>
+        <w:tc>
+          <w:tcPr>
+            <w:tcW w:w="2700" w:type="dxa"/>
+          </w:tcPr>
+          <w:p>
+            <w:r>
+              <w:rPr>
+                <w:sz w:val="17"/>
+              </w:rPr>
+              <w:t>JSON sin clave; viajan solo la calle y el número, la comuna y el país (cl), nunca datos de la persona. Una consulta por segundo para toda la aplicación, cabecera User-Agent de FitSearch, caché de 24 horas y espera máxima de 5 segundos.</w:t>
             </w:r>
           </w:p>
         </w:tc>
@@ -27076,7 +27253,7 @@
               <w:rPr>
                 <w:sz w:val="17"/>
               </w:rPr>
-              <w:t>Navegador, Frontend, Backend, MySQL + Open-Meteo (clima)</w:t>
+              <w:t>Navegador, Frontend, Backend, MySQL + Open-Meteo (clima) + Nominatim (dirección, D36) + OpenFreeMap (mapa de la ficha)</w:t>
             </w:r>
           </w:p>
         </w:tc>
@@ -29286,7 +29463,7 @@
           </w:tcPr>
           <w:p>
             <w:r>
-              <w:t>Dirección de atención propia en profesionales.direccion (VARCHAR(150), nula si atiende solo online) y coordenadas de la ficha limitadas al recuadro de Chile de shared/reglas.json, el mismo que limita el mapa (SC-24, 19-10-2026).</w:t>
+              <w:t>Coordenadas modificadas por D36 desde el 24-10-2026. Dirección de atención propia en profesionales.direccion (VARCHAR(150), nula si atiende solo online) y coordenadas de la ficha limitadas al recuadro de Chile de shared/reglas.json, el mismo que limita el mapa (SC-24, 19-10-2026).</w:t>
             </w:r>
           </w:p>
         </w:tc>
@@ -29306,7 +29483,7 @@
           </w:tcPr>
           <w:p>
             <w:r>
-              <w:t>Antes la dirección escrita solo existía en 4 de las 12 fichas de demostración, a través de su establecimiento, y la ventana del mapa solo podía mostrar la comuna (SC-22). Una columna propia y nula es una migración aditiva que no afecta las fichas existentes. Sin geocodificación (D31), la dirección es un texto declarado y las coordenadas siguen ubicando el marcador. Un solo recuadro para validar y para el mapa evita que una ficha con coordenadas erróneas (-90, -90) aleje el mapa (defecto 35). Rapa Nui (longitud cercana a -109) queda fuera porque incluirla obligaría a mostrar casi todo el Pacífico; se reevaluará si se suman profesionales de la isla.</w:t>
+              <w:t>Antes la dirección escrita solo existía en 4 de las 12 fichas de demostración, a través de su establecimiento, y la ventana del mapa solo podía mostrar la comuna (SC-22). Una columna propia y nula es una migración aditiva que no afecta las fichas existentes. Sin geocodificación (D31), la dirección es un texto declarado y las coordenadas siguen ubicando el marcador. Un solo recuadro para validar y para el mapa evita que una ficha con coordenadas erróneas (-90, -90) aleje el mapa (defecto 35). Rapa Nui (longitud cercana a -109) queda fuera porque incluirla obligaría a mostrar casi todo el Pacífico; se reevaluará si se suman profesionales de la isla. Desde el 24-10-2026 (SC-28) se adoptó la geocodificación que aquí se había descartado (D36): el profesional ya no escribe coordenadas y el recuadro de Chile sigue validándolas.</w:t>
             </w:r>
           </w:p>
         </w:tc>
@@ -29442,6 +29619,51 @@
           <w:p>
             <w:r>
               <w:t>Comparar opciones (FS-HU-06) pide ver a la vez dónde atiende cada profesional y sus datos; con vistas separadas había que cambiar de vista y se perdía la tarjeta. El detalle bajo el mapa no tapa otros marcadores ni queda cortado en pantallas angostas, como la ventana emergente. Con marcadores como botones el mapa se recorre con Tab y Enter sin código extra. La lista va primero en el orden del documento y del teclado y sigue disponible si el mapa no carga. El costo es descargar MapLibre al abrir Profesionales, salvo con el mapa oculto. Sin cambios en la API ni en los datos: precio, etiquetas, horario semanal y fotos del mockup quedan fuera hasta que existan.</w:t>
+            </w:r>
+          </w:p>
+        </w:tc>
+      </w:tr>
+      <w:tr>
+        <w:trPr>
+          <w:cantSplit/>
+        </w:trPr>
+        <w:tc>
+          <w:tcPr>
+            <w:tcW w:w="600" w:type="dxa"/>
+          </w:tcPr>
+          <w:p>
+            <w:r>
+              <w:t>D36</w:t>
+            </w:r>
+          </w:p>
+        </w:tc>
+        <w:tc>
+          <w:tcPr>
+            <w:tcW w:w="2400" w:type="dxa"/>
+          </w:tcPr>
+          <w:p>
+            <w:r>
+              <w:t>Ubicación de la ficha del profesional a partir de su comuna y su dirección (SC-28, 24-10-2026): el backend las convierte en coordenadas con Nominatim, el buscador de direcciones de OpenStreetMap, por GET /api/profesionales/mi-ficha/ubicacion (solo rol profesional), y responde la precisión (exacta, calle o comuna) y lo que encontró. El formulario muestra el lugar en un mapa (MapLibre y OpenFreeMap, D31) y el profesional puede ajustar el marcador arrastrándolo, con un clic o con las flechas. La ficha sigue guardando latitud y longitud, validadas dentro de Chile (D32).</w:t>
+            </w:r>
+          </w:p>
+        </w:tc>
+        <w:tc>
+          <w:tcPr>
+            <w:tcW w:w="2400" w:type="dxa"/>
+          </w:tcPr>
+          <w:p>
+            <w:r>
+              <w:t>Mantener los campos de latitud y longitud (D32); llamar a Nominatim desde el navegador; Photon (komoot); Google Geocoding API (clave y facturación, D8); buscar mientras se escribe (autocompletar).</w:t>
+            </w:r>
+          </w:p>
+        </w:tc>
+        <w:tc>
+          <w:tcPr>
+            <w:tcW w:w="3600" w:type="dxa"/>
+          </w:tcPr>
+          <w:p>
+            <w:r>
+              <w:t>Casi nadie sabe obtener las coordenadas de su dirección, y escribirlas a mano producía errores como el del defecto 35. Nominatim usa los mismos datos de OpenStreetMap que el mapa (D31) y es gratuito, sin clave ni tarjeta. Su política de uso exige identificar la aplicación, no pasar de una consulta por segundo, guardar las respuestas y no usarlo para autocompletar: por eso la búsqueda pasa por el backend (fila de espera, caché de 24 horas, cabecera User-Agent) y se hace al salir del campo o al guardar, no con cada tecla; así, además, la IP de las personas no llega a un tercero. Se busca solo la calle y el número (complementos como «oficina 501» impiden encontrarla) y se descarta un resultado de otra comuna. Si no encuentra el número, deja el marcador en la calle o en el centro de la comuna y lo dice, para que el profesional lo ajuste. Si Nominatim no responde, una ficha nueva no se puede guardar hasta reintentar; una ficha ya ubicada se guarda sin consultarlo mientras no cambie su dirección. Sin cambios en la base de datos.</w:t>
             </w:r>
           </w:p>
         </w:tc>
@@ -29982,6 +30204,48 @@
                 <w:b/>
                 <w:sz w:val="17"/>
               </w:rPr>
+              <w:t>Nominatim (OpenStreetMap)</w:t>
+            </w:r>
+          </w:p>
+        </w:tc>
+        <w:tc>
+          <w:tcPr>
+            <w:tcW w:w="2200" w:type="dxa"/>
+          </w:tcPr>
+          <w:p>
+            <w:r>
+              <w:rPr>
+                <w:sz w:val="17"/>
+              </w:rPr>
+              <w:t>Reutilizado (servicio externo)</w:t>
+            </w:r>
+          </w:p>
+        </w:tc>
+        <w:tc>
+          <w:tcPr>
+            <w:tcW w:w="3800" w:type="dxa"/>
+          </w:tcPr>
+          <w:p>
+            <w:r>
+              <w:rPr>
+                <w:sz w:val="17"/>
+              </w:rPr>
+              <w:t>Ubicación de la ficha del profesional a partir de su comuna y su dirección (D36); datos de OpenStreetMap con licencia ODbL, con la atribución en el mapa de la ficha.</w:t>
+            </w:r>
+          </w:p>
+        </w:tc>
+      </w:tr>
+      <w:tr>
+        <w:tc>
+          <w:tcPr>
+            <w:tcW w:w="3000" w:type="dxa"/>
+          </w:tcPr>
+          <w:p>
+            <w:r>
+              <w:rPr>
+                <w:b/>
+                <w:sz w:val="17"/>
+              </w:rPr>
               <w:t>Jest, Supertest, Vitest, Testing Library</w:t>
             </w:r>
           </w:p>
@@ -30411,7 +30675,7 @@
         <w:spacing w:after="120"/>
       </w:pPr>
       <w:r>
-        <w:t>Desde el 22-10-2026 (SC-27, D35) la lista y el mapa se ven juntos, y el mapa se puede ocultar sin perder filtros ni página. Desde el 15-10-2026 (SC-18, PR #27, D31) usa MapLibre GL JS 5.24.0, que se descarga solo cuando el mapa se muestra, con versión fija y huella SRI, y las teselas de OpenFreeMap (datos de OpenStreetMap), sin clave ni facturación; ya no se configuran variables de mapa en frontend/.env. Ante una falla mantiene los resultados accesibles y ofrece reintentar. Las suites usan un SDK simulado. Google Maps con Demo Key se comprobó el 12-10-2026; el mapa nuevo se comprobó en el navegador el 15-10-2026 y CP-078 sobre main sigue pendiente. Los defectos 27 y 29 (reintento cuando falla el estilo y textos de los controles en inglés) se corrigieron el 21-10-2026. El 19-10-2026 se corrigieron, pendientes de fusionar a main, el 28 (selección con teclado, SC-22) y el 35 (una ficha con coordenadas fuera de Chile alejaba el mapa): el mapa se limita a Chile y, desde la SC-24, la ficha solo acepta coordenadas dentro del país (D32). El detalle del marcador elegido (desde la SC-27, en un panel bajo el mapa en vez de una ventana sobre el marcador) muestra el tipo de profesional, si está verificado, su dirección y su próxima hora. En una pestaña oculta, el plazo de carga del mapa empieza cuando la pestaña se ve (defecto 37).</w:t>
+        <w:t>Desde el 22-10-2026 (SC-27, D35) la lista y el mapa se ven juntos, y el mapa se puede ocultar sin perder filtros ni página. Desde el 15-10-2026 (SC-18, PR #27, D31) usa MapLibre GL JS 5.24.0, que se descarga solo cuando el mapa se muestra, con versión fija y huella SRI, y las teselas de OpenFreeMap (datos de OpenStreetMap), sin clave ni facturación; ya no se configuran variables de mapa en frontend/.env. Ante una falla mantiene los resultados accesibles y ofrece reintentar. Las suites usan un SDK simulado. Google Maps con Demo Key se comprobó el 12-10-2026; el mapa nuevo se comprobó en el navegador el 15-10-2026 y CP-078 sobre main sigue pendiente. Los defectos 27 y 29 (reintento cuando falla el estilo y textos de los controles en inglés) se corrigieron el 21-10-2026. El 19-10-2026 se corrigieron, pendientes de fusionar a main, el 28 (selección con teclado, SC-22) y el 35 (una ficha con coordenadas fuera de Chile alejaba el mapa): el mapa se limita a Chile y, desde la SC-24, la ficha solo acepta coordenadas dentro del país (D32). El detalle del marcador elegido (desde la SC-27, en un panel bajo el mapa en vez de una ventana sobre el marcador) muestra el tipo de profesional, si está verificado, su dirección y su próxima hora. En una pestaña oculta, el plazo de carga del mapa empieza cuando la pestaña se ve (defecto 37). Desde el 24-10-2026 (SC-28, D36) la ficha del profesional también muestra un mapa: el lugar que encontró Nominatim para su comuna y su dirección, con un marcador que el profesional puede ajustar; usa el mismo SDK y la misma carga (services/cargaMapa.js) y gestos cooperativos (Ctrl + rueda, dos dedos) para no atrapar el desplazamiento del formulario.</w:t>
       </w:r>
     </w:p>
     <w:p>

</xml_diff>